<commit_message>
chore: model with 99.6% accuracy
</commit_message>
<xml_diff>
--- a/docs/Thesis.docx
+++ b/docs/Thesis.docx
@@ -491,80 +491,20 @@
         <w:rPr>
           <w:highlight w:val="darkGray"/>
         </w:rPr>
-        <w:t xml:space="preserve">magnitude = </w:t>
+        <w:t>magnitude = np.sqrt(real_number**2 + imaginary_number**2)</w:t>
+      </w:r>
+      <w:r>
+        <w:br/>
+        <w:t>which takes the square root of the real part squared added to the imaginary part squared. Then to get the phase the function</w:t>
+      </w:r>
+      <w:r>
+        <w:br/>
       </w:r>
       <w:r>
         <w:rPr>
           <w:highlight w:val="darkGray"/>
         </w:rPr>
-        <w:t>np.sqrt(</w:t>
-      </w:r>
-      <w:r>
-        <w:rPr>
-          <w:highlight w:val="darkGray"/>
-        </w:rPr>
-        <w:t>real_number</w:t>
-      </w:r>
-      <w:r>
-        <w:rPr>
-          <w:highlight w:val="darkGray"/>
-        </w:rPr>
-        <w:t xml:space="preserve">**2 + </w:t>
-      </w:r>
-      <w:r>
-        <w:rPr>
-          <w:highlight w:val="darkGray"/>
-        </w:rPr>
-        <w:t>imaginary_number</w:t>
-      </w:r>
-      <w:r>
-        <w:rPr>
-          <w:highlight w:val="darkGray"/>
-        </w:rPr>
-        <w:t>**2)</w:t>
-      </w:r>
-      <w:r>
-        <w:br/>
-        <w:t>which takes the square root of the real part squared added to the imaginary part squared. Then to get the phase the function</w:t>
-      </w:r>
-      <w:r>
-        <w:br/>
-      </w:r>
-      <w:r>
-        <w:rPr>
-          <w:highlight w:val="darkGray"/>
-        </w:rPr>
-        <w:t xml:space="preserve">phase = </w:t>
-      </w:r>
-      <w:r>
-        <w:rPr>
-          <w:highlight w:val="darkGray"/>
-        </w:rPr>
-        <w:t>np.arctan2(</w:t>
-      </w:r>
-      <w:r>
-        <w:rPr>
-          <w:highlight w:val="darkGray"/>
-        </w:rPr>
-        <w:t>imaginary_number</w:t>
-      </w:r>
-      <w:r>
-        <w:rPr>
-          <w:highlight w:val="darkGray"/>
-        </w:rPr>
-        <w:t xml:space="preserve">, </w:t>
-      </w:r>
-      <w:r>
-        <w:rPr>
-          <w:highlight w:val="darkGray"/>
-        </w:rPr>
-        <w:t>real_number</w:t>
-      </w:r>
-      <w:r>
-        <w:rPr>
-          <w:highlight w:val="darkGray"/>
-        </w:rPr>
-        <w:t>)</w:t>
+        <w:t>phase = np.arctan2(imaginary_number, real_number)</w:t>
       </w:r>
       <w:r>
         <w:br/>
@@ -634,12 +574,6 @@
       </w:r>
       <w:r>
         <w:t>based on input of a specific time range which is yet to be determined.</w:t>
-      </w:r>
-    </w:p>
-    <w:p>
-      <w:r>
-        <w:lastRenderedPageBreak/>
-        <w:br w:type="page"/>
       </w:r>
     </w:p>
     <w:p>
@@ -1945,6 +1879,7 @@
   <w:style w:type="character" w:default="1" w:styleId="DefaultParagraphFont">
     <w:name w:val="Default Paragraph Font"/>
     <w:uiPriority w:val="1"/>
+    <w:semiHidden/>
     <w:unhideWhenUsed/>
   </w:style>
   <w:style w:type="table" w:default="1" w:styleId="TableNormal">

</xml_diff>

<commit_message>
chore: model drawn using torchviz and increased instructions
</commit_message>
<xml_diff>
--- a/docs/Thesis.docx
+++ b/docs/Thesis.docx
@@ -1,6 +1,6 @@
 
 <file path=word/document.xml><?xml version="1.0" encoding="utf-8"?>
-<w:document xmlns:wpc="http://schemas.microsoft.com/office/word/2010/wordprocessingCanvas" xmlns:cx="http://schemas.microsoft.com/office/drawing/2014/chartex" xmlns:cx1="http://schemas.microsoft.com/office/drawing/2015/9/8/chartex" xmlns:cx2="http://schemas.microsoft.com/office/drawing/2015/10/21/chartex" xmlns:cx3="http://schemas.microsoft.com/office/drawing/2016/5/9/chartex" xmlns:cx4="http://schemas.microsoft.com/office/drawing/2016/5/10/chartex" xmlns:cx5="http://schemas.microsoft.com/office/drawing/2016/5/11/chartex" xmlns:cx6="http://schemas.microsoft.com/office/drawing/2016/5/12/chartex" xmlns:cx7="http://schemas.microsoft.com/office/drawing/2016/5/13/chartex" xmlns:cx8="http://schemas.microsoft.com/office/drawing/2016/5/14/chartex" xmlns:mc="http://schemas.openxmlformats.org/markup-compatibility/2006" xmlns:aink="http://schemas.microsoft.com/office/drawing/2016/ink" xmlns:am3d="http://schemas.microsoft.com/office/drawing/2017/model3d" xmlns:o="urn:schemas-microsoft-com:office:office" xmlns:oel="http://schemas.microsoft.com/office/2019/extlst" xmlns:r="http://schemas.openxmlformats.org/officeDocument/2006/relationships" xmlns:m="http://schemas.openxmlformats.org/officeDocument/2006/math" xmlns:v="urn:schemas-microsoft-com:vml" xmlns:wp14="http://schemas.microsoft.com/office/word/2010/wordprocessingDrawing" xmlns:wp="http://schemas.openxmlformats.org/drawingml/2006/wordprocessingDrawing" xmlns:w10="urn:schemas-microsoft-com:office:word" xmlns:w="http://schemas.openxmlformats.org/wordprocessingml/2006/main" xmlns:w14="http://schemas.microsoft.com/office/word/2010/wordml" xmlns:w15="http://schemas.microsoft.com/office/word/2012/wordml" xmlns:w16cex="http://schemas.microsoft.com/office/word/2018/wordml/cex" xmlns:w16cid="http://schemas.microsoft.com/office/word/2016/wordml/cid" xmlns:w16="http://schemas.microsoft.com/office/word/2018/wordml" xmlns:w16du="http://schemas.microsoft.com/office/word/2023/wordml/word16du" xmlns:w16sdtdh="http://schemas.microsoft.com/office/word/2020/wordml/sdtdatahash" xmlns:w16se="http://schemas.microsoft.com/office/word/2015/wordml/symex" xmlns:wpg="http://schemas.microsoft.com/office/word/2010/wordprocessingGroup" xmlns:wpi="http://schemas.microsoft.com/office/word/2010/wordprocessingInk" xmlns:wne="http://schemas.microsoft.com/office/word/2006/wordml" xmlns:wps="http://schemas.microsoft.com/office/word/2010/wordprocessingShape" mc:Ignorable="w14 w15 w16se w16cid w16 w16cex w16sdtdh w16du wp14">
+<w:document xmlns:wpc="http://schemas.microsoft.com/office/word/2010/wordprocessingCanvas" xmlns:cx="http://schemas.microsoft.com/office/drawing/2014/chartex" xmlns:cx1="http://schemas.microsoft.com/office/drawing/2015/9/8/chartex" xmlns:cx2="http://schemas.microsoft.com/office/drawing/2015/10/21/chartex" xmlns:cx3="http://schemas.microsoft.com/office/drawing/2016/5/9/chartex" xmlns:cx4="http://schemas.microsoft.com/office/drawing/2016/5/10/chartex" xmlns:cx5="http://schemas.microsoft.com/office/drawing/2016/5/11/chartex" xmlns:cx6="http://schemas.microsoft.com/office/drawing/2016/5/12/chartex" xmlns:cx7="http://schemas.microsoft.com/office/drawing/2016/5/13/chartex" xmlns:cx8="http://schemas.microsoft.com/office/drawing/2016/5/14/chartex" xmlns:mc="http://schemas.openxmlformats.org/markup-compatibility/2006" xmlns:aink="http://schemas.microsoft.com/office/drawing/2016/ink" xmlns:am3d="http://schemas.microsoft.com/office/drawing/2017/model3d" xmlns:o="urn:schemas-microsoft-com:office:office" xmlns:oel="http://schemas.microsoft.com/office/2019/extlst" xmlns:r="http://schemas.openxmlformats.org/officeDocument/2006/relationships" xmlns:m="http://schemas.openxmlformats.org/officeDocument/2006/math" xmlns:v="urn:schemas-microsoft-com:vml" xmlns:wp14="http://schemas.microsoft.com/office/word/2010/wordprocessingDrawing" xmlns:wp="http://schemas.openxmlformats.org/drawingml/2006/wordprocessingDrawing" xmlns:w10="urn:schemas-microsoft-com:office:word" xmlns:w="http://schemas.openxmlformats.org/wordprocessingml/2006/main" xmlns:w14="http://schemas.microsoft.com/office/word/2010/wordml" xmlns:w15="http://schemas.microsoft.com/office/word/2012/wordml" xmlns:w16cex="http://schemas.microsoft.com/office/word/2018/wordml/cex" xmlns:w16cid="http://schemas.microsoft.com/office/word/2016/wordml/cid" xmlns:w16="http://schemas.microsoft.com/office/word/2018/wordml" xmlns:w16du="http://schemas.microsoft.com/office/word/2023/wordml/word16du" xmlns:w16sdtdh="http://schemas.microsoft.com/office/word/2020/wordml/sdtdatahash" xmlns:w16sdtfl="http://schemas.microsoft.com/office/word/2024/wordml/sdtformatlock" xmlns:w16se="http://schemas.microsoft.com/office/word/2015/wordml/symex" xmlns:wpg="http://schemas.microsoft.com/office/word/2010/wordprocessingGroup" xmlns:wpi="http://schemas.microsoft.com/office/word/2010/wordprocessingInk" xmlns:wne="http://schemas.microsoft.com/office/word/2006/wordml" xmlns:wps="http://schemas.microsoft.com/office/word/2010/wordprocessingShape" mc:Ignorable="w14 w15 w16se w16cid w16 w16cex w16sdtdh w16sdtfl w16du wp14">
   <w:body>
     <w:p>
       <w:pPr>
@@ -1790,11 +1790,9 @@
           <w:numId w:val="1"/>
         </w:numPr>
       </w:pPr>
-      <w:proofErr w:type="spellStart"/>
       <w:r>
         <w:t>PyTorch</w:t>
       </w:r>
-      <w:proofErr w:type="spellEnd"/>
     </w:p>
     <w:p>
       <w:pPr>
@@ -2013,23 +2011,7 @@
     </w:p>
     <w:p>
       <w:r>
-        <w:t xml:space="preserve">To validate the model I have created a model that uses the fast </w:t>
-      </w:r>
-      <w:proofErr w:type="spellStart"/>
-      <w:r>
-        <w:t>fourier</w:t>
-      </w:r>
-      <w:proofErr w:type="spellEnd"/>
-      <w:r>
-        <w:t xml:space="preserve"> transform over the input data to see if the predictions can match this approach and to validate if the current model is actually more performant than just performing a fast </w:t>
-      </w:r>
-      <w:proofErr w:type="spellStart"/>
-      <w:r>
-        <w:t>fourier</w:t>
-      </w:r>
-      <w:proofErr w:type="spellEnd"/>
-      <w:r>
-        <w:t xml:space="preserve"> transform over the collection data samples.</w:t>
+        <w:t>To validate the model I have created a model that uses the fast fourier transform over the input data to see if the predictions can match this approach and to validate if the current model is actually more performant than just performing a fast fourier transform over the collection data samples.</w:t>
       </w:r>
     </w:p>
     <w:p>
@@ -2347,21 +2329,7 @@
               <w:rPr>
                 <w:lang w:eastAsia="en-GB"/>
               </w:rPr>
-              <w:t xml:space="preserve">This model classifies channels using two linear classifiers. Within </w:t>
-            </w:r>
-            <w:proofErr w:type="spellStart"/>
-            <w:r>
-              <w:rPr>
-                <w:lang w:eastAsia="en-GB"/>
-              </w:rPr>
-              <w:t>PyTorch</w:t>
-            </w:r>
-            <w:proofErr w:type="spellEnd"/>
-            <w:r>
-              <w:rPr>
-                <w:lang w:eastAsia="en-GB"/>
-              </w:rPr>
-              <w:t>, this approach is implemented to behave like a Support Vector Machine (SVM). Despite its simplicity, this method performs surprisingly well compared to more complex alternatives.</w:t>
+              <w:t>This model classifies channels using two linear classifiers. Within PyTorch, this approach is implemented to behave like a Support Vector Machine (SVM). Despite its simplicity, this method performs surprisingly well compared to more complex alternatives.</w:t>
             </w:r>
           </w:p>
         </w:tc>
@@ -2508,7 +2476,31 @@
               <w:rPr>
                 <w:lang w:eastAsia="en-GB"/>
               </w:rPr>
-              <w:t xml:space="preserve"> and is able to not only classify the current channel that is available, but also what will be the available bandwidth in the future.</w:t>
+              <w:t xml:space="preserve"> and is able to not only classify the current channel that is available, but also what </w:t>
+            </w:r>
+            <w:r>
+              <w:rPr>
+                <w:lang w:eastAsia="en-GB"/>
+              </w:rPr>
+              <w:t xml:space="preserve">the </w:t>
+            </w:r>
+            <w:r>
+              <w:rPr>
+                <w:lang w:eastAsia="en-GB"/>
+              </w:rPr>
+              <w:t xml:space="preserve">available bandwidth </w:t>
+            </w:r>
+            <w:r>
+              <w:rPr>
+                <w:lang w:eastAsia="en-GB"/>
+              </w:rPr>
+              <w:t xml:space="preserve">will be </w:t>
+            </w:r>
+            <w:r>
+              <w:rPr>
+                <w:lang w:eastAsia="en-GB"/>
+              </w:rPr>
+              <w:t>in the future.</w:t>
             </w:r>
           </w:p>
         </w:tc>
@@ -3889,6 +3881,7 @@
             </w:pPr>
             <w:r>
               <w:rPr>
+                <w:noProof/>
                 <w:lang w:eastAsia="en-GB"/>
               </w:rPr>
               <w:drawing>
@@ -3942,6 +3935,7 @@
             </w:pPr>
             <w:r>
               <w:rPr>
+                <w:noProof/>
                 <w:lang w:eastAsia="en-GB"/>
               </w:rPr>
               <w:drawing>
@@ -4002,6 +3996,7 @@
             </w:pPr>
             <w:r>
               <w:rPr>
+                <w:noProof/>
                 <w:lang w:eastAsia="en-GB"/>
               </w:rPr>
               <w:drawing>
@@ -4055,6 +4050,7 @@
             </w:pPr>
             <w:r>
               <w:rPr>
+                <w:noProof/>
                 <w:lang w:eastAsia="en-GB"/>
               </w:rPr>
               <w:drawing>
@@ -4879,6 +4875,7 @@
             </w:pPr>
             <w:r>
               <w:rPr>
+                <w:noProof/>
                 <w:lang w:eastAsia="en-GB"/>
               </w:rPr>
               <w:drawing>
@@ -4932,6 +4929,7 @@
             </w:pPr>
             <w:r>
               <w:rPr>
+                <w:noProof/>
                 <w:lang w:eastAsia="en-GB"/>
               </w:rPr>
               <w:drawing>
@@ -4992,6 +4990,7 @@
             </w:pPr>
             <w:r>
               <w:rPr>
+                <w:noProof/>
                 <w:lang w:eastAsia="en-GB"/>
               </w:rPr>
               <w:drawing>
@@ -5045,6 +5044,7 @@
             </w:pPr>
             <w:r>
               <w:rPr>
+                <w:noProof/>
                 <w:lang w:eastAsia="en-GB"/>
               </w:rPr>
               <w:drawing>
@@ -5882,6 +5882,7 @@
             </w:pPr>
             <w:r>
               <w:rPr>
+                <w:noProof/>
                 <w:lang w:eastAsia="en-GB"/>
               </w:rPr>
               <w:drawing>
@@ -5935,6 +5936,7 @@
             </w:pPr>
             <w:r>
               <w:rPr>
+                <w:noProof/>
                 <w:lang w:eastAsia="en-GB"/>
               </w:rPr>
               <w:drawing>
@@ -5995,6 +5997,7 @@
             </w:pPr>
             <w:r>
               <w:rPr>
+                <w:noProof/>
                 <w:lang w:eastAsia="en-GB"/>
               </w:rPr>
               <w:drawing>
@@ -6048,6 +6051,7 @@
             </w:pPr>
             <w:r>
               <w:rPr>
+                <w:noProof/>
                 <w:lang w:eastAsia="en-GB"/>
               </w:rPr>
               <w:drawing>
@@ -6859,31 +6863,7 @@
           <w:lang w:eastAsia="en-GB"/>
         </w:rPr>
         <w:lastRenderedPageBreak/>
-        <w:t xml:space="preserve">Where each model compared, </w:t>
-      </w:r>
-      <w:r>
-        <w:rPr>
-          <w:lang w:eastAsia="en-GB"/>
-        </w:rPr>
-        <w:t xml:space="preserve">less sequences used again for training </w:t>
-      </w:r>
-      <w:r>
-        <w:rPr>
-          <w:lang w:eastAsia="en-GB"/>
-        </w:rPr>
-        <w:t>(</w:t>
-      </w:r>
-      <w:r>
-        <w:rPr>
-          <w:lang w:eastAsia="en-GB"/>
-        </w:rPr>
-        <w:t>50</w:t>
-      </w:r>
-      <w:r>
-        <w:rPr>
-          <w:lang w:eastAsia="en-GB"/>
-        </w:rPr>
-        <w:t>.000 sequences)</w:t>
+        <w:t>Where each model compared, less sequences used again for training (50.000 sequences)</w:t>
       </w:r>
     </w:p>
     <w:tbl>
@@ -6917,6 +6897,7 @@
             </w:pPr>
             <w:r>
               <w:rPr>
+                <w:noProof/>
                 <w:lang w:eastAsia="en-GB"/>
               </w:rPr>
               <w:drawing>
@@ -6970,6 +6951,7 @@
             </w:pPr>
             <w:r>
               <w:rPr>
+                <w:noProof/>
                 <w:lang w:eastAsia="en-GB"/>
               </w:rPr>
               <w:drawing>
@@ -7030,6 +7012,7 @@
             </w:pPr>
             <w:r>
               <w:rPr>
+                <w:noProof/>
                 <w:lang w:eastAsia="en-GB"/>
               </w:rPr>
               <w:drawing>
@@ -7083,6 +7066,7 @@
             </w:pPr>
             <w:r>
               <w:rPr>
+                <w:noProof/>
                 <w:lang w:eastAsia="en-GB"/>
               </w:rPr>
               <w:drawing>
@@ -7131,6 +7115,370 @@
           <w:lang w:eastAsia="en-GB"/>
         </w:rPr>
       </w:pPr>
+    </w:p>
+    <w:p>
+      <w:pPr>
+        <w:rPr>
+          <w:lang w:eastAsia="en-GB"/>
+        </w:rPr>
+      </w:pPr>
+      <w:r>
+        <w:rPr>
+          <w:lang w:eastAsia="en-GB"/>
+        </w:rPr>
+        <w:br w:type="page"/>
+      </w:r>
+    </w:p>
+    <w:p>
+      <w:pPr>
+        <w:pStyle w:val="Heading3"/>
+        <w:rPr>
+          <w:lang w:eastAsia="en-GB"/>
+        </w:rPr>
+      </w:pPr>
+      <w:r>
+        <w:rPr>
+          <w:lang w:eastAsia="en-GB"/>
+        </w:rPr>
+        <w:lastRenderedPageBreak/>
+        <w:t>Model diagrams</w:t>
+      </w:r>
+    </w:p>
+    <w:p>
+      <w:pPr>
+        <w:rPr>
+          <w:lang w:eastAsia="en-GB"/>
+        </w:rPr>
+      </w:pPr>
+      <w:r>
+        <w:rPr>
+          <w:lang w:eastAsia="en-GB"/>
+        </w:rPr>
+        <w:t xml:space="preserve">Using the </w:t>
+      </w:r>
+      <w:proofErr w:type="spellStart"/>
+      <w:r>
+        <w:rPr>
+          <w:lang w:eastAsia="en-GB"/>
+        </w:rPr>
+        <w:t>torchviz</w:t>
+      </w:r>
+      <w:proofErr w:type="spellEnd"/>
+      <w:r>
+        <w:rPr>
+          <w:lang w:eastAsia="en-GB"/>
+        </w:rPr>
+        <w:t xml:space="preserve"> library I have visualised the three chosen models for classification and what their corresponding weights are after training</w:t>
+      </w:r>
+    </w:p>
+    <w:tbl>
+      <w:tblPr>
+        <w:tblStyle w:val="TableGrid"/>
+        <w:tblW w:w="9918" w:type="dxa"/>
+        <w:tblLook w:val="04A0" w:firstRow="1" w:lastRow="0" w:firstColumn="1" w:lastColumn="0" w:noHBand="0" w:noVBand="1"/>
+      </w:tblPr>
+      <w:tblGrid>
+        <w:gridCol w:w="2689"/>
+        <w:gridCol w:w="7229"/>
+      </w:tblGrid>
+      <w:tr>
+        <w:tc>
+          <w:tcPr>
+            <w:tcW w:w="2689" w:type="dxa"/>
+          </w:tcPr>
+          <w:p>
+            <w:pPr>
+              <w:rPr>
+                <w:b/>
+                <w:bCs/>
+                <w:lang w:eastAsia="en-GB"/>
+              </w:rPr>
+            </w:pPr>
+            <w:r>
+              <w:rPr>
+                <w:b/>
+                <w:bCs/>
+                <w:lang w:eastAsia="en-GB"/>
+              </w:rPr>
+              <w:t>Model</w:t>
+            </w:r>
+          </w:p>
+        </w:tc>
+        <w:tc>
+          <w:tcPr>
+            <w:tcW w:w="7229" w:type="dxa"/>
+          </w:tcPr>
+          <w:p>
+            <w:pPr>
+              <w:rPr>
+                <w:b/>
+                <w:bCs/>
+                <w:lang w:eastAsia="en-GB"/>
+              </w:rPr>
+            </w:pPr>
+            <w:r>
+              <w:rPr>
+                <w:b/>
+                <w:bCs/>
+                <w:lang w:eastAsia="en-GB"/>
+              </w:rPr>
+              <w:t>Graph</w:t>
+            </w:r>
+          </w:p>
+        </w:tc>
+      </w:tr>
+      <w:tr>
+        <w:tc>
+          <w:tcPr>
+            <w:tcW w:w="2689" w:type="dxa"/>
+          </w:tcPr>
+          <w:p>
+            <w:pPr>
+              <w:rPr>
+                <w:sz w:val="22"/>
+                <w:szCs w:val="22"/>
+                <w:lang w:eastAsia="en-GB"/>
+              </w:rPr>
+            </w:pPr>
+            <w:r>
+              <w:rPr>
+                <w:sz w:val="22"/>
+                <w:szCs w:val="22"/>
+                <w:lang w:eastAsia="en-GB"/>
+              </w:rPr>
+              <w:t>Convolutional model</w:t>
+            </w:r>
+          </w:p>
+        </w:tc>
+        <w:tc>
+          <w:tcPr>
+            <w:tcW w:w="7229" w:type="dxa"/>
+          </w:tcPr>
+          <w:p>
+            <w:pPr>
+              <w:rPr>
+                <w:lang w:eastAsia="en-GB"/>
+              </w:rPr>
+            </w:pPr>
+            <w:r>
+              <w:rPr>
+                <w:lang w:eastAsia="en-GB"/>
+              </w:rPr>
+              <w:drawing>
+                <wp:inline distT="0" distB="0" distL="0" distR="0" wp14:anchorId="488F6601" wp14:editId="3FFED30F">
+                  <wp:extent cx="3240000" cy="5886998"/>
+                  <wp:effectExtent l="0" t="0" r="0" b="0"/>
+                  <wp:docPr id="747622412" name="Picture 1"/>
+                  <wp:cNvGraphicFramePr>
+                    <a:graphicFrameLocks xmlns:a="http://schemas.openxmlformats.org/drawingml/2006/main" noChangeAspect="1"/>
+                  </wp:cNvGraphicFramePr>
+                  <a:graphic xmlns:a="http://schemas.openxmlformats.org/drawingml/2006/main">
+                    <a:graphicData uri="http://schemas.openxmlformats.org/drawingml/2006/picture">
+                      <pic:pic xmlns:pic="http://schemas.openxmlformats.org/drawingml/2006/picture">
+                        <pic:nvPicPr>
+                          <pic:cNvPr id="747622412" name=""/>
+                          <pic:cNvPicPr/>
+                        </pic:nvPicPr>
+                        <pic:blipFill>
+                          <a:blip r:embed="rId39"/>
+                          <a:stretch>
+                            <a:fillRect/>
+                          </a:stretch>
+                        </pic:blipFill>
+                        <pic:spPr>
+                          <a:xfrm>
+                            <a:off x="0" y="0"/>
+                            <a:ext cx="3240000" cy="5886998"/>
+                          </a:xfrm>
+                          <a:prstGeom prst="rect">
+                            <a:avLst/>
+                          </a:prstGeom>
+                        </pic:spPr>
+                      </pic:pic>
+                    </a:graphicData>
+                  </a:graphic>
+                </wp:inline>
+              </w:drawing>
+            </w:r>
+          </w:p>
+        </w:tc>
+      </w:tr>
+      <w:tr>
+        <w:tc>
+          <w:tcPr>
+            <w:tcW w:w="2689" w:type="dxa"/>
+          </w:tcPr>
+          <w:p>
+            <w:pPr>
+              <w:rPr>
+                <w:sz w:val="22"/>
+                <w:szCs w:val="22"/>
+                <w:lang w:eastAsia="en-GB"/>
+              </w:rPr>
+            </w:pPr>
+            <w:r>
+              <w:rPr>
+                <w:sz w:val="22"/>
+                <w:szCs w:val="22"/>
+                <w:lang w:eastAsia="en-GB"/>
+              </w:rPr>
+              <w:lastRenderedPageBreak/>
+              <w:t xml:space="preserve">Convolutional </w:t>
+            </w:r>
+            <w:r>
+              <w:rPr>
+                <w:sz w:val="22"/>
+                <w:szCs w:val="22"/>
+                <w:lang w:eastAsia="en-GB"/>
+              </w:rPr>
+              <w:t>SVM</w:t>
+            </w:r>
+          </w:p>
+        </w:tc>
+        <w:tc>
+          <w:tcPr>
+            <w:tcW w:w="7229" w:type="dxa"/>
+          </w:tcPr>
+          <w:p>
+            <w:pPr>
+              <w:rPr>
+                <w:lang w:eastAsia="en-GB"/>
+              </w:rPr>
+            </w:pPr>
+            <w:r>
+              <w:rPr>
+                <w:lang w:eastAsia="en-GB"/>
+              </w:rPr>
+              <w:drawing>
+                <wp:inline distT="0" distB="0" distL="0" distR="0" wp14:anchorId="3D7E6CE4" wp14:editId="165FA927">
+                  <wp:extent cx="3240000" cy="4448269"/>
+                  <wp:effectExtent l="0" t="0" r="0" b="0"/>
+                  <wp:docPr id="852423303" name="Picture 1"/>
+                  <wp:cNvGraphicFramePr>
+                    <a:graphicFrameLocks xmlns:a="http://schemas.openxmlformats.org/drawingml/2006/main" noChangeAspect="1"/>
+                  </wp:cNvGraphicFramePr>
+                  <a:graphic xmlns:a="http://schemas.openxmlformats.org/drawingml/2006/main">
+                    <a:graphicData uri="http://schemas.openxmlformats.org/drawingml/2006/picture">
+                      <pic:pic xmlns:pic="http://schemas.openxmlformats.org/drawingml/2006/picture">
+                        <pic:nvPicPr>
+                          <pic:cNvPr id="852423303" name=""/>
+                          <pic:cNvPicPr/>
+                        </pic:nvPicPr>
+                        <pic:blipFill>
+                          <a:blip r:embed="rId40"/>
+                          <a:stretch>
+                            <a:fillRect/>
+                          </a:stretch>
+                        </pic:blipFill>
+                        <pic:spPr>
+                          <a:xfrm>
+                            <a:off x="0" y="0"/>
+                            <a:ext cx="3240000" cy="4448269"/>
+                          </a:xfrm>
+                          <a:prstGeom prst="rect">
+                            <a:avLst/>
+                          </a:prstGeom>
+                        </pic:spPr>
+                      </pic:pic>
+                    </a:graphicData>
+                  </a:graphic>
+                </wp:inline>
+              </w:drawing>
+            </w:r>
+          </w:p>
+        </w:tc>
+      </w:tr>
+      <w:tr>
+        <w:tc>
+          <w:tcPr>
+            <w:tcW w:w="2689" w:type="dxa"/>
+          </w:tcPr>
+          <w:p>
+            <w:pPr>
+              <w:rPr>
+                <w:sz w:val="22"/>
+                <w:szCs w:val="22"/>
+                <w:lang w:eastAsia="en-GB"/>
+              </w:rPr>
+            </w:pPr>
+            <w:r>
+              <w:rPr>
+                <w:sz w:val="22"/>
+                <w:szCs w:val="22"/>
+                <w:lang w:eastAsia="en-GB"/>
+              </w:rPr>
+              <w:t>FFT linear model</w:t>
+            </w:r>
+          </w:p>
+        </w:tc>
+        <w:tc>
+          <w:tcPr>
+            <w:tcW w:w="7229" w:type="dxa"/>
+          </w:tcPr>
+          <w:p>
+            <w:pPr>
+              <w:ind w:left="720" w:hanging="720"/>
+            </w:pPr>
+            <w:r>
+              <w:drawing>
+                <wp:inline distT="0" distB="0" distL="0" distR="0" wp14:anchorId="2FFE1161" wp14:editId="1CEA340D">
+                  <wp:extent cx="3240000" cy="4156437"/>
+                  <wp:effectExtent l="0" t="0" r="0" b="0"/>
+                  <wp:docPr id="365919529" name="Picture 2"/>
+                  <wp:cNvGraphicFramePr>
+                    <a:graphicFrameLocks xmlns:a="http://schemas.openxmlformats.org/drawingml/2006/main" noChangeAspect="1"/>
+                  </wp:cNvGraphicFramePr>
+                  <a:graphic xmlns:a="http://schemas.openxmlformats.org/drawingml/2006/main">
+                    <a:graphicData uri="http://schemas.openxmlformats.org/drawingml/2006/picture">
+                      <pic:pic xmlns:pic="http://schemas.openxmlformats.org/drawingml/2006/picture">
+                        <pic:nvPicPr>
+                          <pic:cNvPr id="0" name="Picture 6"/>
+                          <pic:cNvPicPr>
+                            <a:picLocks noChangeAspect="1" noChangeArrowheads="1"/>
+                          </pic:cNvPicPr>
+                        </pic:nvPicPr>
+                        <pic:blipFill>
+                          <a:blip r:embed="rId41">
+                            <a:extLst>
+                              <a:ext uri="{28A0092B-C50C-407E-A947-70E740481C1C}">
+                                <a14:useLocalDpi xmlns:a14="http://schemas.microsoft.com/office/drawing/2010/main" val="0"/>
+                              </a:ext>
+                            </a:extLst>
+                          </a:blip>
+                          <a:srcRect/>
+                          <a:stretch>
+                            <a:fillRect/>
+                          </a:stretch>
+                        </pic:blipFill>
+                        <pic:spPr bwMode="auto">
+                          <a:xfrm>
+                            <a:off x="0" y="0"/>
+                            <a:ext cx="3240000" cy="4156437"/>
+                          </a:xfrm>
+                          <a:prstGeom prst="rect">
+                            <a:avLst/>
+                          </a:prstGeom>
+                          <a:noFill/>
+                          <a:ln>
+                            <a:noFill/>
+                          </a:ln>
+                        </pic:spPr>
+                      </pic:pic>
+                    </a:graphicData>
+                  </a:graphic>
+                </wp:inline>
+              </w:drawing>
+            </w:r>
+          </w:p>
+        </w:tc>
+      </w:tr>
+    </w:tbl>
+    <w:p>
+      <w:pPr>
+        <w:rPr>
+          <w:lang w:eastAsia="en-GB"/>
+        </w:rPr>
+      </w:pPr>
       <w:r>
         <w:rPr>
           <w:lang w:eastAsia="en-GB"/>
@@ -7226,21 +7574,8 @@
           <w:rFonts w:eastAsia="Times New Roman"/>
         </w:rPr>
       </w:pPr>
-      <w:proofErr w:type="spellStart"/>
-      <w:r>
-        <w:t>Kockaya</w:t>
-      </w:r>
-      <w:proofErr w:type="spellEnd"/>
-      <w:r>
-        <w:t xml:space="preserve">, K., &amp; </w:t>
-      </w:r>
-      <w:proofErr w:type="spellStart"/>
-      <w:r>
-        <w:t>Develi</w:t>
-      </w:r>
-      <w:proofErr w:type="spellEnd"/>
-      <w:r>
-        <w:t xml:space="preserve">, I. (2020). Spectrum sensing in cognitive radio networks: threshold optimization and analysis. </w:t>
+      <w:r>
+        <w:t xml:space="preserve">Kockaya, K., &amp; Develi, I. (2020). Spectrum sensing in cognitive radio networks: threshold optimization and analysis. </w:t>
       </w:r>
       <w:r>
         <w:rPr>
@@ -7262,7 +7597,7 @@
       <w:r>
         <w:t xml:space="preserve">(1). </w:t>
       </w:r>
-      <w:hyperlink r:id="rId39" w:history="1">
+      <w:hyperlink r:id="rId42" w:history="1">
         <w:r>
           <w:rPr>
             <w:rStyle w:val="Hyperlink"/>
@@ -7285,7 +7620,7 @@
       <w:r>
         <w:t xml:space="preserve">What is a Large Language Model? | A Comprehensive LLMs Guide. (n.d.). Elastic. </w:t>
       </w:r>
-      <w:hyperlink r:id="rId40" w:anchor="what-is-the-difference-between-large-language-models-and-generative-ai" w:history="1">
+      <w:hyperlink r:id="rId43" w:anchor="what-is-the-difference-between-large-language-models-and-generative-ai" w:history="1">
         <w:r>
           <w:rPr>
             <w:rStyle w:val="Hyperlink"/>
@@ -7305,21 +7640,8 @@
           <w:rStyle w:val="url"/>
         </w:rPr>
       </w:pPr>
-      <w:proofErr w:type="spellStart"/>
-      <w:r>
-        <w:t>Davaslioglu</w:t>
-      </w:r>
-      <w:proofErr w:type="spellEnd"/>
-      <w:r>
-        <w:t xml:space="preserve">, K., &amp; </w:t>
-      </w:r>
-      <w:proofErr w:type="spellStart"/>
-      <w:r>
-        <w:t>Sagduyu</w:t>
-      </w:r>
-      <w:proofErr w:type="spellEnd"/>
-      <w:r>
-        <w:t xml:space="preserve">, Y. E. (n.d.). </w:t>
+      <w:r>
+        <w:t xml:space="preserve">Davaslioglu, K., &amp; Sagduyu, Y. E. (n.d.). </w:t>
       </w:r>
       <w:r>
         <w:rPr>
@@ -7331,7 +7653,7 @@
       <w:r>
         <w:t xml:space="preserve">. arXiv.org. </w:t>
       </w:r>
-      <w:hyperlink r:id="rId41" w:history="1">
+      <w:hyperlink r:id="rId44" w:history="1">
         <w:r>
           <w:rPr>
             <w:rStyle w:val="Hyperlink"/>
@@ -7361,7 +7683,7 @@
       <w:r>
         <w:t xml:space="preserve">. (2016, January 1). IEEE Journals &amp; Magazine | IEEE Xplore. </w:t>
       </w:r>
-      <w:hyperlink r:id="rId42" w:history="1">
+      <w:hyperlink r:id="rId45" w:history="1">
         <w:r>
           <w:rPr>
             <w:rStyle w:val="Hyperlink"/>
@@ -7388,17 +7710,9 @@
         <w:t>‐</w:t>
       </w:r>
       <w:r>
-        <w:t xml:space="preserve">Scale mapping of urban radio frequency noise at very high frequency and </w:t>
-      </w:r>
-      <w:proofErr w:type="spellStart"/>
-      <w:r>
-        <w:t>ultra high</w:t>
-      </w:r>
-      <w:proofErr w:type="spellEnd"/>
-      <w:r>
-        <w:t xml:space="preserve"> frequency. Radio Science, 54(11), 934–948. </w:t>
-      </w:r>
-      <w:hyperlink r:id="rId43" w:history="1">
+        <w:t xml:space="preserve">Scale mapping of urban radio frequency noise at very high frequency and ultra high frequency. Radio Science, 54(11), 934–948. </w:t>
+      </w:r>
+      <w:hyperlink r:id="rId46" w:history="1">
         <w:r>
           <w:rPr>
             <w:rStyle w:val="Hyperlink"/>
@@ -7421,21 +7735,8 @@
         </w:rPr>
         <w:t xml:space="preserve">Uvaydov, D., D’Oro, S., Restuccia, F., &amp; Melodia, T. (2021). </w:t>
       </w:r>
-      <w:proofErr w:type="spellStart"/>
-      <w:r>
-        <w:t>DeepSense</w:t>
-      </w:r>
-      <w:proofErr w:type="spellEnd"/>
-      <w:r>
-        <w:t xml:space="preserve">: Fast </w:t>
-      </w:r>
-      <w:proofErr w:type="spellStart"/>
-      <w:r>
-        <w:t>Wideban</w:t>
-      </w:r>
-      <w:proofErr w:type="spellEnd"/>
-      <w:r>
-        <w:t xml:space="preserve"> Spectrum Sensing Through Real-Time In-The-Loop Deep Learning (No. 978-1-6654-0325-2/21/$31.00). IEEE.</w:t>
+      <w:r>
+        <w:t>DeepSense: Fast Wideban Spectrum Sensing Through Real-Time In-The-Loop Deep Learning (No. 978-1-6654-0325-2/21/$31.00). IEEE.</w:t>
       </w:r>
     </w:p>
     <w:p>
@@ -7447,15 +7748,7 @@
         </w:numPr>
       </w:pPr>
       <w:r>
-        <w:t xml:space="preserve">Hu, H. [Dept. of Electronic Engineering Beijing University of Posts and Telecommunication], Song, J. [Dept. of Electronic Engineering Beijing University of Posts and Telecommunication], &amp; Wang, Y. [Dept. of Telecommunication Engineering </w:t>
-      </w:r>
-      <w:proofErr w:type="spellStart"/>
-      <w:r>
-        <w:t>Xidian</w:t>
-      </w:r>
-      <w:proofErr w:type="spellEnd"/>
-      <w:r>
-        <w:t xml:space="preserve"> University]. (2008). Signal Classification based on Spectral Correlation Analysis and SVM in Cognitive Radio (No. 1550-445X/08).</w:t>
+        <w:t>Hu, H. [Dept. of Electronic Engineering Beijing University of Posts and Telecommunication], Song, J. [Dept. of Electronic Engineering Beijing University of Posts and Telecommunication], &amp; Wang, Y. [Dept. of Telecommunication Engineering Xidian University]. (2008). Signal Classification based on Spectral Correlation Analysis and SVM in Cognitive Radio (No. 1550-445X/08).</w:t>
       </w:r>
     </w:p>
     <w:p>
@@ -7475,7 +7768,7 @@
 </file>
 
 <file path=word/numbering.xml><?xml version="1.0" encoding="utf-8"?>
-<w:numbering xmlns:wpc="http://schemas.microsoft.com/office/word/2010/wordprocessingCanvas" xmlns:cx="http://schemas.microsoft.com/office/drawing/2014/chartex" xmlns:cx1="http://schemas.microsoft.com/office/drawing/2015/9/8/chartex" xmlns:cx2="http://schemas.microsoft.com/office/drawing/2015/10/21/chartex" xmlns:cx3="http://schemas.microsoft.com/office/drawing/2016/5/9/chartex" xmlns:cx4="http://schemas.microsoft.com/office/drawing/2016/5/10/chartex" xmlns:cx5="http://schemas.microsoft.com/office/drawing/2016/5/11/chartex" xmlns:cx6="http://schemas.microsoft.com/office/drawing/2016/5/12/chartex" xmlns:cx7="http://schemas.microsoft.com/office/drawing/2016/5/13/chartex" xmlns:cx8="http://schemas.microsoft.com/office/drawing/2016/5/14/chartex" xmlns:mc="http://schemas.openxmlformats.org/markup-compatibility/2006" xmlns:aink="http://schemas.microsoft.com/office/drawing/2016/ink" xmlns:am3d="http://schemas.microsoft.com/office/drawing/2017/model3d" xmlns:o="urn:schemas-microsoft-com:office:office" xmlns:oel="http://schemas.microsoft.com/office/2019/extlst" xmlns:r="http://schemas.openxmlformats.org/officeDocument/2006/relationships" xmlns:m="http://schemas.openxmlformats.org/officeDocument/2006/math" xmlns:v="urn:schemas-microsoft-com:vml" xmlns:wp14="http://schemas.microsoft.com/office/word/2010/wordprocessingDrawing" xmlns:wp="http://schemas.openxmlformats.org/drawingml/2006/wordprocessingDrawing" xmlns:w10="urn:schemas-microsoft-com:office:word" xmlns:w="http://schemas.openxmlformats.org/wordprocessingml/2006/main" xmlns:w14="http://schemas.microsoft.com/office/word/2010/wordml" xmlns:w15="http://schemas.microsoft.com/office/word/2012/wordml" xmlns:w16cex="http://schemas.microsoft.com/office/word/2018/wordml/cex" xmlns:w16cid="http://schemas.microsoft.com/office/word/2016/wordml/cid" xmlns:w16="http://schemas.microsoft.com/office/word/2018/wordml" xmlns:w16du="http://schemas.microsoft.com/office/word/2023/wordml/word16du" xmlns:w16sdtdh="http://schemas.microsoft.com/office/word/2020/wordml/sdtdatahash" xmlns:w16se="http://schemas.microsoft.com/office/word/2015/wordml/symex" xmlns:wpg="http://schemas.microsoft.com/office/word/2010/wordprocessingGroup" xmlns:wpi="http://schemas.microsoft.com/office/word/2010/wordprocessingInk" xmlns:wne="http://schemas.microsoft.com/office/word/2006/wordml" xmlns:wps="http://schemas.microsoft.com/office/word/2010/wordprocessingShape" mc:Ignorable="w14 w15 w16se w16cid w16 w16cex w16sdtdh w16du wp14">
+<w:numbering xmlns:wpc="http://schemas.microsoft.com/office/word/2010/wordprocessingCanvas" xmlns:cx="http://schemas.microsoft.com/office/drawing/2014/chartex" xmlns:cx1="http://schemas.microsoft.com/office/drawing/2015/9/8/chartex" xmlns:cx2="http://schemas.microsoft.com/office/drawing/2015/10/21/chartex" xmlns:cx3="http://schemas.microsoft.com/office/drawing/2016/5/9/chartex" xmlns:cx4="http://schemas.microsoft.com/office/drawing/2016/5/10/chartex" xmlns:cx5="http://schemas.microsoft.com/office/drawing/2016/5/11/chartex" xmlns:cx6="http://schemas.microsoft.com/office/drawing/2016/5/12/chartex" xmlns:cx7="http://schemas.microsoft.com/office/drawing/2016/5/13/chartex" xmlns:cx8="http://schemas.microsoft.com/office/drawing/2016/5/14/chartex" xmlns:mc="http://schemas.openxmlformats.org/markup-compatibility/2006" xmlns:aink="http://schemas.microsoft.com/office/drawing/2016/ink" xmlns:am3d="http://schemas.microsoft.com/office/drawing/2017/model3d" xmlns:o="urn:schemas-microsoft-com:office:office" xmlns:oel="http://schemas.microsoft.com/office/2019/extlst" xmlns:r="http://schemas.openxmlformats.org/officeDocument/2006/relationships" xmlns:m="http://schemas.openxmlformats.org/officeDocument/2006/math" xmlns:v="urn:schemas-microsoft-com:vml" xmlns:wp14="http://schemas.microsoft.com/office/word/2010/wordprocessingDrawing" xmlns:wp="http://schemas.openxmlformats.org/drawingml/2006/wordprocessingDrawing" xmlns:w10="urn:schemas-microsoft-com:office:word" xmlns:w="http://schemas.openxmlformats.org/wordprocessingml/2006/main" xmlns:w14="http://schemas.microsoft.com/office/word/2010/wordml" xmlns:w15="http://schemas.microsoft.com/office/word/2012/wordml" xmlns:w16cex="http://schemas.microsoft.com/office/word/2018/wordml/cex" xmlns:w16cid="http://schemas.microsoft.com/office/word/2016/wordml/cid" xmlns:w16="http://schemas.microsoft.com/office/word/2018/wordml" xmlns:w16du="http://schemas.microsoft.com/office/word/2023/wordml/word16du" xmlns:w16sdtdh="http://schemas.microsoft.com/office/word/2020/wordml/sdtdatahash" xmlns:w16sdtfl="http://schemas.microsoft.com/office/word/2024/wordml/sdtformatlock" xmlns:w16se="http://schemas.microsoft.com/office/word/2015/wordml/symex" xmlns:wpg="http://schemas.microsoft.com/office/word/2010/wordprocessingGroup" xmlns:wpi="http://schemas.microsoft.com/office/word/2010/wordprocessingInk" xmlns:wne="http://schemas.microsoft.com/office/word/2006/wordml" xmlns:wps="http://schemas.microsoft.com/office/word/2010/wordprocessingShape" mc:Ignorable="w14 w15 w16se w16cid w16 w16cex w16sdtdh w16sdtfl w16du wp14">
   <w:abstractNum w:abstractNumId="0" w15:restartNumberingAfterBreak="0">
     <w:nsid w:val="365815B3"/>
     <w:multiLevelType w:val="hybridMultilevel"/>
@@ -8040,7 +8333,7 @@
 </file>
 
 <file path=word/styles.xml><?xml version="1.0" encoding="utf-8"?>
-<w:styles xmlns:mc="http://schemas.openxmlformats.org/markup-compatibility/2006" xmlns:r="http://schemas.openxmlformats.org/officeDocument/2006/relationships" xmlns:w="http://schemas.openxmlformats.org/wordprocessingml/2006/main" xmlns:w14="http://schemas.microsoft.com/office/word/2010/wordml" xmlns:w15="http://schemas.microsoft.com/office/word/2012/wordml" xmlns:w16cex="http://schemas.microsoft.com/office/word/2018/wordml/cex" xmlns:w16cid="http://schemas.microsoft.com/office/word/2016/wordml/cid" xmlns:w16="http://schemas.microsoft.com/office/word/2018/wordml" xmlns:w16du="http://schemas.microsoft.com/office/word/2023/wordml/word16du" xmlns:w16sdtdh="http://schemas.microsoft.com/office/word/2020/wordml/sdtdatahash" xmlns:w16se="http://schemas.microsoft.com/office/word/2015/wordml/symex" mc:Ignorable="w14 w15 w16se w16cid w16 w16cex w16sdtdh w16du">
+<w:styles xmlns:mc="http://schemas.openxmlformats.org/markup-compatibility/2006" xmlns:r="http://schemas.openxmlformats.org/officeDocument/2006/relationships" xmlns:w="http://schemas.openxmlformats.org/wordprocessingml/2006/main" xmlns:w14="http://schemas.microsoft.com/office/word/2010/wordml" xmlns:w15="http://schemas.microsoft.com/office/word/2012/wordml" xmlns:w16cex="http://schemas.microsoft.com/office/word/2018/wordml/cex" xmlns:w16cid="http://schemas.microsoft.com/office/word/2016/wordml/cid" xmlns:w16="http://schemas.microsoft.com/office/word/2018/wordml" xmlns:w16du="http://schemas.microsoft.com/office/word/2023/wordml/word16du" xmlns:w16sdtdh="http://schemas.microsoft.com/office/word/2020/wordml/sdtdatahash" xmlns:w16sdtfl="http://schemas.microsoft.com/office/word/2024/wordml/sdtformatlock" xmlns:w16se="http://schemas.microsoft.com/office/word/2015/wordml/symex" mc:Ignorable="w14 w15 w16se w16cid w16 w16cex w16sdtdh w16sdtfl w16du">
   <w:docDefaults>
     <w:rPrDefault>
       <w:rPr>
@@ -8439,7 +8732,7 @@
   <w:style w:type="paragraph" w:default="1" w:styleId="Normal">
     <w:name w:val="Normal"/>
     <w:qFormat/>
-    <w:rsid w:val="00BC3AC5"/>
+    <w:rsid w:val="00A8658D"/>
   </w:style>
   <w:style w:type="paragraph" w:styleId="Heading1">
     <w:name w:val="heading 1"/>
@@ -8640,7 +8933,6 @@
   <w:style w:type="character" w:default="1" w:styleId="DefaultParagraphFont">
     <w:name w:val="Default Paragraph Font"/>
     <w:uiPriority w:val="1"/>
-    <w:semiHidden/>
     <w:unhideWhenUsed/>
   </w:style>
   <w:style w:type="table" w:default="1" w:styleId="TableNormal">

</xml_diff>

<commit_message>
chore: results extended with lower sampling rates
</commit_message>
<xml_diff>
--- a/docs/Thesis.docx
+++ b/docs/Thesis.docx
@@ -3589,24 +3589,48 @@
                 <w:szCs w:val="22"/>
                 <w:lang w:eastAsia="en-GB"/>
               </w:rPr>
-              <w:t>90.8109%</w:t>
-            </w:r>
-          </w:p>
-          <w:p>
-            <w:pPr>
-              <w:rPr>
-                <w:sz w:val="22"/>
-                <w:szCs w:val="22"/>
-                <w:lang w:eastAsia="en-GB"/>
-              </w:rPr>
-            </w:pPr>
-            <w:r>
-              <w:rPr>
-                <w:sz w:val="22"/>
-                <w:szCs w:val="22"/>
-                <w:lang w:eastAsia="en-GB"/>
-              </w:rPr>
-              <w:t>Response time: ~0.28950ms</w:t>
+              <w:t>97.6104</w:t>
+            </w:r>
+            <w:r>
+              <w:rPr>
+                <w:sz w:val="22"/>
+                <w:szCs w:val="22"/>
+                <w:lang w:eastAsia="en-GB"/>
+              </w:rPr>
+              <w:t>%</w:t>
+            </w:r>
+          </w:p>
+          <w:p>
+            <w:pPr>
+              <w:rPr>
+                <w:sz w:val="22"/>
+                <w:szCs w:val="22"/>
+                <w:lang w:eastAsia="en-GB"/>
+              </w:rPr>
+            </w:pPr>
+            <w:r>
+              <w:rPr>
+                <w:sz w:val="22"/>
+                <w:szCs w:val="22"/>
+                <w:lang w:eastAsia="en-GB"/>
+              </w:rPr>
+              <w:t>Response time: ~</w:t>
+            </w:r>
+            <w:r>
+              <w:rPr>
+                <w:sz w:val="22"/>
+                <w:szCs w:val="22"/>
+                <w:lang w:eastAsia="en-GB"/>
+              </w:rPr>
+              <w:t>0.50997</w:t>
+            </w:r>
+            <w:r>
+              <w:rPr>
+                <w:sz w:val="22"/>
+                <w:szCs w:val="22"/>
+                <w:lang w:eastAsia="en-GB"/>
+              </w:rPr>
+              <w:t>ms</w:t>
             </w:r>
           </w:p>
           <w:p>
@@ -7131,7 +7155,6 @@
     </w:p>
     <w:p>
       <w:pPr>
-        <w:pStyle w:val="Heading3"/>
         <w:rPr>
           <w:lang w:eastAsia="en-GB"/>
         </w:rPr>
@@ -7141,19 +7164,6 @@
           <w:lang w:eastAsia="en-GB"/>
         </w:rPr>
         <w:lastRenderedPageBreak/>
-        <w:t>Model diagrams</w:t>
-      </w:r>
-    </w:p>
-    <w:p>
-      <w:pPr>
-        <w:rPr>
-          <w:lang w:eastAsia="en-GB"/>
-        </w:rPr>
-      </w:pPr>
-      <w:r>
-        <w:rPr>
-          <w:lang w:eastAsia="en-GB"/>
-        </w:rPr>
         <w:t xml:space="preserve">Using the </w:t>
       </w:r>
       <w:proofErr w:type="spellStart"/>
@@ -7169,6 +7179,12 @@
           <w:lang w:eastAsia="en-GB"/>
         </w:rPr>
         <w:t xml:space="preserve"> library I have visualised the three chosen models for classification and what their corresponding weights are after training</w:t>
+      </w:r>
+      <w:r>
+        <w:rPr>
+          <w:lang w:eastAsia="en-GB"/>
+        </w:rPr>
+        <w:t xml:space="preserve"> (for 32 samples per sequence).</w:t>
       </w:r>
     </w:p>
     <w:tbl>
@@ -7262,6 +7278,7 @@
             </w:pPr>
             <w:r>
               <w:rPr>
+                <w:noProof/>
                 <w:lang w:eastAsia="en-GB"/>
               </w:rPr>
               <w:drawing>
@@ -7347,6 +7364,7 @@
             </w:pPr>
             <w:r>
               <w:rPr>
+                <w:noProof/>
                 <w:lang w:eastAsia="en-GB"/>
               </w:rPr>
               <w:drawing>
@@ -7420,6 +7438,9 @@
               <w:ind w:left="720" w:hanging="720"/>
             </w:pPr>
             <w:r>
+              <w:rPr>
+                <w:noProof/>
+              </w:rPr>
               <w:drawing>
                 <wp:inline distT="0" distB="0" distL="0" distR="0" wp14:anchorId="2FFE1161" wp14:editId="1CEA340D">
                   <wp:extent cx="3240000" cy="4156437"/>
@@ -7488,6 +7509,4583 @@
     </w:p>
     <w:p>
       <w:pPr>
+        <w:pStyle w:val="Heading3"/>
+        <w:rPr>
+          <w:lang w:eastAsia="en-GB"/>
+        </w:rPr>
+      </w:pPr>
+      <w:r>
+        <w:rPr>
+          <w:lang w:eastAsia="en-GB"/>
+        </w:rPr>
+        <w:lastRenderedPageBreak/>
+        <w:t xml:space="preserve">64 samples using every </w:t>
+      </w:r>
+      <w:r>
+        <w:rPr>
+          <w:lang w:eastAsia="en-GB"/>
+        </w:rPr>
+        <w:t>2</w:t>
+      </w:r>
+      <w:r>
+        <w:rPr>
+          <w:vertAlign w:val="superscript"/>
+          <w:lang w:eastAsia="en-GB"/>
+        </w:rPr>
+        <w:t>nd</w:t>
+      </w:r>
+      <w:r>
+        <w:rPr>
+          <w:lang w:eastAsia="en-GB"/>
+        </w:rPr>
+        <w:t xml:space="preserve"> sample</w:t>
+      </w:r>
+    </w:p>
+    <w:p>
+      <w:pPr>
+        <w:rPr>
+          <w:lang w:eastAsia="en-GB"/>
+        </w:rPr>
+      </w:pPr>
+      <w:r>
+        <w:rPr>
+          <w:lang w:eastAsia="en-GB"/>
+        </w:rPr>
+        <w:t xml:space="preserve">To also test on lower sampling rates sequence of </w:t>
+      </w:r>
+      <w:r>
+        <w:rPr>
+          <w:lang w:eastAsia="en-GB"/>
+        </w:rPr>
+        <w:t xml:space="preserve">128 </w:t>
+      </w:r>
+      <w:r>
+        <w:rPr>
+          <w:lang w:eastAsia="en-GB"/>
+        </w:rPr>
+        <w:t xml:space="preserve">sequence length were generated and then every </w:t>
+      </w:r>
+      <w:r>
+        <w:rPr>
+          <w:lang w:eastAsia="en-GB"/>
+        </w:rPr>
+        <w:t>2</w:t>
+      </w:r>
+      <w:r>
+        <w:rPr>
+          <w:vertAlign w:val="superscript"/>
+          <w:lang w:eastAsia="en-GB"/>
+        </w:rPr>
+        <w:t>nd</w:t>
+      </w:r>
+      <w:r>
+        <w:rPr>
+          <w:lang w:eastAsia="en-GB"/>
+        </w:rPr>
+        <w:t xml:space="preserve"> </w:t>
+      </w:r>
+      <w:r>
+        <w:rPr>
+          <w:lang w:eastAsia="en-GB"/>
+        </w:rPr>
+        <w:t xml:space="preserve">sample was taken simulating a sequence that is 64 samples long with a sampling rate that is </w:t>
+      </w:r>
+      <w:r>
+        <w:rPr>
+          <w:lang w:eastAsia="en-GB"/>
+        </w:rPr>
+        <w:t>50</w:t>
+      </w:r>
+      <w:r>
+        <w:rPr>
+          <w:lang w:eastAsia="en-GB"/>
+        </w:rPr>
+        <w:t>% of the original sampling rate.</w:t>
+      </w:r>
+    </w:p>
+    <w:tbl>
+      <w:tblPr>
+        <w:tblStyle w:val="TableGrid"/>
+        <w:tblW w:w="10060" w:type="dxa"/>
+        <w:tblLook w:val="04A0" w:firstRow="1" w:lastRow="0" w:firstColumn="1" w:lastColumn="0" w:noHBand="0" w:noVBand="1"/>
+      </w:tblPr>
+      <w:tblGrid>
+        <w:gridCol w:w="1604"/>
+        <w:gridCol w:w="5318"/>
+        <w:gridCol w:w="3138"/>
+      </w:tblGrid>
+      <w:tr>
+        <w:tc>
+          <w:tcPr>
+            <w:tcW w:w="1621" w:type="dxa"/>
+          </w:tcPr>
+          <w:p>
+            <w:pPr>
+              <w:rPr>
+                <w:b/>
+                <w:bCs/>
+                <w:lang w:eastAsia="en-GB"/>
+              </w:rPr>
+            </w:pPr>
+            <w:r>
+              <w:rPr>
+                <w:b/>
+                <w:bCs/>
+                <w:lang w:eastAsia="en-GB"/>
+              </w:rPr>
+              <w:t>Model</w:t>
+            </w:r>
+          </w:p>
+        </w:tc>
+        <w:tc>
+          <w:tcPr>
+            <w:tcW w:w="4751" w:type="dxa"/>
+          </w:tcPr>
+          <w:p>
+            <w:pPr>
+              <w:rPr>
+                <w:b/>
+                <w:bCs/>
+                <w:lang w:eastAsia="en-GB"/>
+              </w:rPr>
+            </w:pPr>
+            <w:r>
+              <w:rPr>
+                <w:b/>
+                <w:bCs/>
+                <w:lang w:eastAsia="en-GB"/>
+              </w:rPr>
+              <w:t>Graph</w:t>
+            </w:r>
+          </w:p>
+        </w:tc>
+        <w:tc>
+          <w:tcPr>
+            <w:tcW w:w="3688" w:type="dxa"/>
+          </w:tcPr>
+          <w:p>
+            <w:pPr>
+              <w:rPr>
+                <w:b/>
+                <w:bCs/>
+                <w:lang w:eastAsia="en-GB"/>
+              </w:rPr>
+            </w:pPr>
+            <w:r>
+              <w:rPr>
+                <w:b/>
+                <w:bCs/>
+                <w:lang w:eastAsia="en-GB"/>
+              </w:rPr>
+              <w:t>Statistics</w:t>
+            </w:r>
+          </w:p>
+        </w:tc>
+      </w:tr>
+      <w:tr>
+        <w:tc>
+          <w:tcPr>
+            <w:tcW w:w="1621" w:type="dxa"/>
+          </w:tcPr>
+          <w:p>
+            <w:pPr>
+              <w:rPr>
+                <w:sz w:val="22"/>
+                <w:szCs w:val="22"/>
+                <w:lang w:eastAsia="en-GB"/>
+              </w:rPr>
+            </w:pPr>
+            <w:r>
+              <w:rPr>
+                <w:sz w:val="22"/>
+                <w:szCs w:val="22"/>
+                <w:lang w:eastAsia="en-GB"/>
+              </w:rPr>
+              <w:t>Convolutional model</w:t>
+            </w:r>
+          </w:p>
+        </w:tc>
+        <w:tc>
+          <w:tcPr>
+            <w:tcW w:w="4751" w:type="dxa"/>
+          </w:tcPr>
+          <w:p>
+            <w:pPr>
+              <w:rPr>
+                <w:lang w:eastAsia="en-GB"/>
+              </w:rPr>
+            </w:pPr>
+            <w:r>
+              <w:rPr>
+                <w:lang w:eastAsia="en-GB"/>
+              </w:rPr>
+              <w:drawing>
+                <wp:inline distT="0" distB="0" distL="0" distR="0" wp14:anchorId="4E4DC94E" wp14:editId="062E6933">
+                  <wp:extent cx="3240000" cy="2430179"/>
+                  <wp:effectExtent l="0" t="0" r="0" b="8255"/>
+                  <wp:docPr id="1880724798" name="Picture 1"/>
+                  <wp:cNvGraphicFramePr>
+                    <a:graphicFrameLocks xmlns:a="http://schemas.openxmlformats.org/drawingml/2006/main" noChangeAspect="1"/>
+                  </wp:cNvGraphicFramePr>
+                  <a:graphic xmlns:a="http://schemas.openxmlformats.org/drawingml/2006/main">
+                    <a:graphicData uri="http://schemas.openxmlformats.org/drawingml/2006/picture">
+                      <pic:pic xmlns:pic="http://schemas.openxmlformats.org/drawingml/2006/picture">
+                        <pic:nvPicPr>
+                          <pic:cNvPr id="1880724798" name=""/>
+                          <pic:cNvPicPr/>
+                        </pic:nvPicPr>
+                        <pic:blipFill>
+                          <a:blip r:embed="rId42"/>
+                          <a:stretch>
+                            <a:fillRect/>
+                          </a:stretch>
+                        </pic:blipFill>
+                        <pic:spPr>
+                          <a:xfrm>
+                            <a:off x="0" y="0"/>
+                            <a:ext cx="3240000" cy="2430179"/>
+                          </a:xfrm>
+                          <a:prstGeom prst="rect">
+                            <a:avLst/>
+                          </a:prstGeom>
+                        </pic:spPr>
+                      </pic:pic>
+                    </a:graphicData>
+                  </a:graphic>
+                </wp:inline>
+              </w:drawing>
+            </w:r>
+          </w:p>
+        </w:tc>
+        <w:tc>
+          <w:tcPr>
+            <w:tcW w:w="3688" w:type="dxa"/>
+          </w:tcPr>
+          <w:p>
+            <w:pPr>
+              <w:rPr>
+                <w:sz w:val="22"/>
+                <w:szCs w:val="22"/>
+                <w:lang w:eastAsia="en-GB"/>
+              </w:rPr>
+            </w:pPr>
+            <w:r>
+              <w:rPr>
+                <w:sz w:val="22"/>
+                <w:szCs w:val="22"/>
+                <w:lang w:eastAsia="en-GB"/>
+              </w:rPr>
+              <w:t xml:space="preserve">Accuracy: </w:t>
+            </w:r>
+            <w:r>
+              <w:rPr>
+                <w:sz w:val="22"/>
+                <w:szCs w:val="22"/>
+                <w:lang w:eastAsia="en-GB"/>
+              </w:rPr>
+              <w:t>~</w:t>
+            </w:r>
+            <w:r>
+              <w:rPr>
+                <w:sz w:val="22"/>
+                <w:szCs w:val="22"/>
+                <w:lang w:eastAsia="en-GB"/>
+              </w:rPr>
+              <w:t>67.3</w:t>
+            </w:r>
+            <w:r>
+              <w:rPr>
+                <w:sz w:val="22"/>
+                <w:szCs w:val="22"/>
+                <w:lang w:eastAsia="en-GB"/>
+              </w:rPr>
+              <w:t>28</w:t>
+            </w:r>
+            <w:r>
+              <w:rPr>
+                <w:sz w:val="22"/>
+                <w:szCs w:val="22"/>
+                <w:lang w:eastAsia="en-GB"/>
+              </w:rPr>
+              <w:t>%</w:t>
+            </w:r>
+          </w:p>
+          <w:p>
+            <w:pPr>
+              <w:rPr>
+                <w:sz w:val="22"/>
+                <w:szCs w:val="22"/>
+                <w:lang w:eastAsia="en-GB"/>
+              </w:rPr>
+            </w:pPr>
+            <w:r>
+              <w:rPr>
+                <w:sz w:val="22"/>
+                <w:szCs w:val="22"/>
+                <w:lang w:eastAsia="en-GB"/>
+              </w:rPr>
+              <w:t>Response time: ~</w:t>
+            </w:r>
+            <w:r>
+              <w:rPr>
+                <w:sz w:val="22"/>
+                <w:szCs w:val="22"/>
+                <w:lang w:eastAsia="en-GB"/>
+              </w:rPr>
+              <w:t>0.46888</w:t>
+            </w:r>
+            <w:r>
+              <w:rPr>
+                <w:sz w:val="22"/>
+                <w:szCs w:val="22"/>
+                <w:lang w:eastAsia="en-GB"/>
+              </w:rPr>
+              <w:t>ms</w:t>
+            </w:r>
+          </w:p>
+          <w:p>
+            <w:pPr>
+              <w:rPr>
+                <w:sz w:val="22"/>
+                <w:szCs w:val="22"/>
+                <w:lang w:eastAsia="en-GB"/>
+              </w:rPr>
+            </w:pPr>
+            <w:r>
+              <w:rPr>
+                <w:sz w:val="22"/>
+                <w:szCs w:val="22"/>
+                <w:lang w:eastAsia="en-GB"/>
+              </w:rPr>
+              <w:t>Training time: ~</w:t>
+            </w:r>
+            <w:r>
+              <w:rPr>
+                <w:sz w:val="22"/>
+                <w:szCs w:val="22"/>
+                <w:lang w:eastAsia="en-GB"/>
+              </w:rPr>
+              <w:t>605.9</w:t>
+            </w:r>
+            <w:r>
+              <w:rPr>
+                <w:sz w:val="22"/>
+                <w:szCs w:val="22"/>
+                <w:lang w:eastAsia="en-GB"/>
+              </w:rPr>
+              <w:t>40</w:t>
+            </w:r>
+            <w:r>
+              <w:rPr>
+                <w:sz w:val="22"/>
+                <w:szCs w:val="22"/>
+                <w:lang w:eastAsia="en-GB"/>
+              </w:rPr>
+              <w:t>s (20 epochs)</w:t>
+            </w:r>
+          </w:p>
+        </w:tc>
+      </w:tr>
+      <w:tr>
+        <w:tc>
+          <w:tcPr>
+            <w:tcW w:w="1621" w:type="dxa"/>
+          </w:tcPr>
+          <w:p>
+            <w:pPr>
+              <w:rPr>
+                <w:sz w:val="22"/>
+                <w:szCs w:val="22"/>
+                <w:lang w:eastAsia="en-GB"/>
+              </w:rPr>
+            </w:pPr>
+            <w:r>
+              <w:rPr>
+                <w:sz w:val="22"/>
+                <w:szCs w:val="22"/>
+                <w:lang w:eastAsia="en-GB"/>
+              </w:rPr>
+              <w:t xml:space="preserve">Convolutional </w:t>
+            </w:r>
+            <w:r>
+              <w:rPr>
+                <w:sz w:val="22"/>
+                <w:szCs w:val="22"/>
+                <w:lang w:eastAsia="en-GB"/>
+              </w:rPr>
+              <w:t>SVM</w:t>
+            </w:r>
+          </w:p>
+        </w:tc>
+        <w:tc>
+          <w:tcPr>
+            <w:tcW w:w="4751" w:type="dxa"/>
+          </w:tcPr>
+          <w:p>
+            <w:pPr>
+              <w:rPr>
+                <w:lang w:eastAsia="en-GB"/>
+              </w:rPr>
+            </w:pPr>
+            <w:r>
+              <w:rPr>
+                <w:lang w:eastAsia="en-GB"/>
+              </w:rPr>
+              <w:drawing>
+                <wp:inline distT="0" distB="0" distL="0" distR="0" wp14:anchorId="49E211ED" wp14:editId="3D3A5D62">
+                  <wp:extent cx="3240000" cy="2430179"/>
+                  <wp:effectExtent l="0" t="0" r="0" b="8255"/>
+                  <wp:docPr id="1678034480" name="Picture 1"/>
+                  <wp:cNvGraphicFramePr>
+                    <a:graphicFrameLocks xmlns:a="http://schemas.openxmlformats.org/drawingml/2006/main" noChangeAspect="1"/>
+                  </wp:cNvGraphicFramePr>
+                  <a:graphic xmlns:a="http://schemas.openxmlformats.org/drawingml/2006/main">
+                    <a:graphicData uri="http://schemas.openxmlformats.org/drawingml/2006/picture">
+                      <pic:pic xmlns:pic="http://schemas.openxmlformats.org/drawingml/2006/picture">
+                        <pic:nvPicPr>
+                          <pic:cNvPr id="1678034480" name=""/>
+                          <pic:cNvPicPr/>
+                        </pic:nvPicPr>
+                        <pic:blipFill>
+                          <a:blip r:embed="rId43"/>
+                          <a:stretch>
+                            <a:fillRect/>
+                          </a:stretch>
+                        </pic:blipFill>
+                        <pic:spPr>
+                          <a:xfrm>
+                            <a:off x="0" y="0"/>
+                            <a:ext cx="3240000" cy="2430179"/>
+                          </a:xfrm>
+                          <a:prstGeom prst="rect">
+                            <a:avLst/>
+                          </a:prstGeom>
+                        </pic:spPr>
+                      </pic:pic>
+                    </a:graphicData>
+                  </a:graphic>
+                </wp:inline>
+              </w:drawing>
+            </w:r>
+          </w:p>
+        </w:tc>
+        <w:tc>
+          <w:tcPr>
+            <w:tcW w:w="3688" w:type="dxa"/>
+          </w:tcPr>
+          <w:p>
+            <w:pPr>
+              <w:rPr>
+                <w:sz w:val="22"/>
+                <w:szCs w:val="22"/>
+                <w:lang w:eastAsia="en-GB"/>
+              </w:rPr>
+            </w:pPr>
+            <w:r>
+              <w:rPr>
+                <w:sz w:val="22"/>
+                <w:szCs w:val="22"/>
+                <w:lang w:eastAsia="en-GB"/>
+              </w:rPr>
+              <w:t xml:space="preserve">Accuracy: </w:t>
+            </w:r>
+            <w:r>
+              <w:rPr>
+                <w:sz w:val="22"/>
+                <w:szCs w:val="22"/>
+                <w:lang w:eastAsia="en-GB"/>
+              </w:rPr>
+              <w:t>~</w:t>
+            </w:r>
+            <w:r>
+              <w:rPr>
+                <w:sz w:val="22"/>
+                <w:szCs w:val="22"/>
+                <w:lang w:eastAsia="en-GB"/>
+              </w:rPr>
+              <w:t>77.8</w:t>
+            </w:r>
+            <w:r>
+              <w:rPr>
+                <w:sz w:val="22"/>
+                <w:szCs w:val="22"/>
+                <w:lang w:eastAsia="en-GB"/>
+              </w:rPr>
+              <w:t>60</w:t>
+            </w:r>
+            <w:r>
+              <w:rPr>
+                <w:sz w:val="22"/>
+                <w:szCs w:val="22"/>
+                <w:lang w:eastAsia="en-GB"/>
+              </w:rPr>
+              <w:t>%</w:t>
+            </w:r>
+          </w:p>
+          <w:p>
+            <w:pPr>
+              <w:rPr>
+                <w:sz w:val="22"/>
+                <w:szCs w:val="22"/>
+                <w:lang w:eastAsia="en-GB"/>
+              </w:rPr>
+            </w:pPr>
+            <w:r>
+              <w:rPr>
+                <w:sz w:val="22"/>
+                <w:szCs w:val="22"/>
+                <w:lang w:eastAsia="en-GB"/>
+              </w:rPr>
+              <w:t>Response time: ~</w:t>
+            </w:r>
+            <w:r>
+              <w:rPr>
+                <w:sz w:val="22"/>
+                <w:szCs w:val="22"/>
+                <w:lang w:eastAsia="en-GB"/>
+              </w:rPr>
+              <w:t>1.27068</w:t>
+            </w:r>
+            <w:r>
+              <w:rPr>
+                <w:sz w:val="22"/>
+                <w:szCs w:val="22"/>
+                <w:lang w:eastAsia="en-GB"/>
+              </w:rPr>
+              <w:t>ms</w:t>
+            </w:r>
+          </w:p>
+          <w:p>
+            <w:pPr>
+              <w:rPr>
+                <w:sz w:val="22"/>
+                <w:szCs w:val="22"/>
+                <w:lang w:eastAsia="en-GB"/>
+              </w:rPr>
+            </w:pPr>
+            <w:r>
+              <w:rPr>
+                <w:sz w:val="22"/>
+                <w:szCs w:val="22"/>
+                <w:lang w:eastAsia="en-GB"/>
+              </w:rPr>
+              <w:t>Training time: ~</w:t>
+            </w:r>
+            <w:r>
+              <w:rPr>
+                <w:sz w:val="22"/>
+                <w:szCs w:val="22"/>
+                <w:lang w:eastAsia="en-GB"/>
+              </w:rPr>
+              <w:t>607.51</w:t>
+            </w:r>
+            <w:r>
+              <w:rPr>
+                <w:sz w:val="22"/>
+                <w:szCs w:val="22"/>
+                <w:lang w:eastAsia="en-GB"/>
+              </w:rPr>
+              <w:t>7</w:t>
+            </w:r>
+            <w:r>
+              <w:rPr>
+                <w:sz w:val="22"/>
+                <w:szCs w:val="22"/>
+                <w:lang w:eastAsia="en-GB"/>
+              </w:rPr>
+              <w:t>s (20 epochs)</w:t>
+            </w:r>
+          </w:p>
+        </w:tc>
+      </w:tr>
+      <w:tr>
+        <w:tc>
+          <w:tcPr>
+            <w:tcW w:w="1621" w:type="dxa"/>
+          </w:tcPr>
+          <w:p>
+            <w:pPr>
+              <w:rPr>
+                <w:sz w:val="22"/>
+                <w:szCs w:val="22"/>
+                <w:lang w:eastAsia="en-GB"/>
+              </w:rPr>
+            </w:pPr>
+            <w:r>
+              <w:rPr>
+                <w:sz w:val="22"/>
+                <w:szCs w:val="22"/>
+                <w:lang w:eastAsia="en-GB"/>
+              </w:rPr>
+              <w:t>FFT linear model</w:t>
+            </w:r>
+          </w:p>
+        </w:tc>
+        <w:tc>
+          <w:tcPr>
+            <w:tcW w:w="4751" w:type="dxa"/>
+          </w:tcPr>
+          <w:p>
+            <w:r>
+              <w:drawing>
+                <wp:inline distT="0" distB="0" distL="0" distR="0" wp14:anchorId="616D99CA" wp14:editId="42773247">
+                  <wp:extent cx="3240000" cy="2430180"/>
+                  <wp:effectExtent l="0" t="0" r="0" b="8255"/>
+                  <wp:docPr id="1084864576" name="Picture 1"/>
+                  <wp:cNvGraphicFramePr>
+                    <a:graphicFrameLocks xmlns:a="http://schemas.openxmlformats.org/drawingml/2006/main" noChangeAspect="1"/>
+                  </wp:cNvGraphicFramePr>
+                  <a:graphic xmlns:a="http://schemas.openxmlformats.org/drawingml/2006/main">
+                    <a:graphicData uri="http://schemas.openxmlformats.org/drawingml/2006/picture">
+                      <pic:pic xmlns:pic="http://schemas.openxmlformats.org/drawingml/2006/picture">
+                        <pic:nvPicPr>
+                          <pic:cNvPr id="1084864576" name=""/>
+                          <pic:cNvPicPr/>
+                        </pic:nvPicPr>
+                        <pic:blipFill>
+                          <a:blip r:embed="rId44"/>
+                          <a:stretch>
+                            <a:fillRect/>
+                          </a:stretch>
+                        </pic:blipFill>
+                        <pic:spPr>
+                          <a:xfrm>
+                            <a:off x="0" y="0"/>
+                            <a:ext cx="3240000" cy="2430180"/>
+                          </a:xfrm>
+                          <a:prstGeom prst="rect">
+                            <a:avLst/>
+                          </a:prstGeom>
+                        </pic:spPr>
+                      </pic:pic>
+                    </a:graphicData>
+                  </a:graphic>
+                </wp:inline>
+              </w:drawing>
+            </w:r>
+          </w:p>
+        </w:tc>
+        <w:tc>
+          <w:tcPr>
+            <w:tcW w:w="3688" w:type="dxa"/>
+          </w:tcPr>
+          <w:p>
+            <w:pPr>
+              <w:rPr>
+                <w:sz w:val="22"/>
+                <w:szCs w:val="22"/>
+                <w:lang w:eastAsia="en-GB"/>
+              </w:rPr>
+            </w:pPr>
+            <w:r>
+              <w:rPr>
+                <w:sz w:val="22"/>
+                <w:szCs w:val="22"/>
+                <w:lang w:eastAsia="en-GB"/>
+              </w:rPr>
+              <w:t xml:space="preserve">Accuracy: </w:t>
+            </w:r>
+            <w:r>
+              <w:rPr>
+                <w:sz w:val="22"/>
+                <w:szCs w:val="22"/>
+                <w:lang w:eastAsia="en-GB"/>
+              </w:rPr>
+              <w:t>~</w:t>
+            </w:r>
+            <w:r>
+              <w:rPr>
+                <w:sz w:val="22"/>
+                <w:szCs w:val="22"/>
+                <w:lang w:eastAsia="en-GB"/>
+              </w:rPr>
+              <w:t>73.897</w:t>
+            </w:r>
+            <w:r>
+              <w:rPr>
+                <w:sz w:val="22"/>
+                <w:szCs w:val="22"/>
+                <w:lang w:eastAsia="en-GB"/>
+              </w:rPr>
+              <w:t>%</w:t>
+            </w:r>
+          </w:p>
+          <w:p>
+            <w:pPr>
+              <w:rPr>
+                <w:sz w:val="22"/>
+                <w:szCs w:val="22"/>
+                <w:lang w:eastAsia="en-GB"/>
+              </w:rPr>
+            </w:pPr>
+            <w:r>
+              <w:rPr>
+                <w:sz w:val="22"/>
+                <w:szCs w:val="22"/>
+                <w:lang w:eastAsia="en-GB"/>
+              </w:rPr>
+              <w:t>Response time: ~</w:t>
+            </w:r>
+            <w:r>
+              <w:rPr>
+                <w:sz w:val="22"/>
+                <w:szCs w:val="22"/>
+                <w:lang w:eastAsia="en-GB"/>
+              </w:rPr>
+              <w:t>0.4340</w:t>
+            </w:r>
+            <w:r>
+              <w:rPr>
+                <w:sz w:val="22"/>
+                <w:szCs w:val="22"/>
+                <w:lang w:eastAsia="en-GB"/>
+              </w:rPr>
+              <w:t>6</w:t>
+            </w:r>
+            <w:r>
+              <w:rPr>
+                <w:sz w:val="22"/>
+                <w:szCs w:val="22"/>
+                <w:lang w:eastAsia="en-GB"/>
+              </w:rPr>
+              <w:t>ms</w:t>
+            </w:r>
+          </w:p>
+          <w:p>
+            <w:pPr>
+              <w:rPr>
+                <w:sz w:val="22"/>
+                <w:szCs w:val="22"/>
+                <w:lang w:eastAsia="en-GB"/>
+              </w:rPr>
+            </w:pPr>
+            <w:r>
+              <w:rPr>
+                <w:sz w:val="22"/>
+                <w:szCs w:val="22"/>
+                <w:lang w:eastAsia="en-GB"/>
+              </w:rPr>
+              <w:t>Training time: ~</w:t>
+            </w:r>
+            <w:r>
+              <w:rPr>
+                <w:sz w:val="22"/>
+                <w:szCs w:val="22"/>
+                <w:lang w:eastAsia="en-GB"/>
+              </w:rPr>
+              <w:t>461.910</w:t>
+            </w:r>
+            <w:r>
+              <w:rPr>
+                <w:sz w:val="22"/>
+                <w:szCs w:val="22"/>
+                <w:lang w:eastAsia="en-GB"/>
+              </w:rPr>
+              <w:t>s (20 epochs)</w:t>
+            </w:r>
+          </w:p>
+        </w:tc>
+      </w:tr>
+    </w:tbl>
+    <w:p>
+      <w:pPr>
+        <w:rPr>
+          <w:lang w:eastAsia="en-GB"/>
+        </w:rPr>
+      </w:pPr>
+    </w:p>
+    <w:p>
+      <w:pPr>
+        <w:rPr>
+          <w:lang w:eastAsia="en-GB"/>
+        </w:rPr>
+      </w:pPr>
+      <w:r>
+        <w:rPr>
+          <w:lang w:eastAsia="en-GB"/>
+        </w:rPr>
+        <w:lastRenderedPageBreak/>
+        <w:t>Where each model compared, less sequences used again for training (50.000 sequences)</w:t>
+      </w:r>
+    </w:p>
+    <w:tbl>
+      <w:tblPr>
+        <w:tblStyle w:val="PlainTable4"/>
+        <w:tblW w:w="0" w:type="auto"/>
+        <w:tblCellMar>
+          <w:top w:w="57" w:type="dxa"/>
+          <w:bottom w:w="57" w:type="dxa"/>
+        </w:tblCellMar>
+        <w:tblLook w:val="04A0" w:firstRow="1" w:lastRow="0" w:firstColumn="1" w:lastColumn="0" w:noHBand="0" w:noVBand="1"/>
+      </w:tblPr>
+      <w:tblGrid>
+        <w:gridCol w:w="4508"/>
+        <w:gridCol w:w="4508"/>
+      </w:tblGrid>
+      <w:tr>
+        <w:trPr>
+          <w:cnfStyle w:val="100000000000" w:firstRow="1" w:lastRow="0" w:firstColumn="0" w:lastColumn="0" w:oddVBand="0" w:evenVBand="0" w:oddHBand="0" w:evenHBand="0" w:firstRowFirstColumn="0" w:firstRowLastColumn="0" w:lastRowFirstColumn="0" w:lastRowLastColumn="0"/>
+        </w:trPr>
+        <w:tc>
+          <w:tcPr>
+            <w:cnfStyle w:val="001000000000" w:firstRow="0" w:lastRow="0" w:firstColumn="1" w:lastColumn="0" w:oddVBand="0" w:evenVBand="0" w:oddHBand="0" w:evenHBand="0" w:firstRowFirstColumn="0" w:firstRowLastColumn="0" w:lastRowFirstColumn="0" w:lastRowLastColumn="0"/>
+            <w:tcW w:w="4508" w:type="dxa"/>
+          </w:tcPr>
+          <w:p>
+            <w:pPr>
+              <w:rPr>
+                <w:lang w:eastAsia="en-GB"/>
+              </w:rPr>
+            </w:pPr>
+            <w:r>
+              <w:rPr>
+                <w:lang w:eastAsia="en-GB"/>
+              </w:rPr>
+              <w:drawing>
+                <wp:inline distT="0" distB="0" distL="0" distR="0" wp14:anchorId="188EAA73" wp14:editId="74A8E3BA">
+                  <wp:extent cx="2700000" cy="2185943"/>
+                  <wp:effectExtent l="0" t="0" r="5715" b="5080"/>
+                  <wp:docPr id="127421967" name="Picture 1"/>
+                  <wp:cNvGraphicFramePr>
+                    <a:graphicFrameLocks xmlns:a="http://schemas.openxmlformats.org/drawingml/2006/main" noChangeAspect="1"/>
+                  </wp:cNvGraphicFramePr>
+                  <a:graphic xmlns:a="http://schemas.openxmlformats.org/drawingml/2006/main">
+                    <a:graphicData uri="http://schemas.openxmlformats.org/drawingml/2006/picture">
+                      <pic:pic xmlns:pic="http://schemas.openxmlformats.org/drawingml/2006/picture">
+                        <pic:nvPicPr>
+                          <pic:cNvPr id="127421967" name=""/>
+                          <pic:cNvPicPr/>
+                        </pic:nvPicPr>
+                        <pic:blipFill>
+                          <a:blip r:embed="rId45"/>
+                          <a:stretch>
+                            <a:fillRect/>
+                          </a:stretch>
+                        </pic:blipFill>
+                        <pic:spPr>
+                          <a:xfrm>
+                            <a:off x="0" y="0"/>
+                            <a:ext cx="2700000" cy="2185943"/>
+                          </a:xfrm>
+                          <a:prstGeom prst="rect">
+                            <a:avLst/>
+                          </a:prstGeom>
+                        </pic:spPr>
+                      </pic:pic>
+                    </a:graphicData>
+                  </a:graphic>
+                </wp:inline>
+              </w:drawing>
+            </w:r>
+          </w:p>
+        </w:tc>
+        <w:tc>
+          <w:tcPr>
+            <w:tcW w:w="4508" w:type="dxa"/>
+          </w:tcPr>
+          <w:p>
+            <w:pPr>
+              <w:cnfStyle w:val="100000000000" w:firstRow="1" w:lastRow="0" w:firstColumn="0" w:lastColumn="0" w:oddVBand="0" w:evenVBand="0" w:oddHBand="0" w:evenHBand="0" w:firstRowFirstColumn="0" w:firstRowLastColumn="0" w:lastRowFirstColumn="0" w:lastRowLastColumn="0"/>
+              <w:rPr>
+                <w:lang w:eastAsia="en-GB"/>
+              </w:rPr>
+            </w:pPr>
+            <w:r>
+              <w:rPr>
+                <w:lang w:eastAsia="en-GB"/>
+              </w:rPr>
+              <w:drawing>
+                <wp:inline distT="0" distB="0" distL="0" distR="0" wp14:anchorId="11B9C5EF" wp14:editId="59B58FB5">
+                  <wp:extent cx="2700000" cy="2151489"/>
+                  <wp:effectExtent l="0" t="0" r="5715" b="1270"/>
+                  <wp:docPr id="922940191" name="Picture 1"/>
+                  <wp:cNvGraphicFramePr>
+                    <a:graphicFrameLocks xmlns:a="http://schemas.openxmlformats.org/drawingml/2006/main" noChangeAspect="1"/>
+                  </wp:cNvGraphicFramePr>
+                  <a:graphic xmlns:a="http://schemas.openxmlformats.org/drawingml/2006/main">
+                    <a:graphicData uri="http://schemas.openxmlformats.org/drawingml/2006/picture">
+                      <pic:pic xmlns:pic="http://schemas.openxmlformats.org/drawingml/2006/picture">
+                        <pic:nvPicPr>
+                          <pic:cNvPr id="922940191" name=""/>
+                          <pic:cNvPicPr/>
+                        </pic:nvPicPr>
+                        <pic:blipFill>
+                          <a:blip r:embed="rId46"/>
+                          <a:stretch>
+                            <a:fillRect/>
+                          </a:stretch>
+                        </pic:blipFill>
+                        <pic:spPr>
+                          <a:xfrm>
+                            <a:off x="0" y="0"/>
+                            <a:ext cx="2700000" cy="2151489"/>
+                          </a:xfrm>
+                          <a:prstGeom prst="rect">
+                            <a:avLst/>
+                          </a:prstGeom>
+                        </pic:spPr>
+                      </pic:pic>
+                    </a:graphicData>
+                  </a:graphic>
+                </wp:inline>
+              </w:drawing>
+            </w:r>
+          </w:p>
+        </w:tc>
+      </w:tr>
+      <w:tr>
+        <w:trPr>
+          <w:cnfStyle w:val="000000100000" w:firstRow="0" w:lastRow="0" w:firstColumn="0" w:lastColumn="0" w:oddVBand="0" w:evenVBand="0" w:oddHBand="1" w:evenHBand="0" w:firstRowFirstColumn="0" w:firstRowLastColumn="0" w:lastRowFirstColumn="0" w:lastRowLastColumn="0"/>
+        </w:trPr>
+        <w:tc>
+          <w:tcPr>
+            <w:cnfStyle w:val="001000000000" w:firstRow="0" w:lastRow="0" w:firstColumn="1" w:lastColumn="0" w:oddVBand="0" w:evenVBand="0" w:oddHBand="0" w:evenHBand="0" w:firstRowFirstColumn="0" w:firstRowLastColumn="0" w:lastRowFirstColumn="0" w:lastRowLastColumn="0"/>
+            <w:tcW w:w="4508" w:type="dxa"/>
+          </w:tcPr>
+          <w:p>
+            <w:pPr>
+              <w:rPr>
+                <w:b w:val="0"/>
+                <w:bCs w:val="0"/>
+                <w:lang w:eastAsia="en-GB"/>
+              </w:rPr>
+            </w:pPr>
+            <w:r>
+              <w:rPr>
+                <w:b w:val="0"/>
+                <w:bCs w:val="0"/>
+                <w:lang w:eastAsia="en-GB"/>
+              </w:rPr>
+              <w:drawing>
+                <wp:inline distT="0" distB="0" distL="0" distR="0" wp14:anchorId="679027B7" wp14:editId="3CB373B7">
+                  <wp:extent cx="2700000" cy="2151489"/>
+                  <wp:effectExtent l="0" t="0" r="5715" b="1270"/>
+                  <wp:docPr id="119802732" name="Picture 1"/>
+                  <wp:cNvGraphicFramePr>
+                    <a:graphicFrameLocks xmlns:a="http://schemas.openxmlformats.org/drawingml/2006/main" noChangeAspect="1"/>
+                  </wp:cNvGraphicFramePr>
+                  <a:graphic xmlns:a="http://schemas.openxmlformats.org/drawingml/2006/main">
+                    <a:graphicData uri="http://schemas.openxmlformats.org/drawingml/2006/picture">
+                      <pic:pic xmlns:pic="http://schemas.openxmlformats.org/drawingml/2006/picture">
+                        <pic:nvPicPr>
+                          <pic:cNvPr id="119802732" name=""/>
+                          <pic:cNvPicPr/>
+                        </pic:nvPicPr>
+                        <pic:blipFill>
+                          <a:blip r:embed="rId47"/>
+                          <a:stretch>
+                            <a:fillRect/>
+                          </a:stretch>
+                        </pic:blipFill>
+                        <pic:spPr>
+                          <a:xfrm>
+                            <a:off x="0" y="0"/>
+                            <a:ext cx="2700000" cy="2151489"/>
+                          </a:xfrm>
+                          <a:prstGeom prst="rect">
+                            <a:avLst/>
+                          </a:prstGeom>
+                        </pic:spPr>
+                      </pic:pic>
+                    </a:graphicData>
+                  </a:graphic>
+                </wp:inline>
+              </w:drawing>
+            </w:r>
+          </w:p>
+        </w:tc>
+        <w:tc>
+          <w:tcPr>
+            <w:tcW w:w="4508" w:type="dxa"/>
+          </w:tcPr>
+          <w:p>
+            <w:pPr>
+              <w:cnfStyle w:val="000000100000" w:firstRow="0" w:lastRow="0" w:firstColumn="0" w:lastColumn="0" w:oddVBand="0" w:evenVBand="0" w:oddHBand="1" w:evenHBand="0" w:firstRowFirstColumn="0" w:firstRowLastColumn="0" w:lastRowFirstColumn="0" w:lastRowLastColumn="0"/>
+              <w:rPr>
+                <w:lang w:eastAsia="en-GB"/>
+              </w:rPr>
+            </w:pPr>
+            <w:r>
+              <w:rPr>
+                <w:lang w:eastAsia="en-GB"/>
+              </w:rPr>
+              <w:drawing>
+                <wp:inline distT="0" distB="0" distL="0" distR="0" wp14:anchorId="157A035A" wp14:editId="7A59658A">
+                  <wp:extent cx="2700000" cy="2166667"/>
+                  <wp:effectExtent l="0" t="0" r="5715" b="5080"/>
+                  <wp:docPr id="1072304238" name="Picture 1"/>
+                  <wp:cNvGraphicFramePr>
+                    <a:graphicFrameLocks xmlns:a="http://schemas.openxmlformats.org/drawingml/2006/main" noChangeAspect="1"/>
+                  </wp:cNvGraphicFramePr>
+                  <a:graphic xmlns:a="http://schemas.openxmlformats.org/drawingml/2006/main">
+                    <a:graphicData uri="http://schemas.openxmlformats.org/drawingml/2006/picture">
+                      <pic:pic xmlns:pic="http://schemas.openxmlformats.org/drawingml/2006/picture">
+                        <pic:nvPicPr>
+                          <pic:cNvPr id="1072304238" name=""/>
+                          <pic:cNvPicPr/>
+                        </pic:nvPicPr>
+                        <pic:blipFill>
+                          <a:blip r:embed="rId48"/>
+                          <a:stretch>
+                            <a:fillRect/>
+                          </a:stretch>
+                        </pic:blipFill>
+                        <pic:spPr>
+                          <a:xfrm>
+                            <a:off x="0" y="0"/>
+                            <a:ext cx="2700000" cy="2166667"/>
+                          </a:xfrm>
+                          <a:prstGeom prst="rect">
+                            <a:avLst/>
+                          </a:prstGeom>
+                        </pic:spPr>
+                      </pic:pic>
+                    </a:graphicData>
+                  </a:graphic>
+                </wp:inline>
+              </w:drawing>
+            </w:r>
+          </w:p>
+        </w:tc>
+      </w:tr>
+    </w:tbl>
+    <w:p>
+      <w:pPr>
+        <w:rPr>
+          <w:rFonts w:asciiTheme="majorHAnsi" w:hAnsiTheme="majorHAnsi"/>
+          <w:sz w:val="40"/>
+          <w:szCs w:val="40"/>
+          <w:lang w:eastAsia="en-GB"/>
+        </w:rPr>
+      </w:pPr>
+      <w:r>
+        <w:rPr>
+          <w:lang w:eastAsia="en-GB"/>
+        </w:rPr>
+        <w:br w:type="page"/>
+      </w:r>
+    </w:p>
+    <w:p>
+      <w:pPr>
+        <w:pStyle w:val="Heading3"/>
+        <w:rPr>
+          <w:lang w:eastAsia="en-GB"/>
+        </w:rPr>
+      </w:pPr>
+      <w:r>
+        <w:rPr>
+          <w:lang w:eastAsia="en-GB"/>
+        </w:rPr>
+        <w:lastRenderedPageBreak/>
+        <w:t>128</w:t>
+      </w:r>
+      <w:r>
+        <w:rPr>
+          <w:lang w:eastAsia="en-GB"/>
+        </w:rPr>
+        <w:t xml:space="preserve"> samples using every </w:t>
+      </w:r>
+      <w:r>
+        <w:rPr>
+          <w:lang w:eastAsia="en-GB"/>
+        </w:rPr>
+        <w:t>2</w:t>
+      </w:r>
+      <w:r>
+        <w:rPr>
+          <w:vertAlign w:val="superscript"/>
+          <w:lang w:eastAsia="en-GB"/>
+        </w:rPr>
+        <w:t>nd</w:t>
+      </w:r>
+      <w:r>
+        <w:rPr>
+          <w:lang w:eastAsia="en-GB"/>
+        </w:rPr>
+        <w:t xml:space="preserve"> sample</w:t>
+      </w:r>
+    </w:p>
+    <w:p>
+      <w:pPr>
+        <w:rPr>
+          <w:lang w:eastAsia="en-GB"/>
+        </w:rPr>
+      </w:pPr>
+      <w:r>
+        <w:rPr>
+          <w:lang w:eastAsia="en-GB"/>
+        </w:rPr>
+        <w:t xml:space="preserve">To also test on lower sampling rates sequence of 256 sequence length were generated and then every </w:t>
+      </w:r>
+      <w:r>
+        <w:rPr>
+          <w:lang w:eastAsia="en-GB"/>
+        </w:rPr>
+        <w:t>2</w:t>
+      </w:r>
+      <w:r>
+        <w:rPr>
+          <w:vertAlign w:val="superscript"/>
+          <w:lang w:eastAsia="en-GB"/>
+        </w:rPr>
+        <w:t>nd</w:t>
+      </w:r>
+      <w:r>
+        <w:rPr>
+          <w:lang w:eastAsia="en-GB"/>
+        </w:rPr>
+        <w:t xml:space="preserve"> sample was taken simulating a sequence that is </w:t>
+      </w:r>
+      <w:r>
+        <w:rPr>
+          <w:lang w:eastAsia="en-GB"/>
+        </w:rPr>
+        <w:t>128</w:t>
+      </w:r>
+      <w:r>
+        <w:rPr>
+          <w:lang w:eastAsia="en-GB"/>
+        </w:rPr>
+        <w:t xml:space="preserve"> samples long with a sampling rate that is </w:t>
+      </w:r>
+      <w:r>
+        <w:rPr>
+          <w:lang w:eastAsia="en-GB"/>
+        </w:rPr>
+        <w:t>50</w:t>
+      </w:r>
+      <w:r>
+        <w:rPr>
+          <w:lang w:eastAsia="en-GB"/>
+        </w:rPr>
+        <w:t>% of the original sampling rate.</w:t>
+      </w:r>
+    </w:p>
+    <w:tbl>
+      <w:tblPr>
+        <w:tblStyle w:val="TableGrid"/>
+        <w:tblW w:w="10060" w:type="dxa"/>
+        <w:tblLook w:val="04A0" w:firstRow="1" w:lastRow="0" w:firstColumn="1" w:lastColumn="0" w:noHBand="0" w:noVBand="1"/>
+      </w:tblPr>
+      <w:tblGrid>
+        <w:gridCol w:w="1607"/>
+        <w:gridCol w:w="5204"/>
+        <w:gridCol w:w="3249"/>
+      </w:tblGrid>
+      <w:tr>
+        <w:tc>
+          <w:tcPr>
+            <w:tcW w:w="1621" w:type="dxa"/>
+          </w:tcPr>
+          <w:p>
+            <w:pPr>
+              <w:rPr>
+                <w:b/>
+                <w:bCs/>
+                <w:lang w:eastAsia="en-GB"/>
+              </w:rPr>
+            </w:pPr>
+            <w:r>
+              <w:rPr>
+                <w:b/>
+                <w:bCs/>
+                <w:lang w:eastAsia="en-GB"/>
+              </w:rPr>
+              <w:t>Model</w:t>
+            </w:r>
+          </w:p>
+        </w:tc>
+        <w:tc>
+          <w:tcPr>
+            <w:tcW w:w="4751" w:type="dxa"/>
+          </w:tcPr>
+          <w:p>
+            <w:pPr>
+              <w:rPr>
+                <w:b/>
+                <w:bCs/>
+                <w:lang w:eastAsia="en-GB"/>
+              </w:rPr>
+            </w:pPr>
+            <w:r>
+              <w:rPr>
+                <w:b/>
+                <w:bCs/>
+                <w:lang w:eastAsia="en-GB"/>
+              </w:rPr>
+              <w:t>Graph</w:t>
+            </w:r>
+          </w:p>
+        </w:tc>
+        <w:tc>
+          <w:tcPr>
+            <w:tcW w:w="3688" w:type="dxa"/>
+          </w:tcPr>
+          <w:p>
+            <w:pPr>
+              <w:rPr>
+                <w:b/>
+                <w:bCs/>
+                <w:lang w:eastAsia="en-GB"/>
+              </w:rPr>
+            </w:pPr>
+            <w:r>
+              <w:rPr>
+                <w:b/>
+                <w:bCs/>
+                <w:lang w:eastAsia="en-GB"/>
+              </w:rPr>
+              <w:t>Statistics</w:t>
+            </w:r>
+          </w:p>
+        </w:tc>
+      </w:tr>
+      <w:tr>
+        <w:tc>
+          <w:tcPr>
+            <w:tcW w:w="1621" w:type="dxa"/>
+          </w:tcPr>
+          <w:p>
+            <w:pPr>
+              <w:rPr>
+                <w:sz w:val="22"/>
+                <w:szCs w:val="22"/>
+                <w:lang w:eastAsia="en-GB"/>
+              </w:rPr>
+            </w:pPr>
+            <w:r>
+              <w:rPr>
+                <w:sz w:val="22"/>
+                <w:szCs w:val="22"/>
+                <w:lang w:eastAsia="en-GB"/>
+              </w:rPr>
+              <w:t>Convolutional model</w:t>
+            </w:r>
+          </w:p>
+        </w:tc>
+        <w:tc>
+          <w:tcPr>
+            <w:tcW w:w="4751" w:type="dxa"/>
+          </w:tcPr>
+          <w:p>
+            <w:pPr>
+              <w:rPr>
+                <w:lang w:eastAsia="en-GB"/>
+              </w:rPr>
+            </w:pPr>
+            <w:r>
+              <w:rPr>
+                <w:lang w:eastAsia="en-GB"/>
+              </w:rPr>
+              <w:drawing>
+                <wp:inline distT="0" distB="0" distL="0" distR="0" wp14:anchorId="4249D446" wp14:editId="410E551C">
+                  <wp:extent cx="3168000" cy="2476702"/>
+                  <wp:effectExtent l="0" t="0" r="0" b="0"/>
+                  <wp:docPr id="1750057717" name="Picture 1"/>
+                  <wp:cNvGraphicFramePr>
+                    <a:graphicFrameLocks xmlns:a="http://schemas.openxmlformats.org/drawingml/2006/main" noChangeAspect="1"/>
+                  </wp:cNvGraphicFramePr>
+                  <a:graphic xmlns:a="http://schemas.openxmlformats.org/drawingml/2006/main">
+                    <a:graphicData uri="http://schemas.openxmlformats.org/drawingml/2006/picture">
+                      <pic:pic xmlns:pic="http://schemas.openxmlformats.org/drawingml/2006/picture">
+                        <pic:nvPicPr>
+                          <pic:cNvPr id="1750057717" name=""/>
+                          <pic:cNvPicPr/>
+                        </pic:nvPicPr>
+                        <pic:blipFill>
+                          <a:blip r:embed="rId49"/>
+                          <a:stretch>
+                            <a:fillRect/>
+                          </a:stretch>
+                        </pic:blipFill>
+                        <pic:spPr>
+                          <a:xfrm>
+                            <a:off x="0" y="0"/>
+                            <a:ext cx="3168000" cy="2476702"/>
+                          </a:xfrm>
+                          <a:prstGeom prst="rect">
+                            <a:avLst/>
+                          </a:prstGeom>
+                        </pic:spPr>
+                      </pic:pic>
+                    </a:graphicData>
+                  </a:graphic>
+                </wp:inline>
+              </w:drawing>
+            </w:r>
+          </w:p>
+        </w:tc>
+        <w:tc>
+          <w:tcPr>
+            <w:tcW w:w="3688" w:type="dxa"/>
+          </w:tcPr>
+          <w:p>
+            <w:pPr>
+              <w:rPr>
+                <w:sz w:val="22"/>
+                <w:szCs w:val="22"/>
+                <w:lang w:eastAsia="en-GB"/>
+              </w:rPr>
+            </w:pPr>
+            <w:r>
+              <w:rPr>
+                <w:sz w:val="22"/>
+                <w:szCs w:val="22"/>
+                <w:lang w:eastAsia="en-GB"/>
+              </w:rPr>
+              <w:t xml:space="preserve">Accuracy: </w:t>
+            </w:r>
+            <w:r>
+              <w:rPr>
+                <w:sz w:val="22"/>
+                <w:szCs w:val="22"/>
+                <w:lang w:eastAsia="en-GB"/>
+              </w:rPr>
+              <w:t>~</w:t>
+            </w:r>
+            <w:r>
+              <w:rPr>
+                <w:sz w:val="22"/>
+                <w:szCs w:val="22"/>
+                <w:lang w:eastAsia="en-GB"/>
+              </w:rPr>
+              <w:t>84.473</w:t>
+            </w:r>
+            <w:r>
+              <w:rPr>
+                <w:sz w:val="22"/>
+                <w:szCs w:val="22"/>
+                <w:lang w:eastAsia="en-GB"/>
+              </w:rPr>
+              <w:t>6</w:t>
+            </w:r>
+            <w:r>
+              <w:rPr>
+                <w:sz w:val="22"/>
+                <w:szCs w:val="22"/>
+                <w:lang w:eastAsia="en-GB"/>
+              </w:rPr>
+              <w:t>%</w:t>
+            </w:r>
+          </w:p>
+          <w:p>
+            <w:pPr>
+              <w:rPr>
+                <w:sz w:val="22"/>
+                <w:szCs w:val="22"/>
+                <w:lang w:eastAsia="en-GB"/>
+              </w:rPr>
+            </w:pPr>
+            <w:r>
+              <w:rPr>
+                <w:sz w:val="22"/>
+                <w:szCs w:val="22"/>
+                <w:lang w:eastAsia="en-GB"/>
+              </w:rPr>
+              <w:t>Response time: ~</w:t>
+            </w:r>
+            <w:r>
+              <w:rPr>
+                <w:sz w:val="22"/>
+                <w:szCs w:val="22"/>
+                <w:lang w:eastAsia="en-GB"/>
+              </w:rPr>
+              <w:t>0.38390</w:t>
+            </w:r>
+            <w:r>
+              <w:rPr>
+                <w:sz w:val="22"/>
+                <w:szCs w:val="22"/>
+                <w:lang w:eastAsia="en-GB"/>
+              </w:rPr>
+              <w:t>ms</w:t>
+            </w:r>
+          </w:p>
+          <w:p>
+            <w:pPr>
+              <w:rPr>
+                <w:sz w:val="22"/>
+                <w:szCs w:val="22"/>
+                <w:lang w:eastAsia="en-GB"/>
+              </w:rPr>
+            </w:pPr>
+            <w:r>
+              <w:rPr>
+                <w:sz w:val="22"/>
+                <w:szCs w:val="22"/>
+                <w:lang w:eastAsia="en-GB"/>
+              </w:rPr>
+              <w:t>Training time: ~</w:t>
+            </w:r>
+            <w:r>
+              <w:rPr>
+                <w:sz w:val="22"/>
+                <w:szCs w:val="22"/>
+                <w:lang w:eastAsia="en-GB"/>
+              </w:rPr>
+              <w:t>580.9265</w:t>
+            </w:r>
+            <w:r>
+              <w:rPr>
+                <w:sz w:val="22"/>
+                <w:szCs w:val="22"/>
+                <w:lang w:eastAsia="en-GB"/>
+              </w:rPr>
+              <w:t>s (20 epochs)</w:t>
+            </w:r>
+          </w:p>
+        </w:tc>
+      </w:tr>
+      <w:tr>
+        <w:tc>
+          <w:tcPr>
+            <w:tcW w:w="1621" w:type="dxa"/>
+          </w:tcPr>
+          <w:p>
+            <w:pPr>
+              <w:rPr>
+                <w:sz w:val="22"/>
+                <w:szCs w:val="22"/>
+                <w:lang w:eastAsia="en-GB"/>
+              </w:rPr>
+            </w:pPr>
+            <w:r>
+              <w:rPr>
+                <w:sz w:val="22"/>
+                <w:szCs w:val="22"/>
+                <w:lang w:eastAsia="en-GB"/>
+              </w:rPr>
+              <w:t xml:space="preserve">Convolutional </w:t>
+            </w:r>
+            <w:r>
+              <w:rPr>
+                <w:sz w:val="22"/>
+                <w:szCs w:val="22"/>
+                <w:lang w:eastAsia="en-GB"/>
+              </w:rPr>
+              <w:t>SVM</w:t>
+            </w:r>
+          </w:p>
+        </w:tc>
+        <w:tc>
+          <w:tcPr>
+            <w:tcW w:w="4751" w:type="dxa"/>
+          </w:tcPr>
+          <w:p>
+            <w:pPr>
+              <w:rPr>
+                <w:lang w:eastAsia="en-GB"/>
+              </w:rPr>
+            </w:pPr>
+            <w:r>
+              <w:rPr>
+                <w:lang w:eastAsia="en-GB"/>
+              </w:rPr>
+              <w:drawing>
+                <wp:inline distT="0" distB="0" distL="0" distR="0" wp14:anchorId="1DEF766E" wp14:editId="137A9FCE">
+                  <wp:extent cx="3168000" cy="2476702"/>
+                  <wp:effectExtent l="0" t="0" r="0" b="0"/>
+                  <wp:docPr id="850036605" name="Picture 1"/>
+                  <wp:cNvGraphicFramePr>
+                    <a:graphicFrameLocks xmlns:a="http://schemas.openxmlformats.org/drawingml/2006/main" noChangeAspect="1"/>
+                  </wp:cNvGraphicFramePr>
+                  <a:graphic xmlns:a="http://schemas.openxmlformats.org/drawingml/2006/main">
+                    <a:graphicData uri="http://schemas.openxmlformats.org/drawingml/2006/picture">
+                      <pic:pic xmlns:pic="http://schemas.openxmlformats.org/drawingml/2006/picture">
+                        <pic:nvPicPr>
+                          <pic:cNvPr id="850036605" name=""/>
+                          <pic:cNvPicPr/>
+                        </pic:nvPicPr>
+                        <pic:blipFill>
+                          <a:blip r:embed="rId50"/>
+                          <a:stretch>
+                            <a:fillRect/>
+                          </a:stretch>
+                        </pic:blipFill>
+                        <pic:spPr>
+                          <a:xfrm>
+                            <a:off x="0" y="0"/>
+                            <a:ext cx="3168000" cy="2476702"/>
+                          </a:xfrm>
+                          <a:prstGeom prst="rect">
+                            <a:avLst/>
+                          </a:prstGeom>
+                        </pic:spPr>
+                      </pic:pic>
+                    </a:graphicData>
+                  </a:graphic>
+                </wp:inline>
+              </w:drawing>
+            </w:r>
+          </w:p>
+        </w:tc>
+        <w:tc>
+          <w:tcPr>
+            <w:tcW w:w="3688" w:type="dxa"/>
+          </w:tcPr>
+          <w:p>
+            <w:pPr>
+              <w:rPr>
+                <w:sz w:val="22"/>
+                <w:szCs w:val="22"/>
+                <w:lang w:eastAsia="en-GB"/>
+              </w:rPr>
+            </w:pPr>
+            <w:r>
+              <w:rPr>
+                <w:sz w:val="22"/>
+                <w:szCs w:val="22"/>
+                <w:lang w:eastAsia="en-GB"/>
+              </w:rPr>
+              <w:t xml:space="preserve">Accuracy: </w:t>
+            </w:r>
+            <w:r>
+              <w:rPr>
+                <w:sz w:val="22"/>
+                <w:szCs w:val="22"/>
+                <w:lang w:eastAsia="en-GB"/>
+              </w:rPr>
+              <w:t>~</w:t>
+            </w:r>
+            <w:r>
+              <w:rPr>
+                <w:sz w:val="22"/>
+                <w:szCs w:val="22"/>
+                <w:lang w:eastAsia="en-GB"/>
+              </w:rPr>
+              <w:t>92.036</w:t>
+            </w:r>
+            <w:r>
+              <w:rPr>
+                <w:sz w:val="22"/>
+                <w:szCs w:val="22"/>
+                <w:lang w:eastAsia="en-GB"/>
+              </w:rPr>
+              <w:t>3</w:t>
+            </w:r>
+            <w:r>
+              <w:rPr>
+                <w:sz w:val="22"/>
+                <w:szCs w:val="22"/>
+                <w:lang w:eastAsia="en-GB"/>
+              </w:rPr>
+              <w:t>%</w:t>
+            </w:r>
+          </w:p>
+          <w:p>
+            <w:pPr>
+              <w:rPr>
+                <w:sz w:val="22"/>
+                <w:szCs w:val="22"/>
+                <w:lang w:eastAsia="en-GB"/>
+              </w:rPr>
+            </w:pPr>
+            <w:r>
+              <w:rPr>
+                <w:sz w:val="22"/>
+                <w:szCs w:val="22"/>
+                <w:lang w:eastAsia="en-GB"/>
+              </w:rPr>
+              <w:t>Response time: ~</w:t>
+            </w:r>
+            <w:r>
+              <w:rPr>
+                <w:sz w:val="22"/>
+                <w:szCs w:val="22"/>
+                <w:lang w:eastAsia="en-GB"/>
+              </w:rPr>
+              <w:t>0.34399</w:t>
+            </w:r>
+            <w:r>
+              <w:rPr>
+                <w:sz w:val="22"/>
+                <w:szCs w:val="22"/>
+                <w:lang w:eastAsia="en-GB"/>
+              </w:rPr>
+              <w:t>ms</w:t>
+            </w:r>
+          </w:p>
+          <w:p>
+            <w:pPr>
+              <w:rPr>
+                <w:sz w:val="22"/>
+                <w:szCs w:val="22"/>
+                <w:lang w:eastAsia="en-GB"/>
+              </w:rPr>
+            </w:pPr>
+            <w:r>
+              <w:rPr>
+                <w:sz w:val="22"/>
+                <w:szCs w:val="22"/>
+                <w:lang w:eastAsia="en-GB"/>
+              </w:rPr>
+              <w:t>Training time: ~</w:t>
+            </w:r>
+            <w:r>
+              <w:rPr>
+                <w:sz w:val="22"/>
+                <w:szCs w:val="22"/>
+                <w:lang w:eastAsia="en-GB"/>
+              </w:rPr>
+              <w:t>572.9687</w:t>
+            </w:r>
+            <w:r>
+              <w:rPr>
+                <w:sz w:val="22"/>
+                <w:szCs w:val="22"/>
+                <w:lang w:eastAsia="en-GB"/>
+              </w:rPr>
+              <w:t>s (20 epochs)</w:t>
+            </w:r>
+          </w:p>
+        </w:tc>
+      </w:tr>
+      <w:tr>
+        <w:tc>
+          <w:tcPr>
+            <w:tcW w:w="1621" w:type="dxa"/>
+          </w:tcPr>
+          <w:p>
+            <w:pPr>
+              <w:rPr>
+                <w:sz w:val="22"/>
+                <w:szCs w:val="22"/>
+                <w:lang w:eastAsia="en-GB"/>
+              </w:rPr>
+            </w:pPr>
+            <w:r>
+              <w:rPr>
+                <w:sz w:val="22"/>
+                <w:szCs w:val="22"/>
+                <w:lang w:eastAsia="en-GB"/>
+              </w:rPr>
+              <w:t>FFT linear model</w:t>
+            </w:r>
+          </w:p>
+        </w:tc>
+        <w:tc>
+          <w:tcPr>
+            <w:tcW w:w="4751" w:type="dxa"/>
+          </w:tcPr>
+          <w:p>
+            <w:r>
+              <w:drawing>
+                <wp:inline distT="0" distB="0" distL="0" distR="0" wp14:anchorId="0D1DEF90" wp14:editId="0D1251E1">
+                  <wp:extent cx="3168000" cy="2476702"/>
+                  <wp:effectExtent l="0" t="0" r="0" b="0"/>
+                  <wp:docPr id="293031671" name="Picture 1"/>
+                  <wp:cNvGraphicFramePr>
+                    <a:graphicFrameLocks xmlns:a="http://schemas.openxmlformats.org/drawingml/2006/main" noChangeAspect="1"/>
+                  </wp:cNvGraphicFramePr>
+                  <a:graphic xmlns:a="http://schemas.openxmlformats.org/drawingml/2006/main">
+                    <a:graphicData uri="http://schemas.openxmlformats.org/drawingml/2006/picture">
+                      <pic:pic xmlns:pic="http://schemas.openxmlformats.org/drawingml/2006/picture">
+                        <pic:nvPicPr>
+                          <pic:cNvPr id="293031671" name=""/>
+                          <pic:cNvPicPr/>
+                        </pic:nvPicPr>
+                        <pic:blipFill>
+                          <a:blip r:embed="rId51"/>
+                          <a:stretch>
+                            <a:fillRect/>
+                          </a:stretch>
+                        </pic:blipFill>
+                        <pic:spPr>
+                          <a:xfrm>
+                            <a:off x="0" y="0"/>
+                            <a:ext cx="3168000" cy="2476702"/>
+                          </a:xfrm>
+                          <a:prstGeom prst="rect">
+                            <a:avLst/>
+                          </a:prstGeom>
+                        </pic:spPr>
+                      </pic:pic>
+                    </a:graphicData>
+                  </a:graphic>
+                </wp:inline>
+              </w:drawing>
+            </w:r>
+          </w:p>
+        </w:tc>
+        <w:tc>
+          <w:tcPr>
+            <w:tcW w:w="3688" w:type="dxa"/>
+          </w:tcPr>
+          <w:p>
+            <w:pPr>
+              <w:rPr>
+                <w:sz w:val="22"/>
+                <w:szCs w:val="22"/>
+                <w:lang w:eastAsia="en-GB"/>
+              </w:rPr>
+            </w:pPr>
+            <w:r>
+              <w:rPr>
+                <w:sz w:val="22"/>
+                <w:szCs w:val="22"/>
+                <w:lang w:eastAsia="en-GB"/>
+              </w:rPr>
+              <w:t xml:space="preserve">Accuracy: </w:t>
+            </w:r>
+            <w:r>
+              <w:rPr>
+                <w:sz w:val="22"/>
+                <w:szCs w:val="22"/>
+                <w:lang w:eastAsia="en-GB"/>
+              </w:rPr>
+              <w:t>~</w:t>
+            </w:r>
+            <w:r>
+              <w:rPr>
+                <w:sz w:val="22"/>
+                <w:szCs w:val="22"/>
+                <w:lang w:eastAsia="en-GB"/>
+              </w:rPr>
+              <w:t>84.3697</w:t>
+            </w:r>
+            <w:r>
+              <w:rPr>
+                <w:sz w:val="22"/>
+                <w:szCs w:val="22"/>
+                <w:lang w:eastAsia="en-GB"/>
+              </w:rPr>
+              <w:t>%</w:t>
+            </w:r>
+          </w:p>
+          <w:p>
+            <w:pPr>
+              <w:rPr>
+                <w:sz w:val="22"/>
+                <w:szCs w:val="22"/>
+                <w:lang w:eastAsia="en-GB"/>
+              </w:rPr>
+            </w:pPr>
+            <w:r>
+              <w:rPr>
+                <w:sz w:val="22"/>
+                <w:szCs w:val="22"/>
+                <w:lang w:eastAsia="en-GB"/>
+              </w:rPr>
+              <w:t>Response time: ~</w:t>
+            </w:r>
+            <w:r>
+              <w:rPr>
+                <w:sz w:val="22"/>
+                <w:szCs w:val="22"/>
+                <w:lang w:eastAsia="en-GB"/>
+              </w:rPr>
+              <w:t>0.32966</w:t>
+            </w:r>
+            <w:r>
+              <w:rPr>
+                <w:sz w:val="22"/>
+                <w:szCs w:val="22"/>
+                <w:lang w:eastAsia="en-GB"/>
+              </w:rPr>
+              <w:t>ms</w:t>
+            </w:r>
+          </w:p>
+          <w:p>
+            <w:pPr>
+              <w:rPr>
+                <w:sz w:val="22"/>
+                <w:szCs w:val="22"/>
+                <w:lang w:eastAsia="en-GB"/>
+              </w:rPr>
+            </w:pPr>
+            <w:r>
+              <w:rPr>
+                <w:sz w:val="22"/>
+                <w:szCs w:val="22"/>
+                <w:lang w:eastAsia="en-GB"/>
+              </w:rPr>
+              <w:t>Training time: ~</w:t>
+            </w:r>
+            <w:r>
+              <w:rPr>
+                <w:sz w:val="22"/>
+                <w:szCs w:val="22"/>
+                <w:lang w:eastAsia="en-GB"/>
+              </w:rPr>
+              <w:t>495.0271</w:t>
+            </w:r>
+            <w:r>
+              <w:rPr>
+                <w:sz w:val="22"/>
+                <w:szCs w:val="22"/>
+                <w:lang w:eastAsia="en-GB"/>
+              </w:rPr>
+              <w:t>s (20 epochs)</w:t>
+            </w:r>
+          </w:p>
+        </w:tc>
+      </w:tr>
+    </w:tbl>
+    <w:p>
+      <w:pPr>
+        <w:rPr>
+          <w:lang w:eastAsia="en-GB"/>
+        </w:rPr>
+      </w:pPr>
+      <w:r>
+        <w:rPr>
+          <w:lang w:eastAsia="en-GB"/>
+        </w:rPr>
+        <w:lastRenderedPageBreak/>
+        <w:t>Where each model compared, less sequences used again for training (50.000 sequences)</w:t>
+      </w:r>
+    </w:p>
+    <w:tbl>
+      <w:tblPr>
+        <w:tblStyle w:val="PlainTable4"/>
+        <w:tblW w:w="0" w:type="auto"/>
+        <w:tblCellMar>
+          <w:top w:w="57" w:type="dxa"/>
+          <w:bottom w:w="57" w:type="dxa"/>
+        </w:tblCellMar>
+        <w:tblLook w:val="04A0" w:firstRow="1" w:lastRow="0" w:firstColumn="1" w:lastColumn="0" w:noHBand="0" w:noVBand="1"/>
+      </w:tblPr>
+      <w:tblGrid>
+        <w:gridCol w:w="4508"/>
+        <w:gridCol w:w="4508"/>
+      </w:tblGrid>
+      <w:tr>
+        <w:trPr>
+          <w:cnfStyle w:val="100000000000" w:firstRow="1" w:lastRow="0" w:firstColumn="0" w:lastColumn="0" w:oddVBand="0" w:evenVBand="0" w:oddHBand="0" w:evenHBand="0" w:firstRowFirstColumn="0" w:firstRowLastColumn="0" w:lastRowFirstColumn="0" w:lastRowLastColumn="0"/>
+        </w:trPr>
+        <w:tc>
+          <w:tcPr>
+            <w:cnfStyle w:val="001000000000" w:firstRow="0" w:lastRow="0" w:firstColumn="1" w:lastColumn="0" w:oddVBand="0" w:evenVBand="0" w:oddHBand="0" w:evenHBand="0" w:firstRowFirstColumn="0" w:firstRowLastColumn="0" w:lastRowFirstColumn="0" w:lastRowLastColumn="0"/>
+            <w:tcW w:w="4508" w:type="dxa"/>
+          </w:tcPr>
+          <w:p>
+            <w:pPr>
+              <w:rPr>
+                <w:lang w:eastAsia="en-GB"/>
+              </w:rPr>
+            </w:pPr>
+            <w:r>
+              <w:rPr>
+                <w:lang w:eastAsia="en-GB"/>
+              </w:rPr>
+              <w:drawing>
+                <wp:inline distT="0" distB="0" distL="0" distR="0" wp14:anchorId="09809E21" wp14:editId="524D0C80">
+                  <wp:extent cx="2700000" cy="2185943"/>
+                  <wp:effectExtent l="0" t="0" r="5715" b="5080"/>
+                  <wp:docPr id="947166997" name="Picture 1"/>
+                  <wp:cNvGraphicFramePr>
+                    <a:graphicFrameLocks xmlns:a="http://schemas.openxmlformats.org/drawingml/2006/main" noChangeAspect="1"/>
+                  </wp:cNvGraphicFramePr>
+                  <a:graphic xmlns:a="http://schemas.openxmlformats.org/drawingml/2006/main">
+                    <a:graphicData uri="http://schemas.openxmlformats.org/drawingml/2006/picture">
+                      <pic:pic xmlns:pic="http://schemas.openxmlformats.org/drawingml/2006/picture">
+                        <pic:nvPicPr>
+                          <pic:cNvPr id="947166997" name=""/>
+                          <pic:cNvPicPr/>
+                        </pic:nvPicPr>
+                        <pic:blipFill>
+                          <a:blip r:embed="rId52"/>
+                          <a:stretch>
+                            <a:fillRect/>
+                          </a:stretch>
+                        </pic:blipFill>
+                        <pic:spPr>
+                          <a:xfrm>
+                            <a:off x="0" y="0"/>
+                            <a:ext cx="2700000" cy="2185943"/>
+                          </a:xfrm>
+                          <a:prstGeom prst="rect">
+                            <a:avLst/>
+                          </a:prstGeom>
+                        </pic:spPr>
+                      </pic:pic>
+                    </a:graphicData>
+                  </a:graphic>
+                </wp:inline>
+              </w:drawing>
+            </w:r>
+          </w:p>
+        </w:tc>
+        <w:tc>
+          <w:tcPr>
+            <w:tcW w:w="4508" w:type="dxa"/>
+          </w:tcPr>
+          <w:p>
+            <w:pPr>
+              <w:cnfStyle w:val="100000000000" w:firstRow="1" w:lastRow="0" w:firstColumn="0" w:lastColumn="0" w:oddVBand="0" w:evenVBand="0" w:oddHBand="0" w:evenHBand="0" w:firstRowFirstColumn="0" w:firstRowLastColumn="0" w:lastRowFirstColumn="0" w:lastRowLastColumn="0"/>
+              <w:rPr>
+                <w:lang w:eastAsia="en-GB"/>
+              </w:rPr>
+            </w:pPr>
+            <w:r>
+              <w:rPr>
+                <w:lang w:eastAsia="en-GB"/>
+              </w:rPr>
+              <w:drawing>
+                <wp:inline distT="0" distB="0" distL="0" distR="0" wp14:anchorId="72730914" wp14:editId="788E0A6D">
+                  <wp:extent cx="2700000" cy="2151489"/>
+                  <wp:effectExtent l="0" t="0" r="5715" b="1270"/>
+                  <wp:docPr id="1772826875" name="Picture 1"/>
+                  <wp:cNvGraphicFramePr>
+                    <a:graphicFrameLocks xmlns:a="http://schemas.openxmlformats.org/drawingml/2006/main" noChangeAspect="1"/>
+                  </wp:cNvGraphicFramePr>
+                  <a:graphic xmlns:a="http://schemas.openxmlformats.org/drawingml/2006/main">
+                    <a:graphicData uri="http://schemas.openxmlformats.org/drawingml/2006/picture">
+                      <pic:pic xmlns:pic="http://schemas.openxmlformats.org/drawingml/2006/picture">
+                        <pic:nvPicPr>
+                          <pic:cNvPr id="1772826875" name=""/>
+                          <pic:cNvPicPr/>
+                        </pic:nvPicPr>
+                        <pic:blipFill>
+                          <a:blip r:embed="rId53"/>
+                          <a:stretch>
+                            <a:fillRect/>
+                          </a:stretch>
+                        </pic:blipFill>
+                        <pic:spPr>
+                          <a:xfrm>
+                            <a:off x="0" y="0"/>
+                            <a:ext cx="2700000" cy="2151489"/>
+                          </a:xfrm>
+                          <a:prstGeom prst="rect">
+                            <a:avLst/>
+                          </a:prstGeom>
+                        </pic:spPr>
+                      </pic:pic>
+                    </a:graphicData>
+                  </a:graphic>
+                </wp:inline>
+              </w:drawing>
+            </w:r>
+          </w:p>
+        </w:tc>
+      </w:tr>
+      <w:tr>
+        <w:trPr>
+          <w:cnfStyle w:val="000000100000" w:firstRow="0" w:lastRow="0" w:firstColumn="0" w:lastColumn="0" w:oddVBand="0" w:evenVBand="0" w:oddHBand="1" w:evenHBand="0" w:firstRowFirstColumn="0" w:firstRowLastColumn="0" w:lastRowFirstColumn="0" w:lastRowLastColumn="0"/>
+        </w:trPr>
+        <w:tc>
+          <w:tcPr>
+            <w:cnfStyle w:val="001000000000" w:firstRow="0" w:lastRow="0" w:firstColumn="1" w:lastColumn="0" w:oddVBand="0" w:evenVBand="0" w:oddHBand="0" w:evenHBand="0" w:firstRowFirstColumn="0" w:firstRowLastColumn="0" w:lastRowFirstColumn="0" w:lastRowLastColumn="0"/>
+            <w:tcW w:w="4508" w:type="dxa"/>
+          </w:tcPr>
+          <w:p>
+            <w:pPr>
+              <w:rPr>
+                <w:b w:val="0"/>
+                <w:bCs w:val="0"/>
+                <w:lang w:eastAsia="en-GB"/>
+              </w:rPr>
+            </w:pPr>
+            <w:r>
+              <w:rPr>
+                <w:b w:val="0"/>
+                <w:bCs w:val="0"/>
+                <w:lang w:eastAsia="en-GB"/>
+              </w:rPr>
+              <w:drawing>
+                <wp:inline distT="0" distB="0" distL="0" distR="0" wp14:anchorId="0AF170B6" wp14:editId="0AD3338E">
+                  <wp:extent cx="2700000" cy="2151489"/>
+                  <wp:effectExtent l="0" t="0" r="5715" b="1270"/>
+                  <wp:docPr id="2095392954" name="Picture 1"/>
+                  <wp:cNvGraphicFramePr>
+                    <a:graphicFrameLocks xmlns:a="http://schemas.openxmlformats.org/drawingml/2006/main" noChangeAspect="1"/>
+                  </wp:cNvGraphicFramePr>
+                  <a:graphic xmlns:a="http://schemas.openxmlformats.org/drawingml/2006/main">
+                    <a:graphicData uri="http://schemas.openxmlformats.org/drawingml/2006/picture">
+                      <pic:pic xmlns:pic="http://schemas.openxmlformats.org/drawingml/2006/picture">
+                        <pic:nvPicPr>
+                          <pic:cNvPr id="2095392954" name=""/>
+                          <pic:cNvPicPr/>
+                        </pic:nvPicPr>
+                        <pic:blipFill>
+                          <a:blip r:embed="rId54"/>
+                          <a:stretch>
+                            <a:fillRect/>
+                          </a:stretch>
+                        </pic:blipFill>
+                        <pic:spPr>
+                          <a:xfrm>
+                            <a:off x="0" y="0"/>
+                            <a:ext cx="2700000" cy="2151489"/>
+                          </a:xfrm>
+                          <a:prstGeom prst="rect">
+                            <a:avLst/>
+                          </a:prstGeom>
+                        </pic:spPr>
+                      </pic:pic>
+                    </a:graphicData>
+                  </a:graphic>
+                </wp:inline>
+              </w:drawing>
+            </w:r>
+          </w:p>
+        </w:tc>
+        <w:tc>
+          <w:tcPr>
+            <w:tcW w:w="4508" w:type="dxa"/>
+          </w:tcPr>
+          <w:p>
+            <w:pPr>
+              <w:cnfStyle w:val="000000100000" w:firstRow="0" w:lastRow="0" w:firstColumn="0" w:lastColumn="0" w:oddVBand="0" w:evenVBand="0" w:oddHBand="1" w:evenHBand="0" w:firstRowFirstColumn="0" w:firstRowLastColumn="0" w:lastRowFirstColumn="0" w:lastRowLastColumn="0"/>
+              <w:rPr>
+                <w:lang w:eastAsia="en-GB"/>
+              </w:rPr>
+            </w:pPr>
+            <w:r>
+              <w:rPr>
+                <w:lang w:eastAsia="en-GB"/>
+              </w:rPr>
+              <w:drawing>
+                <wp:inline distT="0" distB="0" distL="0" distR="0" wp14:anchorId="43C10BB7" wp14:editId="394BC26C">
+                  <wp:extent cx="2700000" cy="2132813"/>
+                  <wp:effectExtent l="0" t="0" r="5715" b="1270"/>
+                  <wp:docPr id="1466169289" name="Picture 1"/>
+                  <wp:cNvGraphicFramePr>
+                    <a:graphicFrameLocks xmlns:a="http://schemas.openxmlformats.org/drawingml/2006/main" noChangeAspect="1"/>
+                  </wp:cNvGraphicFramePr>
+                  <a:graphic xmlns:a="http://schemas.openxmlformats.org/drawingml/2006/main">
+                    <a:graphicData uri="http://schemas.openxmlformats.org/drawingml/2006/picture">
+                      <pic:pic xmlns:pic="http://schemas.openxmlformats.org/drawingml/2006/picture">
+                        <pic:nvPicPr>
+                          <pic:cNvPr id="1466169289" name=""/>
+                          <pic:cNvPicPr/>
+                        </pic:nvPicPr>
+                        <pic:blipFill>
+                          <a:blip r:embed="rId55"/>
+                          <a:stretch>
+                            <a:fillRect/>
+                          </a:stretch>
+                        </pic:blipFill>
+                        <pic:spPr>
+                          <a:xfrm>
+                            <a:off x="0" y="0"/>
+                            <a:ext cx="2700000" cy="2132813"/>
+                          </a:xfrm>
+                          <a:prstGeom prst="rect">
+                            <a:avLst/>
+                          </a:prstGeom>
+                        </pic:spPr>
+                      </pic:pic>
+                    </a:graphicData>
+                  </a:graphic>
+                </wp:inline>
+              </w:drawing>
+            </w:r>
+          </w:p>
+        </w:tc>
+      </w:tr>
+    </w:tbl>
+    <w:p>
+      <w:pPr>
+        <w:rPr>
+          <w:lang w:eastAsia="en-GB"/>
+        </w:rPr>
+      </w:pPr>
+    </w:p>
+    <w:p>
+      <w:pPr>
+        <w:rPr>
+          <w:lang w:eastAsia="en-GB"/>
+        </w:rPr>
+      </w:pPr>
+      <w:r>
+        <w:rPr>
+          <w:lang w:eastAsia="en-GB"/>
+        </w:rPr>
+        <w:br w:type="page"/>
+      </w:r>
+    </w:p>
+    <w:p>
+      <w:pPr>
+        <w:pStyle w:val="Heading3"/>
+        <w:rPr>
+          <w:lang w:eastAsia="en-GB"/>
+        </w:rPr>
+      </w:pPr>
+      <w:r>
+        <w:rPr>
+          <w:lang w:eastAsia="en-GB"/>
+        </w:rPr>
+        <w:lastRenderedPageBreak/>
+        <w:t>256</w:t>
+      </w:r>
+      <w:r>
+        <w:rPr>
+          <w:lang w:eastAsia="en-GB"/>
+        </w:rPr>
+        <w:t xml:space="preserve"> samples using every 2</w:t>
+      </w:r>
+      <w:r>
+        <w:rPr>
+          <w:vertAlign w:val="superscript"/>
+          <w:lang w:eastAsia="en-GB"/>
+        </w:rPr>
+        <w:t>nd</w:t>
+      </w:r>
+      <w:r>
+        <w:rPr>
+          <w:lang w:eastAsia="en-GB"/>
+        </w:rPr>
+        <w:t xml:space="preserve"> sample</w:t>
+      </w:r>
+    </w:p>
+    <w:p>
+      <w:pPr>
+        <w:rPr>
+          <w:lang w:eastAsia="en-GB"/>
+        </w:rPr>
+      </w:pPr>
+      <w:r>
+        <w:rPr>
+          <w:lang w:eastAsia="en-GB"/>
+        </w:rPr>
+        <w:t xml:space="preserve">To also test on lower sampling rates sequence of </w:t>
+      </w:r>
+      <w:r>
+        <w:rPr>
+          <w:lang w:eastAsia="en-GB"/>
+        </w:rPr>
+        <w:t>512</w:t>
+      </w:r>
+      <w:r>
+        <w:rPr>
+          <w:lang w:eastAsia="en-GB"/>
+        </w:rPr>
+        <w:t xml:space="preserve"> sequence length were generated and then every 2</w:t>
+      </w:r>
+      <w:r>
+        <w:rPr>
+          <w:vertAlign w:val="superscript"/>
+          <w:lang w:eastAsia="en-GB"/>
+        </w:rPr>
+        <w:t>nd</w:t>
+      </w:r>
+      <w:r>
+        <w:rPr>
+          <w:lang w:eastAsia="en-GB"/>
+        </w:rPr>
+        <w:t xml:space="preserve"> sample was taken simulating a sequence that is </w:t>
+      </w:r>
+      <w:r>
+        <w:rPr>
+          <w:lang w:eastAsia="en-GB"/>
+        </w:rPr>
+        <w:t xml:space="preserve">256 </w:t>
+      </w:r>
+      <w:r>
+        <w:rPr>
+          <w:lang w:eastAsia="en-GB"/>
+        </w:rPr>
+        <w:t>samples long with a sampling rate that is 50% of the original sampling rate.</w:t>
+      </w:r>
+      <w:r>
+        <w:rPr>
+          <w:lang w:eastAsia="en-GB"/>
+        </w:rPr>
+        <w:t xml:space="preserve"> This sequence size was necessary since in prior experiments using a lower sampling rate the accuracy decreased too much.</w:t>
+      </w:r>
+    </w:p>
+    <w:tbl>
+      <w:tblPr>
+        <w:tblStyle w:val="TableGrid"/>
+        <w:tblW w:w="10060" w:type="dxa"/>
+        <w:tblLook w:val="04A0" w:firstRow="1" w:lastRow="0" w:firstColumn="1" w:lastColumn="0" w:noHBand="0" w:noVBand="1"/>
+      </w:tblPr>
+      <w:tblGrid>
+        <w:gridCol w:w="1614"/>
+        <w:gridCol w:w="4986"/>
+        <w:gridCol w:w="3460"/>
+      </w:tblGrid>
+      <w:tr>
+        <w:tc>
+          <w:tcPr>
+            <w:tcW w:w="1621" w:type="dxa"/>
+          </w:tcPr>
+          <w:p>
+            <w:pPr>
+              <w:rPr>
+                <w:b/>
+                <w:bCs/>
+                <w:lang w:eastAsia="en-GB"/>
+              </w:rPr>
+            </w:pPr>
+            <w:r>
+              <w:rPr>
+                <w:b/>
+                <w:bCs/>
+                <w:lang w:eastAsia="en-GB"/>
+              </w:rPr>
+              <w:t>Model</w:t>
+            </w:r>
+          </w:p>
+        </w:tc>
+        <w:tc>
+          <w:tcPr>
+            <w:tcW w:w="4751" w:type="dxa"/>
+          </w:tcPr>
+          <w:p>
+            <w:pPr>
+              <w:rPr>
+                <w:b/>
+                <w:bCs/>
+                <w:lang w:eastAsia="en-GB"/>
+              </w:rPr>
+            </w:pPr>
+            <w:r>
+              <w:rPr>
+                <w:b/>
+                <w:bCs/>
+                <w:lang w:eastAsia="en-GB"/>
+              </w:rPr>
+              <w:t>Graph</w:t>
+            </w:r>
+          </w:p>
+        </w:tc>
+        <w:tc>
+          <w:tcPr>
+            <w:tcW w:w="3688" w:type="dxa"/>
+          </w:tcPr>
+          <w:p>
+            <w:pPr>
+              <w:rPr>
+                <w:b/>
+                <w:bCs/>
+                <w:lang w:eastAsia="en-GB"/>
+              </w:rPr>
+            </w:pPr>
+            <w:r>
+              <w:rPr>
+                <w:b/>
+                <w:bCs/>
+                <w:lang w:eastAsia="en-GB"/>
+              </w:rPr>
+              <w:t>Statistics</w:t>
+            </w:r>
+          </w:p>
+        </w:tc>
+      </w:tr>
+      <w:tr>
+        <w:tc>
+          <w:tcPr>
+            <w:tcW w:w="1621" w:type="dxa"/>
+          </w:tcPr>
+          <w:p>
+            <w:pPr>
+              <w:rPr>
+                <w:sz w:val="22"/>
+                <w:szCs w:val="22"/>
+                <w:lang w:eastAsia="en-GB"/>
+              </w:rPr>
+            </w:pPr>
+            <w:r>
+              <w:rPr>
+                <w:sz w:val="22"/>
+                <w:szCs w:val="22"/>
+                <w:lang w:eastAsia="en-GB"/>
+              </w:rPr>
+              <w:t>Convolutional model</w:t>
+            </w:r>
+          </w:p>
+        </w:tc>
+        <w:tc>
+          <w:tcPr>
+            <w:tcW w:w="4751" w:type="dxa"/>
+          </w:tcPr>
+          <w:p>
+            <w:pPr>
+              <w:rPr>
+                <w:lang w:eastAsia="en-GB"/>
+              </w:rPr>
+            </w:pPr>
+            <w:r>
+              <w:rPr>
+                <w:lang w:eastAsia="en-GB"/>
+              </w:rPr>
+              <w:drawing>
+                <wp:inline distT="0" distB="0" distL="0" distR="0" wp14:anchorId="3406A4DB" wp14:editId="394630AB">
+                  <wp:extent cx="3024000" cy="2364124"/>
+                  <wp:effectExtent l="0" t="0" r="5080" b="0"/>
+                  <wp:docPr id="468152905" name="Picture 1"/>
+                  <wp:cNvGraphicFramePr>
+                    <a:graphicFrameLocks xmlns:a="http://schemas.openxmlformats.org/drawingml/2006/main" noChangeAspect="1"/>
+                  </wp:cNvGraphicFramePr>
+                  <a:graphic xmlns:a="http://schemas.openxmlformats.org/drawingml/2006/main">
+                    <a:graphicData uri="http://schemas.openxmlformats.org/drawingml/2006/picture">
+                      <pic:pic xmlns:pic="http://schemas.openxmlformats.org/drawingml/2006/picture">
+                        <pic:nvPicPr>
+                          <pic:cNvPr id="468152905" name=""/>
+                          <pic:cNvPicPr/>
+                        </pic:nvPicPr>
+                        <pic:blipFill>
+                          <a:blip r:embed="rId56"/>
+                          <a:stretch>
+                            <a:fillRect/>
+                          </a:stretch>
+                        </pic:blipFill>
+                        <pic:spPr>
+                          <a:xfrm>
+                            <a:off x="0" y="0"/>
+                            <a:ext cx="3024000" cy="2364124"/>
+                          </a:xfrm>
+                          <a:prstGeom prst="rect">
+                            <a:avLst/>
+                          </a:prstGeom>
+                        </pic:spPr>
+                      </pic:pic>
+                    </a:graphicData>
+                  </a:graphic>
+                </wp:inline>
+              </w:drawing>
+            </w:r>
+          </w:p>
+        </w:tc>
+        <w:tc>
+          <w:tcPr>
+            <w:tcW w:w="3688" w:type="dxa"/>
+          </w:tcPr>
+          <w:p>
+            <w:pPr>
+              <w:rPr>
+                <w:sz w:val="22"/>
+                <w:szCs w:val="22"/>
+                <w:lang w:eastAsia="en-GB"/>
+              </w:rPr>
+            </w:pPr>
+            <w:r>
+              <w:rPr>
+                <w:sz w:val="22"/>
+                <w:szCs w:val="22"/>
+                <w:lang w:eastAsia="en-GB"/>
+              </w:rPr>
+              <w:t xml:space="preserve">Accuracy: </w:t>
+            </w:r>
+            <w:r>
+              <w:rPr>
+                <w:sz w:val="22"/>
+                <w:szCs w:val="22"/>
+                <w:lang w:eastAsia="en-GB"/>
+              </w:rPr>
+              <w:t>~</w:t>
+            </w:r>
+            <w:r>
+              <w:rPr>
+                <w:sz w:val="22"/>
+                <w:szCs w:val="22"/>
+                <w:lang w:eastAsia="en-GB"/>
+              </w:rPr>
+              <w:t>86.5591</w:t>
+            </w:r>
+            <w:r>
+              <w:rPr>
+                <w:sz w:val="22"/>
+                <w:szCs w:val="22"/>
+                <w:lang w:eastAsia="en-GB"/>
+              </w:rPr>
+              <w:t>%</w:t>
+            </w:r>
+          </w:p>
+          <w:p>
+            <w:pPr>
+              <w:rPr>
+                <w:sz w:val="22"/>
+                <w:szCs w:val="22"/>
+                <w:lang w:eastAsia="en-GB"/>
+              </w:rPr>
+            </w:pPr>
+            <w:r>
+              <w:rPr>
+                <w:sz w:val="22"/>
+                <w:szCs w:val="22"/>
+                <w:lang w:eastAsia="en-GB"/>
+              </w:rPr>
+              <w:t>Response time: ~</w:t>
+            </w:r>
+            <w:r>
+              <w:rPr>
+                <w:sz w:val="22"/>
+                <w:szCs w:val="22"/>
+                <w:lang w:eastAsia="en-GB"/>
+              </w:rPr>
+              <w:t>0.52097</w:t>
+            </w:r>
+            <w:r>
+              <w:rPr>
+                <w:sz w:val="22"/>
+                <w:szCs w:val="22"/>
+                <w:lang w:eastAsia="en-GB"/>
+              </w:rPr>
+              <w:t>ms</w:t>
+            </w:r>
+          </w:p>
+          <w:p>
+            <w:pPr>
+              <w:rPr>
+                <w:sz w:val="22"/>
+                <w:szCs w:val="22"/>
+                <w:lang w:eastAsia="en-GB"/>
+              </w:rPr>
+            </w:pPr>
+            <w:r>
+              <w:rPr>
+                <w:sz w:val="22"/>
+                <w:szCs w:val="22"/>
+                <w:lang w:eastAsia="en-GB"/>
+              </w:rPr>
+              <w:t>Training time: ~</w:t>
+            </w:r>
+            <w:r>
+              <w:rPr>
+                <w:sz w:val="22"/>
+                <w:szCs w:val="22"/>
+                <w:lang w:eastAsia="en-GB"/>
+              </w:rPr>
+              <w:t>639.20</w:t>
+            </w:r>
+            <w:r>
+              <w:rPr>
+                <w:sz w:val="22"/>
+                <w:szCs w:val="22"/>
+                <w:lang w:eastAsia="en-GB"/>
+              </w:rPr>
+              <w:t>10</w:t>
+            </w:r>
+            <w:r>
+              <w:rPr>
+                <w:sz w:val="22"/>
+                <w:szCs w:val="22"/>
+                <w:lang w:eastAsia="en-GB"/>
+              </w:rPr>
+              <w:t>s (20 epochs)</w:t>
+            </w:r>
+          </w:p>
+        </w:tc>
+      </w:tr>
+      <w:tr>
+        <w:tc>
+          <w:tcPr>
+            <w:tcW w:w="1621" w:type="dxa"/>
+          </w:tcPr>
+          <w:p>
+            <w:pPr>
+              <w:rPr>
+                <w:sz w:val="22"/>
+                <w:szCs w:val="22"/>
+                <w:lang w:eastAsia="en-GB"/>
+              </w:rPr>
+            </w:pPr>
+            <w:r>
+              <w:rPr>
+                <w:sz w:val="22"/>
+                <w:szCs w:val="22"/>
+                <w:lang w:eastAsia="en-GB"/>
+              </w:rPr>
+              <w:t xml:space="preserve">Convolutional </w:t>
+            </w:r>
+            <w:r>
+              <w:rPr>
+                <w:sz w:val="22"/>
+                <w:szCs w:val="22"/>
+                <w:lang w:eastAsia="en-GB"/>
+              </w:rPr>
+              <w:t>SVM</w:t>
+            </w:r>
+          </w:p>
+        </w:tc>
+        <w:tc>
+          <w:tcPr>
+            <w:tcW w:w="4751" w:type="dxa"/>
+          </w:tcPr>
+          <w:p>
+            <w:pPr>
+              <w:rPr>
+                <w:lang w:eastAsia="en-GB"/>
+              </w:rPr>
+            </w:pPr>
+            <w:r>
+              <w:rPr>
+                <w:lang w:eastAsia="en-GB"/>
+              </w:rPr>
+              <w:drawing>
+                <wp:inline distT="0" distB="0" distL="0" distR="0" wp14:anchorId="433056CA" wp14:editId="4DE421E6">
+                  <wp:extent cx="3024000" cy="2364124"/>
+                  <wp:effectExtent l="0" t="0" r="5080" b="0"/>
+                  <wp:docPr id="77327059" name="Picture 1"/>
+                  <wp:cNvGraphicFramePr>
+                    <a:graphicFrameLocks xmlns:a="http://schemas.openxmlformats.org/drawingml/2006/main" noChangeAspect="1"/>
+                  </wp:cNvGraphicFramePr>
+                  <a:graphic xmlns:a="http://schemas.openxmlformats.org/drawingml/2006/main">
+                    <a:graphicData uri="http://schemas.openxmlformats.org/drawingml/2006/picture">
+                      <pic:pic xmlns:pic="http://schemas.openxmlformats.org/drawingml/2006/picture">
+                        <pic:nvPicPr>
+                          <pic:cNvPr id="77327059" name=""/>
+                          <pic:cNvPicPr/>
+                        </pic:nvPicPr>
+                        <pic:blipFill>
+                          <a:blip r:embed="rId57"/>
+                          <a:stretch>
+                            <a:fillRect/>
+                          </a:stretch>
+                        </pic:blipFill>
+                        <pic:spPr>
+                          <a:xfrm>
+                            <a:off x="0" y="0"/>
+                            <a:ext cx="3024000" cy="2364124"/>
+                          </a:xfrm>
+                          <a:prstGeom prst="rect">
+                            <a:avLst/>
+                          </a:prstGeom>
+                        </pic:spPr>
+                      </pic:pic>
+                    </a:graphicData>
+                  </a:graphic>
+                </wp:inline>
+              </w:drawing>
+            </w:r>
+          </w:p>
+        </w:tc>
+        <w:tc>
+          <w:tcPr>
+            <w:tcW w:w="3688" w:type="dxa"/>
+          </w:tcPr>
+          <w:p>
+            <w:pPr>
+              <w:rPr>
+                <w:sz w:val="22"/>
+                <w:szCs w:val="22"/>
+                <w:lang w:eastAsia="en-GB"/>
+              </w:rPr>
+            </w:pPr>
+            <w:r>
+              <w:rPr>
+                <w:sz w:val="22"/>
+                <w:szCs w:val="22"/>
+                <w:lang w:eastAsia="en-GB"/>
+              </w:rPr>
+              <w:t xml:space="preserve">Accuracy: </w:t>
+            </w:r>
+            <w:r>
+              <w:rPr>
+                <w:sz w:val="22"/>
+                <w:szCs w:val="22"/>
+                <w:lang w:eastAsia="en-GB"/>
+              </w:rPr>
+              <w:t>~</w:t>
+            </w:r>
+            <w:r>
+              <w:rPr>
+                <w:sz w:val="22"/>
+                <w:szCs w:val="22"/>
+                <w:lang w:eastAsia="en-GB"/>
+              </w:rPr>
+              <w:t>92.531</w:t>
+            </w:r>
+            <w:r>
+              <w:rPr>
+                <w:sz w:val="22"/>
+                <w:szCs w:val="22"/>
+                <w:lang w:eastAsia="en-GB"/>
+              </w:rPr>
+              <w:t>9</w:t>
+            </w:r>
+            <w:r>
+              <w:rPr>
+                <w:sz w:val="22"/>
+                <w:szCs w:val="22"/>
+                <w:lang w:eastAsia="en-GB"/>
+              </w:rPr>
+              <w:t>%</w:t>
+            </w:r>
+          </w:p>
+          <w:p>
+            <w:pPr>
+              <w:rPr>
+                <w:sz w:val="22"/>
+                <w:szCs w:val="22"/>
+                <w:lang w:eastAsia="en-GB"/>
+              </w:rPr>
+            </w:pPr>
+            <w:r>
+              <w:rPr>
+                <w:sz w:val="22"/>
+                <w:szCs w:val="22"/>
+                <w:lang w:eastAsia="en-GB"/>
+              </w:rPr>
+              <w:t>Response time: ~</w:t>
+            </w:r>
+            <w:r>
+              <w:rPr>
+                <w:sz w:val="22"/>
+                <w:szCs w:val="22"/>
+                <w:lang w:eastAsia="en-GB"/>
+              </w:rPr>
+              <w:t>0.4667</w:t>
+            </w:r>
+            <w:r>
+              <w:rPr>
+                <w:sz w:val="22"/>
+                <w:szCs w:val="22"/>
+                <w:lang w:eastAsia="en-GB"/>
+              </w:rPr>
+              <w:t>4</w:t>
+            </w:r>
+            <w:r>
+              <w:rPr>
+                <w:sz w:val="22"/>
+                <w:szCs w:val="22"/>
+                <w:lang w:eastAsia="en-GB"/>
+              </w:rPr>
+              <w:t>ms</w:t>
+            </w:r>
+          </w:p>
+          <w:p>
+            <w:pPr>
+              <w:rPr>
+                <w:sz w:val="22"/>
+                <w:szCs w:val="22"/>
+                <w:lang w:eastAsia="en-GB"/>
+              </w:rPr>
+            </w:pPr>
+            <w:r>
+              <w:rPr>
+                <w:sz w:val="22"/>
+                <w:szCs w:val="22"/>
+                <w:lang w:eastAsia="en-GB"/>
+              </w:rPr>
+              <w:t>Training time: ~</w:t>
+            </w:r>
+            <w:r>
+              <w:rPr>
+                <w:sz w:val="22"/>
+                <w:szCs w:val="22"/>
+                <w:lang w:eastAsia="en-GB"/>
+              </w:rPr>
+              <w:t>624.4349</w:t>
+            </w:r>
+            <w:r>
+              <w:rPr>
+                <w:sz w:val="22"/>
+                <w:szCs w:val="22"/>
+                <w:lang w:eastAsia="en-GB"/>
+              </w:rPr>
+              <w:t>s (20 epochs)</w:t>
+            </w:r>
+          </w:p>
+        </w:tc>
+      </w:tr>
+      <w:tr>
+        <w:tc>
+          <w:tcPr>
+            <w:tcW w:w="1621" w:type="dxa"/>
+          </w:tcPr>
+          <w:p>
+            <w:pPr>
+              <w:rPr>
+                <w:sz w:val="22"/>
+                <w:szCs w:val="22"/>
+                <w:lang w:eastAsia="en-GB"/>
+              </w:rPr>
+            </w:pPr>
+            <w:r>
+              <w:rPr>
+                <w:sz w:val="22"/>
+                <w:szCs w:val="22"/>
+                <w:lang w:eastAsia="en-GB"/>
+              </w:rPr>
+              <w:t>FFT linear model</w:t>
+            </w:r>
+          </w:p>
+        </w:tc>
+        <w:tc>
+          <w:tcPr>
+            <w:tcW w:w="4751" w:type="dxa"/>
+          </w:tcPr>
+          <w:p>
+            <w:r>
+              <w:drawing>
+                <wp:inline distT="0" distB="0" distL="0" distR="0" wp14:anchorId="2F5C2DFA" wp14:editId="54096A47">
+                  <wp:extent cx="3024000" cy="2364124"/>
+                  <wp:effectExtent l="0" t="0" r="5080" b="0"/>
+                  <wp:docPr id="2011370578" name="Picture 1"/>
+                  <wp:cNvGraphicFramePr>
+                    <a:graphicFrameLocks xmlns:a="http://schemas.openxmlformats.org/drawingml/2006/main" noChangeAspect="1"/>
+                  </wp:cNvGraphicFramePr>
+                  <a:graphic xmlns:a="http://schemas.openxmlformats.org/drawingml/2006/main">
+                    <a:graphicData uri="http://schemas.openxmlformats.org/drawingml/2006/picture">
+                      <pic:pic xmlns:pic="http://schemas.openxmlformats.org/drawingml/2006/picture">
+                        <pic:nvPicPr>
+                          <pic:cNvPr id="2011370578" name=""/>
+                          <pic:cNvPicPr/>
+                        </pic:nvPicPr>
+                        <pic:blipFill>
+                          <a:blip r:embed="rId58"/>
+                          <a:stretch>
+                            <a:fillRect/>
+                          </a:stretch>
+                        </pic:blipFill>
+                        <pic:spPr>
+                          <a:xfrm>
+                            <a:off x="0" y="0"/>
+                            <a:ext cx="3024000" cy="2364124"/>
+                          </a:xfrm>
+                          <a:prstGeom prst="rect">
+                            <a:avLst/>
+                          </a:prstGeom>
+                        </pic:spPr>
+                      </pic:pic>
+                    </a:graphicData>
+                  </a:graphic>
+                </wp:inline>
+              </w:drawing>
+            </w:r>
+          </w:p>
+        </w:tc>
+        <w:tc>
+          <w:tcPr>
+            <w:tcW w:w="3688" w:type="dxa"/>
+          </w:tcPr>
+          <w:p>
+            <w:pPr>
+              <w:rPr>
+                <w:sz w:val="22"/>
+                <w:szCs w:val="22"/>
+                <w:lang w:eastAsia="en-GB"/>
+              </w:rPr>
+            </w:pPr>
+            <w:r>
+              <w:rPr>
+                <w:sz w:val="22"/>
+                <w:szCs w:val="22"/>
+                <w:lang w:eastAsia="en-GB"/>
+              </w:rPr>
+              <w:t xml:space="preserve">Accuracy: </w:t>
+            </w:r>
+            <w:r>
+              <w:rPr>
+                <w:sz w:val="22"/>
+                <w:szCs w:val="22"/>
+                <w:lang w:eastAsia="en-GB"/>
+              </w:rPr>
+              <w:t>~</w:t>
+            </w:r>
+            <w:r>
+              <w:rPr>
+                <w:sz w:val="22"/>
+                <w:szCs w:val="22"/>
+                <w:lang w:eastAsia="en-GB"/>
+              </w:rPr>
+              <w:t>87.3216</w:t>
+            </w:r>
+            <w:r>
+              <w:rPr>
+                <w:sz w:val="22"/>
+                <w:szCs w:val="22"/>
+                <w:lang w:eastAsia="en-GB"/>
+              </w:rPr>
+              <w:t>%</w:t>
+            </w:r>
+          </w:p>
+          <w:p>
+            <w:pPr>
+              <w:rPr>
+                <w:sz w:val="22"/>
+                <w:szCs w:val="22"/>
+                <w:lang w:eastAsia="en-GB"/>
+              </w:rPr>
+            </w:pPr>
+            <w:r>
+              <w:rPr>
+                <w:sz w:val="22"/>
+                <w:szCs w:val="22"/>
+                <w:lang w:eastAsia="en-GB"/>
+              </w:rPr>
+              <w:t>Response time: ~</w:t>
+            </w:r>
+            <w:r>
+              <w:rPr>
+                <w:sz w:val="22"/>
+                <w:szCs w:val="22"/>
+                <w:lang w:eastAsia="en-GB"/>
+              </w:rPr>
+              <w:t>0.4299</w:t>
+            </w:r>
+            <w:r>
+              <w:rPr>
+                <w:sz w:val="22"/>
+                <w:szCs w:val="22"/>
+                <w:lang w:eastAsia="en-GB"/>
+              </w:rPr>
+              <w:t>9</w:t>
+            </w:r>
+            <w:r>
+              <w:rPr>
+                <w:sz w:val="22"/>
+                <w:szCs w:val="22"/>
+                <w:lang w:eastAsia="en-GB"/>
+              </w:rPr>
+              <w:t>ms</w:t>
+            </w:r>
+          </w:p>
+          <w:p>
+            <w:pPr>
+              <w:rPr>
+                <w:sz w:val="22"/>
+                <w:szCs w:val="22"/>
+                <w:lang w:eastAsia="en-GB"/>
+              </w:rPr>
+            </w:pPr>
+            <w:r>
+              <w:rPr>
+                <w:sz w:val="22"/>
+                <w:szCs w:val="22"/>
+                <w:lang w:eastAsia="en-GB"/>
+              </w:rPr>
+              <w:t>Training time: ~</w:t>
+            </w:r>
+            <w:r>
+              <w:rPr>
+                <w:sz w:val="22"/>
+                <w:szCs w:val="22"/>
+                <w:lang w:eastAsia="en-GB"/>
+              </w:rPr>
+              <w:t>481.9033</w:t>
+            </w:r>
+            <w:r>
+              <w:rPr>
+                <w:sz w:val="22"/>
+                <w:szCs w:val="22"/>
+                <w:lang w:eastAsia="en-GB"/>
+              </w:rPr>
+              <w:t>s (20 epochs)</w:t>
+            </w:r>
+          </w:p>
+        </w:tc>
+      </w:tr>
+    </w:tbl>
+    <w:p>
+      <w:pPr>
+        <w:rPr>
+          <w:lang w:eastAsia="en-GB"/>
+        </w:rPr>
+      </w:pPr>
+      <w:r>
+        <w:rPr>
+          <w:lang w:eastAsia="en-GB"/>
+        </w:rPr>
+        <w:lastRenderedPageBreak/>
+        <w:t>Where each model compared, less sequences used again for training (50.000 sequences)</w:t>
+      </w:r>
+    </w:p>
+    <w:tbl>
+      <w:tblPr>
+        <w:tblStyle w:val="PlainTable4"/>
+        <w:tblW w:w="0" w:type="auto"/>
+        <w:tblCellMar>
+          <w:top w:w="57" w:type="dxa"/>
+          <w:bottom w:w="57" w:type="dxa"/>
+        </w:tblCellMar>
+        <w:tblLook w:val="04A0" w:firstRow="1" w:lastRow="0" w:firstColumn="1" w:lastColumn="0" w:noHBand="0" w:noVBand="1"/>
+      </w:tblPr>
+      <w:tblGrid>
+        <w:gridCol w:w="4508"/>
+        <w:gridCol w:w="4508"/>
+      </w:tblGrid>
+      <w:tr>
+        <w:trPr>
+          <w:cnfStyle w:val="100000000000" w:firstRow="1" w:lastRow="0" w:firstColumn="0" w:lastColumn="0" w:oddVBand="0" w:evenVBand="0" w:oddHBand="0" w:evenHBand="0" w:firstRowFirstColumn="0" w:firstRowLastColumn="0" w:lastRowFirstColumn="0" w:lastRowLastColumn="0"/>
+        </w:trPr>
+        <w:tc>
+          <w:tcPr>
+            <w:cnfStyle w:val="001000000000" w:firstRow="0" w:lastRow="0" w:firstColumn="1" w:lastColumn="0" w:oddVBand="0" w:evenVBand="0" w:oddHBand="0" w:evenHBand="0" w:firstRowFirstColumn="0" w:firstRowLastColumn="0" w:lastRowFirstColumn="0" w:lastRowLastColumn="0"/>
+            <w:tcW w:w="4508" w:type="dxa"/>
+          </w:tcPr>
+          <w:p>
+            <w:pPr>
+              <w:rPr>
+                <w:lang w:eastAsia="en-GB"/>
+              </w:rPr>
+            </w:pPr>
+            <w:r>
+              <w:rPr>
+                <w:lang w:eastAsia="en-GB"/>
+              </w:rPr>
+              <w:drawing>
+                <wp:inline distT="0" distB="0" distL="0" distR="0" wp14:anchorId="0AE6CFAF" wp14:editId="06B4D4ED">
+                  <wp:extent cx="2700000" cy="2185943"/>
+                  <wp:effectExtent l="0" t="0" r="5715" b="5080"/>
+                  <wp:docPr id="1732973649" name="Picture 1"/>
+                  <wp:cNvGraphicFramePr>
+                    <a:graphicFrameLocks xmlns:a="http://schemas.openxmlformats.org/drawingml/2006/main" noChangeAspect="1"/>
+                  </wp:cNvGraphicFramePr>
+                  <a:graphic xmlns:a="http://schemas.openxmlformats.org/drawingml/2006/main">
+                    <a:graphicData uri="http://schemas.openxmlformats.org/drawingml/2006/picture">
+                      <pic:pic xmlns:pic="http://schemas.openxmlformats.org/drawingml/2006/picture">
+                        <pic:nvPicPr>
+                          <pic:cNvPr id="1732973649" name=""/>
+                          <pic:cNvPicPr/>
+                        </pic:nvPicPr>
+                        <pic:blipFill>
+                          <a:blip r:embed="rId59"/>
+                          <a:stretch>
+                            <a:fillRect/>
+                          </a:stretch>
+                        </pic:blipFill>
+                        <pic:spPr>
+                          <a:xfrm>
+                            <a:off x="0" y="0"/>
+                            <a:ext cx="2700000" cy="2185943"/>
+                          </a:xfrm>
+                          <a:prstGeom prst="rect">
+                            <a:avLst/>
+                          </a:prstGeom>
+                        </pic:spPr>
+                      </pic:pic>
+                    </a:graphicData>
+                  </a:graphic>
+                </wp:inline>
+              </w:drawing>
+            </w:r>
+          </w:p>
+        </w:tc>
+        <w:tc>
+          <w:tcPr>
+            <w:tcW w:w="4508" w:type="dxa"/>
+          </w:tcPr>
+          <w:p>
+            <w:pPr>
+              <w:cnfStyle w:val="100000000000" w:firstRow="1" w:lastRow="0" w:firstColumn="0" w:lastColumn="0" w:oddVBand="0" w:evenVBand="0" w:oddHBand="0" w:evenHBand="0" w:firstRowFirstColumn="0" w:firstRowLastColumn="0" w:lastRowFirstColumn="0" w:lastRowLastColumn="0"/>
+              <w:rPr>
+                <w:lang w:eastAsia="en-GB"/>
+              </w:rPr>
+            </w:pPr>
+            <w:r>
+              <w:rPr>
+                <w:lang w:eastAsia="en-GB"/>
+              </w:rPr>
+              <w:drawing>
+                <wp:inline distT="0" distB="0" distL="0" distR="0" wp14:anchorId="222067DD" wp14:editId="6F695EE4">
+                  <wp:extent cx="2700000" cy="2151489"/>
+                  <wp:effectExtent l="0" t="0" r="5715" b="1270"/>
+                  <wp:docPr id="1920216232" name="Picture 1"/>
+                  <wp:cNvGraphicFramePr>
+                    <a:graphicFrameLocks xmlns:a="http://schemas.openxmlformats.org/drawingml/2006/main" noChangeAspect="1"/>
+                  </wp:cNvGraphicFramePr>
+                  <a:graphic xmlns:a="http://schemas.openxmlformats.org/drawingml/2006/main">
+                    <a:graphicData uri="http://schemas.openxmlformats.org/drawingml/2006/picture">
+                      <pic:pic xmlns:pic="http://schemas.openxmlformats.org/drawingml/2006/picture">
+                        <pic:nvPicPr>
+                          <pic:cNvPr id="1920216232" name=""/>
+                          <pic:cNvPicPr/>
+                        </pic:nvPicPr>
+                        <pic:blipFill>
+                          <a:blip r:embed="rId60"/>
+                          <a:stretch>
+                            <a:fillRect/>
+                          </a:stretch>
+                        </pic:blipFill>
+                        <pic:spPr>
+                          <a:xfrm>
+                            <a:off x="0" y="0"/>
+                            <a:ext cx="2700000" cy="2151489"/>
+                          </a:xfrm>
+                          <a:prstGeom prst="rect">
+                            <a:avLst/>
+                          </a:prstGeom>
+                        </pic:spPr>
+                      </pic:pic>
+                    </a:graphicData>
+                  </a:graphic>
+                </wp:inline>
+              </w:drawing>
+            </w:r>
+          </w:p>
+        </w:tc>
+      </w:tr>
+      <w:tr>
+        <w:trPr>
+          <w:cnfStyle w:val="000000100000" w:firstRow="0" w:lastRow="0" w:firstColumn="0" w:lastColumn="0" w:oddVBand="0" w:evenVBand="0" w:oddHBand="1" w:evenHBand="0" w:firstRowFirstColumn="0" w:firstRowLastColumn="0" w:lastRowFirstColumn="0" w:lastRowLastColumn="0"/>
+        </w:trPr>
+        <w:tc>
+          <w:tcPr>
+            <w:cnfStyle w:val="001000000000" w:firstRow="0" w:lastRow="0" w:firstColumn="1" w:lastColumn="0" w:oddVBand="0" w:evenVBand="0" w:oddHBand="0" w:evenHBand="0" w:firstRowFirstColumn="0" w:firstRowLastColumn="0" w:lastRowFirstColumn="0" w:lastRowLastColumn="0"/>
+            <w:tcW w:w="4508" w:type="dxa"/>
+          </w:tcPr>
+          <w:p>
+            <w:pPr>
+              <w:rPr>
+                <w:b w:val="0"/>
+                <w:bCs w:val="0"/>
+                <w:lang w:eastAsia="en-GB"/>
+              </w:rPr>
+            </w:pPr>
+            <w:r>
+              <w:rPr>
+                <w:b w:val="0"/>
+                <w:bCs w:val="0"/>
+                <w:lang w:eastAsia="en-GB"/>
+              </w:rPr>
+              <w:drawing>
+                <wp:inline distT="0" distB="0" distL="0" distR="0" wp14:anchorId="467A7CAD" wp14:editId="4823BDD0">
+                  <wp:extent cx="2700000" cy="2151489"/>
+                  <wp:effectExtent l="0" t="0" r="5715" b="1270"/>
+                  <wp:docPr id="1714778376" name="Picture 1"/>
+                  <wp:cNvGraphicFramePr>
+                    <a:graphicFrameLocks xmlns:a="http://schemas.openxmlformats.org/drawingml/2006/main" noChangeAspect="1"/>
+                  </wp:cNvGraphicFramePr>
+                  <a:graphic xmlns:a="http://schemas.openxmlformats.org/drawingml/2006/main">
+                    <a:graphicData uri="http://schemas.openxmlformats.org/drawingml/2006/picture">
+                      <pic:pic xmlns:pic="http://schemas.openxmlformats.org/drawingml/2006/picture">
+                        <pic:nvPicPr>
+                          <pic:cNvPr id="1714778376" name=""/>
+                          <pic:cNvPicPr/>
+                        </pic:nvPicPr>
+                        <pic:blipFill>
+                          <a:blip r:embed="rId61"/>
+                          <a:stretch>
+                            <a:fillRect/>
+                          </a:stretch>
+                        </pic:blipFill>
+                        <pic:spPr>
+                          <a:xfrm>
+                            <a:off x="0" y="0"/>
+                            <a:ext cx="2700000" cy="2151489"/>
+                          </a:xfrm>
+                          <a:prstGeom prst="rect">
+                            <a:avLst/>
+                          </a:prstGeom>
+                        </pic:spPr>
+                      </pic:pic>
+                    </a:graphicData>
+                  </a:graphic>
+                </wp:inline>
+              </w:drawing>
+            </w:r>
+          </w:p>
+        </w:tc>
+        <w:tc>
+          <w:tcPr>
+            <w:tcW w:w="4508" w:type="dxa"/>
+          </w:tcPr>
+          <w:p>
+            <w:pPr>
+              <w:cnfStyle w:val="000000100000" w:firstRow="0" w:lastRow="0" w:firstColumn="0" w:lastColumn="0" w:oddVBand="0" w:evenVBand="0" w:oddHBand="1" w:evenHBand="0" w:firstRowFirstColumn="0" w:firstRowLastColumn="0" w:lastRowFirstColumn="0" w:lastRowLastColumn="0"/>
+              <w:rPr>
+                <w:lang w:eastAsia="en-GB"/>
+              </w:rPr>
+            </w:pPr>
+            <w:r>
+              <w:rPr>
+                <w:lang w:eastAsia="en-GB"/>
+              </w:rPr>
+              <w:drawing>
+                <wp:inline distT="0" distB="0" distL="0" distR="0" wp14:anchorId="73EFE46E" wp14:editId="00720B5A">
+                  <wp:extent cx="2700000" cy="2166667"/>
+                  <wp:effectExtent l="0" t="0" r="5715" b="5080"/>
+                  <wp:docPr id="1040824930" name="Picture 1"/>
+                  <wp:cNvGraphicFramePr>
+                    <a:graphicFrameLocks xmlns:a="http://schemas.openxmlformats.org/drawingml/2006/main" noChangeAspect="1"/>
+                  </wp:cNvGraphicFramePr>
+                  <a:graphic xmlns:a="http://schemas.openxmlformats.org/drawingml/2006/main">
+                    <a:graphicData uri="http://schemas.openxmlformats.org/drawingml/2006/picture">
+                      <pic:pic xmlns:pic="http://schemas.openxmlformats.org/drawingml/2006/picture">
+                        <pic:nvPicPr>
+                          <pic:cNvPr id="1040824930" name=""/>
+                          <pic:cNvPicPr/>
+                        </pic:nvPicPr>
+                        <pic:blipFill>
+                          <a:blip r:embed="rId62"/>
+                          <a:stretch>
+                            <a:fillRect/>
+                          </a:stretch>
+                        </pic:blipFill>
+                        <pic:spPr>
+                          <a:xfrm>
+                            <a:off x="0" y="0"/>
+                            <a:ext cx="2700000" cy="2166667"/>
+                          </a:xfrm>
+                          <a:prstGeom prst="rect">
+                            <a:avLst/>
+                          </a:prstGeom>
+                        </pic:spPr>
+                      </pic:pic>
+                    </a:graphicData>
+                  </a:graphic>
+                </wp:inline>
+              </w:drawing>
+            </w:r>
+          </w:p>
+        </w:tc>
+      </w:tr>
+    </w:tbl>
+    <w:p>
+      <w:pPr>
+        <w:rPr>
+          <w:rFonts w:asciiTheme="majorHAnsi" w:hAnsiTheme="majorHAnsi"/>
+          <w:sz w:val="40"/>
+          <w:szCs w:val="40"/>
+          <w:lang w:eastAsia="en-GB"/>
+        </w:rPr>
+      </w:pPr>
+      <w:r>
+        <w:rPr>
+          <w:lang w:eastAsia="en-GB"/>
+        </w:rPr>
+        <w:br w:type="page"/>
+      </w:r>
+    </w:p>
+    <w:p>
+      <w:pPr>
+        <w:pStyle w:val="Heading3"/>
+        <w:rPr>
+          <w:lang w:eastAsia="en-GB"/>
+        </w:rPr>
+      </w:pPr>
+      <w:r>
+        <w:rPr>
+          <w:lang w:eastAsia="en-GB"/>
+        </w:rPr>
+        <w:lastRenderedPageBreak/>
+        <w:t>256</w:t>
+      </w:r>
+      <w:r>
+        <w:rPr>
+          <w:lang w:eastAsia="en-GB"/>
+        </w:rPr>
+        <w:t xml:space="preserve"> samples using every </w:t>
+      </w:r>
+      <w:r>
+        <w:rPr>
+          <w:lang w:eastAsia="en-GB"/>
+        </w:rPr>
+        <w:t>4</w:t>
+      </w:r>
+      <w:r>
+        <w:rPr>
+          <w:vertAlign w:val="superscript"/>
+          <w:lang w:eastAsia="en-GB"/>
+        </w:rPr>
+        <w:t>th</w:t>
+      </w:r>
+      <w:r>
+        <w:rPr>
+          <w:lang w:eastAsia="en-GB"/>
+        </w:rPr>
+        <w:t xml:space="preserve"> </w:t>
+      </w:r>
+      <w:r>
+        <w:rPr>
+          <w:lang w:eastAsia="en-GB"/>
+        </w:rPr>
+        <w:t>sample</w:t>
+      </w:r>
+    </w:p>
+    <w:p>
+      <w:pPr>
+        <w:rPr>
+          <w:lang w:eastAsia="en-GB"/>
+        </w:rPr>
+      </w:pPr>
+      <w:r>
+        <w:rPr>
+          <w:lang w:eastAsia="en-GB"/>
+        </w:rPr>
+        <w:t xml:space="preserve">To also test on lower sampling rates sequence of </w:t>
+      </w:r>
+      <w:r>
+        <w:rPr>
+          <w:lang w:eastAsia="en-GB"/>
+        </w:rPr>
+        <w:t>1024</w:t>
+      </w:r>
+      <w:r>
+        <w:rPr>
+          <w:lang w:eastAsia="en-GB"/>
+        </w:rPr>
+        <w:t xml:space="preserve"> sequence length were generated and then every </w:t>
+      </w:r>
+      <w:r>
+        <w:rPr>
+          <w:lang w:eastAsia="en-GB"/>
+        </w:rPr>
+        <w:t>4</w:t>
+      </w:r>
+      <w:r>
+        <w:rPr>
+          <w:vertAlign w:val="superscript"/>
+          <w:lang w:eastAsia="en-GB"/>
+        </w:rPr>
+        <w:t>th</w:t>
+      </w:r>
+      <w:r>
+        <w:rPr>
+          <w:lang w:eastAsia="en-GB"/>
+        </w:rPr>
+        <w:t xml:space="preserve"> </w:t>
+      </w:r>
+      <w:r>
+        <w:rPr>
+          <w:lang w:eastAsia="en-GB"/>
+        </w:rPr>
+        <w:t xml:space="preserve">sample was taken simulating a sequence that is </w:t>
+      </w:r>
+      <w:r>
+        <w:rPr>
+          <w:lang w:eastAsia="en-GB"/>
+        </w:rPr>
+        <w:t xml:space="preserve">256 </w:t>
+      </w:r>
+      <w:r>
+        <w:rPr>
+          <w:lang w:eastAsia="en-GB"/>
+        </w:rPr>
+        <w:t>samples long with a sampling rate that is 50% of the original sampling rate.</w:t>
+      </w:r>
+      <w:r>
+        <w:rPr>
+          <w:lang w:eastAsia="en-GB"/>
+        </w:rPr>
+        <w:t xml:space="preserve"> To see if </w:t>
+      </w:r>
+      <w:r>
+        <w:rPr>
+          <w:lang w:eastAsia="en-GB"/>
+        </w:rPr>
+        <w:t>with even lower sampling rates the result can be viable.</w:t>
+      </w:r>
+    </w:p>
+    <w:tbl>
+      <w:tblPr>
+        <w:tblStyle w:val="TableGrid"/>
+        <w:tblW w:w="10060" w:type="dxa"/>
+        <w:tblLook w:val="04A0" w:firstRow="1" w:lastRow="0" w:firstColumn="1" w:lastColumn="0" w:noHBand="0" w:noVBand="1"/>
+      </w:tblPr>
+      <w:tblGrid>
+        <w:gridCol w:w="1614"/>
+        <w:gridCol w:w="4986"/>
+        <w:gridCol w:w="3460"/>
+      </w:tblGrid>
+      <w:tr>
+        <w:tc>
+          <w:tcPr>
+            <w:tcW w:w="1621" w:type="dxa"/>
+          </w:tcPr>
+          <w:p>
+            <w:pPr>
+              <w:rPr>
+                <w:b/>
+                <w:bCs/>
+                <w:lang w:eastAsia="en-GB"/>
+              </w:rPr>
+            </w:pPr>
+            <w:r>
+              <w:rPr>
+                <w:b/>
+                <w:bCs/>
+                <w:lang w:eastAsia="en-GB"/>
+              </w:rPr>
+              <w:t>Model</w:t>
+            </w:r>
+          </w:p>
+        </w:tc>
+        <w:tc>
+          <w:tcPr>
+            <w:tcW w:w="4751" w:type="dxa"/>
+          </w:tcPr>
+          <w:p>
+            <w:pPr>
+              <w:rPr>
+                <w:b/>
+                <w:bCs/>
+                <w:lang w:eastAsia="en-GB"/>
+              </w:rPr>
+            </w:pPr>
+            <w:r>
+              <w:rPr>
+                <w:b/>
+                <w:bCs/>
+                <w:lang w:eastAsia="en-GB"/>
+              </w:rPr>
+              <w:t>Graph</w:t>
+            </w:r>
+          </w:p>
+        </w:tc>
+        <w:tc>
+          <w:tcPr>
+            <w:tcW w:w="3688" w:type="dxa"/>
+          </w:tcPr>
+          <w:p>
+            <w:pPr>
+              <w:rPr>
+                <w:b/>
+                <w:bCs/>
+                <w:lang w:eastAsia="en-GB"/>
+              </w:rPr>
+            </w:pPr>
+            <w:r>
+              <w:rPr>
+                <w:b/>
+                <w:bCs/>
+                <w:lang w:eastAsia="en-GB"/>
+              </w:rPr>
+              <w:t>Statistics</w:t>
+            </w:r>
+          </w:p>
+        </w:tc>
+      </w:tr>
+      <w:tr>
+        <w:tc>
+          <w:tcPr>
+            <w:tcW w:w="1621" w:type="dxa"/>
+          </w:tcPr>
+          <w:p>
+            <w:pPr>
+              <w:rPr>
+                <w:sz w:val="22"/>
+                <w:szCs w:val="22"/>
+                <w:lang w:eastAsia="en-GB"/>
+              </w:rPr>
+            </w:pPr>
+            <w:r>
+              <w:rPr>
+                <w:sz w:val="22"/>
+                <w:szCs w:val="22"/>
+                <w:lang w:eastAsia="en-GB"/>
+              </w:rPr>
+              <w:t>Convolutional model</w:t>
+            </w:r>
+          </w:p>
+        </w:tc>
+        <w:tc>
+          <w:tcPr>
+            <w:tcW w:w="4751" w:type="dxa"/>
+          </w:tcPr>
+          <w:p>
+            <w:pPr>
+              <w:rPr>
+                <w:lang w:eastAsia="en-GB"/>
+              </w:rPr>
+            </w:pPr>
+            <w:r>
+              <w:rPr>
+                <w:lang w:eastAsia="en-GB"/>
+              </w:rPr>
+              <w:drawing>
+                <wp:inline distT="0" distB="0" distL="0" distR="0" wp14:anchorId="68205C2C" wp14:editId="7C95E257">
+                  <wp:extent cx="3024000" cy="2364124"/>
+                  <wp:effectExtent l="0" t="0" r="5080" b="0"/>
+                  <wp:docPr id="1260182811" name="Picture 1"/>
+                  <wp:cNvGraphicFramePr>
+                    <a:graphicFrameLocks xmlns:a="http://schemas.openxmlformats.org/drawingml/2006/main" noChangeAspect="1"/>
+                  </wp:cNvGraphicFramePr>
+                  <a:graphic xmlns:a="http://schemas.openxmlformats.org/drawingml/2006/main">
+                    <a:graphicData uri="http://schemas.openxmlformats.org/drawingml/2006/picture">
+                      <pic:pic xmlns:pic="http://schemas.openxmlformats.org/drawingml/2006/picture">
+                        <pic:nvPicPr>
+                          <pic:cNvPr id="1260182811" name=""/>
+                          <pic:cNvPicPr/>
+                        </pic:nvPicPr>
+                        <pic:blipFill>
+                          <a:blip r:embed="rId63"/>
+                          <a:stretch>
+                            <a:fillRect/>
+                          </a:stretch>
+                        </pic:blipFill>
+                        <pic:spPr>
+                          <a:xfrm>
+                            <a:off x="0" y="0"/>
+                            <a:ext cx="3024000" cy="2364124"/>
+                          </a:xfrm>
+                          <a:prstGeom prst="rect">
+                            <a:avLst/>
+                          </a:prstGeom>
+                        </pic:spPr>
+                      </pic:pic>
+                    </a:graphicData>
+                  </a:graphic>
+                </wp:inline>
+              </w:drawing>
+            </w:r>
+          </w:p>
+        </w:tc>
+        <w:tc>
+          <w:tcPr>
+            <w:tcW w:w="3688" w:type="dxa"/>
+          </w:tcPr>
+          <w:p>
+            <w:pPr>
+              <w:rPr>
+                <w:sz w:val="22"/>
+                <w:szCs w:val="22"/>
+                <w:lang w:eastAsia="en-GB"/>
+              </w:rPr>
+            </w:pPr>
+            <w:r>
+              <w:rPr>
+                <w:sz w:val="22"/>
+                <w:szCs w:val="22"/>
+                <w:lang w:eastAsia="en-GB"/>
+              </w:rPr>
+              <w:t xml:space="preserve">Accuracy: </w:t>
+            </w:r>
+            <w:r>
+              <w:rPr>
+                <w:sz w:val="22"/>
+                <w:szCs w:val="22"/>
+                <w:lang w:eastAsia="en-GB"/>
+              </w:rPr>
+              <w:t>~</w:t>
+            </w:r>
+            <w:r>
+              <w:rPr>
+                <w:sz w:val="22"/>
+                <w:szCs w:val="22"/>
+                <w:lang w:eastAsia="en-GB"/>
+              </w:rPr>
+              <w:t>72.486</w:t>
+            </w:r>
+            <w:r>
+              <w:rPr>
+                <w:sz w:val="22"/>
+                <w:szCs w:val="22"/>
+                <w:lang w:eastAsia="en-GB"/>
+              </w:rPr>
+              <w:t>7</w:t>
+            </w:r>
+            <w:r>
+              <w:rPr>
+                <w:sz w:val="22"/>
+                <w:szCs w:val="22"/>
+                <w:lang w:eastAsia="en-GB"/>
+              </w:rPr>
+              <w:t>%</w:t>
+            </w:r>
+          </w:p>
+          <w:p>
+            <w:pPr>
+              <w:rPr>
+                <w:sz w:val="22"/>
+                <w:szCs w:val="22"/>
+                <w:lang w:eastAsia="en-GB"/>
+              </w:rPr>
+            </w:pPr>
+            <w:r>
+              <w:rPr>
+                <w:sz w:val="22"/>
+                <w:szCs w:val="22"/>
+                <w:lang w:eastAsia="en-GB"/>
+              </w:rPr>
+              <w:t>Response time: ~</w:t>
+            </w:r>
+            <w:r>
+              <w:rPr>
+                <w:sz w:val="22"/>
+                <w:szCs w:val="22"/>
+                <w:lang w:eastAsia="en-GB"/>
+              </w:rPr>
+              <w:t>0.54716</w:t>
+            </w:r>
+            <w:r>
+              <w:rPr>
+                <w:sz w:val="22"/>
+                <w:szCs w:val="22"/>
+                <w:lang w:eastAsia="en-GB"/>
+              </w:rPr>
+              <w:t>ms</w:t>
+            </w:r>
+          </w:p>
+          <w:p>
+            <w:pPr>
+              <w:rPr>
+                <w:sz w:val="22"/>
+                <w:szCs w:val="22"/>
+                <w:lang w:eastAsia="en-GB"/>
+              </w:rPr>
+            </w:pPr>
+            <w:r>
+              <w:rPr>
+                <w:sz w:val="22"/>
+                <w:szCs w:val="22"/>
+                <w:lang w:eastAsia="en-GB"/>
+              </w:rPr>
+              <w:t>Training time: ~</w:t>
+            </w:r>
+            <w:r>
+              <w:rPr>
+                <w:sz w:val="22"/>
+                <w:szCs w:val="22"/>
+                <w:lang w:eastAsia="en-GB"/>
+              </w:rPr>
+              <w:t>599.5033</w:t>
+            </w:r>
+            <w:r>
+              <w:rPr>
+                <w:sz w:val="22"/>
+                <w:szCs w:val="22"/>
+                <w:lang w:eastAsia="en-GB"/>
+              </w:rPr>
+              <w:t>s (20 epochs)</w:t>
+            </w:r>
+          </w:p>
+        </w:tc>
+      </w:tr>
+      <w:tr>
+        <w:tc>
+          <w:tcPr>
+            <w:tcW w:w="1621" w:type="dxa"/>
+          </w:tcPr>
+          <w:p>
+            <w:pPr>
+              <w:rPr>
+                <w:sz w:val="22"/>
+                <w:szCs w:val="22"/>
+                <w:lang w:eastAsia="en-GB"/>
+              </w:rPr>
+            </w:pPr>
+            <w:r>
+              <w:rPr>
+                <w:sz w:val="22"/>
+                <w:szCs w:val="22"/>
+                <w:lang w:eastAsia="en-GB"/>
+              </w:rPr>
+              <w:t xml:space="preserve">Convolutional </w:t>
+            </w:r>
+            <w:r>
+              <w:rPr>
+                <w:sz w:val="22"/>
+                <w:szCs w:val="22"/>
+                <w:lang w:eastAsia="en-GB"/>
+              </w:rPr>
+              <w:t>SVM</w:t>
+            </w:r>
+          </w:p>
+        </w:tc>
+        <w:tc>
+          <w:tcPr>
+            <w:tcW w:w="4751" w:type="dxa"/>
+          </w:tcPr>
+          <w:p>
+            <w:pPr>
+              <w:rPr>
+                <w:lang w:eastAsia="en-GB"/>
+              </w:rPr>
+            </w:pPr>
+            <w:r>
+              <w:rPr>
+                <w:lang w:eastAsia="en-GB"/>
+              </w:rPr>
+              <w:drawing>
+                <wp:inline distT="0" distB="0" distL="0" distR="0" wp14:anchorId="4DF93F6B" wp14:editId="6443A38C">
+                  <wp:extent cx="3024000" cy="2364124"/>
+                  <wp:effectExtent l="0" t="0" r="5080" b="0"/>
+                  <wp:docPr id="2114549516" name="Picture 1"/>
+                  <wp:cNvGraphicFramePr>
+                    <a:graphicFrameLocks xmlns:a="http://schemas.openxmlformats.org/drawingml/2006/main" noChangeAspect="1"/>
+                  </wp:cNvGraphicFramePr>
+                  <a:graphic xmlns:a="http://schemas.openxmlformats.org/drawingml/2006/main">
+                    <a:graphicData uri="http://schemas.openxmlformats.org/drawingml/2006/picture">
+                      <pic:pic xmlns:pic="http://schemas.openxmlformats.org/drawingml/2006/picture">
+                        <pic:nvPicPr>
+                          <pic:cNvPr id="2114549516" name=""/>
+                          <pic:cNvPicPr/>
+                        </pic:nvPicPr>
+                        <pic:blipFill>
+                          <a:blip r:embed="rId64"/>
+                          <a:stretch>
+                            <a:fillRect/>
+                          </a:stretch>
+                        </pic:blipFill>
+                        <pic:spPr>
+                          <a:xfrm>
+                            <a:off x="0" y="0"/>
+                            <a:ext cx="3024000" cy="2364124"/>
+                          </a:xfrm>
+                          <a:prstGeom prst="rect">
+                            <a:avLst/>
+                          </a:prstGeom>
+                        </pic:spPr>
+                      </pic:pic>
+                    </a:graphicData>
+                  </a:graphic>
+                </wp:inline>
+              </w:drawing>
+            </w:r>
+          </w:p>
+        </w:tc>
+        <w:tc>
+          <w:tcPr>
+            <w:tcW w:w="3688" w:type="dxa"/>
+          </w:tcPr>
+          <w:p>
+            <w:pPr>
+              <w:rPr>
+                <w:sz w:val="22"/>
+                <w:szCs w:val="22"/>
+                <w:lang w:eastAsia="en-GB"/>
+              </w:rPr>
+            </w:pPr>
+            <w:r>
+              <w:rPr>
+                <w:sz w:val="22"/>
+                <w:szCs w:val="22"/>
+                <w:lang w:eastAsia="en-GB"/>
+              </w:rPr>
+              <w:t xml:space="preserve">Accuracy: </w:t>
+            </w:r>
+            <w:r>
+              <w:rPr>
+                <w:sz w:val="22"/>
+                <w:szCs w:val="22"/>
+                <w:lang w:eastAsia="en-GB"/>
+              </w:rPr>
+              <w:t>~</w:t>
+            </w:r>
+            <w:r>
+              <w:rPr>
+                <w:sz w:val="22"/>
+                <w:szCs w:val="22"/>
+                <w:lang w:eastAsia="en-GB"/>
+              </w:rPr>
+              <w:t>76.987</w:t>
+            </w:r>
+            <w:r>
+              <w:rPr>
+                <w:sz w:val="22"/>
+                <w:szCs w:val="22"/>
+                <w:lang w:eastAsia="en-GB"/>
+              </w:rPr>
+              <w:t>4</w:t>
+            </w:r>
+            <w:r>
+              <w:rPr>
+                <w:sz w:val="22"/>
+                <w:szCs w:val="22"/>
+                <w:lang w:eastAsia="en-GB"/>
+              </w:rPr>
+              <w:t>%</w:t>
+            </w:r>
+          </w:p>
+          <w:p>
+            <w:pPr>
+              <w:rPr>
+                <w:sz w:val="22"/>
+                <w:szCs w:val="22"/>
+                <w:lang w:eastAsia="en-GB"/>
+              </w:rPr>
+            </w:pPr>
+            <w:r>
+              <w:rPr>
+                <w:sz w:val="22"/>
+                <w:szCs w:val="22"/>
+                <w:lang w:eastAsia="en-GB"/>
+              </w:rPr>
+              <w:t>Response time: ~</w:t>
+            </w:r>
+            <w:r>
+              <w:rPr>
+                <w:sz w:val="22"/>
+                <w:szCs w:val="22"/>
+                <w:lang w:eastAsia="en-GB"/>
+              </w:rPr>
+              <w:t>0.44277</w:t>
+            </w:r>
+            <w:r>
+              <w:rPr>
+                <w:sz w:val="22"/>
+                <w:szCs w:val="22"/>
+                <w:lang w:eastAsia="en-GB"/>
+              </w:rPr>
+              <w:t>ms</w:t>
+            </w:r>
+          </w:p>
+          <w:p>
+            <w:pPr>
+              <w:rPr>
+                <w:sz w:val="22"/>
+                <w:szCs w:val="22"/>
+                <w:lang w:eastAsia="en-GB"/>
+              </w:rPr>
+            </w:pPr>
+            <w:r>
+              <w:rPr>
+                <w:sz w:val="22"/>
+                <w:szCs w:val="22"/>
+                <w:lang w:eastAsia="en-GB"/>
+              </w:rPr>
+              <w:t>Training time: ~</w:t>
+            </w:r>
+            <w:r>
+              <w:rPr>
+                <w:sz w:val="22"/>
+                <w:szCs w:val="22"/>
+                <w:lang w:eastAsia="en-GB"/>
+              </w:rPr>
+              <w:t>635.8919</w:t>
+            </w:r>
+            <w:r>
+              <w:rPr>
+                <w:sz w:val="22"/>
+                <w:szCs w:val="22"/>
+                <w:lang w:eastAsia="en-GB"/>
+              </w:rPr>
+              <w:t>s (20 epochs)</w:t>
+            </w:r>
+          </w:p>
+        </w:tc>
+      </w:tr>
+      <w:tr>
+        <w:tc>
+          <w:tcPr>
+            <w:tcW w:w="1621" w:type="dxa"/>
+          </w:tcPr>
+          <w:p>
+            <w:pPr>
+              <w:rPr>
+                <w:sz w:val="22"/>
+                <w:szCs w:val="22"/>
+                <w:lang w:eastAsia="en-GB"/>
+              </w:rPr>
+            </w:pPr>
+            <w:r>
+              <w:rPr>
+                <w:sz w:val="22"/>
+                <w:szCs w:val="22"/>
+                <w:lang w:eastAsia="en-GB"/>
+              </w:rPr>
+              <w:t>FFT linear model</w:t>
+            </w:r>
+          </w:p>
+        </w:tc>
+        <w:tc>
+          <w:tcPr>
+            <w:tcW w:w="4751" w:type="dxa"/>
+          </w:tcPr>
+          <w:p>
+            <w:r>
+              <w:drawing>
+                <wp:inline distT="0" distB="0" distL="0" distR="0" wp14:anchorId="3A35C6E0" wp14:editId="68F41075">
+                  <wp:extent cx="3024000" cy="2364124"/>
+                  <wp:effectExtent l="0" t="0" r="5080" b="0"/>
+                  <wp:docPr id="1750131455" name="Picture 1"/>
+                  <wp:cNvGraphicFramePr>
+                    <a:graphicFrameLocks xmlns:a="http://schemas.openxmlformats.org/drawingml/2006/main" noChangeAspect="1"/>
+                  </wp:cNvGraphicFramePr>
+                  <a:graphic xmlns:a="http://schemas.openxmlformats.org/drawingml/2006/main">
+                    <a:graphicData uri="http://schemas.openxmlformats.org/drawingml/2006/picture">
+                      <pic:pic xmlns:pic="http://schemas.openxmlformats.org/drawingml/2006/picture">
+                        <pic:nvPicPr>
+                          <pic:cNvPr id="1750131455" name=""/>
+                          <pic:cNvPicPr/>
+                        </pic:nvPicPr>
+                        <pic:blipFill>
+                          <a:blip r:embed="rId65"/>
+                          <a:stretch>
+                            <a:fillRect/>
+                          </a:stretch>
+                        </pic:blipFill>
+                        <pic:spPr>
+                          <a:xfrm>
+                            <a:off x="0" y="0"/>
+                            <a:ext cx="3024000" cy="2364124"/>
+                          </a:xfrm>
+                          <a:prstGeom prst="rect">
+                            <a:avLst/>
+                          </a:prstGeom>
+                        </pic:spPr>
+                      </pic:pic>
+                    </a:graphicData>
+                  </a:graphic>
+                </wp:inline>
+              </w:drawing>
+            </w:r>
+          </w:p>
+        </w:tc>
+        <w:tc>
+          <w:tcPr>
+            <w:tcW w:w="3688" w:type="dxa"/>
+          </w:tcPr>
+          <w:p>
+            <w:pPr>
+              <w:rPr>
+                <w:sz w:val="22"/>
+                <w:szCs w:val="22"/>
+                <w:lang w:eastAsia="en-GB"/>
+              </w:rPr>
+            </w:pPr>
+            <w:r>
+              <w:rPr>
+                <w:sz w:val="22"/>
+                <w:szCs w:val="22"/>
+                <w:lang w:eastAsia="en-GB"/>
+              </w:rPr>
+              <w:t xml:space="preserve">Accuracy: </w:t>
+            </w:r>
+            <w:r>
+              <w:rPr>
+                <w:sz w:val="22"/>
+                <w:szCs w:val="22"/>
+                <w:lang w:eastAsia="en-GB"/>
+              </w:rPr>
+              <w:t>~</w:t>
+            </w:r>
+            <w:r>
+              <w:rPr>
+                <w:sz w:val="22"/>
+                <w:szCs w:val="22"/>
+                <w:lang w:eastAsia="en-GB"/>
+              </w:rPr>
+              <w:t>83.2153</w:t>
+            </w:r>
+            <w:r>
+              <w:rPr>
+                <w:sz w:val="22"/>
+                <w:szCs w:val="22"/>
+                <w:lang w:eastAsia="en-GB"/>
+              </w:rPr>
+              <w:t>%</w:t>
+            </w:r>
+          </w:p>
+          <w:p>
+            <w:pPr>
+              <w:rPr>
+                <w:sz w:val="22"/>
+                <w:szCs w:val="22"/>
+                <w:lang w:eastAsia="en-GB"/>
+              </w:rPr>
+            </w:pPr>
+            <w:r>
+              <w:rPr>
+                <w:sz w:val="22"/>
+                <w:szCs w:val="22"/>
+                <w:lang w:eastAsia="en-GB"/>
+              </w:rPr>
+              <w:t>Response time: ~</w:t>
+            </w:r>
+            <w:r>
+              <w:rPr>
+                <w:sz w:val="22"/>
+                <w:szCs w:val="22"/>
+                <w:lang w:eastAsia="en-GB"/>
+              </w:rPr>
+              <w:t>0.1959</w:t>
+            </w:r>
+            <w:r>
+              <w:rPr>
+                <w:sz w:val="22"/>
+                <w:szCs w:val="22"/>
+                <w:lang w:eastAsia="en-GB"/>
+              </w:rPr>
+              <w:t>7</w:t>
+            </w:r>
+            <w:r>
+              <w:rPr>
+                <w:sz w:val="22"/>
+                <w:szCs w:val="22"/>
+                <w:lang w:eastAsia="en-GB"/>
+              </w:rPr>
+              <w:t>ms</w:t>
+            </w:r>
+          </w:p>
+          <w:p>
+            <w:pPr>
+              <w:rPr>
+                <w:sz w:val="22"/>
+                <w:szCs w:val="22"/>
+                <w:lang w:eastAsia="en-GB"/>
+              </w:rPr>
+            </w:pPr>
+            <w:r>
+              <w:rPr>
+                <w:sz w:val="22"/>
+                <w:szCs w:val="22"/>
+                <w:lang w:eastAsia="en-GB"/>
+              </w:rPr>
+              <w:t>Training time: ~</w:t>
+            </w:r>
+            <w:r>
+              <w:rPr>
+                <w:sz w:val="22"/>
+                <w:szCs w:val="22"/>
+                <w:lang w:eastAsia="en-GB"/>
+              </w:rPr>
+              <w:t>469.8129</w:t>
+            </w:r>
+            <w:r>
+              <w:rPr>
+                <w:sz w:val="22"/>
+                <w:szCs w:val="22"/>
+                <w:lang w:eastAsia="en-GB"/>
+              </w:rPr>
+              <w:t>s (20 epochs)</w:t>
+            </w:r>
+          </w:p>
+        </w:tc>
+      </w:tr>
+    </w:tbl>
+    <w:p>
+      <w:pPr>
+        <w:rPr>
+          <w:lang w:eastAsia="en-GB"/>
+        </w:rPr>
+      </w:pPr>
+      <w:r>
+        <w:rPr>
+          <w:lang w:eastAsia="en-GB"/>
+        </w:rPr>
+        <w:lastRenderedPageBreak/>
+        <w:t>Where each model compared, less sequences used again for training (50.000 sequences)</w:t>
+      </w:r>
+    </w:p>
+    <w:tbl>
+      <w:tblPr>
+        <w:tblStyle w:val="PlainTable4"/>
+        <w:tblW w:w="0" w:type="auto"/>
+        <w:tblCellMar>
+          <w:top w:w="57" w:type="dxa"/>
+          <w:bottom w:w="57" w:type="dxa"/>
+        </w:tblCellMar>
+        <w:tblLook w:val="04A0" w:firstRow="1" w:lastRow="0" w:firstColumn="1" w:lastColumn="0" w:noHBand="0" w:noVBand="1"/>
+      </w:tblPr>
+      <w:tblGrid>
+        <w:gridCol w:w="4508"/>
+        <w:gridCol w:w="4508"/>
+      </w:tblGrid>
+      <w:tr>
+        <w:trPr>
+          <w:cnfStyle w:val="100000000000" w:firstRow="1" w:lastRow="0" w:firstColumn="0" w:lastColumn="0" w:oddVBand="0" w:evenVBand="0" w:oddHBand="0" w:evenHBand="0" w:firstRowFirstColumn="0" w:firstRowLastColumn="0" w:lastRowFirstColumn="0" w:lastRowLastColumn="0"/>
+        </w:trPr>
+        <w:tc>
+          <w:tcPr>
+            <w:cnfStyle w:val="001000000000" w:firstRow="0" w:lastRow="0" w:firstColumn="1" w:lastColumn="0" w:oddVBand="0" w:evenVBand="0" w:oddHBand="0" w:evenHBand="0" w:firstRowFirstColumn="0" w:firstRowLastColumn="0" w:lastRowFirstColumn="0" w:lastRowLastColumn="0"/>
+            <w:tcW w:w="4508" w:type="dxa"/>
+          </w:tcPr>
+          <w:p>
+            <w:pPr>
+              <w:rPr>
+                <w:lang w:eastAsia="en-GB"/>
+              </w:rPr>
+            </w:pPr>
+            <w:r>
+              <w:rPr>
+                <w:lang w:eastAsia="en-GB"/>
+              </w:rPr>
+              <w:drawing>
+                <wp:inline distT="0" distB="0" distL="0" distR="0" wp14:anchorId="00B4D3A1" wp14:editId="7E0E4A1E">
+                  <wp:extent cx="2700000" cy="2185943"/>
+                  <wp:effectExtent l="0" t="0" r="5715" b="5080"/>
+                  <wp:docPr id="347681985" name="Picture 1"/>
+                  <wp:cNvGraphicFramePr>
+                    <a:graphicFrameLocks xmlns:a="http://schemas.openxmlformats.org/drawingml/2006/main" noChangeAspect="1"/>
+                  </wp:cNvGraphicFramePr>
+                  <a:graphic xmlns:a="http://schemas.openxmlformats.org/drawingml/2006/main">
+                    <a:graphicData uri="http://schemas.openxmlformats.org/drawingml/2006/picture">
+                      <pic:pic xmlns:pic="http://schemas.openxmlformats.org/drawingml/2006/picture">
+                        <pic:nvPicPr>
+                          <pic:cNvPr id="347681985" name=""/>
+                          <pic:cNvPicPr/>
+                        </pic:nvPicPr>
+                        <pic:blipFill>
+                          <a:blip r:embed="rId66"/>
+                          <a:stretch>
+                            <a:fillRect/>
+                          </a:stretch>
+                        </pic:blipFill>
+                        <pic:spPr>
+                          <a:xfrm>
+                            <a:off x="0" y="0"/>
+                            <a:ext cx="2700000" cy="2185943"/>
+                          </a:xfrm>
+                          <a:prstGeom prst="rect">
+                            <a:avLst/>
+                          </a:prstGeom>
+                        </pic:spPr>
+                      </pic:pic>
+                    </a:graphicData>
+                  </a:graphic>
+                </wp:inline>
+              </w:drawing>
+            </w:r>
+          </w:p>
+        </w:tc>
+        <w:tc>
+          <w:tcPr>
+            <w:tcW w:w="4508" w:type="dxa"/>
+          </w:tcPr>
+          <w:p>
+            <w:pPr>
+              <w:cnfStyle w:val="100000000000" w:firstRow="1" w:lastRow="0" w:firstColumn="0" w:lastColumn="0" w:oddVBand="0" w:evenVBand="0" w:oddHBand="0" w:evenHBand="0" w:firstRowFirstColumn="0" w:firstRowLastColumn="0" w:lastRowFirstColumn="0" w:lastRowLastColumn="0"/>
+              <w:rPr>
+                <w:lang w:eastAsia="en-GB"/>
+              </w:rPr>
+            </w:pPr>
+            <w:r>
+              <w:rPr>
+                <w:lang w:eastAsia="en-GB"/>
+              </w:rPr>
+              <w:drawing>
+                <wp:inline distT="0" distB="0" distL="0" distR="0" wp14:anchorId="235971C2" wp14:editId="1DA544EF">
+                  <wp:extent cx="2700000" cy="2151489"/>
+                  <wp:effectExtent l="0" t="0" r="5715" b="1270"/>
+                  <wp:docPr id="1437209650" name="Picture 1"/>
+                  <wp:cNvGraphicFramePr>
+                    <a:graphicFrameLocks xmlns:a="http://schemas.openxmlformats.org/drawingml/2006/main" noChangeAspect="1"/>
+                  </wp:cNvGraphicFramePr>
+                  <a:graphic xmlns:a="http://schemas.openxmlformats.org/drawingml/2006/main">
+                    <a:graphicData uri="http://schemas.openxmlformats.org/drawingml/2006/picture">
+                      <pic:pic xmlns:pic="http://schemas.openxmlformats.org/drawingml/2006/picture">
+                        <pic:nvPicPr>
+                          <pic:cNvPr id="1437209650" name=""/>
+                          <pic:cNvPicPr/>
+                        </pic:nvPicPr>
+                        <pic:blipFill>
+                          <a:blip r:embed="rId67"/>
+                          <a:stretch>
+                            <a:fillRect/>
+                          </a:stretch>
+                        </pic:blipFill>
+                        <pic:spPr>
+                          <a:xfrm>
+                            <a:off x="0" y="0"/>
+                            <a:ext cx="2700000" cy="2151489"/>
+                          </a:xfrm>
+                          <a:prstGeom prst="rect">
+                            <a:avLst/>
+                          </a:prstGeom>
+                        </pic:spPr>
+                      </pic:pic>
+                    </a:graphicData>
+                  </a:graphic>
+                </wp:inline>
+              </w:drawing>
+            </w:r>
+          </w:p>
+        </w:tc>
+      </w:tr>
+      <w:tr>
+        <w:trPr>
+          <w:cnfStyle w:val="000000100000" w:firstRow="0" w:lastRow="0" w:firstColumn="0" w:lastColumn="0" w:oddVBand="0" w:evenVBand="0" w:oddHBand="1" w:evenHBand="0" w:firstRowFirstColumn="0" w:firstRowLastColumn="0" w:lastRowFirstColumn="0" w:lastRowLastColumn="0"/>
+        </w:trPr>
+        <w:tc>
+          <w:tcPr>
+            <w:cnfStyle w:val="001000000000" w:firstRow="0" w:lastRow="0" w:firstColumn="1" w:lastColumn="0" w:oddVBand="0" w:evenVBand="0" w:oddHBand="0" w:evenHBand="0" w:firstRowFirstColumn="0" w:firstRowLastColumn="0" w:lastRowFirstColumn="0" w:lastRowLastColumn="0"/>
+            <w:tcW w:w="4508" w:type="dxa"/>
+          </w:tcPr>
+          <w:p>
+            <w:pPr>
+              <w:rPr>
+                <w:b w:val="0"/>
+                <w:bCs w:val="0"/>
+                <w:lang w:eastAsia="en-GB"/>
+              </w:rPr>
+            </w:pPr>
+            <w:r>
+              <w:rPr>
+                <w:b w:val="0"/>
+                <w:bCs w:val="0"/>
+                <w:lang w:eastAsia="en-GB"/>
+              </w:rPr>
+              <w:drawing>
+                <wp:inline distT="0" distB="0" distL="0" distR="0" wp14:anchorId="020C5372" wp14:editId="6BD22138">
+                  <wp:extent cx="2700000" cy="2151489"/>
+                  <wp:effectExtent l="0" t="0" r="5715" b="1270"/>
+                  <wp:docPr id="68797534" name="Picture 1"/>
+                  <wp:cNvGraphicFramePr>
+                    <a:graphicFrameLocks xmlns:a="http://schemas.openxmlformats.org/drawingml/2006/main" noChangeAspect="1"/>
+                  </wp:cNvGraphicFramePr>
+                  <a:graphic xmlns:a="http://schemas.openxmlformats.org/drawingml/2006/main">
+                    <a:graphicData uri="http://schemas.openxmlformats.org/drawingml/2006/picture">
+                      <pic:pic xmlns:pic="http://schemas.openxmlformats.org/drawingml/2006/picture">
+                        <pic:nvPicPr>
+                          <pic:cNvPr id="68797534" name=""/>
+                          <pic:cNvPicPr/>
+                        </pic:nvPicPr>
+                        <pic:blipFill>
+                          <a:blip r:embed="rId68"/>
+                          <a:stretch>
+                            <a:fillRect/>
+                          </a:stretch>
+                        </pic:blipFill>
+                        <pic:spPr>
+                          <a:xfrm>
+                            <a:off x="0" y="0"/>
+                            <a:ext cx="2700000" cy="2151489"/>
+                          </a:xfrm>
+                          <a:prstGeom prst="rect">
+                            <a:avLst/>
+                          </a:prstGeom>
+                        </pic:spPr>
+                      </pic:pic>
+                    </a:graphicData>
+                  </a:graphic>
+                </wp:inline>
+              </w:drawing>
+            </w:r>
+          </w:p>
+        </w:tc>
+        <w:tc>
+          <w:tcPr>
+            <w:tcW w:w="4508" w:type="dxa"/>
+          </w:tcPr>
+          <w:p>
+            <w:pPr>
+              <w:cnfStyle w:val="000000100000" w:firstRow="0" w:lastRow="0" w:firstColumn="0" w:lastColumn="0" w:oddVBand="0" w:evenVBand="0" w:oddHBand="1" w:evenHBand="0" w:firstRowFirstColumn="0" w:firstRowLastColumn="0" w:lastRowFirstColumn="0" w:lastRowLastColumn="0"/>
+              <w:rPr>
+                <w:lang w:eastAsia="en-GB"/>
+              </w:rPr>
+            </w:pPr>
+            <w:r>
+              <w:rPr>
+                <w:lang w:eastAsia="en-GB"/>
+              </w:rPr>
+              <w:drawing>
+                <wp:inline distT="0" distB="0" distL="0" distR="0" wp14:anchorId="08E7C362" wp14:editId="7A5AE52F">
+                  <wp:extent cx="2700000" cy="2166667"/>
+                  <wp:effectExtent l="0" t="0" r="5715" b="5080"/>
+                  <wp:docPr id="456410438" name="Picture 1"/>
+                  <wp:cNvGraphicFramePr>
+                    <a:graphicFrameLocks xmlns:a="http://schemas.openxmlformats.org/drawingml/2006/main" noChangeAspect="1"/>
+                  </wp:cNvGraphicFramePr>
+                  <a:graphic xmlns:a="http://schemas.openxmlformats.org/drawingml/2006/main">
+                    <a:graphicData uri="http://schemas.openxmlformats.org/drawingml/2006/picture">
+                      <pic:pic xmlns:pic="http://schemas.openxmlformats.org/drawingml/2006/picture">
+                        <pic:nvPicPr>
+                          <pic:cNvPr id="456410438" name=""/>
+                          <pic:cNvPicPr/>
+                        </pic:nvPicPr>
+                        <pic:blipFill>
+                          <a:blip r:embed="rId69"/>
+                          <a:stretch>
+                            <a:fillRect/>
+                          </a:stretch>
+                        </pic:blipFill>
+                        <pic:spPr>
+                          <a:xfrm>
+                            <a:off x="0" y="0"/>
+                            <a:ext cx="2700000" cy="2166667"/>
+                          </a:xfrm>
+                          <a:prstGeom prst="rect">
+                            <a:avLst/>
+                          </a:prstGeom>
+                        </pic:spPr>
+                      </pic:pic>
+                    </a:graphicData>
+                  </a:graphic>
+                </wp:inline>
+              </w:drawing>
+            </w:r>
+          </w:p>
+        </w:tc>
+      </w:tr>
+    </w:tbl>
+    <w:p>
+      <w:pPr>
+        <w:rPr>
+          <w:rFonts w:asciiTheme="majorHAnsi" w:hAnsiTheme="majorHAnsi"/>
+          <w:sz w:val="40"/>
+          <w:szCs w:val="40"/>
+          <w:lang w:eastAsia="en-GB"/>
+        </w:rPr>
+      </w:pPr>
+      <w:r>
+        <w:rPr>
+          <w:lang w:eastAsia="en-GB"/>
+        </w:rPr>
+        <w:br w:type="page"/>
+      </w:r>
+    </w:p>
+    <w:p>
+      <w:pPr>
+        <w:pStyle w:val="Heading3"/>
+        <w:rPr>
+          <w:lang w:eastAsia="en-GB"/>
+        </w:rPr>
+      </w:pPr>
+      <w:r>
+        <w:rPr>
+          <w:lang w:eastAsia="en-GB"/>
+        </w:rPr>
+        <w:lastRenderedPageBreak/>
+        <w:t>1024</w:t>
+      </w:r>
+      <w:r>
+        <w:rPr>
+          <w:lang w:eastAsia="en-GB"/>
+        </w:rPr>
+        <w:t xml:space="preserve"> samples</w:t>
+      </w:r>
+      <w:r>
+        <w:rPr>
+          <w:lang w:eastAsia="en-GB"/>
+        </w:rPr>
+        <w:t xml:space="preserve"> for prediction</w:t>
+      </w:r>
+    </w:p>
+    <w:p>
+      <w:pPr>
+        <w:rPr>
+          <w:lang w:eastAsia="en-GB"/>
+        </w:rPr>
+      </w:pPr>
+      <w:r>
+        <w:rPr>
+          <w:lang w:eastAsia="en-GB"/>
+        </w:rPr>
+        <w:t xml:space="preserve">Since Long </w:t>
+      </w:r>
+      <w:r>
+        <w:rPr>
+          <w:lang w:eastAsia="en-GB"/>
+        </w:rPr>
+        <w:t>short-term</w:t>
+      </w:r>
+      <w:r>
+        <w:rPr>
+          <w:lang w:eastAsia="en-GB"/>
+        </w:rPr>
+        <w:t xml:space="preserve"> memory models are build for prediction and not classification, the experiment was also run with a high number of samples to improve the accuracy of the model</w:t>
+      </w:r>
+    </w:p>
+    <w:tbl>
+      <w:tblPr>
+        <w:tblStyle w:val="TableGrid"/>
+        <w:tblW w:w="10060" w:type="dxa"/>
+        <w:tblLook w:val="04A0" w:firstRow="1" w:lastRow="0" w:firstColumn="1" w:lastColumn="0" w:noHBand="0" w:noVBand="1"/>
+      </w:tblPr>
+      <w:tblGrid>
+        <w:gridCol w:w="1607"/>
+        <w:gridCol w:w="5204"/>
+        <w:gridCol w:w="3249"/>
+      </w:tblGrid>
+      <w:tr>
+        <w:tc>
+          <w:tcPr>
+            <w:tcW w:w="1607" w:type="dxa"/>
+          </w:tcPr>
+          <w:p>
+            <w:pPr>
+              <w:rPr>
+                <w:b/>
+                <w:bCs/>
+                <w:lang w:eastAsia="en-GB"/>
+              </w:rPr>
+            </w:pPr>
+            <w:r>
+              <w:rPr>
+                <w:b/>
+                <w:bCs/>
+                <w:lang w:eastAsia="en-GB"/>
+              </w:rPr>
+              <w:t>Model</w:t>
+            </w:r>
+          </w:p>
+        </w:tc>
+        <w:tc>
+          <w:tcPr>
+            <w:tcW w:w="5204" w:type="dxa"/>
+          </w:tcPr>
+          <w:p>
+            <w:pPr>
+              <w:rPr>
+                <w:b/>
+                <w:bCs/>
+                <w:lang w:eastAsia="en-GB"/>
+              </w:rPr>
+            </w:pPr>
+            <w:r>
+              <w:rPr>
+                <w:b/>
+                <w:bCs/>
+                <w:lang w:eastAsia="en-GB"/>
+              </w:rPr>
+              <w:t>Graph</w:t>
+            </w:r>
+          </w:p>
+        </w:tc>
+        <w:tc>
+          <w:tcPr>
+            <w:tcW w:w="3249" w:type="dxa"/>
+          </w:tcPr>
+          <w:p>
+            <w:pPr>
+              <w:rPr>
+                <w:b/>
+                <w:bCs/>
+                <w:lang w:eastAsia="en-GB"/>
+              </w:rPr>
+            </w:pPr>
+            <w:r>
+              <w:rPr>
+                <w:b/>
+                <w:bCs/>
+                <w:lang w:eastAsia="en-GB"/>
+              </w:rPr>
+              <w:t>Statistics</w:t>
+            </w:r>
+          </w:p>
+        </w:tc>
+      </w:tr>
+      <w:tr>
+        <w:tc>
+          <w:tcPr>
+            <w:tcW w:w="1607" w:type="dxa"/>
+          </w:tcPr>
+          <w:p>
+            <w:pPr>
+              <w:rPr>
+                <w:sz w:val="22"/>
+                <w:szCs w:val="22"/>
+                <w:lang w:eastAsia="en-GB"/>
+              </w:rPr>
+            </w:pPr>
+            <w:r>
+              <w:rPr>
+                <w:sz w:val="22"/>
+                <w:szCs w:val="22"/>
+                <w:lang w:eastAsia="en-GB"/>
+              </w:rPr>
+              <w:t>LSTM</w:t>
+            </w:r>
+          </w:p>
+        </w:tc>
+        <w:tc>
+          <w:tcPr>
+            <w:tcW w:w="5204" w:type="dxa"/>
+          </w:tcPr>
+          <w:p>
+            <w:pPr>
+              <w:rPr>
+                <w:lang w:eastAsia="en-GB"/>
+              </w:rPr>
+            </w:pPr>
+          </w:p>
+        </w:tc>
+        <w:tc>
+          <w:tcPr>
+            <w:tcW w:w="3249" w:type="dxa"/>
+          </w:tcPr>
+          <w:p>
+            <w:pPr>
+              <w:rPr>
+                <w:sz w:val="22"/>
+                <w:szCs w:val="22"/>
+                <w:lang w:eastAsia="en-GB"/>
+              </w:rPr>
+            </w:pPr>
+            <w:r>
+              <w:rPr>
+                <w:sz w:val="22"/>
+                <w:szCs w:val="22"/>
+                <w:lang w:eastAsia="en-GB"/>
+              </w:rPr>
+              <w:t xml:space="preserve">Accuracy: </w:t>
+            </w:r>
+            <w:r>
+              <w:rPr>
+                <w:sz w:val="22"/>
+                <w:szCs w:val="22"/>
+                <w:lang w:eastAsia="en-GB"/>
+              </w:rPr>
+              <w:t>~</w:t>
+            </w:r>
+            <w:r>
+              <w:rPr>
+                <w:sz w:val="22"/>
+                <w:szCs w:val="22"/>
+                <w:lang w:eastAsia="en-GB"/>
+              </w:rPr>
+              <w:t>%</w:t>
+            </w:r>
+          </w:p>
+          <w:p>
+            <w:pPr>
+              <w:rPr>
+                <w:sz w:val="22"/>
+                <w:szCs w:val="22"/>
+                <w:lang w:eastAsia="en-GB"/>
+              </w:rPr>
+            </w:pPr>
+            <w:r>
+              <w:rPr>
+                <w:sz w:val="22"/>
+                <w:szCs w:val="22"/>
+                <w:lang w:eastAsia="en-GB"/>
+              </w:rPr>
+              <w:t>Response time: ~</w:t>
+            </w:r>
+            <w:proofErr w:type="spellStart"/>
+            <w:r>
+              <w:rPr>
+                <w:sz w:val="22"/>
+                <w:szCs w:val="22"/>
+                <w:lang w:eastAsia="en-GB"/>
+              </w:rPr>
+              <w:t>ms</w:t>
+            </w:r>
+            <w:proofErr w:type="spellEnd"/>
+          </w:p>
+          <w:p>
+            <w:pPr>
+              <w:rPr>
+                <w:sz w:val="22"/>
+                <w:szCs w:val="22"/>
+                <w:lang w:eastAsia="en-GB"/>
+              </w:rPr>
+            </w:pPr>
+            <w:r>
+              <w:rPr>
+                <w:sz w:val="22"/>
+                <w:szCs w:val="22"/>
+                <w:lang w:eastAsia="en-GB"/>
+              </w:rPr>
+              <w:t>Training time: ~s (20 epochs)</w:t>
+            </w:r>
+          </w:p>
+        </w:tc>
+      </w:tr>
+      <w:tr>
+        <w:tc>
+          <w:tcPr>
+            <w:tcW w:w="1607" w:type="dxa"/>
+          </w:tcPr>
+          <w:p>
+            <w:pPr>
+              <w:rPr>
+                <w:sz w:val="22"/>
+                <w:szCs w:val="22"/>
+                <w:lang w:eastAsia="en-GB"/>
+              </w:rPr>
+            </w:pPr>
+            <w:r>
+              <w:rPr>
+                <w:sz w:val="22"/>
+                <w:szCs w:val="22"/>
+                <w:lang w:eastAsia="en-GB"/>
+              </w:rPr>
+              <w:t xml:space="preserve">Convolutional </w:t>
+            </w:r>
+            <w:r>
+              <w:rPr>
+                <w:sz w:val="22"/>
+                <w:szCs w:val="22"/>
+                <w:lang w:eastAsia="en-GB"/>
+              </w:rPr>
+              <w:t>SVM</w:t>
+            </w:r>
+          </w:p>
+        </w:tc>
+        <w:tc>
+          <w:tcPr>
+            <w:tcW w:w="5204" w:type="dxa"/>
+          </w:tcPr>
+          <w:p>
+            <w:pPr>
+              <w:rPr>
+                <w:lang w:eastAsia="en-GB"/>
+              </w:rPr>
+            </w:pPr>
+          </w:p>
+        </w:tc>
+        <w:tc>
+          <w:tcPr>
+            <w:tcW w:w="3249" w:type="dxa"/>
+          </w:tcPr>
+          <w:p>
+            <w:pPr>
+              <w:rPr>
+                <w:sz w:val="22"/>
+                <w:szCs w:val="22"/>
+                <w:lang w:eastAsia="en-GB"/>
+              </w:rPr>
+            </w:pPr>
+            <w:r>
+              <w:rPr>
+                <w:sz w:val="22"/>
+                <w:szCs w:val="22"/>
+                <w:lang w:eastAsia="en-GB"/>
+              </w:rPr>
+              <w:t xml:space="preserve">Accuracy: </w:t>
+            </w:r>
+            <w:r>
+              <w:rPr>
+                <w:sz w:val="22"/>
+                <w:szCs w:val="22"/>
+                <w:lang w:eastAsia="en-GB"/>
+              </w:rPr>
+              <w:t>~</w:t>
+            </w:r>
+            <w:r>
+              <w:rPr>
+                <w:sz w:val="22"/>
+                <w:szCs w:val="22"/>
+                <w:lang w:eastAsia="en-GB"/>
+              </w:rPr>
+              <w:t>%</w:t>
+            </w:r>
+          </w:p>
+          <w:p>
+            <w:pPr>
+              <w:rPr>
+                <w:sz w:val="22"/>
+                <w:szCs w:val="22"/>
+                <w:lang w:eastAsia="en-GB"/>
+              </w:rPr>
+            </w:pPr>
+            <w:r>
+              <w:rPr>
+                <w:sz w:val="22"/>
+                <w:szCs w:val="22"/>
+                <w:lang w:eastAsia="en-GB"/>
+              </w:rPr>
+              <w:t>Response time: ~</w:t>
+            </w:r>
+            <w:proofErr w:type="spellStart"/>
+            <w:r>
+              <w:rPr>
+                <w:sz w:val="22"/>
+                <w:szCs w:val="22"/>
+                <w:lang w:eastAsia="en-GB"/>
+              </w:rPr>
+              <w:t>ms</w:t>
+            </w:r>
+            <w:proofErr w:type="spellEnd"/>
+          </w:p>
+          <w:p>
+            <w:pPr>
+              <w:rPr>
+                <w:sz w:val="22"/>
+                <w:szCs w:val="22"/>
+                <w:lang w:eastAsia="en-GB"/>
+              </w:rPr>
+            </w:pPr>
+            <w:r>
+              <w:rPr>
+                <w:sz w:val="22"/>
+                <w:szCs w:val="22"/>
+                <w:lang w:eastAsia="en-GB"/>
+              </w:rPr>
+              <w:t>Training time: ~s (20 epochs)</w:t>
+            </w:r>
+          </w:p>
+        </w:tc>
+      </w:tr>
+    </w:tbl>
+    <w:p>
+      <w:pPr>
+        <w:rPr>
+          <w:rFonts w:asciiTheme="majorHAnsi" w:hAnsiTheme="majorHAnsi"/>
+          <w:sz w:val="40"/>
+          <w:szCs w:val="40"/>
+          <w:lang w:eastAsia="en-GB"/>
+        </w:rPr>
+      </w:pPr>
+      <w:r>
+        <w:rPr>
+          <w:lang w:eastAsia="en-GB"/>
+        </w:rPr>
+        <w:br w:type="page"/>
+      </w:r>
+    </w:p>
+    <w:p>
+      <w:pPr>
         <w:pStyle w:val="Heading1"/>
         <w:rPr>
           <w:lang w:eastAsia="en-GB"/>
@@ -7498,17 +12096,20 @@
           <w:lang w:eastAsia="en-GB"/>
         </w:rPr>
         <w:lastRenderedPageBreak/>
-        <w:t>Conclusion</w:t>
-      </w:r>
-    </w:p>
-    <w:p>
-      <w:r>
-        <w:t>The results show that different neural network models can achieve high accuracy in classifying which channels within a Wi-Fi spectrum have low occupancy. Interestingly, with shorter sequence lengths, the convolutional neural network and the support vector machine, which used simple convolution on the IQ samples, performed significantly better than using FFT. This suggests that the patterns present in the IQ samples are well-suited for these models to identify. Furthermore, it was observed that increasing the features derived from the two IQ samples (to 32 features in the models used) also led to a notable improvement in accuracy.</w:t>
-      </w:r>
-    </w:p>
-    <w:p>
-      <w:r>
-        <w:t>Additionally, it was demonstrated that neural networks are effective for both classification (SVM with convolution) and prediction (LSTM with convolution) of available broadband. However, as previously discussed, predicting spectrum usage for time frames longer than a few minutes requires consideration of additional factors to ensure reliability.</w:t>
+        <w:t>Discussion</w:t>
+      </w:r>
+    </w:p>
+    <w:p>
+      <w:pPr>
+        <w:rPr>
+          <w:lang w:eastAsia="en-GB"/>
+        </w:rPr>
+      </w:pPr>
+      <w:r>
+        <w:rPr>
+          <w:lang w:eastAsia="en-GB"/>
+        </w:rPr>
+        <w:t>In the previous chapter many different graphs of many different sequence lengths have been shown and the following things can be observed</w:t>
       </w:r>
     </w:p>
     <w:p>
@@ -7518,6 +12119,91 @@
           <w:ilvl w:val="0"/>
           <w:numId w:val="1"/>
         </w:numPr>
+        <w:rPr>
+          <w:lang w:eastAsia="en-GB"/>
+        </w:rPr>
+      </w:pPr>
+      <w:r>
+        <w:rPr>
+          <w:lang w:eastAsia="en-GB"/>
+        </w:rPr>
+        <w:t>Support vector machine and convolution work very well with high sampling rates even getting up to 90% accuracy with a sequence length of only 32 IQ samples.</w:t>
+      </w:r>
+    </w:p>
+    <w:p>
+      <w:pPr>
+        <w:pStyle w:val="ListParagraph"/>
+        <w:numPr>
+          <w:ilvl w:val="0"/>
+          <w:numId w:val="1"/>
+        </w:numPr>
+        <w:rPr>
+          <w:lang w:eastAsia="en-GB"/>
+        </w:rPr>
+      </w:pPr>
+      <w:r>
+        <w:rPr>
+          <w:lang w:eastAsia="en-GB"/>
+        </w:rPr>
+        <w:t>The model using FFT starts to perform less well once the amount of IQ samples drops, even getting surpassed by the model using convolution and a SVM, giving the impression that the neural network using these models are finding patterns that the FFT transformation cannot find.</w:t>
+      </w:r>
+    </w:p>
+    <w:p>
+      <w:pPr>
+        <w:pStyle w:val="ListParagraph"/>
+        <w:numPr>
+          <w:ilvl w:val="0"/>
+          <w:numId w:val="1"/>
+        </w:numPr>
+        <w:rPr>
+          <w:lang w:eastAsia="en-GB"/>
+        </w:rPr>
+      </w:pPr>
+      <w:r>
+        <w:rPr>
+          <w:lang w:eastAsia="en-GB"/>
+        </w:rPr>
+        <w:t>The accuracy decreases greatly once the sampling rate is decreased by dropping every other or 3 out of 4 samples. The sequence length must be increased greatly to 256 samples to get close to the same accuracy achieved with only 32 samples.</w:t>
+      </w:r>
+      <w:r>
+        <w:rPr>
+          <w:lang w:eastAsia="en-GB"/>
+        </w:rPr>
+        <w:br w:type="page"/>
+      </w:r>
+    </w:p>
+    <w:p>
+      <w:pPr>
+        <w:pStyle w:val="Heading1"/>
+        <w:rPr>
+          <w:lang w:eastAsia="en-GB"/>
+        </w:rPr>
+      </w:pPr>
+      <w:r>
+        <w:rPr>
+          <w:lang w:eastAsia="en-GB"/>
+        </w:rPr>
+        <w:lastRenderedPageBreak/>
+        <w:t>Conclusion</w:t>
+      </w:r>
+    </w:p>
+    <w:p>
+      <w:r>
+        <w:t>The results show that different neural network models can achieve high accuracy in classifying which channels within a Wi-Fi spectrum have low occupancy. Interestingly, with shorter sequence lengths, the convolutional neural network and the support vector machine, which used simple convolution on the IQ samples, performed significantly better than using FFT. This suggests that the patterns present in the IQ samples are well-suited for these models to identify. Furthermore, it was observed that increasing the features derived from the two IQ samples (to 32 features in the models used) also led to a notable improvement in accuracy.</w:t>
+      </w:r>
+    </w:p>
+    <w:p>
+      <w:r>
+        <w:t>Additionally, it was demonstrated that neural networks are effective for both classification (SVM with convolution) and prediction (LSTM with convolution) of available broadband. However, as previously discussed, predicting spectrum usage for time frames longer than a few minutes requires consideration of additional factors to ensure reliability.</w:t>
+      </w:r>
+    </w:p>
+    <w:p>
+      <w:pPr>
+        <w:pStyle w:val="ListParagraph"/>
+        <w:numPr>
+          <w:ilvl w:val="0"/>
+          <w:numId w:val="1"/>
+        </w:numPr>
       </w:pPr>
       <w:r>
         <w:br w:type="page"/>
@@ -7597,7 +12283,7 @@
       <w:r>
         <w:t xml:space="preserve">(1). </w:t>
       </w:r>
-      <w:hyperlink r:id="rId42" w:history="1">
+      <w:hyperlink r:id="rId70" w:history="1">
         <w:r>
           <w:rPr>
             <w:rStyle w:val="Hyperlink"/>
@@ -7620,7 +12306,7 @@
       <w:r>
         <w:t xml:space="preserve">What is a Large Language Model? | A Comprehensive LLMs Guide. (n.d.). Elastic. </w:t>
       </w:r>
-      <w:hyperlink r:id="rId43" w:anchor="what-is-the-difference-between-large-language-models-and-generative-ai" w:history="1">
+      <w:hyperlink r:id="rId71" w:anchor="what-is-the-difference-between-large-language-models-and-generative-ai" w:history="1">
         <w:r>
           <w:rPr>
             <w:rStyle w:val="Hyperlink"/>
@@ -7653,7 +12339,7 @@
       <w:r>
         <w:t xml:space="preserve">. arXiv.org. </w:t>
       </w:r>
-      <w:hyperlink r:id="rId44" w:history="1">
+      <w:hyperlink r:id="rId72" w:history="1">
         <w:r>
           <w:rPr>
             <w:rStyle w:val="Hyperlink"/>
@@ -7683,7 +12369,7 @@
       <w:r>
         <w:t xml:space="preserve">. (2016, January 1). IEEE Journals &amp; Magazine | IEEE Xplore. </w:t>
       </w:r>
-      <w:hyperlink r:id="rId45" w:history="1">
+      <w:hyperlink r:id="rId73" w:history="1">
         <w:r>
           <w:rPr>
             <w:rStyle w:val="Hyperlink"/>
@@ -7712,7 +12398,7 @@
       <w:r>
         <w:t xml:space="preserve">Scale mapping of urban radio frequency noise at very high frequency and ultra high frequency. Radio Science, 54(11), 934–948. </w:t>
       </w:r>
-      <w:hyperlink r:id="rId46" w:history="1">
+      <w:hyperlink r:id="rId74" w:history="1">
         <w:r>
           <w:rPr>
             <w:rStyle w:val="Hyperlink"/>
@@ -8732,7 +13418,7 @@
   <w:style w:type="paragraph" w:default="1" w:styleId="Normal">
     <w:name w:val="Normal"/>
     <w:qFormat/>
-    <w:rsid w:val="00A8658D"/>
+    <w:rsid w:val="002653B9"/>
   </w:style>
   <w:style w:type="paragraph" w:styleId="Heading1">
     <w:name w:val="heading 1"/>

</xml_diff>

<commit_message>
chore: extra graphs added for comparisson between sampling rates
</commit_message>
<xml_diff>
--- a/docs/Thesis.docx
+++ b/docs/Thesis.docx
@@ -2011,7 +2011,15 @@
     </w:p>
     <w:p>
       <w:r>
-        <w:t>To validate the model I have created a model that uses the fast fourier transform over the input data to see if the predictions can match this approach and to validate if the current model is actually more performant than just performing a fast fourier transform over the collection data samples.</w:t>
+        <w:t xml:space="preserve">To validate the </w:t>
+      </w:r>
+      <w:proofErr w:type="gramStart"/>
+      <w:r>
+        <w:t>model</w:t>
+      </w:r>
+      <w:proofErr w:type="gramEnd"/>
+      <w:r>
+        <w:t xml:space="preserve"> I have created a model that uses the fast fourier transform over the input data to see if the predictions can match this approach and to validate if the current model is actually more performant than just performing a fast fourier transform over the collection data samples.</w:t>
       </w:r>
     </w:p>
     <w:p>
@@ -2476,7 +2484,21 @@
               <w:rPr>
                 <w:lang w:eastAsia="en-GB"/>
               </w:rPr>
-              <w:t xml:space="preserve"> and is able to not only classify the current channel that is available, but also what </w:t>
+              <w:t xml:space="preserve"> and </w:t>
+            </w:r>
+            <w:proofErr w:type="gramStart"/>
+            <w:r>
+              <w:rPr>
+                <w:lang w:eastAsia="en-GB"/>
+              </w:rPr>
+              <w:t>is able to</w:t>
+            </w:r>
+            <w:proofErr w:type="gramEnd"/>
+            <w:r>
+              <w:rPr>
+                <w:lang w:eastAsia="en-GB"/>
+              </w:rPr>
+              <w:t xml:space="preserve"> not only classify the current channel that is available, but also what </w:t>
             </w:r>
             <w:r>
               <w:rPr>
@@ -2538,11 +2560,19 @@
                 <w:lang w:eastAsia="en-GB"/>
               </w:rPr>
             </w:pPr>
-            <w:r>
-              <w:rPr>
-                <w:lang w:eastAsia="en-GB"/>
-              </w:rPr>
-              <w:t xml:space="preserve">Similar to the approach taken with the SVM model, a convolutional layer was added to the LSTM model to evaluate its </w:t>
+            <w:proofErr w:type="gramStart"/>
+            <w:r>
+              <w:rPr>
+                <w:lang w:eastAsia="en-GB"/>
+              </w:rPr>
+              <w:t>Similar to</w:t>
+            </w:r>
+            <w:proofErr w:type="gramEnd"/>
+            <w:r>
+              <w:rPr>
+                <w:lang w:eastAsia="en-GB"/>
+              </w:rPr>
+              <w:t xml:space="preserve"> the approach taken with the SVM model, a convolutional layer was added to the LSTM model to evaluate its </w:t>
             </w:r>
             <w:r>
               <w:rPr>
@@ -2703,7 +2733,34 @@
           <w:lang w:eastAsia="en-GB"/>
         </w:rPr>
         <w:lastRenderedPageBreak/>
-        <w:t>Graphs</w:t>
+        <w:t>Training results visualised</w:t>
+      </w:r>
+    </w:p>
+    <w:p>
+      <w:pPr>
+        <w:rPr>
+          <w:lang w:eastAsia="en-GB"/>
+        </w:rPr>
+      </w:pPr>
+      <w:r>
+        <w:rPr>
+          <w:lang w:eastAsia="en-GB"/>
+        </w:rPr>
+        <w:t>In this section all results will be shown in graphs</w:t>
+      </w:r>
+    </w:p>
+    <w:p>
+      <w:pPr>
+        <w:pStyle w:val="Heading3"/>
+        <w:rPr>
+          <w:lang w:eastAsia="en-GB"/>
+        </w:rPr>
+      </w:pPr>
+      <w:r>
+        <w:rPr>
+          <w:lang w:eastAsia="en-GB"/>
+        </w:rPr>
+        <w:t>Classification per model per sequence length</w:t>
       </w:r>
     </w:p>
     <w:p>
@@ -2727,7 +2784,7 @@
     </w:p>
     <w:p>
       <w:pPr>
-        <w:pStyle w:val="Heading3"/>
+        <w:pStyle w:val="Heading4"/>
         <w:rPr>
           <w:lang w:eastAsia="en-GB"/>
         </w:rPr>
@@ -4139,7 +4196,7 @@
     </w:p>
     <w:p>
       <w:pPr>
-        <w:pStyle w:val="Heading3"/>
+        <w:pStyle w:val="Heading4"/>
         <w:rPr>
           <w:lang w:eastAsia="en-GB"/>
         </w:rPr>
@@ -5126,7 +5183,7 @@
     </w:p>
     <w:p>
       <w:pPr>
-        <w:pStyle w:val="Heading3"/>
+        <w:pStyle w:val="Heading4"/>
         <w:rPr>
           <w:lang w:eastAsia="en-GB"/>
         </w:rPr>
@@ -6133,7 +6190,7 @@
     </w:p>
     <w:p>
       <w:pPr>
-        <w:pStyle w:val="Heading3"/>
+        <w:pStyle w:val="Heading4"/>
         <w:rPr>
           <w:lang w:eastAsia="en-GB"/>
         </w:rPr>
@@ -7155,6 +7212,7 @@
     </w:p>
     <w:p>
       <w:pPr>
+        <w:pStyle w:val="Heading4"/>
         <w:rPr>
           <w:lang w:eastAsia="en-GB"/>
         </w:rPr>
@@ -7164,6 +7222,19 @@
           <w:lang w:eastAsia="en-GB"/>
         </w:rPr>
         <w:lastRenderedPageBreak/>
+        <w:t>Model parameters when using 32 samples per sequence</w:t>
+      </w:r>
+    </w:p>
+    <w:p>
+      <w:pPr>
+        <w:rPr>
+          <w:lang w:eastAsia="en-GB"/>
+        </w:rPr>
+      </w:pPr>
+      <w:r>
+        <w:rPr>
+          <w:lang w:eastAsia="en-GB"/>
+        </w:rPr>
         <w:t xml:space="preserve">Using the </w:t>
       </w:r>
       <w:proofErr w:type="spellStart"/>
@@ -7509,7 +7580,7 @@
     </w:p>
     <w:p>
       <w:pPr>
-        <w:pStyle w:val="Heading3"/>
+        <w:pStyle w:val="Heading4"/>
         <w:rPr>
           <w:lang w:eastAsia="en-GB"/>
         </w:rPr>
@@ -7519,13 +7590,7 @@
           <w:lang w:eastAsia="en-GB"/>
         </w:rPr>
         <w:lastRenderedPageBreak/>
-        <w:t xml:space="preserve">64 samples using every </w:t>
-      </w:r>
-      <w:r>
-        <w:rPr>
-          <w:lang w:eastAsia="en-GB"/>
-        </w:rPr>
-        <w:t>2</w:t>
+        <w:t>64 samples using every 2</w:t>
       </w:r>
       <w:r>
         <w:rPr>
@@ -7551,25 +7616,7 @@
         <w:rPr>
           <w:lang w:eastAsia="en-GB"/>
         </w:rPr>
-        <w:t xml:space="preserve">To also test on lower sampling rates sequence of </w:t>
-      </w:r>
-      <w:r>
-        <w:rPr>
-          <w:lang w:eastAsia="en-GB"/>
-        </w:rPr>
-        <w:t xml:space="preserve">128 </w:t>
-      </w:r>
-      <w:r>
-        <w:rPr>
-          <w:lang w:eastAsia="en-GB"/>
-        </w:rPr>
-        <w:t xml:space="preserve">sequence length were generated and then every </w:t>
-      </w:r>
-      <w:r>
-        <w:rPr>
-          <w:lang w:eastAsia="en-GB"/>
-        </w:rPr>
-        <w:t>2</w:t>
+        <w:t>To also test on lower sampling rates sequence of 128 sequence length were generated and then every 2</w:t>
       </w:r>
       <w:r>
         <w:rPr>
@@ -7582,25 +7629,7 @@
         <w:rPr>
           <w:lang w:eastAsia="en-GB"/>
         </w:rPr>
-        <w:t xml:space="preserve"> </w:t>
-      </w:r>
-      <w:r>
-        <w:rPr>
-          <w:lang w:eastAsia="en-GB"/>
-        </w:rPr>
-        <w:t xml:space="preserve">sample was taken simulating a sequence that is 64 samples long with a sampling rate that is </w:t>
-      </w:r>
-      <w:r>
-        <w:rPr>
-          <w:lang w:eastAsia="en-GB"/>
-        </w:rPr>
-        <w:t>50</w:t>
-      </w:r>
-      <w:r>
-        <w:rPr>
-          <w:lang w:eastAsia="en-GB"/>
-        </w:rPr>
-        <w:t>% of the original sampling rate.</w:t>
+        <w:t xml:space="preserve"> sample was taken simulating a sequence that is 64 samples long with a sampling rate that is 50% of the original sampling rate.</w:t>
       </w:r>
     </w:p>
     <w:tbl>
@@ -7717,6 +7746,7 @@
             </w:pPr>
             <w:r>
               <w:rPr>
+                <w:noProof/>
                 <w:lang w:eastAsia="en-GB"/>
               </w:rPr>
               <w:drawing>
@@ -7929,6 +7959,7 @@
             </w:pPr>
             <w:r>
               <w:rPr>
+                <w:noProof/>
                 <w:lang w:eastAsia="en-GB"/>
               </w:rPr>
               <w:drawing>
@@ -8127,6 +8158,9 @@
           </w:tcPr>
           <w:p>
             <w:r>
+              <w:rPr>
+                <w:noProof/>
+              </w:rPr>
               <w:drawing>
                 <wp:inline distT="0" distB="0" distL="0" distR="0" wp14:anchorId="616D99CA" wp14:editId="42773247">
                   <wp:extent cx="3240000" cy="2430180"/>
@@ -8339,6 +8373,7 @@
             </w:pPr>
             <w:r>
               <w:rPr>
+                <w:noProof/>
                 <w:lang w:eastAsia="en-GB"/>
               </w:rPr>
               <w:drawing>
@@ -8392,6 +8427,7 @@
             </w:pPr>
             <w:r>
               <w:rPr>
+                <w:noProof/>
                 <w:lang w:eastAsia="en-GB"/>
               </w:rPr>
               <w:drawing>
@@ -8452,8 +8488,7 @@
             </w:pPr>
             <w:r>
               <w:rPr>
-                <w:b w:val="0"/>
-                <w:bCs w:val="0"/>
+                <w:noProof/>
                 <w:lang w:eastAsia="en-GB"/>
               </w:rPr>
               <w:drawing>
@@ -8507,6 +8542,7 @@
             </w:pPr>
             <w:r>
               <w:rPr>
+                <w:noProof/>
                 <w:lang w:eastAsia="en-GB"/>
               </w:rPr>
               <w:drawing>
@@ -8567,7 +8603,7 @@
     </w:p>
     <w:p>
       <w:pPr>
-        <w:pStyle w:val="Heading3"/>
+        <w:pStyle w:val="Heading4"/>
         <w:rPr>
           <w:lang w:eastAsia="en-GB"/>
         </w:rPr>
@@ -8775,6 +8811,7 @@
             </w:pPr>
             <w:r>
               <w:rPr>
+                <w:noProof/>
                 <w:lang w:eastAsia="en-GB"/>
               </w:rPr>
               <w:drawing>
@@ -8979,6 +9016,7 @@
             </w:pPr>
             <w:r>
               <w:rPr>
+                <w:noProof/>
                 <w:lang w:eastAsia="en-GB"/>
               </w:rPr>
               <w:drawing>
@@ -9169,6 +9207,9 @@
           </w:tcPr>
           <w:p>
             <w:r>
+              <w:rPr>
+                <w:noProof/>
+              </w:rPr>
               <w:drawing>
                 <wp:inline distT="0" distB="0" distL="0" distR="0" wp14:anchorId="0D1DEF90" wp14:editId="0D1251E1">
                   <wp:extent cx="3168000" cy="2476702"/>
@@ -9366,6 +9407,7 @@
             </w:pPr>
             <w:r>
               <w:rPr>
+                <w:noProof/>
                 <w:lang w:eastAsia="en-GB"/>
               </w:rPr>
               <w:drawing>
@@ -9419,6 +9461,7 @@
             </w:pPr>
             <w:r>
               <w:rPr>
+                <w:noProof/>
                 <w:lang w:eastAsia="en-GB"/>
               </w:rPr>
               <w:drawing>
@@ -9479,8 +9522,7 @@
             </w:pPr>
             <w:r>
               <w:rPr>
-                <w:b w:val="0"/>
-                <w:bCs w:val="0"/>
+                <w:noProof/>
                 <w:lang w:eastAsia="en-GB"/>
               </w:rPr>
               <w:drawing>
@@ -9534,6 +9576,7 @@
             </w:pPr>
             <w:r>
               <w:rPr>
+                <w:noProof/>
                 <w:lang w:eastAsia="en-GB"/>
               </w:rPr>
               <w:drawing>
@@ -9598,7 +9641,7 @@
     </w:p>
     <w:p>
       <w:pPr>
-        <w:pStyle w:val="Heading3"/>
+        <w:pStyle w:val="Heading4"/>
         <w:rPr>
           <w:lang w:eastAsia="en-GB"/>
         </w:rPr>
@@ -9608,13 +9651,7 @@
           <w:lang w:eastAsia="en-GB"/>
         </w:rPr>
         <w:lastRenderedPageBreak/>
-        <w:t>256</w:t>
-      </w:r>
-      <w:r>
-        <w:rPr>
-          <w:lang w:eastAsia="en-GB"/>
-        </w:rPr>
-        <w:t xml:space="preserve"> samples using every 2</w:t>
+        <w:t>256 samples using every 2</w:t>
       </w:r>
       <w:r>
         <w:rPr>
@@ -9800,6 +9837,7 @@
             </w:pPr>
             <w:r>
               <w:rPr>
+                <w:noProof/>
                 <w:lang w:eastAsia="en-GB"/>
               </w:rPr>
               <w:drawing>
@@ -10004,6 +10042,7 @@
             </w:pPr>
             <w:r>
               <w:rPr>
+                <w:noProof/>
                 <w:lang w:eastAsia="en-GB"/>
               </w:rPr>
               <w:drawing>
@@ -10202,6 +10241,9 @@
           </w:tcPr>
           <w:p>
             <w:r>
+              <w:rPr>
+                <w:noProof/>
+              </w:rPr>
               <w:drawing>
                 <wp:inline distT="0" distB="0" distL="0" distR="0" wp14:anchorId="2F5C2DFA" wp14:editId="54096A47">
                   <wp:extent cx="3024000" cy="2364124"/>
@@ -10407,6 +10449,7 @@
             </w:pPr>
             <w:r>
               <w:rPr>
+                <w:noProof/>
                 <w:lang w:eastAsia="en-GB"/>
               </w:rPr>
               <w:drawing>
@@ -10460,6 +10503,7 @@
             </w:pPr>
             <w:r>
               <w:rPr>
+                <w:noProof/>
                 <w:lang w:eastAsia="en-GB"/>
               </w:rPr>
               <w:drawing>
@@ -10520,8 +10564,7 @@
             </w:pPr>
             <w:r>
               <w:rPr>
-                <w:b w:val="0"/>
-                <w:bCs w:val="0"/>
+                <w:noProof/>
                 <w:lang w:eastAsia="en-GB"/>
               </w:rPr>
               <w:drawing>
@@ -10575,6 +10618,7 @@
             </w:pPr>
             <w:r>
               <w:rPr>
+                <w:noProof/>
                 <w:lang w:eastAsia="en-GB"/>
               </w:rPr>
               <w:drawing>
@@ -10635,7 +10679,7 @@
     </w:p>
     <w:p>
       <w:pPr>
-        <w:pStyle w:val="Heading3"/>
+        <w:pStyle w:val="Heading4"/>
         <w:rPr>
           <w:lang w:eastAsia="en-GB"/>
         </w:rPr>
@@ -10645,19 +10689,7 @@
           <w:lang w:eastAsia="en-GB"/>
         </w:rPr>
         <w:lastRenderedPageBreak/>
-        <w:t>256</w:t>
-      </w:r>
-      <w:r>
-        <w:rPr>
-          <w:lang w:eastAsia="en-GB"/>
-        </w:rPr>
-        <w:t xml:space="preserve"> samples using every </w:t>
-      </w:r>
-      <w:r>
-        <w:rPr>
-          <w:lang w:eastAsia="en-GB"/>
-        </w:rPr>
-        <w:t>4</w:t>
+        <w:t>256 samples using every 4</w:t>
       </w:r>
       <w:r>
         <w:rPr>
@@ -10670,13 +10702,7 @@
         <w:rPr>
           <w:lang w:eastAsia="en-GB"/>
         </w:rPr>
-        <w:t xml:space="preserve"> </w:t>
-      </w:r>
-      <w:r>
-        <w:rPr>
-          <w:lang w:eastAsia="en-GB"/>
-        </w:rPr>
-        <w:t>sample</w:t>
+        <w:t xml:space="preserve"> sample</w:t>
       </w:r>
     </w:p>
     <w:p>
@@ -10767,7 +10793,7 @@
       <w:tr>
         <w:tc>
           <w:tcPr>
-            <w:tcW w:w="1621" w:type="dxa"/>
+            <w:tcW w:w="1614" w:type="dxa"/>
           </w:tcPr>
           <w:p>
             <w:pPr>
@@ -10789,7 +10815,7 @@
         </w:tc>
         <w:tc>
           <w:tcPr>
-            <w:tcW w:w="4751" w:type="dxa"/>
+            <w:tcW w:w="4986" w:type="dxa"/>
           </w:tcPr>
           <w:p>
             <w:pPr>
@@ -10811,7 +10837,7 @@
         </w:tc>
         <w:tc>
           <w:tcPr>
-            <w:tcW w:w="3688" w:type="dxa"/>
+            <w:tcW w:w="3460" w:type="dxa"/>
           </w:tcPr>
           <w:p>
             <w:pPr>
@@ -10835,7 +10861,7 @@
       <w:tr>
         <w:tc>
           <w:tcPr>
-            <w:tcW w:w="1621" w:type="dxa"/>
+            <w:tcW w:w="1614" w:type="dxa"/>
           </w:tcPr>
           <w:p>
             <w:pPr>
@@ -10857,16 +10883,17 @@
         </w:tc>
         <w:tc>
           <w:tcPr>
-            <w:tcW w:w="4751" w:type="dxa"/>
-          </w:tcPr>
-          <w:p>
-            <w:pPr>
-              <w:rPr>
-                <w:lang w:eastAsia="en-GB"/>
-              </w:rPr>
-            </w:pPr>
-            <w:r>
-              <w:rPr>
+            <w:tcW w:w="4986" w:type="dxa"/>
+          </w:tcPr>
+          <w:p>
+            <w:pPr>
+              <w:rPr>
+                <w:lang w:eastAsia="en-GB"/>
+              </w:rPr>
+            </w:pPr>
+            <w:r>
+              <w:rPr>
+                <w:noProof/>
                 <w:lang w:eastAsia="en-GB"/>
               </w:rPr>
               <w:drawing>
@@ -10909,7 +10936,7 @@
         </w:tc>
         <w:tc>
           <w:tcPr>
-            <w:tcW w:w="3688" w:type="dxa"/>
+            <w:tcW w:w="3460" w:type="dxa"/>
           </w:tcPr>
           <w:p>
             <w:pPr>
@@ -11031,7 +11058,7 @@
       <w:tr>
         <w:tc>
           <w:tcPr>
-            <w:tcW w:w="1621" w:type="dxa"/>
+            <w:tcW w:w="1614" w:type="dxa"/>
           </w:tcPr>
           <w:p>
             <w:pPr>
@@ -11061,16 +11088,17 @@
         </w:tc>
         <w:tc>
           <w:tcPr>
-            <w:tcW w:w="4751" w:type="dxa"/>
-          </w:tcPr>
-          <w:p>
-            <w:pPr>
-              <w:rPr>
-                <w:lang w:eastAsia="en-GB"/>
-              </w:rPr>
-            </w:pPr>
-            <w:r>
-              <w:rPr>
+            <w:tcW w:w="4986" w:type="dxa"/>
+          </w:tcPr>
+          <w:p>
+            <w:pPr>
+              <w:rPr>
+                <w:lang w:eastAsia="en-GB"/>
+              </w:rPr>
+            </w:pPr>
+            <w:r>
+              <w:rPr>
+                <w:noProof/>
                 <w:lang w:eastAsia="en-GB"/>
               </w:rPr>
               <w:drawing>
@@ -11113,7 +11141,7 @@
         </w:tc>
         <w:tc>
           <w:tcPr>
-            <w:tcW w:w="3688" w:type="dxa"/>
+            <w:tcW w:w="3460" w:type="dxa"/>
           </w:tcPr>
           <w:p>
             <w:pPr>
@@ -11235,7 +11263,7 @@
       <w:tr>
         <w:tc>
           <w:tcPr>
-            <w:tcW w:w="1621" w:type="dxa"/>
+            <w:tcW w:w="1614" w:type="dxa"/>
           </w:tcPr>
           <w:p>
             <w:pPr>
@@ -11257,10 +11285,13 @@
         </w:tc>
         <w:tc>
           <w:tcPr>
-            <w:tcW w:w="4751" w:type="dxa"/>
-          </w:tcPr>
-          <w:p>
-            <w:r>
+            <w:tcW w:w="4986" w:type="dxa"/>
+          </w:tcPr>
+          <w:p>
+            <w:r>
+              <w:rPr>
+                <w:noProof/>
+              </w:rPr>
               <w:drawing>
                 <wp:inline distT="0" distB="0" distL="0" distR="0" wp14:anchorId="3A35C6E0" wp14:editId="68F41075">
                   <wp:extent cx="3024000" cy="2364124"/>
@@ -11301,7 +11332,7 @@
         </w:tc>
         <w:tc>
           <w:tcPr>
-            <w:tcW w:w="3688" w:type="dxa"/>
+            <w:tcW w:w="3460" w:type="dxa"/>
           </w:tcPr>
           <w:p>
             <w:pPr>
@@ -11466,6 +11497,7 @@
             </w:pPr>
             <w:r>
               <w:rPr>
+                <w:noProof/>
                 <w:lang w:eastAsia="en-GB"/>
               </w:rPr>
               <w:drawing>
@@ -11519,6 +11551,7 @@
             </w:pPr>
             <w:r>
               <w:rPr>
+                <w:noProof/>
                 <w:lang w:eastAsia="en-GB"/>
               </w:rPr>
               <w:drawing>
@@ -11579,8 +11612,7 @@
             </w:pPr>
             <w:r>
               <w:rPr>
-                <w:b w:val="0"/>
-                <w:bCs w:val="0"/>
+                <w:noProof/>
                 <w:lang w:eastAsia="en-GB"/>
               </w:rPr>
               <w:drawing>
@@ -11634,6 +11666,7 @@
             </w:pPr>
             <w:r>
               <w:rPr>
+                <w:noProof/>
                 <w:lang w:eastAsia="en-GB"/>
               </w:rPr>
               <w:drawing>
@@ -11679,9 +11712,13 @@
     <w:p>
       <w:pPr>
         <w:rPr>
-          <w:rFonts w:asciiTheme="majorHAnsi" w:hAnsiTheme="majorHAnsi"/>
-          <w:sz w:val="40"/>
-          <w:szCs w:val="40"/>
+          <w:lang w:eastAsia="en-GB"/>
+        </w:rPr>
+      </w:pPr>
+    </w:p>
+    <w:p>
+      <w:pPr>
+        <w:rPr>
           <w:lang w:eastAsia="en-GB"/>
         </w:rPr>
       </w:pPr>
@@ -11694,6 +11731,877 @@
     </w:p>
     <w:p>
       <w:pPr>
+        <w:pStyle w:val="Heading4"/>
+        <w:rPr>
+          <w:lang w:eastAsia="en-GB"/>
+        </w:rPr>
+      </w:pPr>
+      <w:r>
+        <w:rPr>
+          <w:lang w:eastAsia="en-GB"/>
+        </w:rPr>
+        <w:lastRenderedPageBreak/>
+        <w:t xml:space="preserve">Model parameters when using </w:t>
+      </w:r>
+      <w:r>
+        <w:rPr>
+          <w:lang w:eastAsia="en-GB"/>
+        </w:rPr>
+        <w:t xml:space="preserve">256 </w:t>
+      </w:r>
+      <w:r>
+        <w:rPr>
+          <w:lang w:eastAsia="en-GB"/>
+        </w:rPr>
+        <w:t>samples per sequence</w:t>
+      </w:r>
+      <w:r>
+        <w:rPr>
+          <w:lang w:eastAsia="en-GB"/>
+        </w:rPr>
+        <w:t xml:space="preserve"> and ¼th of the sampling rate</w:t>
+      </w:r>
+    </w:p>
+    <w:p>
+      <w:pPr>
+        <w:rPr>
+          <w:lang w:eastAsia="en-GB"/>
+        </w:rPr>
+      </w:pPr>
+      <w:r>
+        <w:rPr>
+          <w:lang w:eastAsia="en-GB"/>
+        </w:rPr>
+        <w:t xml:space="preserve">Using the </w:t>
+      </w:r>
+      <w:proofErr w:type="spellStart"/>
+      <w:r>
+        <w:rPr>
+          <w:lang w:eastAsia="en-GB"/>
+        </w:rPr>
+        <w:t>torchviz</w:t>
+      </w:r>
+      <w:proofErr w:type="spellEnd"/>
+      <w:r>
+        <w:rPr>
+          <w:lang w:eastAsia="en-GB"/>
+        </w:rPr>
+        <w:t xml:space="preserve"> library I have visualised the three chosen models for classification and what their corresponding weights are after training (for 32 samples per sequence).</w:t>
+      </w:r>
+    </w:p>
+    <w:tbl>
+      <w:tblPr>
+        <w:tblStyle w:val="TableGrid"/>
+        <w:tblW w:w="9918" w:type="dxa"/>
+        <w:tblLook w:val="04A0" w:firstRow="1" w:lastRow="0" w:firstColumn="1" w:lastColumn="0" w:noHBand="0" w:noVBand="1"/>
+      </w:tblPr>
+      <w:tblGrid>
+        <w:gridCol w:w="2689"/>
+        <w:gridCol w:w="7229"/>
+      </w:tblGrid>
+      <w:tr>
+        <w:tc>
+          <w:tcPr>
+            <w:tcW w:w="2689" w:type="dxa"/>
+          </w:tcPr>
+          <w:p>
+            <w:pPr>
+              <w:rPr>
+                <w:b/>
+                <w:bCs/>
+                <w:lang w:eastAsia="en-GB"/>
+              </w:rPr>
+            </w:pPr>
+            <w:r>
+              <w:rPr>
+                <w:b/>
+                <w:bCs/>
+                <w:lang w:eastAsia="en-GB"/>
+              </w:rPr>
+              <w:t>Convolutional model</w:t>
+            </w:r>
+          </w:p>
+        </w:tc>
+        <w:tc>
+          <w:tcPr>
+            <w:tcW w:w="7229" w:type="dxa"/>
+          </w:tcPr>
+          <w:p>
+            <w:pPr>
+              <w:rPr>
+                <w:b/>
+                <w:bCs/>
+                <w:lang w:eastAsia="en-GB"/>
+              </w:rPr>
+            </w:pPr>
+            <w:r>
+              <w:rPr>
+                <w:b/>
+                <w:bCs/>
+                <w:lang w:eastAsia="en-GB"/>
+              </w:rPr>
+              <w:t>Graph</w:t>
+            </w:r>
+          </w:p>
+        </w:tc>
+      </w:tr>
+      <w:tr>
+        <w:tc>
+          <w:tcPr>
+            <w:tcW w:w="2689" w:type="dxa"/>
+          </w:tcPr>
+          <w:p>
+            <w:pPr>
+              <w:rPr>
+                <w:sz w:val="22"/>
+                <w:szCs w:val="22"/>
+                <w:lang w:eastAsia="en-GB"/>
+              </w:rPr>
+            </w:pPr>
+            <w:r>
+              <w:rPr>
+                <w:sz w:val="22"/>
+                <w:szCs w:val="22"/>
+                <w:lang w:eastAsia="en-GB"/>
+              </w:rPr>
+              <w:t>Convolutional model</w:t>
+            </w:r>
+          </w:p>
+        </w:tc>
+        <w:tc>
+          <w:tcPr>
+            <w:tcW w:w="7229" w:type="dxa"/>
+          </w:tcPr>
+          <w:p>
+            <w:pPr>
+              <w:rPr>
+                <w:lang w:eastAsia="en-GB"/>
+              </w:rPr>
+            </w:pPr>
+            <w:r>
+              <w:rPr>
+                <w:lang w:eastAsia="en-GB"/>
+              </w:rPr>
+              <w:drawing>
+                <wp:inline distT="0" distB="0" distL="0" distR="0" wp14:anchorId="29C9E927" wp14:editId="18C3DCA7">
+                  <wp:extent cx="2880000" cy="5232887"/>
+                  <wp:effectExtent l="0" t="0" r="0" b="6350"/>
+                  <wp:docPr id="382248606" name="Picture 1"/>
+                  <wp:cNvGraphicFramePr>
+                    <a:graphicFrameLocks xmlns:a="http://schemas.openxmlformats.org/drawingml/2006/main" noChangeAspect="1"/>
+                  </wp:cNvGraphicFramePr>
+                  <a:graphic xmlns:a="http://schemas.openxmlformats.org/drawingml/2006/main">
+                    <a:graphicData uri="http://schemas.openxmlformats.org/drawingml/2006/picture">
+                      <pic:pic xmlns:pic="http://schemas.openxmlformats.org/drawingml/2006/picture">
+                        <pic:nvPicPr>
+                          <pic:cNvPr id="382248606" name=""/>
+                          <pic:cNvPicPr/>
+                        </pic:nvPicPr>
+                        <pic:blipFill>
+                          <a:blip r:embed="rId39"/>
+                          <a:stretch>
+                            <a:fillRect/>
+                          </a:stretch>
+                        </pic:blipFill>
+                        <pic:spPr>
+                          <a:xfrm>
+                            <a:off x="0" y="0"/>
+                            <a:ext cx="2880000" cy="5232887"/>
+                          </a:xfrm>
+                          <a:prstGeom prst="rect">
+                            <a:avLst/>
+                          </a:prstGeom>
+                        </pic:spPr>
+                      </pic:pic>
+                    </a:graphicData>
+                  </a:graphic>
+                </wp:inline>
+              </w:drawing>
+            </w:r>
+          </w:p>
+        </w:tc>
+      </w:tr>
+      <w:tr>
+        <w:tc>
+          <w:tcPr>
+            <w:tcW w:w="2689" w:type="dxa"/>
+          </w:tcPr>
+          <w:p>
+            <w:pPr>
+              <w:rPr>
+                <w:sz w:val="22"/>
+                <w:szCs w:val="22"/>
+                <w:lang w:eastAsia="en-GB"/>
+              </w:rPr>
+            </w:pPr>
+            <w:r>
+              <w:rPr>
+                <w:sz w:val="22"/>
+                <w:szCs w:val="22"/>
+                <w:lang w:eastAsia="en-GB"/>
+              </w:rPr>
+              <w:lastRenderedPageBreak/>
+              <w:t xml:space="preserve">Convolutional </w:t>
+            </w:r>
+            <w:r>
+              <w:rPr>
+                <w:sz w:val="22"/>
+                <w:szCs w:val="22"/>
+                <w:lang w:eastAsia="en-GB"/>
+              </w:rPr>
+              <w:t>SVM</w:t>
+            </w:r>
+          </w:p>
+        </w:tc>
+        <w:tc>
+          <w:tcPr>
+            <w:tcW w:w="7229" w:type="dxa"/>
+          </w:tcPr>
+          <w:p>
+            <w:pPr>
+              <w:rPr>
+                <w:lang w:eastAsia="en-GB"/>
+              </w:rPr>
+            </w:pPr>
+            <w:r>
+              <w:rPr>
+                <w:lang w:eastAsia="en-GB"/>
+              </w:rPr>
+              <w:drawing>
+                <wp:inline distT="0" distB="0" distL="0" distR="0" wp14:anchorId="1A9C0CC9" wp14:editId="25238D74">
+                  <wp:extent cx="2880000" cy="3954017"/>
+                  <wp:effectExtent l="0" t="0" r="0" b="8890"/>
+                  <wp:docPr id="798711825" name="Picture 1"/>
+                  <wp:cNvGraphicFramePr>
+                    <a:graphicFrameLocks xmlns:a="http://schemas.openxmlformats.org/drawingml/2006/main" noChangeAspect="1"/>
+                  </wp:cNvGraphicFramePr>
+                  <a:graphic xmlns:a="http://schemas.openxmlformats.org/drawingml/2006/main">
+                    <a:graphicData uri="http://schemas.openxmlformats.org/drawingml/2006/picture">
+                      <pic:pic xmlns:pic="http://schemas.openxmlformats.org/drawingml/2006/picture">
+                        <pic:nvPicPr>
+                          <pic:cNvPr id="798711825" name=""/>
+                          <pic:cNvPicPr/>
+                        </pic:nvPicPr>
+                        <pic:blipFill>
+                          <a:blip r:embed="rId70"/>
+                          <a:stretch>
+                            <a:fillRect/>
+                          </a:stretch>
+                        </pic:blipFill>
+                        <pic:spPr>
+                          <a:xfrm>
+                            <a:off x="0" y="0"/>
+                            <a:ext cx="2880000" cy="3954017"/>
+                          </a:xfrm>
+                          <a:prstGeom prst="rect">
+                            <a:avLst/>
+                          </a:prstGeom>
+                        </pic:spPr>
+                      </pic:pic>
+                    </a:graphicData>
+                  </a:graphic>
+                </wp:inline>
+              </w:drawing>
+            </w:r>
+          </w:p>
+        </w:tc>
+      </w:tr>
+      <w:tr>
+        <w:tc>
+          <w:tcPr>
+            <w:tcW w:w="2689" w:type="dxa"/>
+          </w:tcPr>
+          <w:p>
+            <w:pPr>
+              <w:rPr>
+                <w:sz w:val="22"/>
+                <w:szCs w:val="22"/>
+                <w:lang w:eastAsia="en-GB"/>
+              </w:rPr>
+            </w:pPr>
+            <w:r>
+              <w:rPr>
+                <w:sz w:val="22"/>
+                <w:szCs w:val="22"/>
+                <w:lang w:eastAsia="en-GB"/>
+              </w:rPr>
+              <w:t>FFT linear model</w:t>
+            </w:r>
+          </w:p>
+        </w:tc>
+        <w:tc>
+          <w:tcPr>
+            <w:tcW w:w="7229" w:type="dxa"/>
+          </w:tcPr>
+          <w:p>
+            <w:pPr>
+              <w:ind w:left="720" w:hanging="720"/>
+            </w:pPr>
+            <w:r>
+              <w:drawing>
+                <wp:inline distT="0" distB="0" distL="0" distR="0" wp14:anchorId="3281EECC" wp14:editId="2A1517ED">
+                  <wp:extent cx="2880000" cy="3694610"/>
+                  <wp:effectExtent l="0" t="0" r="0" b="1270"/>
+                  <wp:docPr id="1341843176" name="Picture 2"/>
+                  <wp:cNvGraphicFramePr>
+                    <a:graphicFrameLocks xmlns:a="http://schemas.openxmlformats.org/drawingml/2006/main" noChangeAspect="1"/>
+                  </wp:cNvGraphicFramePr>
+                  <a:graphic xmlns:a="http://schemas.openxmlformats.org/drawingml/2006/main">
+                    <a:graphicData uri="http://schemas.openxmlformats.org/drawingml/2006/picture">
+                      <pic:pic xmlns:pic="http://schemas.openxmlformats.org/drawingml/2006/picture">
+                        <pic:nvPicPr>
+                          <pic:cNvPr id="0" name="Picture 6"/>
+                          <pic:cNvPicPr>
+                            <a:picLocks noChangeAspect="1" noChangeArrowheads="1"/>
+                          </pic:cNvPicPr>
+                        </pic:nvPicPr>
+                        <pic:blipFill>
+                          <a:blip r:embed="rId71">
+                            <a:extLst>
+                              <a:ext uri="{28A0092B-C50C-407E-A947-70E740481C1C}">
+                                <a14:useLocalDpi xmlns:a14="http://schemas.microsoft.com/office/drawing/2010/main" val="0"/>
+                              </a:ext>
+                            </a:extLst>
+                          </a:blip>
+                          <a:srcRect/>
+                          <a:stretch>
+                            <a:fillRect/>
+                          </a:stretch>
+                        </pic:blipFill>
+                        <pic:spPr bwMode="auto">
+                          <a:xfrm>
+                            <a:off x="0" y="0"/>
+                            <a:ext cx="2880000" cy="3694610"/>
+                          </a:xfrm>
+                          <a:prstGeom prst="rect">
+                            <a:avLst/>
+                          </a:prstGeom>
+                          <a:noFill/>
+                          <a:ln>
+                            <a:noFill/>
+                          </a:ln>
+                        </pic:spPr>
+                      </pic:pic>
+                    </a:graphicData>
+                  </a:graphic>
+                </wp:inline>
+              </w:drawing>
+            </w:r>
+          </w:p>
+          <w:p>
+            <w:pPr>
+              <w:ind w:left="720" w:hanging="720"/>
+            </w:pPr>
+          </w:p>
+        </w:tc>
+      </w:tr>
+    </w:tbl>
+    <w:p>
+      <w:pPr>
+        <w:rPr>
+          <w:lang w:eastAsia="en-GB"/>
+        </w:rPr>
+      </w:pPr>
+      <w:r>
+        <w:rPr>
+          <w:lang w:eastAsia="en-GB"/>
+        </w:rPr>
+        <w:br w:type="page"/>
+      </w:r>
+    </w:p>
+    <w:p>
+      <w:pPr>
+        <w:pStyle w:val="Heading4"/>
+        <w:rPr>
+          <w:lang w:eastAsia="en-GB"/>
+        </w:rPr>
+      </w:pPr>
+      <w:r>
+        <w:rPr>
+          <w:lang w:eastAsia="en-GB"/>
+        </w:rPr>
+        <w:lastRenderedPageBreak/>
+        <w:t>Accuracy comparison per model per sequence length</w:t>
+      </w:r>
+    </w:p>
+    <w:p>
+      <w:pPr>
+        <w:rPr>
+          <w:lang w:eastAsia="en-GB"/>
+        </w:rPr>
+      </w:pPr>
+      <w:r>
+        <w:rPr>
+          <w:lang w:eastAsia="en-GB"/>
+        </w:rPr>
+        <w:t>Each model has shown different accuracy when the sequence length and sampling rate changed, in the graphs below these results were compared per sequence length and sampling rate</w:t>
+      </w:r>
+      <w:r>
+        <w:rPr>
+          <w:lang w:eastAsia="en-GB"/>
+        </w:rPr>
+        <w:t>.</w:t>
+      </w:r>
+    </w:p>
+    <w:tbl>
+      <w:tblPr>
+        <w:tblStyle w:val="TableGrid"/>
+        <w:tblW w:w="10632" w:type="dxa"/>
+        <w:tblInd w:w="-808" w:type="dxa"/>
+        <w:tblLook w:val="04A0" w:firstRow="1" w:lastRow="0" w:firstColumn="1" w:lastColumn="0" w:noHBand="0" w:noVBand="1"/>
+      </w:tblPr>
+      <w:tblGrid>
+        <w:gridCol w:w="1549"/>
+        <w:gridCol w:w="4476"/>
+        <w:gridCol w:w="4607"/>
+      </w:tblGrid>
+      <w:tr>
+        <w:tc>
+          <w:tcPr>
+            <w:tcW w:w="1549" w:type="dxa"/>
+          </w:tcPr>
+          <w:p>
+            <w:pPr>
+              <w:rPr>
+                <w:b/>
+                <w:bCs/>
+                <w:lang w:eastAsia="en-GB"/>
+              </w:rPr>
+            </w:pPr>
+            <w:r>
+              <w:rPr>
+                <w:b/>
+                <w:bCs/>
+                <w:lang w:eastAsia="en-GB"/>
+              </w:rPr>
+              <w:t>Model</w:t>
+            </w:r>
+          </w:p>
+        </w:tc>
+        <w:tc>
+          <w:tcPr>
+            <w:tcW w:w="4476" w:type="dxa"/>
+          </w:tcPr>
+          <w:p>
+            <w:pPr>
+              <w:rPr>
+                <w:b/>
+                <w:bCs/>
+                <w:lang w:eastAsia="en-GB"/>
+              </w:rPr>
+            </w:pPr>
+            <w:r>
+              <w:rPr>
+                <w:b/>
+                <w:bCs/>
+                <w:lang w:eastAsia="en-GB"/>
+              </w:rPr>
+              <w:t>Sequence length + sample rate</w:t>
+            </w:r>
+          </w:p>
+        </w:tc>
+        <w:tc>
+          <w:tcPr>
+            <w:tcW w:w="4607" w:type="dxa"/>
+          </w:tcPr>
+          <w:p>
+            <w:pPr>
+              <w:rPr>
+                <w:b/>
+                <w:bCs/>
+                <w:lang w:eastAsia="en-GB"/>
+              </w:rPr>
+            </w:pPr>
+            <w:r>
+              <w:rPr>
+                <w:b/>
+                <w:bCs/>
+                <w:lang w:eastAsia="en-GB"/>
+              </w:rPr>
+              <w:t>Sample rate</w:t>
+            </w:r>
+          </w:p>
+        </w:tc>
+      </w:tr>
+      <w:tr>
+        <w:tc>
+          <w:tcPr>
+            <w:tcW w:w="1549" w:type="dxa"/>
+          </w:tcPr>
+          <w:p>
+            <w:pPr>
+              <w:rPr>
+                <w:sz w:val="22"/>
+                <w:szCs w:val="22"/>
+                <w:lang w:eastAsia="en-GB"/>
+              </w:rPr>
+            </w:pPr>
+            <w:r>
+              <w:rPr>
+                <w:sz w:val="22"/>
+                <w:szCs w:val="22"/>
+                <w:lang w:eastAsia="en-GB"/>
+              </w:rPr>
+              <w:t>Convolutional model</w:t>
+            </w:r>
+          </w:p>
+        </w:tc>
+        <w:tc>
+          <w:tcPr>
+            <w:tcW w:w="4476" w:type="dxa"/>
+          </w:tcPr>
+          <w:p>
+            <w:pPr>
+              <w:rPr>
+                <w:lang w:eastAsia="en-GB"/>
+              </w:rPr>
+            </w:pPr>
+            <w:r>
+              <w:rPr>
+                <w:lang w:eastAsia="en-GB"/>
+              </w:rPr>
+              <w:drawing>
+                <wp:inline distT="0" distB="0" distL="0" distR="0" wp14:anchorId="5537E4DB" wp14:editId="45E48772">
+                  <wp:extent cx="2700000" cy="2298073"/>
+                  <wp:effectExtent l="0" t="0" r="5715" b="6985"/>
+                  <wp:docPr id="2096553227" name="Picture 1"/>
+                  <wp:cNvGraphicFramePr>
+                    <a:graphicFrameLocks xmlns:a="http://schemas.openxmlformats.org/drawingml/2006/main" noChangeAspect="1"/>
+                  </wp:cNvGraphicFramePr>
+                  <a:graphic xmlns:a="http://schemas.openxmlformats.org/drawingml/2006/main">
+                    <a:graphicData uri="http://schemas.openxmlformats.org/drawingml/2006/picture">
+                      <pic:pic xmlns:pic="http://schemas.openxmlformats.org/drawingml/2006/picture">
+                        <pic:nvPicPr>
+                          <pic:cNvPr id="2096553227" name=""/>
+                          <pic:cNvPicPr/>
+                        </pic:nvPicPr>
+                        <pic:blipFill>
+                          <a:blip r:embed="rId72"/>
+                          <a:stretch>
+                            <a:fillRect/>
+                          </a:stretch>
+                        </pic:blipFill>
+                        <pic:spPr>
+                          <a:xfrm>
+                            <a:off x="0" y="0"/>
+                            <a:ext cx="2700000" cy="2298073"/>
+                          </a:xfrm>
+                          <a:prstGeom prst="rect">
+                            <a:avLst/>
+                          </a:prstGeom>
+                        </pic:spPr>
+                      </pic:pic>
+                    </a:graphicData>
+                  </a:graphic>
+                </wp:inline>
+              </w:drawing>
+            </w:r>
+          </w:p>
+        </w:tc>
+        <w:tc>
+          <w:tcPr>
+            <w:tcW w:w="4607" w:type="dxa"/>
+          </w:tcPr>
+          <w:p>
+            <w:pPr>
+              <w:rPr>
+                <w:lang w:eastAsia="en-GB"/>
+              </w:rPr>
+            </w:pPr>
+            <w:r>
+              <w:rPr>
+                <w:lang w:eastAsia="en-GB"/>
+              </w:rPr>
+              <w:drawing>
+                <wp:inline distT="0" distB="0" distL="0" distR="0" wp14:anchorId="60F4C367" wp14:editId="1B1043EE">
+                  <wp:extent cx="2700000" cy="2172623"/>
+                  <wp:effectExtent l="0" t="0" r="5715" b="0"/>
+                  <wp:docPr id="1402615254" name="Picture 1"/>
+                  <wp:cNvGraphicFramePr>
+                    <a:graphicFrameLocks xmlns:a="http://schemas.openxmlformats.org/drawingml/2006/main" noChangeAspect="1"/>
+                  </wp:cNvGraphicFramePr>
+                  <a:graphic xmlns:a="http://schemas.openxmlformats.org/drawingml/2006/main">
+                    <a:graphicData uri="http://schemas.openxmlformats.org/drawingml/2006/picture">
+                      <pic:pic xmlns:pic="http://schemas.openxmlformats.org/drawingml/2006/picture">
+                        <pic:nvPicPr>
+                          <pic:cNvPr id="1402615254" name=""/>
+                          <pic:cNvPicPr/>
+                        </pic:nvPicPr>
+                        <pic:blipFill>
+                          <a:blip r:embed="rId73"/>
+                          <a:stretch>
+                            <a:fillRect/>
+                          </a:stretch>
+                        </pic:blipFill>
+                        <pic:spPr>
+                          <a:xfrm>
+                            <a:off x="0" y="0"/>
+                            <a:ext cx="2700000" cy="2172623"/>
+                          </a:xfrm>
+                          <a:prstGeom prst="rect">
+                            <a:avLst/>
+                          </a:prstGeom>
+                        </pic:spPr>
+                      </pic:pic>
+                    </a:graphicData>
+                  </a:graphic>
+                </wp:inline>
+              </w:drawing>
+            </w:r>
+          </w:p>
+        </w:tc>
+      </w:tr>
+      <w:tr>
+        <w:tc>
+          <w:tcPr>
+            <w:tcW w:w="1549" w:type="dxa"/>
+          </w:tcPr>
+          <w:p>
+            <w:pPr>
+              <w:rPr>
+                <w:sz w:val="22"/>
+                <w:szCs w:val="22"/>
+                <w:lang w:eastAsia="en-GB"/>
+              </w:rPr>
+            </w:pPr>
+            <w:r>
+              <w:rPr>
+                <w:sz w:val="22"/>
+                <w:szCs w:val="22"/>
+                <w:lang w:eastAsia="en-GB"/>
+              </w:rPr>
+              <w:t xml:space="preserve">Convolutional </w:t>
+            </w:r>
+            <w:r>
+              <w:rPr>
+                <w:sz w:val="22"/>
+                <w:szCs w:val="22"/>
+                <w:lang w:eastAsia="en-GB"/>
+              </w:rPr>
+              <w:t>SVM</w:t>
+            </w:r>
+          </w:p>
+        </w:tc>
+        <w:tc>
+          <w:tcPr>
+            <w:tcW w:w="4476" w:type="dxa"/>
+          </w:tcPr>
+          <w:p>
+            <w:pPr>
+              <w:rPr>
+                <w:lang w:eastAsia="en-GB"/>
+              </w:rPr>
+            </w:pPr>
+            <w:r>
+              <w:rPr>
+                <w:lang w:eastAsia="en-GB"/>
+              </w:rPr>
+              <w:drawing>
+                <wp:inline distT="0" distB="0" distL="0" distR="0" wp14:anchorId="23E27551" wp14:editId="1129FC8F">
+                  <wp:extent cx="2700000" cy="2298073"/>
+                  <wp:effectExtent l="0" t="0" r="5715" b="6985"/>
+                  <wp:docPr id="1134372613" name="Picture 1"/>
+                  <wp:cNvGraphicFramePr>
+                    <a:graphicFrameLocks xmlns:a="http://schemas.openxmlformats.org/drawingml/2006/main" noChangeAspect="1"/>
+                  </wp:cNvGraphicFramePr>
+                  <a:graphic xmlns:a="http://schemas.openxmlformats.org/drawingml/2006/main">
+                    <a:graphicData uri="http://schemas.openxmlformats.org/drawingml/2006/picture">
+                      <pic:pic xmlns:pic="http://schemas.openxmlformats.org/drawingml/2006/picture">
+                        <pic:nvPicPr>
+                          <pic:cNvPr id="1134372613" name=""/>
+                          <pic:cNvPicPr/>
+                        </pic:nvPicPr>
+                        <pic:blipFill>
+                          <a:blip r:embed="rId74"/>
+                          <a:stretch>
+                            <a:fillRect/>
+                          </a:stretch>
+                        </pic:blipFill>
+                        <pic:spPr>
+                          <a:xfrm>
+                            <a:off x="0" y="0"/>
+                            <a:ext cx="2700000" cy="2298073"/>
+                          </a:xfrm>
+                          <a:prstGeom prst="rect">
+                            <a:avLst/>
+                          </a:prstGeom>
+                        </pic:spPr>
+                      </pic:pic>
+                    </a:graphicData>
+                  </a:graphic>
+                </wp:inline>
+              </w:drawing>
+            </w:r>
+          </w:p>
+        </w:tc>
+        <w:tc>
+          <w:tcPr>
+            <w:tcW w:w="4607" w:type="dxa"/>
+          </w:tcPr>
+          <w:p>
+            <w:pPr>
+              <w:rPr>
+                <w:lang w:eastAsia="en-GB"/>
+              </w:rPr>
+            </w:pPr>
+            <w:r>
+              <w:rPr>
+                <w:lang w:eastAsia="en-GB"/>
+              </w:rPr>
+              <w:drawing>
+                <wp:inline distT="0" distB="0" distL="0" distR="0" wp14:anchorId="57EB512C" wp14:editId="1AC0E722">
+                  <wp:extent cx="2700000" cy="2102925"/>
+                  <wp:effectExtent l="0" t="0" r="5715" b="0"/>
+                  <wp:docPr id="1117320100" name="Picture 1"/>
+                  <wp:cNvGraphicFramePr>
+                    <a:graphicFrameLocks xmlns:a="http://schemas.openxmlformats.org/drawingml/2006/main" noChangeAspect="1"/>
+                  </wp:cNvGraphicFramePr>
+                  <a:graphic xmlns:a="http://schemas.openxmlformats.org/drawingml/2006/main">
+                    <a:graphicData uri="http://schemas.openxmlformats.org/drawingml/2006/picture">
+                      <pic:pic xmlns:pic="http://schemas.openxmlformats.org/drawingml/2006/picture">
+                        <pic:nvPicPr>
+                          <pic:cNvPr id="1117320100" name=""/>
+                          <pic:cNvPicPr/>
+                        </pic:nvPicPr>
+                        <pic:blipFill>
+                          <a:blip r:embed="rId75"/>
+                          <a:stretch>
+                            <a:fillRect/>
+                          </a:stretch>
+                        </pic:blipFill>
+                        <pic:spPr>
+                          <a:xfrm>
+                            <a:off x="0" y="0"/>
+                            <a:ext cx="2700000" cy="2102925"/>
+                          </a:xfrm>
+                          <a:prstGeom prst="rect">
+                            <a:avLst/>
+                          </a:prstGeom>
+                        </pic:spPr>
+                      </pic:pic>
+                    </a:graphicData>
+                  </a:graphic>
+                </wp:inline>
+              </w:drawing>
+            </w:r>
+          </w:p>
+        </w:tc>
+      </w:tr>
+      <w:tr>
+        <w:tc>
+          <w:tcPr>
+            <w:tcW w:w="1549" w:type="dxa"/>
+          </w:tcPr>
+          <w:p>
+            <w:pPr>
+              <w:rPr>
+                <w:sz w:val="22"/>
+                <w:szCs w:val="22"/>
+                <w:lang w:eastAsia="en-GB"/>
+              </w:rPr>
+            </w:pPr>
+            <w:r>
+              <w:rPr>
+                <w:sz w:val="22"/>
+                <w:szCs w:val="22"/>
+                <w:lang w:eastAsia="en-GB"/>
+              </w:rPr>
+              <w:t>FFT linear model</w:t>
+            </w:r>
+          </w:p>
+        </w:tc>
+        <w:tc>
+          <w:tcPr>
+            <w:tcW w:w="4476" w:type="dxa"/>
+          </w:tcPr>
+          <w:p>
+            <w:r>
+              <w:drawing>
+                <wp:inline distT="0" distB="0" distL="0" distR="0" wp14:anchorId="6D2D7A8F" wp14:editId="1097B15F">
+                  <wp:extent cx="2700000" cy="2298073"/>
+                  <wp:effectExtent l="0" t="0" r="5715" b="6985"/>
+                  <wp:docPr id="780603837" name="Picture 1"/>
+                  <wp:cNvGraphicFramePr>
+                    <a:graphicFrameLocks xmlns:a="http://schemas.openxmlformats.org/drawingml/2006/main" noChangeAspect="1"/>
+                  </wp:cNvGraphicFramePr>
+                  <a:graphic xmlns:a="http://schemas.openxmlformats.org/drawingml/2006/main">
+                    <a:graphicData uri="http://schemas.openxmlformats.org/drawingml/2006/picture">
+                      <pic:pic xmlns:pic="http://schemas.openxmlformats.org/drawingml/2006/picture">
+                        <pic:nvPicPr>
+                          <pic:cNvPr id="780603837" name=""/>
+                          <pic:cNvPicPr/>
+                        </pic:nvPicPr>
+                        <pic:blipFill>
+                          <a:blip r:embed="rId76"/>
+                          <a:stretch>
+                            <a:fillRect/>
+                          </a:stretch>
+                        </pic:blipFill>
+                        <pic:spPr>
+                          <a:xfrm>
+                            <a:off x="0" y="0"/>
+                            <a:ext cx="2700000" cy="2298073"/>
+                          </a:xfrm>
+                          <a:prstGeom prst="rect">
+                            <a:avLst/>
+                          </a:prstGeom>
+                        </pic:spPr>
+                      </pic:pic>
+                    </a:graphicData>
+                  </a:graphic>
+                </wp:inline>
+              </w:drawing>
+            </w:r>
+          </w:p>
+        </w:tc>
+        <w:tc>
+          <w:tcPr>
+            <w:tcW w:w="4607" w:type="dxa"/>
+          </w:tcPr>
+          <w:p>
+            <w:r>
+              <w:drawing>
+                <wp:inline distT="0" distB="0" distL="0" distR="0" wp14:anchorId="67DDAE42" wp14:editId="26A392D6">
+                  <wp:extent cx="2700000" cy="2298073"/>
+                  <wp:effectExtent l="0" t="0" r="5715" b="6985"/>
+                  <wp:docPr id="276310345" name="Picture 1"/>
+                  <wp:cNvGraphicFramePr>
+                    <a:graphicFrameLocks xmlns:a="http://schemas.openxmlformats.org/drawingml/2006/main" noChangeAspect="1"/>
+                  </wp:cNvGraphicFramePr>
+                  <a:graphic xmlns:a="http://schemas.openxmlformats.org/drawingml/2006/main">
+                    <a:graphicData uri="http://schemas.openxmlformats.org/drawingml/2006/picture">
+                      <pic:pic xmlns:pic="http://schemas.openxmlformats.org/drawingml/2006/picture">
+                        <pic:nvPicPr>
+                          <pic:cNvPr id="276310345" name=""/>
+                          <pic:cNvPicPr/>
+                        </pic:nvPicPr>
+                        <pic:blipFill>
+                          <a:blip r:embed="rId77"/>
+                          <a:stretch>
+                            <a:fillRect/>
+                          </a:stretch>
+                        </pic:blipFill>
+                        <pic:spPr>
+                          <a:xfrm>
+                            <a:off x="0" y="0"/>
+                            <a:ext cx="2700000" cy="2298073"/>
+                          </a:xfrm>
+                          <a:prstGeom prst="rect">
+                            <a:avLst/>
+                          </a:prstGeom>
+                        </pic:spPr>
+                      </pic:pic>
+                    </a:graphicData>
+                  </a:graphic>
+                </wp:inline>
+              </w:drawing>
+            </w:r>
+          </w:p>
+        </w:tc>
+      </w:tr>
+    </w:tbl>
+    <w:p>
+      <w:pPr>
         <w:pStyle w:val="Heading3"/>
         <w:rPr>
           <w:lang w:eastAsia="en-GB"/>
@@ -11704,19 +12612,30 @@
           <w:lang w:eastAsia="en-GB"/>
         </w:rPr>
         <w:lastRenderedPageBreak/>
+        <w:t xml:space="preserve">Prediction </w:t>
+      </w:r>
+      <w:r>
+        <w:rPr>
+          <w:lang w:eastAsia="en-GB"/>
+        </w:rPr>
+        <w:t>per model per sequence length</w:t>
+      </w:r>
+    </w:p>
+    <w:p>
+      <w:pPr>
+        <w:pStyle w:val="Heading4"/>
+        <w:rPr>
+          <w:lang w:eastAsia="en-GB"/>
+        </w:rPr>
+      </w:pPr>
+      <w:r>
         <w:t>1024</w:t>
       </w:r>
       <w:r>
         <w:rPr>
           <w:lang w:eastAsia="en-GB"/>
         </w:rPr>
-        <w:t xml:space="preserve"> samples</w:t>
-      </w:r>
-      <w:r>
-        <w:rPr>
-          <w:lang w:eastAsia="en-GB"/>
-        </w:rPr>
-        <w:t xml:space="preserve"> for prediction</w:t>
+        <w:t xml:space="preserve"> samples for prediction</w:t>
       </w:r>
     </w:p>
     <w:p>
@@ -12071,9 +12990,13 @@
     <w:p>
       <w:pPr>
         <w:rPr>
-          <w:rFonts w:asciiTheme="majorHAnsi" w:hAnsiTheme="majorHAnsi"/>
-          <w:sz w:val="40"/>
-          <w:szCs w:val="40"/>
+          <w:lang w:eastAsia="en-GB"/>
+        </w:rPr>
+      </w:pPr>
+    </w:p>
+    <w:p>
+      <w:pPr>
+        <w:rPr>
           <w:lang w:eastAsia="en-GB"/>
         </w:rPr>
       </w:pPr>
@@ -12100,16 +13023,68 @@
       </w:r>
     </w:p>
     <w:p>
-      <w:pPr>
-        <w:rPr>
-          <w:lang w:eastAsia="en-GB"/>
-        </w:rPr>
-      </w:pPr>
-      <w:r>
-        <w:rPr>
-          <w:lang w:eastAsia="en-GB"/>
-        </w:rPr>
-        <w:t>In the previous chapter many different graphs of many different sequence lengths have been shown and the following things can be observed</w:t>
+      <w:r>
+        <w:t>In the previous chapter, various graphs with different sequence lengths</w:t>
+      </w:r>
+      <w:r>
+        <w:t xml:space="preserve"> and sampling rates</w:t>
+      </w:r>
+      <w:r>
+        <w:t xml:space="preserve"> were presented, and the following observations can be made:</w:t>
+      </w:r>
+    </w:p>
+    <w:p>
+      <w:pPr>
+        <w:pStyle w:val="ListParagraph"/>
+        <w:numPr>
+          <w:ilvl w:val="0"/>
+          <w:numId w:val="7"/>
+        </w:numPr>
+      </w:pPr>
+      <w:r>
+        <w:t xml:space="preserve">The support vector machine and convolution models perform very well with high sampling rates, achieving </w:t>
+      </w:r>
+      <w:r>
+        <w:t xml:space="preserve">over </w:t>
+      </w:r>
+      <w:r>
+        <w:t>90% accuracy with a sequence length of only 32 IQ samples.</w:t>
+      </w:r>
+    </w:p>
+    <w:p>
+      <w:pPr>
+        <w:pStyle w:val="ListParagraph"/>
+        <w:numPr>
+          <w:ilvl w:val="0"/>
+          <w:numId w:val="7"/>
+        </w:numPr>
+      </w:pPr>
+      <w:r>
+        <w:t>The FFT-based model shows a decline in performance as the number of IQ samples decreases. It is even surpassed by the model combining convolution and a support vector machine, suggesting that these models may identify patterns that the FFT transformation misses.</w:t>
+      </w:r>
+    </w:p>
+    <w:p>
+      <w:pPr>
+        <w:pStyle w:val="ListParagraph"/>
+        <w:numPr>
+          <w:ilvl w:val="0"/>
+          <w:numId w:val="7"/>
+        </w:numPr>
+      </w:pPr>
+      <w:r>
+        <w:t>A significant drop in accuracy occurs when the sampling rate is reduced by halving or removing 75% of the samples. To approach the accuracy obtained with just 32 samples, the sequence length must be substantially increased to 256 samples. This trend is consistent across both halving and quartering the sampling rate.</w:t>
+      </w:r>
+    </w:p>
+    <w:p>
+      <w:pPr>
+        <w:pStyle w:val="ListParagraph"/>
+        <w:numPr>
+          <w:ilvl w:val="0"/>
+          <w:numId w:val="7"/>
+        </w:numPr>
+      </w:pPr>
+      <w:r>
+        <w:t>The convolutional support vector machine outperforms all other models, including the FFT-based model, in every scenario.</w:t>
       </w:r>
     </w:p>
     <w:p>
@@ -12127,7 +13102,32 @@
         <w:rPr>
           <w:lang w:eastAsia="en-GB"/>
         </w:rPr>
-        <w:t>Support vector machine and convolution work very well with high sampling rates even getting up to 90% accuracy with a sequence length of only 32 IQ samples.</w:t>
+        <w:br w:type="page"/>
+      </w:r>
+    </w:p>
+    <w:p>
+      <w:pPr>
+        <w:pStyle w:val="Heading1"/>
+        <w:rPr>
+          <w:lang w:eastAsia="en-GB"/>
+        </w:rPr>
+      </w:pPr>
+      <w:r>
+        <w:rPr>
+          <w:lang w:eastAsia="en-GB"/>
+        </w:rPr>
+        <w:lastRenderedPageBreak/>
+        <w:t>Conclusion</w:t>
+      </w:r>
+    </w:p>
+    <w:p>
+      <w:r>
+        <w:t>The results show that different neural network models can achieve high accuracy in classifying which channels within a Wi-Fi spectrum have low occupancy. Interestingly, with shorter sequence lengths, the convolutional neural network and the support vector machine, which used simple convolution on the IQ samples, performed significantly better than using FFT. This suggests that the patterns present in the IQ samples are well-suited for these models to identify. Furthermore, it was observed that increasing the features derived from the two IQ samples (to 32 features in the models used) also led to a notable improvement in accuracy.</w:t>
+      </w:r>
+    </w:p>
+    <w:p>
+      <w:r>
+        <w:t>Additionally, it was demonstrated that neural networks are effective for both classification (SVM with convolution) and prediction (LSTM with convolution) of available broadband. However, as previously discussed, predicting spectrum usage for time frames longer than a few minutes requires consideration of additional factors to ensure reliability.</w:t>
       </w:r>
     </w:p>
     <w:p>
@@ -12137,73 +13137,6 @@
           <w:ilvl w:val="0"/>
           <w:numId w:val="1"/>
         </w:numPr>
-        <w:rPr>
-          <w:lang w:eastAsia="en-GB"/>
-        </w:rPr>
-      </w:pPr>
-      <w:r>
-        <w:rPr>
-          <w:lang w:eastAsia="en-GB"/>
-        </w:rPr>
-        <w:t>The model using FFT starts to perform less well once the amount of IQ samples drops, even getting surpassed by the model using convolution and a SVM, giving the impression that the neural network using these models are finding patterns that the FFT transformation cannot find.</w:t>
-      </w:r>
-    </w:p>
-    <w:p>
-      <w:pPr>
-        <w:pStyle w:val="ListParagraph"/>
-        <w:numPr>
-          <w:ilvl w:val="0"/>
-          <w:numId w:val="1"/>
-        </w:numPr>
-        <w:rPr>
-          <w:lang w:eastAsia="en-GB"/>
-        </w:rPr>
-      </w:pPr>
-      <w:r>
-        <w:rPr>
-          <w:lang w:eastAsia="en-GB"/>
-        </w:rPr>
-        <w:t>The accuracy decreases greatly once the sampling rate is decreased by dropping every other or 3 out of 4 samples. The sequence length must be increased greatly to 256 samples to get close to the same accuracy achieved with only 32 samples.</w:t>
-      </w:r>
-      <w:r>
-        <w:rPr>
-          <w:lang w:eastAsia="en-GB"/>
-        </w:rPr>
-        <w:br w:type="page"/>
-      </w:r>
-    </w:p>
-    <w:p>
-      <w:pPr>
-        <w:pStyle w:val="Heading1"/>
-        <w:rPr>
-          <w:lang w:eastAsia="en-GB"/>
-        </w:rPr>
-      </w:pPr>
-      <w:r>
-        <w:rPr>
-          <w:lang w:eastAsia="en-GB"/>
-        </w:rPr>
-        <w:lastRenderedPageBreak/>
-        <w:t>Conclusion</w:t>
-      </w:r>
-    </w:p>
-    <w:p>
-      <w:r>
-        <w:t>The results show that different neural network models can achieve high accuracy in classifying which channels within a Wi-Fi spectrum have low occupancy. Interestingly, with shorter sequence lengths, the convolutional neural network and the support vector machine, which used simple convolution on the IQ samples, performed significantly better than using FFT. This suggests that the patterns present in the IQ samples are well-suited for these models to identify. Furthermore, it was observed that increasing the features derived from the two IQ samples (to 32 features in the models used) also led to a notable improvement in accuracy.</w:t>
-      </w:r>
-    </w:p>
-    <w:p>
-      <w:r>
-        <w:t>Additionally, it was demonstrated that neural networks are effective for both classification (SVM with convolution) and prediction (LSTM with convolution) of available broadband. However, as previously discussed, predicting spectrum usage for time frames longer than a few minutes requires consideration of additional factors to ensure reliability.</w:t>
-      </w:r>
-    </w:p>
-    <w:p>
-      <w:pPr>
-        <w:pStyle w:val="ListParagraph"/>
-        <w:numPr>
-          <w:ilvl w:val="0"/>
-          <w:numId w:val="1"/>
-        </w:numPr>
       </w:pPr>
       <w:r>
         <w:br w:type="page"/>
@@ -12283,7 +13216,7 @@
       <w:r>
         <w:t xml:space="preserve">(1). </w:t>
       </w:r>
-      <w:hyperlink r:id="rId70" w:history="1">
+      <w:hyperlink r:id="rId78" w:history="1">
         <w:r>
           <w:rPr>
             <w:rStyle w:val="Hyperlink"/>
@@ -12306,7 +13239,7 @@
       <w:r>
         <w:t xml:space="preserve">What is a Large Language Model? | A Comprehensive LLMs Guide. (n.d.). Elastic. </w:t>
       </w:r>
-      <w:hyperlink r:id="rId71" w:anchor="what-is-the-difference-between-large-language-models-and-generative-ai" w:history="1">
+      <w:hyperlink r:id="rId79" w:anchor="what-is-the-difference-between-large-language-models-and-generative-ai" w:history="1">
         <w:r>
           <w:rPr>
             <w:rStyle w:val="Hyperlink"/>
@@ -12339,7 +13272,7 @@
       <w:r>
         <w:t xml:space="preserve">. arXiv.org. </w:t>
       </w:r>
-      <w:hyperlink r:id="rId72" w:history="1">
+      <w:hyperlink r:id="rId80" w:history="1">
         <w:r>
           <w:rPr>
             <w:rStyle w:val="Hyperlink"/>
@@ -12369,7 +13302,7 @@
       <w:r>
         <w:t xml:space="preserve">. (2016, January 1). IEEE Journals &amp; Magazine | IEEE Xplore. </w:t>
       </w:r>
-      <w:hyperlink r:id="rId73" w:history="1">
+      <w:hyperlink r:id="rId81" w:history="1">
         <w:r>
           <w:rPr>
             <w:rStyle w:val="Hyperlink"/>
@@ -12398,7 +13331,7 @@
       <w:r>
         <w:t xml:space="preserve">Scale mapping of urban radio frequency noise at very high frequency and ultra high frequency. Radio Science, 54(11), 934–948. </w:t>
       </w:r>
-      <w:hyperlink r:id="rId74" w:history="1">
+      <w:hyperlink r:id="rId82" w:history="1">
         <w:r>
           <w:rPr>
             <w:rStyle w:val="Hyperlink"/>
@@ -12456,405 +13389,9 @@
 <file path=word/numbering.xml><?xml version="1.0" encoding="utf-8"?>
 <w:numbering xmlns:wpc="http://schemas.microsoft.com/office/word/2010/wordprocessingCanvas" xmlns:cx="http://schemas.microsoft.com/office/drawing/2014/chartex" xmlns:cx1="http://schemas.microsoft.com/office/drawing/2015/9/8/chartex" xmlns:cx2="http://schemas.microsoft.com/office/drawing/2015/10/21/chartex" xmlns:cx3="http://schemas.microsoft.com/office/drawing/2016/5/9/chartex" xmlns:cx4="http://schemas.microsoft.com/office/drawing/2016/5/10/chartex" xmlns:cx5="http://schemas.microsoft.com/office/drawing/2016/5/11/chartex" xmlns:cx6="http://schemas.microsoft.com/office/drawing/2016/5/12/chartex" xmlns:cx7="http://schemas.microsoft.com/office/drawing/2016/5/13/chartex" xmlns:cx8="http://schemas.microsoft.com/office/drawing/2016/5/14/chartex" xmlns:mc="http://schemas.openxmlformats.org/markup-compatibility/2006" xmlns:aink="http://schemas.microsoft.com/office/drawing/2016/ink" xmlns:am3d="http://schemas.microsoft.com/office/drawing/2017/model3d" xmlns:o="urn:schemas-microsoft-com:office:office" xmlns:oel="http://schemas.microsoft.com/office/2019/extlst" xmlns:r="http://schemas.openxmlformats.org/officeDocument/2006/relationships" xmlns:m="http://schemas.openxmlformats.org/officeDocument/2006/math" xmlns:v="urn:schemas-microsoft-com:vml" xmlns:wp14="http://schemas.microsoft.com/office/word/2010/wordprocessingDrawing" xmlns:wp="http://schemas.openxmlformats.org/drawingml/2006/wordprocessingDrawing" xmlns:w10="urn:schemas-microsoft-com:office:word" xmlns:w="http://schemas.openxmlformats.org/wordprocessingml/2006/main" xmlns:w14="http://schemas.microsoft.com/office/word/2010/wordml" xmlns:w15="http://schemas.microsoft.com/office/word/2012/wordml" xmlns:w16cex="http://schemas.microsoft.com/office/word/2018/wordml/cex" xmlns:w16cid="http://schemas.microsoft.com/office/word/2016/wordml/cid" xmlns:w16="http://schemas.microsoft.com/office/word/2018/wordml" xmlns:w16du="http://schemas.microsoft.com/office/word/2023/wordml/word16du" xmlns:w16sdtdh="http://schemas.microsoft.com/office/word/2020/wordml/sdtdatahash" xmlns:w16sdtfl="http://schemas.microsoft.com/office/word/2024/wordml/sdtformatlock" xmlns:w16se="http://schemas.microsoft.com/office/word/2015/wordml/symex" xmlns:wpg="http://schemas.microsoft.com/office/word/2010/wordprocessingGroup" xmlns:wpi="http://schemas.microsoft.com/office/word/2010/wordprocessingInk" xmlns:wne="http://schemas.microsoft.com/office/word/2006/wordml" xmlns:wps="http://schemas.microsoft.com/office/word/2010/wordprocessingShape" mc:Ignorable="w14 w15 w16se w16cid w16 w16cex w16sdtdh w16sdtfl w16du wp14">
   <w:abstractNum w:abstractNumId="0" w15:restartNumberingAfterBreak="0">
-    <w:nsid w:val="365815B3"/>
-    <w:multiLevelType w:val="hybridMultilevel"/>
-    <w:tmpl w:val="6BC26F20"/>
-    <w:lvl w:ilvl="0" w:tplc="E4A65C3C">
-      <w:numFmt w:val="bullet"/>
-      <w:lvlText w:val="-"/>
-      <w:lvlJc w:val="left"/>
-      <w:pPr>
-        <w:ind w:left="360" w:hanging="360"/>
-      </w:pPr>
-      <w:rPr>
-        <w:rFonts w:ascii="Aptos" w:eastAsiaTheme="minorHAnsi" w:hAnsi="Aptos" w:cstheme="minorBidi" w:hint="default"/>
-      </w:rPr>
-    </w:lvl>
-    <w:lvl w:ilvl="1" w:tplc="08090003" w:tentative="1">
-      <w:start w:val="1"/>
-      <w:numFmt w:val="bullet"/>
-      <w:lvlText w:val="o"/>
-      <w:lvlJc w:val="left"/>
-      <w:pPr>
-        <w:ind w:left="1080" w:hanging="360"/>
-      </w:pPr>
-      <w:rPr>
-        <w:rFonts w:ascii="Courier New" w:hAnsi="Courier New" w:cs="Courier New" w:hint="default"/>
-      </w:rPr>
-    </w:lvl>
-    <w:lvl w:ilvl="2" w:tplc="08090005" w:tentative="1">
-      <w:start w:val="1"/>
-      <w:numFmt w:val="bullet"/>
-      <w:lvlText w:val=""/>
-      <w:lvlJc w:val="left"/>
-      <w:pPr>
-        <w:ind w:left="1800" w:hanging="360"/>
-      </w:pPr>
-      <w:rPr>
-        <w:rFonts w:ascii="Wingdings" w:hAnsi="Wingdings" w:hint="default"/>
-      </w:rPr>
-    </w:lvl>
-    <w:lvl w:ilvl="3" w:tplc="08090001" w:tentative="1">
-      <w:start w:val="1"/>
-      <w:numFmt w:val="bullet"/>
-      <w:lvlText w:val=""/>
-      <w:lvlJc w:val="left"/>
-      <w:pPr>
-        <w:ind w:left="2520" w:hanging="360"/>
-      </w:pPr>
-      <w:rPr>
-        <w:rFonts w:ascii="Symbol" w:hAnsi="Symbol" w:hint="default"/>
-      </w:rPr>
-    </w:lvl>
-    <w:lvl w:ilvl="4" w:tplc="08090003" w:tentative="1">
-      <w:start w:val="1"/>
-      <w:numFmt w:val="bullet"/>
-      <w:lvlText w:val="o"/>
-      <w:lvlJc w:val="left"/>
-      <w:pPr>
-        <w:ind w:left="3240" w:hanging="360"/>
-      </w:pPr>
-      <w:rPr>
-        <w:rFonts w:ascii="Courier New" w:hAnsi="Courier New" w:cs="Courier New" w:hint="default"/>
-      </w:rPr>
-    </w:lvl>
-    <w:lvl w:ilvl="5" w:tplc="08090005" w:tentative="1">
-      <w:start w:val="1"/>
-      <w:numFmt w:val="bullet"/>
-      <w:lvlText w:val=""/>
-      <w:lvlJc w:val="left"/>
-      <w:pPr>
-        <w:ind w:left="3960" w:hanging="360"/>
-      </w:pPr>
-      <w:rPr>
-        <w:rFonts w:ascii="Wingdings" w:hAnsi="Wingdings" w:hint="default"/>
-      </w:rPr>
-    </w:lvl>
-    <w:lvl w:ilvl="6" w:tplc="08090001" w:tentative="1">
-      <w:start w:val="1"/>
-      <w:numFmt w:val="bullet"/>
-      <w:lvlText w:val=""/>
-      <w:lvlJc w:val="left"/>
-      <w:pPr>
-        <w:ind w:left="4680" w:hanging="360"/>
-      </w:pPr>
-      <w:rPr>
-        <w:rFonts w:ascii="Symbol" w:hAnsi="Symbol" w:hint="default"/>
-      </w:rPr>
-    </w:lvl>
-    <w:lvl w:ilvl="7" w:tplc="08090003" w:tentative="1">
-      <w:start w:val="1"/>
-      <w:numFmt w:val="bullet"/>
-      <w:lvlText w:val="o"/>
-      <w:lvlJc w:val="left"/>
-      <w:pPr>
-        <w:ind w:left="5400" w:hanging="360"/>
-      </w:pPr>
-      <w:rPr>
-        <w:rFonts w:ascii="Courier New" w:hAnsi="Courier New" w:cs="Courier New" w:hint="default"/>
-      </w:rPr>
-    </w:lvl>
-    <w:lvl w:ilvl="8" w:tplc="08090005" w:tentative="1">
-      <w:start w:val="1"/>
-      <w:numFmt w:val="bullet"/>
-      <w:lvlText w:val=""/>
-      <w:lvlJc w:val="left"/>
-      <w:pPr>
-        <w:ind w:left="6120" w:hanging="360"/>
-      </w:pPr>
-      <w:rPr>
-        <w:rFonts w:ascii="Wingdings" w:hAnsi="Wingdings" w:hint="default"/>
-      </w:rPr>
-    </w:lvl>
-  </w:abstractNum>
-  <w:abstractNum w:abstractNumId="1" w15:restartNumberingAfterBreak="0">
-    <w:nsid w:val="4A304BF4"/>
-    <w:multiLevelType w:val="hybridMultilevel"/>
-    <w:tmpl w:val="61BCC520"/>
-    <w:lvl w:ilvl="0" w:tplc="0809000F">
-      <w:start w:val="1"/>
-      <w:numFmt w:val="decimal"/>
-      <w:lvlText w:val="%1."/>
-      <w:lvlJc w:val="left"/>
-      <w:pPr>
-        <w:ind w:left="360" w:hanging="360"/>
-      </w:pPr>
-    </w:lvl>
-    <w:lvl w:ilvl="1" w:tplc="08090019" w:tentative="1">
-      <w:start w:val="1"/>
-      <w:numFmt w:val="lowerLetter"/>
-      <w:lvlText w:val="%2."/>
-      <w:lvlJc w:val="left"/>
-      <w:pPr>
-        <w:ind w:left="1080" w:hanging="360"/>
-      </w:pPr>
-    </w:lvl>
-    <w:lvl w:ilvl="2" w:tplc="0809001B" w:tentative="1">
-      <w:start w:val="1"/>
-      <w:numFmt w:val="lowerRoman"/>
-      <w:lvlText w:val="%3."/>
-      <w:lvlJc w:val="right"/>
-      <w:pPr>
-        <w:ind w:left="1800" w:hanging="180"/>
-      </w:pPr>
-    </w:lvl>
-    <w:lvl w:ilvl="3" w:tplc="0809000F" w:tentative="1">
-      <w:start w:val="1"/>
-      <w:numFmt w:val="decimal"/>
-      <w:lvlText w:val="%4."/>
-      <w:lvlJc w:val="left"/>
-      <w:pPr>
-        <w:ind w:left="2520" w:hanging="360"/>
-      </w:pPr>
-    </w:lvl>
-    <w:lvl w:ilvl="4" w:tplc="08090019" w:tentative="1">
-      <w:start w:val="1"/>
-      <w:numFmt w:val="lowerLetter"/>
-      <w:lvlText w:val="%5."/>
-      <w:lvlJc w:val="left"/>
-      <w:pPr>
-        <w:ind w:left="3240" w:hanging="360"/>
-      </w:pPr>
-    </w:lvl>
-    <w:lvl w:ilvl="5" w:tplc="0809001B" w:tentative="1">
-      <w:start w:val="1"/>
-      <w:numFmt w:val="lowerRoman"/>
-      <w:lvlText w:val="%6."/>
-      <w:lvlJc w:val="right"/>
-      <w:pPr>
-        <w:ind w:left="3960" w:hanging="180"/>
-      </w:pPr>
-    </w:lvl>
-    <w:lvl w:ilvl="6" w:tplc="0809000F" w:tentative="1">
-      <w:start w:val="1"/>
-      <w:numFmt w:val="decimal"/>
-      <w:lvlText w:val="%7."/>
-      <w:lvlJc w:val="left"/>
-      <w:pPr>
-        <w:ind w:left="4680" w:hanging="360"/>
-      </w:pPr>
-    </w:lvl>
-    <w:lvl w:ilvl="7" w:tplc="08090019" w:tentative="1">
-      <w:start w:val="1"/>
-      <w:numFmt w:val="lowerLetter"/>
-      <w:lvlText w:val="%8."/>
-      <w:lvlJc w:val="left"/>
-      <w:pPr>
-        <w:ind w:left="5400" w:hanging="360"/>
-      </w:pPr>
-    </w:lvl>
-    <w:lvl w:ilvl="8" w:tplc="0809001B" w:tentative="1">
-      <w:start w:val="1"/>
-      <w:numFmt w:val="lowerRoman"/>
-      <w:lvlText w:val="%9."/>
-      <w:lvlJc w:val="right"/>
-      <w:pPr>
-        <w:ind w:left="6120" w:hanging="180"/>
-      </w:pPr>
-    </w:lvl>
-  </w:abstractNum>
-  <w:abstractNum w:abstractNumId="2" w15:restartNumberingAfterBreak="0">
-    <w:nsid w:val="67AF04C5"/>
-    <w:multiLevelType w:val="hybridMultilevel"/>
-    <w:tmpl w:val="DC263FDA"/>
-    <w:lvl w:ilvl="0" w:tplc="0809000F">
-      <w:start w:val="1"/>
-      <w:numFmt w:val="decimal"/>
-      <w:lvlText w:val="%1."/>
-      <w:lvlJc w:val="left"/>
-      <w:pPr>
-        <w:ind w:left="360" w:hanging="360"/>
-      </w:pPr>
-    </w:lvl>
-    <w:lvl w:ilvl="1" w:tplc="08090019" w:tentative="1">
-      <w:start w:val="1"/>
-      <w:numFmt w:val="lowerLetter"/>
-      <w:lvlText w:val="%2."/>
-      <w:lvlJc w:val="left"/>
-      <w:pPr>
-        <w:ind w:left="1080" w:hanging="360"/>
-      </w:pPr>
-    </w:lvl>
-    <w:lvl w:ilvl="2" w:tplc="0809001B" w:tentative="1">
-      <w:start w:val="1"/>
-      <w:numFmt w:val="lowerRoman"/>
-      <w:lvlText w:val="%3."/>
-      <w:lvlJc w:val="right"/>
-      <w:pPr>
-        <w:ind w:left="1800" w:hanging="180"/>
-      </w:pPr>
-    </w:lvl>
-    <w:lvl w:ilvl="3" w:tplc="0809000F" w:tentative="1">
-      <w:start w:val="1"/>
-      <w:numFmt w:val="decimal"/>
-      <w:lvlText w:val="%4."/>
-      <w:lvlJc w:val="left"/>
-      <w:pPr>
-        <w:ind w:left="2520" w:hanging="360"/>
-      </w:pPr>
-    </w:lvl>
-    <w:lvl w:ilvl="4" w:tplc="08090019" w:tentative="1">
-      <w:start w:val="1"/>
-      <w:numFmt w:val="lowerLetter"/>
-      <w:lvlText w:val="%5."/>
-      <w:lvlJc w:val="left"/>
-      <w:pPr>
-        <w:ind w:left="3240" w:hanging="360"/>
-      </w:pPr>
-    </w:lvl>
-    <w:lvl w:ilvl="5" w:tplc="0809001B" w:tentative="1">
-      <w:start w:val="1"/>
-      <w:numFmt w:val="lowerRoman"/>
-      <w:lvlText w:val="%6."/>
-      <w:lvlJc w:val="right"/>
-      <w:pPr>
-        <w:ind w:left="3960" w:hanging="180"/>
-      </w:pPr>
-    </w:lvl>
-    <w:lvl w:ilvl="6" w:tplc="0809000F" w:tentative="1">
-      <w:start w:val="1"/>
-      <w:numFmt w:val="decimal"/>
-      <w:lvlText w:val="%7."/>
-      <w:lvlJc w:val="left"/>
-      <w:pPr>
-        <w:ind w:left="4680" w:hanging="360"/>
-      </w:pPr>
-    </w:lvl>
-    <w:lvl w:ilvl="7" w:tplc="08090019" w:tentative="1">
-      <w:start w:val="1"/>
-      <w:numFmt w:val="lowerLetter"/>
-      <w:lvlText w:val="%8."/>
-      <w:lvlJc w:val="left"/>
-      <w:pPr>
-        <w:ind w:left="5400" w:hanging="360"/>
-      </w:pPr>
-    </w:lvl>
-    <w:lvl w:ilvl="8" w:tplc="0809001B" w:tentative="1">
-      <w:start w:val="1"/>
-      <w:numFmt w:val="lowerRoman"/>
-      <w:lvlText w:val="%9."/>
-      <w:lvlJc w:val="right"/>
-      <w:pPr>
-        <w:ind w:left="6120" w:hanging="180"/>
-      </w:pPr>
-    </w:lvl>
-  </w:abstractNum>
-  <w:abstractNum w:abstractNumId="3" w15:restartNumberingAfterBreak="0">
-    <w:nsid w:val="79266A5F"/>
-    <w:multiLevelType w:val="hybridMultilevel"/>
-    <w:tmpl w:val="BCD49A5E"/>
-    <w:lvl w:ilvl="0" w:tplc="E4A65C3C">
-      <w:numFmt w:val="bullet"/>
-      <w:lvlText w:val="-"/>
-      <w:lvlJc w:val="left"/>
-      <w:pPr>
-        <w:ind w:left="720" w:hanging="360"/>
-      </w:pPr>
-      <w:rPr>
-        <w:rFonts w:ascii="Aptos" w:eastAsiaTheme="minorHAnsi" w:hAnsi="Aptos" w:cstheme="minorBidi" w:hint="default"/>
-      </w:rPr>
-    </w:lvl>
-    <w:lvl w:ilvl="1" w:tplc="08090003" w:tentative="1">
-      <w:start w:val="1"/>
-      <w:numFmt w:val="bullet"/>
-      <w:lvlText w:val="o"/>
-      <w:lvlJc w:val="left"/>
-      <w:pPr>
-        <w:ind w:left="1440" w:hanging="360"/>
-      </w:pPr>
-      <w:rPr>
-        <w:rFonts w:ascii="Courier New" w:hAnsi="Courier New" w:cs="Courier New" w:hint="default"/>
-      </w:rPr>
-    </w:lvl>
-    <w:lvl w:ilvl="2" w:tplc="08090005" w:tentative="1">
-      <w:start w:val="1"/>
-      <w:numFmt w:val="bullet"/>
-      <w:lvlText w:val=""/>
-      <w:lvlJc w:val="left"/>
-      <w:pPr>
-        <w:ind w:left="2160" w:hanging="360"/>
-      </w:pPr>
-      <w:rPr>
-        <w:rFonts w:ascii="Wingdings" w:hAnsi="Wingdings" w:hint="default"/>
-      </w:rPr>
-    </w:lvl>
-    <w:lvl w:ilvl="3" w:tplc="08090001" w:tentative="1">
-      <w:start w:val="1"/>
-      <w:numFmt w:val="bullet"/>
-      <w:lvlText w:val=""/>
-      <w:lvlJc w:val="left"/>
-      <w:pPr>
-        <w:ind w:left="2880" w:hanging="360"/>
-      </w:pPr>
-      <w:rPr>
-        <w:rFonts w:ascii="Symbol" w:hAnsi="Symbol" w:hint="default"/>
-      </w:rPr>
-    </w:lvl>
-    <w:lvl w:ilvl="4" w:tplc="08090003" w:tentative="1">
-      <w:start w:val="1"/>
-      <w:numFmt w:val="bullet"/>
-      <w:lvlText w:val="o"/>
-      <w:lvlJc w:val="left"/>
-      <w:pPr>
-        <w:ind w:left="3600" w:hanging="360"/>
-      </w:pPr>
-      <w:rPr>
-        <w:rFonts w:ascii="Courier New" w:hAnsi="Courier New" w:cs="Courier New" w:hint="default"/>
-      </w:rPr>
-    </w:lvl>
-    <w:lvl w:ilvl="5" w:tplc="08090005" w:tentative="1">
-      <w:start w:val="1"/>
-      <w:numFmt w:val="bullet"/>
-      <w:lvlText w:val=""/>
-      <w:lvlJc w:val="left"/>
-      <w:pPr>
-        <w:ind w:left="4320" w:hanging="360"/>
-      </w:pPr>
-      <w:rPr>
-        <w:rFonts w:ascii="Wingdings" w:hAnsi="Wingdings" w:hint="default"/>
-      </w:rPr>
-    </w:lvl>
-    <w:lvl w:ilvl="6" w:tplc="08090001" w:tentative="1">
-      <w:start w:val="1"/>
-      <w:numFmt w:val="bullet"/>
-      <w:lvlText w:val=""/>
-      <w:lvlJc w:val="left"/>
-      <w:pPr>
-        <w:ind w:left="5040" w:hanging="360"/>
-      </w:pPr>
-      <w:rPr>
-        <w:rFonts w:ascii="Symbol" w:hAnsi="Symbol" w:hint="default"/>
-      </w:rPr>
-    </w:lvl>
-    <w:lvl w:ilvl="7" w:tplc="08090003" w:tentative="1">
-      <w:start w:val="1"/>
-      <w:numFmt w:val="bullet"/>
-      <w:lvlText w:val="o"/>
-      <w:lvlJc w:val="left"/>
-      <w:pPr>
-        <w:ind w:left="5760" w:hanging="360"/>
-      </w:pPr>
-      <w:rPr>
-        <w:rFonts w:ascii="Courier New" w:hAnsi="Courier New" w:cs="Courier New" w:hint="default"/>
-      </w:rPr>
-    </w:lvl>
-    <w:lvl w:ilvl="8" w:tplc="08090005" w:tentative="1">
-      <w:start w:val="1"/>
-      <w:numFmt w:val="bullet"/>
-      <w:lvlText w:val=""/>
-      <w:lvlJc w:val="left"/>
-      <w:pPr>
-        <w:ind w:left="6480" w:hanging="360"/>
-      </w:pPr>
-      <w:rPr>
-        <w:rFonts w:ascii="Wingdings" w:hAnsi="Wingdings" w:hint="default"/>
-      </w:rPr>
-    </w:lvl>
-  </w:abstractNum>
-  <w:abstractNum w:abstractNumId="4" w15:restartNumberingAfterBreak="0">
-    <w:nsid w:val="7E45043B"/>
+    <w:nsid w:val="1AE611CA"/>
     <w:multiLevelType w:val="multilevel"/>
-    <w:tmpl w:val="D264E3C4"/>
+    <w:tmpl w:val="6F604090"/>
     <w:lvl w:ilvl="0">
       <w:start w:val="1"/>
       <w:numFmt w:val="bullet"/>
@@ -13000,19 +13537,682 @@
       </w:rPr>
     </w:lvl>
   </w:abstractNum>
+  <w:abstractNum w:abstractNumId="1" w15:restartNumberingAfterBreak="0">
+    <w:nsid w:val="365815B3"/>
+    <w:multiLevelType w:val="hybridMultilevel"/>
+    <w:tmpl w:val="6BC26F20"/>
+    <w:lvl w:ilvl="0" w:tplc="E4A65C3C">
+      <w:numFmt w:val="bullet"/>
+      <w:lvlText w:val="-"/>
+      <w:lvlJc w:val="left"/>
+      <w:pPr>
+        <w:ind w:left="360" w:hanging="360"/>
+      </w:pPr>
+      <w:rPr>
+        <w:rFonts w:ascii="Aptos" w:eastAsiaTheme="minorHAnsi" w:hAnsi="Aptos" w:cstheme="minorBidi" w:hint="default"/>
+      </w:rPr>
+    </w:lvl>
+    <w:lvl w:ilvl="1" w:tplc="08090003" w:tentative="1">
+      <w:start w:val="1"/>
+      <w:numFmt w:val="bullet"/>
+      <w:lvlText w:val="o"/>
+      <w:lvlJc w:val="left"/>
+      <w:pPr>
+        <w:ind w:left="1080" w:hanging="360"/>
+      </w:pPr>
+      <w:rPr>
+        <w:rFonts w:ascii="Courier New" w:hAnsi="Courier New" w:cs="Courier New" w:hint="default"/>
+      </w:rPr>
+    </w:lvl>
+    <w:lvl w:ilvl="2" w:tplc="08090005" w:tentative="1">
+      <w:start w:val="1"/>
+      <w:numFmt w:val="bullet"/>
+      <w:lvlText w:val=""/>
+      <w:lvlJc w:val="left"/>
+      <w:pPr>
+        <w:ind w:left="1800" w:hanging="360"/>
+      </w:pPr>
+      <w:rPr>
+        <w:rFonts w:ascii="Wingdings" w:hAnsi="Wingdings" w:hint="default"/>
+      </w:rPr>
+    </w:lvl>
+    <w:lvl w:ilvl="3" w:tplc="08090001" w:tentative="1">
+      <w:start w:val="1"/>
+      <w:numFmt w:val="bullet"/>
+      <w:lvlText w:val=""/>
+      <w:lvlJc w:val="left"/>
+      <w:pPr>
+        <w:ind w:left="2520" w:hanging="360"/>
+      </w:pPr>
+      <w:rPr>
+        <w:rFonts w:ascii="Symbol" w:hAnsi="Symbol" w:hint="default"/>
+      </w:rPr>
+    </w:lvl>
+    <w:lvl w:ilvl="4" w:tplc="08090003" w:tentative="1">
+      <w:start w:val="1"/>
+      <w:numFmt w:val="bullet"/>
+      <w:lvlText w:val="o"/>
+      <w:lvlJc w:val="left"/>
+      <w:pPr>
+        <w:ind w:left="3240" w:hanging="360"/>
+      </w:pPr>
+      <w:rPr>
+        <w:rFonts w:ascii="Courier New" w:hAnsi="Courier New" w:cs="Courier New" w:hint="default"/>
+      </w:rPr>
+    </w:lvl>
+    <w:lvl w:ilvl="5" w:tplc="08090005" w:tentative="1">
+      <w:start w:val="1"/>
+      <w:numFmt w:val="bullet"/>
+      <w:lvlText w:val=""/>
+      <w:lvlJc w:val="left"/>
+      <w:pPr>
+        <w:ind w:left="3960" w:hanging="360"/>
+      </w:pPr>
+      <w:rPr>
+        <w:rFonts w:ascii="Wingdings" w:hAnsi="Wingdings" w:hint="default"/>
+      </w:rPr>
+    </w:lvl>
+    <w:lvl w:ilvl="6" w:tplc="08090001" w:tentative="1">
+      <w:start w:val="1"/>
+      <w:numFmt w:val="bullet"/>
+      <w:lvlText w:val=""/>
+      <w:lvlJc w:val="left"/>
+      <w:pPr>
+        <w:ind w:left="4680" w:hanging="360"/>
+      </w:pPr>
+      <w:rPr>
+        <w:rFonts w:ascii="Symbol" w:hAnsi="Symbol" w:hint="default"/>
+      </w:rPr>
+    </w:lvl>
+    <w:lvl w:ilvl="7" w:tplc="08090003" w:tentative="1">
+      <w:start w:val="1"/>
+      <w:numFmt w:val="bullet"/>
+      <w:lvlText w:val="o"/>
+      <w:lvlJc w:val="left"/>
+      <w:pPr>
+        <w:ind w:left="5400" w:hanging="360"/>
+      </w:pPr>
+      <w:rPr>
+        <w:rFonts w:ascii="Courier New" w:hAnsi="Courier New" w:cs="Courier New" w:hint="default"/>
+      </w:rPr>
+    </w:lvl>
+    <w:lvl w:ilvl="8" w:tplc="08090005" w:tentative="1">
+      <w:start w:val="1"/>
+      <w:numFmt w:val="bullet"/>
+      <w:lvlText w:val=""/>
+      <w:lvlJc w:val="left"/>
+      <w:pPr>
+        <w:ind w:left="6120" w:hanging="360"/>
+      </w:pPr>
+      <w:rPr>
+        <w:rFonts w:ascii="Wingdings" w:hAnsi="Wingdings" w:hint="default"/>
+      </w:rPr>
+    </w:lvl>
+  </w:abstractNum>
+  <w:abstractNum w:abstractNumId="2" w15:restartNumberingAfterBreak="0">
+    <w:nsid w:val="4A304BF4"/>
+    <w:multiLevelType w:val="hybridMultilevel"/>
+    <w:tmpl w:val="61BCC520"/>
+    <w:lvl w:ilvl="0" w:tplc="0809000F">
+      <w:start w:val="1"/>
+      <w:numFmt w:val="decimal"/>
+      <w:lvlText w:val="%1."/>
+      <w:lvlJc w:val="left"/>
+      <w:pPr>
+        <w:ind w:left="360" w:hanging="360"/>
+      </w:pPr>
+    </w:lvl>
+    <w:lvl w:ilvl="1" w:tplc="08090019" w:tentative="1">
+      <w:start w:val="1"/>
+      <w:numFmt w:val="lowerLetter"/>
+      <w:lvlText w:val="%2."/>
+      <w:lvlJc w:val="left"/>
+      <w:pPr>
+        <w:ind w:left="1080" w:hanging="360"/>
+      </w:pPr>
+    </w:lvl>
+    <w:lvl w:ilvl="2" w:tplc="0809001B" w:tentative="1">
+      <w:start w:val="1"/>
+      <w:numFmt w:val="lowerRoman"/>
+      <w:lvlText w:val="%3."/>
+      <w:lvlJc w:val="right"/>
+      <w:pPr>
+        <w:ind w:left="1800" w:hanging="180"/>
+      </w:pPr>
+    </w:lvl>
+    <w:lvl w:ilvl="3" w:tplc="0809000F" w:tentative="1">
+      <w:start w:val="1"/>
+      <w:numFmt w:val="decimal"/>
+      <w:lvlText w:val="%4."/>
+      <w:lvlJc w:val="left"/>
+      <w:pPr>
+        <w:ind w:left="2520" w:hanging="360"/>
+      </w:pPr>
+    </w:lvl>
+    <w:lvl w:ilvl="4" w:tplc="08090019" w:tentative="1">
+      <w:start w:val="1"/>
+      <w:numFmt w:val="lowerLetter"/>
+      <w:lvlText w:val="%5."/>
+      <w:lvlJc w:val="left"/>
+      <w:pPr>
+        <w:ind w:left="3240" w:hanging="360"/>
+      </w:pPr>
+    </w:lvl>
+    <w:lvl w:ilvl="5" w:tplc="0809001B" w:tentative="1">
+      <w:start w:val="1"/>
+      <w:numFmt w:val="lowerRoman"/>
+      <w:lvlText w:val="%6."/>
+      <w:lvlJc w:val="right"/>
+      <w:pPr>
+        <w:ind w:left="3960" w:hanging="180"/>
+      </w:pPr>
+    </w:lvl>
+    <w:lvl w:ilvl="6" w:tplc="0809000F" w:tentative="1">
+      <w:start w:val="1"/>
+      <w:numFmt w:val="decimal"/>
+      <w:lvlText w:val="%7."/>
+      <w:lvlJc w:val="left"/>
+      <w:pPr>
+        <w:ind w:left="4680" w:hanging="360"/>
+      </w:pPr>
+    </w:lvl>
+    <w:lvl w:ilvl="7" w:tplc="08090019" w:tentative="1">
+      <w:start w:val="1"/>
+      <w:numFmt w:val="lowerLetter"/>
+      <w:lvlText w:val="%8."/>
+      <w:lvlJc w:val="left"/>
+      <w:pPr>
+        <w:ind w:left="5400" w:hanging="360"/>
+      </w:pPr>
+    </w:lvl>
+    <w:lvl w:ilvl="8" w:tplc="0809001B" w:tentative="1">
+      <w:start w:val="1"/>
+      <w:numFmt w:val="lowerRoman"/>
+      <w:lvlText w:val="%9."/>
+      <w:lvlJc w:val="right"/>
+      <w:pPr>
+        <w:ind w:left="6120" w:hanging="180"/>
+      </w:pPr>
+    </w:lvl>
+  </w:abstractNum>
+  <w:abstractNum w:abstractNumId="3" w15:restartNumberingAfterBreak="0">
+    <w:nsid w:val="67AF04C5"/>
+    <w:multiLevelType w:val="hybridMultilevel"/>
+    <w:tmpl w:val="DC263FDA"/>
+    <w:lvl w:ilvl="0" w:tplc="0809000F">
+      <w:start w:val="1"/>
+      <w:numFmt w:val="decimal"/>
+      <w:lvlText w:val="%1."/>
+      <w:lvlJc w:val="left"/>
+      <w:pPr>
+        <w:ind w:left="360" w:hanging="360"/>
+      </w:pPr>
+    </w:lvl>
+    <w:lvl w:ilvl="1" w:tplc="08090019" w:tentative="1">
+      <w:start w:val="1"/>
+      <w:numFmt w:val="lowerLetter"/>
+      <w:lvlText w:val="%2."/>
+      <w:lvlJc w:val="left"/>
+      <w:pPr>
+        <w:ind w:left="1080" w:hanging="360"/>
+      </w:pPr>
+    </w:lvl>
+    <w:lvl w:ilvl="2" w:tplc="0809001B" w:tentative="1">
+      <w:start w:val="1"/>
+      <w:numFmt w:val="lowerRoman"/>
+      <w:lvlText w:val="%3."/>
+      <w:lvlJc w:val="right"/>
+      <w:pPr>
+        <w:ind w:left="1800" w:hanging="180"/>
+      </w:pPr>
+    </w:lvl>
+    <w:lvl w:ilvl="3" w:tplc="0809000F" w:tentative="1">
+      <w:start w:val="1"/>
+      <w:numFmt w:val="decimal"/>
+      <w:lvlText w:val="%4."/>
+      <w:lvlJc w:val="left"/>
+      <w:pPr>
+        <w:ind w:left="2520" w:hanging="360"/>
+      </w:pPr>
+    </w:lvl>
+    <w:lvl w:ilvl="4" w:tplc="08090019" w:tentative="1">
+      <w:start w:val="1"/>
+      <w:numFmt w:val="lowerLetter"/>
+      <w:lvlText w:val="%5."/>
+      <w:lvlJc w:val="left"/>
+      <w:pPr>
+        <w:ind w:left="3240" w:hanging="360"/>
+      </w:pPr>
+    </w:lvl>
+    <w:lvl w:ilvl="5" w:tplc="0809001B" w:tentative="1">
+      <w:start w:val="1"/>
+      <w:numFmt w:val="lowerRoman"/>
+      <w:lvlText w:val="%6."/>
+      <w:lvlJc w:val="right"/>
+      <w:pPr>
+        <w:ind w:left="3960" w:hanging="180"/>
+      </w:pPr>
+    </w:lvl>
+    <w:lvl w:ilvl="6" w:tplc="0809000F" w:tentative="1">
+      <w:start w:val="1"/>
+      <w:numFmt w:val="decimal"/>
+      <w:lvlText w:val="%7."/>
+      <w:lvlJc w:val="left"/>
+      <w:pPr>
+        <w:ind w:left="4680" w:hanging="360"/>
+      </w:pPr>
+    </w:lvl>
+    <w:lvl w:ilvl="7" w:tplc="08090019" w:tentative="1">
+      <w:start w:val="1"/>
+      <w:numFmt w:val="lowerLetter"/>
+      <w:lvlText w:val="%8."/>
+      <w:lvlJc w:val="left"/>
+      <w:pPr>
+        <w:ind w:left="5400" w:hanging="360"/>
+      </w:pPr>
+    </w:lvl>
+    <w:lvl w:ilvl="8" w:tplc="0809001B" w:tentative="1">
+      <w:start w:val="1"/>
+      <w:numFmt w:val="lowerRoman"/>
+      <w:lvlText w:val="%9."/>
+      <w:lvlJc w:val="right"/>
+      <w:pPr>
+        <w:ind w:left="6120" w:hanging="180"/>
+      </w:pPr>
+    </w:lvl>
+  </w:abstractNum>
+  <w:abstractNum w:abstractNumId="4" w15:restartNumberingAfterBreak="0">
+    <w:nsid w:val="6875255E"/>
+    <w:multiLevelType w:val="hybridMultilevel"/>
+    <w:tmpl w:val="821E1E78"/>
+    <w:lvl w:ilvl="0" w:tplc="E4A65C3C">
+      <w:numFmt w:val="bullet"/>
+      <w:lvlText w:val="-"/>
+      <w:lvlJc w:val="left"/>
+      <w:pPr>
+        <w:ind w:left="720" w:hanging="360"/>
+      </w:pPr>
+      <w:rPr>
+        <w:rFonts w:ascii="Aptos" w:eastAsiaTheme="minorHAnsi" w:hAnsi="Aptos" w:cstheme="minorBidi" w:hint="default"/>
+      </w:rPr>
+    </w:lvl>
+    <w:lvl w:ilvl="1" w:tplc="08090003" w:tentative="1">
+      <w:start w:val="1"/>
+      <w:numFmt w:val="bullet"/>
+      <w:lvlText w:val="o"/>
+      <w:lvlJc w:val="left"/>
+      <w:pPr>
+        <w:ind w:left="1440" w:hanging="360"/>
+      </w:pPr>
+      <w:rPr>
+        <w:rFonts w:ascii="Courier New" w:hAnsi="Courier New" w:cs="Courier New" w:hint="default"/>
+      </w:rPr>
+    </w:lvl>
+    <w:lvl w:ilvl="2" w:tplc="08090005" w:tentative="1">
+      <w:start w:val="1"/>
+      <w:numFmt w:val="bullet"/>
+      <w:lvlText w:val=""/>
+      <w:lvlJc w:val="left"/>
+      <w:pPr>
+        <w:ind w:left="2160" w:hanging="360"/>
+      </w:pPr>
+      <w:rPr>
+        <w:rFonts w:ascii="Wingdings" w:hAnsi="Wingdings" w:hint="default"/>
+      </w:rPr>
+    </w:lvl>
+    <w:lvl w:ilvl="3" w:tplc="08090001" w:tentative="1">
+      <w:start w:val="1"/>
+      <w:numFmt w:val="bullet"/>
+      <w:lvlText w:val=""/>
+      <w:lvlJc w:val="left"/>
+      <w:pPr>
+        <w:ind w:left="2880" w:hanging="360"/>
+      </w:pPr>
+      <w:rPr>
+        <w:rFonts w:ascii="Symbol" w:hAnsi="Symbol" w:hint="default"/>
+      </w:rPr>
+    </w:lvl>
+    <w:lvl w:ilvl="4" w:tplc="08090003" w:tentative="1">
+      <w:start w:val="1"/>
+      <w:numFmt w:val="bullet"/>
+      <w:lvlText w:val="o"/>
+      <w:lvlJc w:val="left"/>
+      <w:pPr>
+        <w:ind w:left="3600" w:hanging="360"/>
+      </w:pPr>
+      <w:rPr>
+        <w:rFonts w:ascii="Courier New" w:hAnsi="Courier New" w:cs="Courier New" w:hint="default"/>
+      </w:rPr>
+    </w:lvl>
+    <w:lvl w:ilvl="5" w:tplc="08090005" w:tentative="1">
+      <w:start w:val="1"/>
+      <w:numFmt w:val="bullet"/>
+      <w:lvlText w:val=""/>
+      <w:lvlJc w:val="left"/>
+      <w:pPr>
+        <w:ind w:left="4320" w:hanging="360"/>
+      </w:pPr>
+      <w:rPr>
+        <w:rFonts w:ascii="Wingdings" w:hAnsi="Wingdings" w:hint="default"/>
+      </w:rPr>
+    </w:lvl>
+    <w:lvl w:ilvl="6" w:tplc="08090001" w:tentative="1">
+      <w:start w:val="1"/>
+      <w:numFmt w:val="bullet"/>
+      <w:lvlText w:val=""/>
+      <w:lvlJc w:val="left"/>
+      <w:pPr>
+        <w:ind w:left="5040" w:hanging="360"/>
+      </w:pPr>
+      <w:rPr>
+        <w:rFonts w:ascii="Symbol" w:hAnsi="Symbol" w:hint="default"/>
+      </w:rPr>
+    </w:lvl>
+    <w:lvl w:ilvl="7" w:tplc="08090003" w:tentative="1">
+      <w:start w:val="1"/>
+      <w:numFmt w:val="bullet"/>
+      <w:lvlText w:val="o"/>
+      <w:lvlJc w:val="left"/>
+      <w:pPr>
+        <w:ind w:left="5760" w:hanging="360"/>
+      </w:pPr>
+      <w:rPr>
+        <w:rFonts w:ascii="Courier New" w:hAnsi="Courier New" w:cs="Courier New" w:hint="default"/>
+      </w:rPr>
+    </w:lvl>
+    <w:lvl w:ilvl="8" w:tplc="08090005" w:tentative="1">
+      <w:start w:val="1"/>
+      <w:numFmt w:val="bullet"/>
+      <w:lvlText w:val=""/>
+      <w:lvlJc w:val="left"/>
+      <w:pPr>
+        <w:ind w:left="6480" w:hanging="360"/>
+      </w:pPr>
+      <w:rPr>
+        <w:rFonts w:ascii="Wingdings" w:hAnsi="Wingdings" w:hint="default"/>
+      </w:rPr>
+    </w:lvl>
+  </w:abstractNum>
+  <w:abstractNum w:abstractNumId="5" w15:restartNumberingAfterBreak="0">
+    <w:nsid w:val="79266A5F"/>
+    <w:multiLevelType w:val="hybridMultilevel"/>
+    <w:tmpl w:val="BCD49A5E"/>
+    <w:lvl w:ilvl="0" w:tplc="E4A65C3C">
+      <w:numFmt w:val="bullet"/>
+      <w:lvlText w:val="-"/>
+      <w:lvlJc w:val="left"/>
+      <w:pPr>
+        <w:ind w:left="720" w:hanging="360"/>
+      </w:pPr>
+      <w:rPr>
+        <w:rFonts w:ascii="Aptos" w:eastAsiaTheme="minorHAnsi" w:hAnsi="Aptos" w:cstheme="minorBidi" w:hint="default"/>
+      </w:rPr>
+    </w:lvl>
+    <w:lvl w:ilvl="1" w:tplc="08090003" w:tentative="1">
+      <w:start w:val="1"/>
+      <w:numFmt w:val="bullet"/>
+      <w:lvlText w:val="o"/>
+      <w:lvlJc w:val="left"/>
+      <w:pPr>
+        <w:ind w:left="1440" w:hanging="360"/>
+      </w:pPr>
+      <w:rPr>
+        <w:rFonts w:ascii="Courier New" w:hAnsi="Courier New" w:cs="Courier New" w:hint="default"/>
+      </w:rPr>
+    </w:lvl>
+    <w:lvl w:ilvl="2" w:tplc="08090005" w:tentative="1">
+      <w:start w:val="1"/>
+      <w:numFmt w:val="bullet"/>
+      <w:lvlText w:val=""/>
+      <w:lvlJc w:val="left"/>
+      <w:pPr>
+        <w:ind w:left="2160" w:hanging="360"/>
+      </w:pPr>
+      <w:rPr>
+        <w:rFonts w:ascii="Wingdings" w:hAnsi="Wingdings" w:hint="default"/>
+      </w:rPr>
+    </w:lvl>
+    <w:lvl w:ilvl="3" w:tplc="08090001" w:tentative="1">
+      <w:start w:val="1"/>
+      <w:numFmt w:val="bullet"/>
+      <w:lvlText w:val=""/>
+      <w:lvlJc w:val="left"/>
+      <w:pPr>
+        <w:ind w:left="2880" w:hanging="360"/>
+      </w:pPr>
+      <w:rPr>
+        <w:rFonts w:ascii="Symbol" w:hAnsi="Symbol" w:hint="default"/>
+      </w:rPr>
+    </w:lvl>
+    <w:lvl w:ilvl="4" w:tplc="08090003" w:tentative="1">
+      <w:start w:val="1"/>
+      <w:numFmt w:val="bullet"/>
+      <w:lvlText w:val="o"/>
+      <w:lvlJc w:val="left"/>
+      <w:pPr>
+        <w:ind w:left="3600" w:hanging="360"/>
+      </w:pPr>
+      <w:rPr>
+        <w:rFonts w:ascii="Courier New" w:hAnsi="Courier New" w:cs="Courier New" w:hint="default"/>
+      </w:rPr>
+    </w:lvl>
+    <w:lvl w:ilvl="5" w:tplc="08090005" w:tentative="1">
+      <w:start w:val="1"/>
+      <w:numFmt w:val="bullet"/>
+      <w:lvlText w:val=""/>
+      <w:lvlJc w:val="left"/>
+      <w:pPr>
+        <w:ind w:left="4320" w:hanging="360"/>
+      </w:pPr>
+      <w:rPr>
+        <w:rFonts w:ascii="Wingdings" w:hAnsi="Wingdings" w:hint="default"/>
+      </w:rPr>
+    </w:lvl>
+    <w:lvl w:ilvl="6" w:tplc="08090001" w:tentative="1">
+      <w:start w:val="1"/>
+      <w:numFmt w:val="bullet"/>
+      <w:lvlText w:val=""/>
+      <w:lvlJc w:val="left"/>
+      <w:pPr>
+        <w:ind w:left="5040" w:hanging="360"/>
+      </w:pPr>
+      <w:rPr>
+        <w:rFonts w:ascii="Symbol" w:hAnsi="Symbol" w:hint="default"/>
+      </w:rPr>
+    </w:lvl>
+    <w:lvl w:ilvl="7" w:tplc="08090003" w:tentative="1">
+      <w:start w:val="1"/>
+      <w:numFmt w:val="bullet"/>
+      <w:lvlText w:val="o"/>
+      <w:lvlJc w:val="left"/>
+      <w:pPr>
+        <w:ind w:left="5760" w:hanging="360"/>
+      </w:pPr>
+      <w:rPr>
+        <w:rFonts w:ascii="Courier New" w:hAnsi="Courier New" w:cs="Courier New" w:hint="default"/>
+      </w:rPr>
+    </w:lvl>
+    <w:lvl w:ilvl="8" w:tplc="08090005" w:tentative="1">
+      <w:start w:val="1"/>
+      <w:numFmt w:val="bullet"/>
+      <w:lvlText w:val=""/>
+      <w:lvlJc w:val="left"/>
+      <w:pPr>
+        <w:ind w:left="6480" w:hanging="360"/>
+      </w:pPr>
+      <w:rPr>
+        <w:rFonts w:ascii="Wingdings" w:hAnsi="Wingdings" w:hint="default"/>
+      </w:rPr>
+    </w:lvl>
+  </w:abstractNum>
+  <w:abstractNum w:abstractNumId="6" w15:restartNumberingAfterBreak="0">
+    <w:nsid w:val="7E45043B"/>
+    <w:multiLevelType w:val="multilevel"/>
+    <w:tmpl w:val="D264E3C4"/>
+    <w:lvl w:ilvl="0">
+      <w:start w:val="1"/>
+      <w:numFmt w:val="bullet"/>
+      <w:lvlText w:val=""/>
+      <w:lvlJc w:val="left"/>
+      <w:pPr>
+        <w:tabs>
+          <w:tab w:val="num" w:pos="720"/>
+        </w:tabs>
+        <w:ind w:left="720" w:hanging="360"/>
+      </w:pPr>
+      <w:rPr>
+        <w:rFonts w:ascii="Symbol" w:hAnsi="Symbol" w:hint="default"/>
+        <w:sz w:val="20"/>
+      </w:rPr>
+    </w:lvl>
+    <w:lvl w:ilvl="1" w:tentative="1">
+      <w:start w:val="1"/>
+      <w:numFmt w:val="bullet"/>
+      <w:lvlText w:val="o"/>
+      <w:lvlJc w:val="left"/>
+      <w:pPr>
+        <w:tabs>
+          <w:tab w:val="num" w:pos="1440"/>
+        </w:tabs>
+        <w:ind w:left="1440" w:hanging="360"/>
+      </w:pPr>
+      <w:rPr>
+        <w:rFonts w:ascii="Courier New" w:hAnsi="Courier New" w:hint="default"/>
+        <w:sz w:val="20"/>
+      </w:rPr>
+    </w:lvl>
+    <w:lvl w:ilvl="2" w:tentative="1">
+      <w:start w:val="1"/>
+      <w:numFmt w:val="bullet"/>
+      <w:lvlText w:val=""/>
+      <w:lvlJc w:val="left"/>
+      <w:pPr>
+        <w:tabs>
+          <w:tab w:val="num" w:pos="2160"/>
+        </w:tabs>
+        <w:ind w:left="2160" w:hanging="360"/>
+      </w:pPr>
+      <w:rPr>
+        <w:rFonts w:ascii="Wingdings" w:hAnsi="Wingdings" w:hint="default"/>
+        <w:sz w:val="20"/>
+      </w:rPr>
+    </w:lvl>
+    <w:lvl w:ilvl="3" w:tentative="1">
+      <w:start w:val="1"/>
+      <w:numFmt w:val="bullet"/>
+      <w:lvlText w:val=""/>
+      <w:lvlJc w:val="left"/>
+      <w:pPr>
+        <w:tabs>
+          <w:tab w:val="num" w:pos="2880"/>
+        </w:tabs>
+        <w:ind w:left="2880" w:hanging="360"/>
+      </w:pPr>
+      <w:rPr>
+        <w:rFonts w:ascii="Wingdings" w:hAnsi="Wingdings" w:hint="default"/>
+        <w:sz w:val="20"/>
+      </w:rPr>
+    </w:lvl>
+    <w:lvl w:ilvl="4" w:tentative="1">
+      <w:start w:val="1"/>
+      <w:numFmt w:val="bullet"/>
+      <w:lvlText w:val=""/>
+      <w:lvlJc w:val="left"/>
+      <w:pPr>
+        <w:tabs>
+          <w:tab w:val="num" w:pos="3600"/>
+        </w:tabs>
+        <w:ind w:left="3600" w:hanging="360"/>
+      </w:pPr>
+      <w:rPr>
+        <w:rFonts w:ascii="Wingdings" w:hAnsi="Wingdings" w:hint="default"/>
+        <w:sz w:val="20"/>
+      </w:rPr>
+    </w:lvl>
+    <w:lvl w:ilvl="5" w:tentative="1">
+      <w:start w:val="1"/>
+      <w:numFmt w:val="bullet"/>
+      <w:lvlText w:val=""/>
+      <w:lvlJc w:val="left"/>
+      <w:pPr>
+        <w:tabs>
+          <w:tab w:val="num" w:pos="4320"/>
+        </w:tabs>
+        <w:ind w:left="4320" w:hanging="360"/>
+      </w:pPr>
+      <w:rPr>
+        <w:rFonts w:ascii="Wingdings" w:hAnsi="Wingdings" w:hint="default"/>
+        <w:sz w:val="20"/>
+      </w:rPr>
+    </w:lvl>
+    <w:lvl w:ilvl="6" w:tentative="1">
+      <w:start w:val="1"/>
+      <w:numFmt w:val="bullet"/>
+      <w:lvlText w:val=""/>
+      <w:lvlJc w:val="left"/>
+      <w:pPr>
+        <w:tabs>
+          <w:tab w:val="num" w:pos="5040"/>
+        </w:tabs>
+        <w:ind w:left="5040" w:hanging="360"/>
+      </w:pPr>
+      <w:rPr>
+        <w:rFonts w:ascii="Wingdings" w:hAnsi="Wingdings" w:hint="default"/>
+        <w:sz w:val="20"/>
+      </w:rPr>
+    </w:lvl>
+    <w:lvl w:ilvl="7" w:tentative="1">
+      <w:start w:val="1"/>
+      <w:numFmt w:val="bullet"/>
+      <w:lvlText w:val=""/>
+      <w:lvlJc w:val="left"/>
+      <w:pPr>
+        <w:tabs>
+          <w:tab w:val="num" w:pos="5760"/>
+        </w:tabs>
+        <w:ind w:left="5760" w:hanging="360"/>
+      </w:pPr>
+      <w:rPr>
+        <w:rFonts w:ascii="Wingdings" w:hAnsi="Wingdings" w:hint="default"/>
+        <w:sz w:val="20"/>
+      </w:rPr>
+    </w:lvl>
+    <w:lvl w:ilvl="8" w:tentative="1">
+      <w:start w:val="1"/>
+      <w:numFmt w:val="bullet"/>
+      <w:lvlText w:val=""/>
+      <w:lvlJc w:val="left"/>
+      <w:pPr>
+        <w:tabs>
+          <w:tab w:val="num" w:pos="6480"/>
+        </w:tabs>
+        <w:ind w:left="6480" w:hanging="360"/>
+      </w:pPr>
+      <w:rPr>
+        <w:rFonts w:ascii="Wingdings" w:hAnsi="Wingdings" w:hint="default"/>
+        <w:sz w:val="20"/>
+      </w:rPr>
+    </w:lvl>
+  </w:abstractNum>
   <w:num w:numId="1" w16cid:durableId="1715157441">
+    <w:abstractNumId w:val="5"/>
+  </w:num>
+  <w:num w:numId="2" w16cid:durableId="251552943">
+    <w:abstractNumId w:val="2"/>
+  </w:num>
+  <w:num w:numId="3" w16cid:durableId="1280651508">
+    <w:abstractNumId w:val="1"/>
+  </w:num>
+  <w:num w:numId="4" w16cid:durableId="710033731">
     <w:abstractNumId w:val="3"/>
   </w:num>
-  <w:num w:numId="2" w16cid:durableId="251552943">
-    <w:abstractNumId w:val="1"/>
+  <w:num w:numId="5" w16cid:durableId="1034694883">
+    <w:abstractNumId w:val="6"/>
   </w:num>
-  <w:num w:numId="3" w16cid:durableId="1280651508">
+  <w:num w:numId="6" w16cid:durableId="324632256">
     <w:abstractNumId w:val="0"/>
   </w:num>
-  <w:num w:numId="4" w16cid:durableId="710033731">
-    <w:abstractNumId w:val="2"/>
-  </w:num>
-  <w:num w:numId="5" w16cid:durableId="1034694883">
+  <w:num w:numId="7" w16cid:durableId="1322656282">
     <w:abstractNumId w:val="4"/>
   </w:num>
 </w:numbering>
@@ -13418,7 +14618,7 @@
   <w:style w:type="paragraph" w:default="1" w:styleId="Normal">
     <w:name w:val="Normal"/>
     <w:qFormat/>
-    <w:rsid w:val="002653B9"/>
+    <w:rsid w:val="00A0684E"/>
   </w:style>
   <w:style w:type="paragraph" w:styleId="Heading1">
     <w:name w:val="heading 1"/>

</xml_diff>

<commit_message>
chore: lstm docs added
</commit_message>
<xml_diff>
--- a/docs/Thesis.docx
+++ b/docs/Thesis.docx
@@ -118,35 +118,32 @@
     </w:p>
     <w:p>
       <w:r>
-        <w:t>Since the internet has become popular and smartphones have become more widespread the amount of radio signals that are constantly being transmitted has increased greatly. Especially in crowded areas in cities this has led to finding available bandwidths for Wi-Fi</w:t>
-      </w:r>
-      <w:r>
-        <w:t xml:space="preserve"> and other use cases</w:t>
-      </w:r>
-      <w:r>
-        <w:t xml:space="preserve"> can be difficult. </w:t>
-      </w:r>
-    </w:p>
-    <w:p>
-      <w:r>
-        <w:t xml:space="preserve">The current approach to find available bandwidths is to </w:t>
-      </w:r>
-      <w:r>
-        <w:t>scan passively or actively. This is done by sensing the already present radio signals on pre-defined channels.</w:t>
-      </w:r>
-    </w:p>
-    <w:p>
-      <w:r>
-        <w:t xml:space="preserve">In an ever-digitalising world where the </w:t>
-      </w:r>
-      <w:r>
-        <w:t>number</w:t>
-      </w:r>
-      <w:r>
-        <w:t xml:space="preserve"> of smart devices and IoT devices transmitting radio signals is every increasing, preventing interference is increasingly more important.</w:t>
-      </w:r>
-    </w:p>
-    <w:p>
+        <w:t>Since the internet became popular and smartphones became widespread, the number of radio signals constantly being transmitted has increased significantly</w:t>
+      </w:r>
+      <w:r>
+        <w:t xml:space="preserve"> </w:t>
+      </w:r>
+      <w:r>
+        <w:t>especially in crowded city areas. As a result, finding an available channel within a given frequency range has become increasingly difficult.</w:t>
+      </w:r>
+    </w:p>
+    <w:p>
+      <w:r>
+        <w:t>The current approach to identifying available bandwidths involves either passive or active scanning. This is done by sensing existing radio signals on predefined channels.</w:t>
+      </w:r>
+    </w:p>
+    <w:p>
+      <w:r>
+        <w:t>In an ever-digitalizing world, where the number of smart and IoT devices transmitting radio signals is constantly growing, preventing interference is more important than ever.</w:t>
+      </w:r>
+    </w:p>
+    <w:p>
+      <w:r>
+        <w:t>With the advancements in artificial intelligence and neural networks in recent years, it is worth exploring whether these technologies can aid in the channel selection process</w:t>
+      </w:r>
+      <w:r>
+        <w:t>.</w:t>
+      </w:r>
       <w:r>
         <w:br w:type="page"/>
       </w:r>
@@ -1022,7 +1019,7 @@
                 <w:noProof/>
                 <w:webHidden/>
               </w:rPr>
-              <w:t>8</w:t>
+              <w:t>9</w:t>
             </w:r>
             <w:r>
               <w:rPr>
@@ -1365,6 +1362,23 @@
       </w:r>
     </w:p>
     <w:p>
+      <w:r>
+        <w:t xml:space="preserve">Another study on the same subject measured the signal strength of different Wi-Fi channels in Osaka </w:t>
+      </w:r>
+      <w:r>
+        <w:t xml:space="preserve">before </w:t>
+      </w:r>
+      <w:r>
+        <w:t xml:space="preserve">the </w:t>
+      </w:r>
+      <w:r>
+        <w:t>2020 Olympics in Japan</w:t>
+      </w:r>
+      <w:r>
+        <w:t>, where it was found that environments with residential access points which were most likely mostly configured with the default settings for channel selection, the interference was very high between different channels. It could be observed that in areas where more offices were that the channel selection was already performed in a more advanced manner resulting in less interference, this concludes that improvements can be made with improved channel selection. [8]</w:t>
+      </w:r>
+    </w:p>
+    <w:p>
       <w:pPr>
         <w:pStyle w:val="Heading2"/>
       </w:pPr>
@@ -1491,10 +1505,24 @@
     </w:p>
     <w:p>
       <w:pPr>
+        <w:rPr>
+          <w:rFonts w:asciiTheme="majorHAnsi" w:eastAsiaTheme="majorEastAsia" w:hAnsiTheme="majorHAnsi" w:cstheme="majorBidi"/>
+          <w:color w:val="0F4761" w:themeColor="accent1" w:themeShade="BF"/>
+          <w:sz w:val="32"/>
+          <w:szCs w:val="32"/>
+        </w:rPr>
+      </w:pPr>
+      <w:bookmarkStart w:id="6" w:name="_Toc186447377"/>
+      <w:r>
+        <w:br w:type="page"/>
+      </w:r>
+    </w:p>
+    <w:p>
+      <w:pPr>
         <w:pStyle w:val="Heading2"/>
       </w:pPr>
-      <w:bookmarkStart w:id="6" w:name="_Toc186447377"/>
-      <w:r>
+      <w:r>
+        <w:lastRenderedPageBreak/>
         <w:t>Neural networks</w:t>
       </w:r>
       <w:bookmarkEnd w:id="6"/>
@@ -1516,181 +1544,200 @@
     </w:p>
     <w:p>
       <w:r>
-        <w:t xml:space="preserve">One such attempt to classify radio signals using a convolutional neural network achieved approximately 99% accuracy in predictions. This demonstrates that </w:t>
-      </w:r>
+        <w:t>One such attempt to classify radio signals using a convolutional neural network achieved approximately 99% accuracy in predictions. This demonstrates that convolutional neural networks are highly effective for classifying radio signals without requiring intensive computations.</w:t>
+      </w:r>
+      <w:r>
+        <w:t xml:space="preserve"> [7]</w:t>
+      </w:r>
+    </w:p>
+    <w:p>
+      <w:pPr>
+        <w:pStyle w:val="Heading3"/>
+      </w:pPr>
+      <w:bookmarkStart w:id="8" w:name="_Toc186447379"/>
+      <w:r>
+        <w:t xml:space="preserve">Support </w:t>
+      </w:r>
+      <w:r>
+        <w:t>vector</w:t>
+      </w:r>
+      <w:r>
+        <w:t xml:space="preserve"> machine</w:t>
+      </w:r>
+      <w:bookmarkEnd w:id="8"/>
+    </w:p>
+    <w:p>
+      <w:r>
+        <w:t xml:space="preserve">Support vector machines (SVMs) </w:t>
+      </w:r>
+      <w:r>
+        <w:t xml:space="preserve">can also be </w:t>
+      </w:r>
+      <w:r>
+        <w:t xml:space="preserve">effective in classifying radio signals, with accuracy ranging from 88% to 100% depending on noise levels. </w:t>
+      </w:r>
+      <w:r>
+        <w:t xml:space="preserve">Support vector machines have shown to be particularly effective in </w:t>
+      </w:r>
+      <w:r>
+        <w:t xml:space="preserve">low signal-to-noise environments. </w:t>
+      </w:r>
+      <w:r>
+        <w:t xml:space="preserve"> </w:t>
+      </w:r>
+      <w:r>
+        <w:t xml:space="preserve">One </w:t>
+      </w:r>
+      <w:r>
+        <w:t xml:space="preserve">method </w:t>
+      </w:r>
+      <w:r>
+        <w:t xml:space="preserve">cited </w:t>
+      </w:r>
+      <w:r>
+        <w:t>achieved over 92.8% accuracy with 1000 samples at an SNR of 4 dB, which is considered a high noise environment.</w:t>
+      </w:r>
+      <w:r>
+        <w:t xml:space="preserve"> [8]</w:t>
+      </w:r>
+    </w:p>
+    <w:p>
+      <w:pPr>
+        <w:pStyle w:val="Heading3"/>
+      </w:pPr>
+      <w:r>
+        <w:t>Long short-term memory model</w:t>
+      </w:r>
+    </w:p>
+    <w:p>
+      <w:r>
+        <w:t>The long short-term memory model is a model that works particularly well in time-series based predictions. While it would not suit channel occupancy classification it could perform well with channel occupancy prediction. While it needs long term training data it could be able to make long term predictions. This makes it an interesting candidate for experimentation for the problem defined in this thesis. [10]</w:t>
+      </w:r>
+    </w:p>
+    <w:p>
+      <w:pPr>
+        <w:pStyle w:val="Heading3"/>
+      </w:pPr>
+      <w:bookmarkStart w:id="9" w:name="_Toc186447380"/>
+      <w:r>
+        <w:t>Generative AI</w:t>
+      </w:r>
+      <w:bookmarkEnd w:id="9"/>
+    </w:p>
+    <w:p>
+      <w:r>
+        <w:t>With the appearance of large language models like ChatGPT the technology behind generative AI has improved greatly. ChatGPT uses generative AI to generate text responses based on prior knowledge [2], which then forms a coherent answer to a question. This technology can also be used to generate images using tools like Midjourney [3]. This technology could also be useful in sensing radio signals and predicting the occupancy of a specific frequency at a specified location and time.</w:t>
+      </w:r>
+    </w:p>
+    <w:p>
+      <w:r>
+        <w:t>Generative AI work</w:t>
+      </w:r>
+      <w:r>
+        <w:t>s</w:t>
+      </w:r>
+      <w:r>
+        <w:t xml:space="preserve"> by being able to recognise patterns in data and from these patterns based on an input</w:t>
+      </w:r>
+      <w:r>
+        <w:t>,</w:t>
+      </w:r>
+      <w:r>
+        <w:t xml:space="preserve"> be able to generate </w:t>
+      </w:r>
+      <w:r>
+        <w:t xml:space="preserve">an </w:t>
+      </w:r>
+      <w:r>
+        <w:t>output. These generative AI’s have become more and more powerful with the introduction of improved processing power introduced by companies like Nvidia [3].</w:t>
+      </w:r>
+    </w:p>
+    <w:p>
       <w:r>
         <w:lastRenderedPageBreak/>
-        <w:t>convolutional neural networks are highly effective for classifying radio signals without requiring intensive computations.</w:t>
-      </w:r>
-      <w:r>
-        <w:t xml:space="preserve"> [7]</w:t>
+        <w:t xml:space="preserve">Challenges that may arise in </w:t>
+      </w:r>
+      <w:r>
+        <w:t xml:space="preserve">predicting </w:t>
+      </w:r>
+      <w:r>
+        <w:t xml:space="preserve">spectrum </w:t>
+      </w:r>
+      <w:r>
+        <w:t xml:space="preserve">occupancy </w:t>
+      </w:r>
+      <w:r>
+        <w:t xml:space="preserve">using generative AI </w:t>
+      </w:r>
+      <w:r>
+        <w:t xml:space="preserve">can be that </w:t>
+      </w:r>
+      <w:r>
+        <w:t>the model that is trained</w:t>
+      </w:r>
+      <w:r>
+        <w:t xml:space="preserve"> on specific data from one location and time. It</w:t>
+      </w:r>
+      <w:r>
+        <w:t xml:space="preserve"> </w:t>
+      </w:r>
+      <w:r>
+        <w:t>might</w:t>
+      </w:r>
+      <w:r>
+        <w:t xml:space="preserve"> need to differ based on different locations and time. Since the traffic on different frequencies differs by time of day and location. For </w:t>
+      </w:r>
+      <w:r>
+        <w:t xml:space="preserve">instance, </w:t>
+      </w:r>
+      <w:r>
+        <w:t>at noon in a large city like Warsaw the</w:t>
+      </w:r>
+      <w:r>
+        <w:t xml:space="preserve">re will be a lot of </w:t>
+      </w:r>
+      <w:r>
+        <w:t>traffic, while at night in a small town it would be negligible</w:t>
+      </w:r>
+      <w:r>
+        <w:t xml:space="preserve"> low</w:t>
+      </w:r>
+      <w:r>
+        <w:t>. This problem gets exacerbated by a generative AI model needing a lot of training data to get an accurate prediction. This means that a lot of data must be gathered, or a method must be found to get accurate predictions on less data [4].</w:t>
+      </w:r>
+    </w:p>
+    <w:p>
+      <w:r>
+        <w:t xml:space="preserve">One way I think this could be possible is to integrate a way to measure occupancy of the spectrum by devices using the final model and sending this data a central server which will use this data to constantly update the model, this will not only give a lot of access to data but also keep the data up to date. Another </w:t>
+      </w:r>
+      <w:r>
+        <w:t>bonus</w:t>
+      </w:r>
+      <w:r>
+        <w:t xml:space="preserve"> is that differences in time of year for instance a cold winter versus a hot summer will also be included in the dataset.</w:t>
+      </w:r>
+    </w:p>
+    <w:p>
+      <w:r>
+        <w:t>The method of spectrum sensing and recording using edge devices, also known as cognitive radio. Cognitive radio aims to measure the entire spectrum, rather than focusing on specific channels, which aligns perfectly with the objectives of comprehensive spectrum analysis. By leveraging edge devices for real-time data collection and analysis, cognitive radio can dynamically adapt to changing conditions, optimize spectrum utilization, and reduce interference. This holistic approach not only enhances the efficiency of spectrum usage but also supports the continuous updating of generative AI models with fresh data, ensuring accurate and timely predictions across diverse environments and timeframes. [5]</w:t>
+      </w:r>
+    </w:p>
+    <w:p>
+      <w:r>
+        <w:t>The initial model created with this research could be used by a business office where multiple devices record the spectrum and send the received signals from all the available channels via a cable to a central unit which per location can choose the best possible channel to establish a connection on. This removes the need for a high-performance processing unit in each device and for a business with many users it could still be cost effective.</w:t>
       </w:r>
     </w:p>
     <w:p>
       <w:pPr>
         <w:pStyle w:val="Heading3"/>
       </w:pPr>
-      <w:bookmarkStart w:id="8" w:name="_Toc186447379"/>
-      <w:r>
-        <w:t xml:space="preserve">Support </w:t>
-      </w:r>
-      <w:r>
-        <w:t>vector</w:t>
-      </w:r>
-      <w:r>
-        <w:t xml:space="preserve"> machine</w:t>
-      </w:r>
-      <w:bookmarkEnd w:id="8"/>
-    </w:p>
-    <w:p>
-      <w:r>
-        <w:t xml:space="preserve">Support vector machines (SVMs) </w:t>
-      </w:r>
-      <w:r>
-        <w:t xml:space="preserve">can also be </w:t>
-      </w:r>
-      <w:r>
-        <w:t xml:space="preserve">effective in classifying radio signals, with accuracy ranging from 88% to 100% depending on noise levels. </w:t>
-      </w:r>
-      <w:r>
-        <w:t xml:space="preserve">Support vector machines have shown to be particularly effective in </w:t>
-      </w:r>
-      <w:r>
-        <w:t xml:space="preserve">low signal-to-noise environments. </w:t>
-      </w:r>
-      <w:r>
-        <w:t xml:space="preserve"> </w:t>
-      </w:r>
-      <w:r>
-        <w:t xml:space="preserve">One </w:t>
-      </w:r>
-      <w:r>
-        <w:t xml:space="preserve">method </w:t>
-      </w:r>
-      <w:r>
-        <w:t xml:space="preserve">cited </w:t>
-      </w:r>
-      <w:r>
-        <w:t>achieved over 92.8% accuracy with 1000 samples at an SNR of 4 dB, which is considered a high noise environment.</w:t>
-      </w:r>
-      <w:r>
-        <w:t xml:space="preserve"> [8]</w:t>
-      </w:r>
-    </w:p>
-    <w:p>
-      <w:pPr>
-        <w:pStyle w:val="Heading3"/>
-      </w:pPr>
-      <w:bookmarkStart w:id="9" w:name="_Toc186447380"/>
-      <w:r>
-        <w:t>Generative AI</w:t>
-      </w:r>
-      <w:bookmarkEnd w:id="9"/>
-    </w:p>
-    <w:p>
-      <w:r>
-        <w:t>With the appearance of large language models like ChatGPT the technology behind generative AI has improved greatly. ChatGPT uses generative AI to generate text responses based on prior knowledge [2], which then forms a coherent answer to a question. This technology can also be used to generate images using tools like Midjourney [3]. This technology could also be useful in sensing radio signals and predicting the occupancy of a specific frequency at a specified location and time.</w:t>
-      </w:r>
-    </w:p>
-    <w:p>
-      <w:r>
-        <w:t>Generative AI work</w:t>
-      </w:r>
-      <w:r>
-        <w:t>s</w:t>
-      </w:r>
-      <w:r>
-        <w:t xml:space="preserve"> by being able to recognise patterns in data and from these patterns based on an input</w:t>
-      </w:r>
-      <w:r>
-        <w:t>,</w:t>
-      </w:r>
-      <w:r>
-        <w:t xml:space="preserve"> be able to generate </w:t>
-      </w:r>
-      <w:r>
-        <w:t xml:space="preserve">an </w:t>
-      </w:r>
-      <w:r>
-        <w:t>output. These generative AI’s have become more and more powerful with the introduction of improved processing power introduced by companies like Nvidia [3].</w:t>
-      </w:r>
-    </w:p>
-    <w:p>
-      <w:r>
-        <w:t xml:space="preserve">Challenges that may arise in </w:t>
-      </w:r>
-      <w:r>
-        <w:t xml:space="preserve">predicting </w:t>
-      </w:r>
-      <w:r>
-        <w:t xml:space="preserve">spectrum </w:t>
-      </w:r>
-      <w:r>
-        <w:t xml:space="preserve">occupancy </w:t>
-      </w:r>
-      <w:r>
-        <w:t xml:space="preserve">using generative AI </w:t>
-      </w:r>
-      <w:r>
-        <w:t xml:space="preserve">can be that </w:t>
-      </w:r>
-      <w:r>
-        <w:t>the model that is trained</w:t>
-      </w:r>
-      <w:r>
-        <w:t xml:space="preserve"> on specific data from one location and time. It</w:t>
-      </w:r>
-      <w:r>
-        <w:t xml:space="preserve"> </w:t>
-      </w:r>
-      <w:r>
-        <w:t>might</w:t>
-      </w:r>
-      <w:r>
-        <w:t xml:space="preserve"> need to differ based on different locations and time. Since the traffic on different frequencies differs by time of day and location. For </w:t>
-      </w:r>
-      <w:r>
-        <w:t xml:space="preserve">instance, </w:t>
-      </w:r>
-      <w:r>
-        <w:t>at noon in a large city like Warsaw the</w:t>
-      </w:r>
-      <w:r>
-        <w:t xml:space="preserve">re will be a lot of </w:t>
-      </w:r>
-      <w:r>
-        <w:t>traffic, while at night in a small town it would be negligible</w:t>
-      </w:r>
-      <w:r>
-        <w:t xml:space="preserve"> low</w:t>
-      </w:r>
-      <w:r>
-        <w:t>. This problem gets exacerbated by a generative AI model needing a lot of training data to get an accurate prediction. This means that a lot of data must be gathered, or a method must be found to get accurate predictions on less data [4].</w:t>
-      </w:r>
-    </w:p>
-    <w:p>
-      <w:r>
-        <w:t xml:space="preserve">One way I think this could be possible is to integrate a way to measure occupancy of the spectrum by devices using the final model and sending this data a central server which will use this data to constantly update the model, this will not only give a lot of access to data but also keep the data up to date. Another </w:t>
-      </w:r>
-      <w:r>
-        <w:t>bonus</w:t>
-      </w:r>
-      <w:r>
-        <w:t xml:space="preserve"> is that differences in time of year for instance a cold winter versus a hot summer will also be included in the dataset.</w:t>
-      </w:r>
-    </w:p>
-    <w:p>
-      <w:r>
-        <w:t xml:space="preserve">The method of spectrum sensing and recording using edge devices, also known as cognitive radio. Cognitive radio aims to measure the entire spectrum, rather than focusing on specific channels, which aligns perfectly with the objectives of comprehensive spectrum analysis. By leveraging edge devices for real-time data collection and analysis, cognitive radio can dynamically adapt to changing conditions, </w:t>
-      </w:r>
-      <w:r>
-        <w:lastRenderedPageBreak/>
-        <w:t>optimize spectrum utilization, and reduce interference. This holistic approach not only enhances the efficiency of spectrum usage but also supports the continuous updating of generative AI models with fresh data, ensuring accurate and timely predictions across diverse environments and timeframes. [5]</w:t>
-      </w:r>
-    </w:p>
-    <w:p>
-      <w:r>
-        <w:t>The initial model created with this research could be used by a business office where multiple devices record the spectrum and send the received signals from all the available channels via a cable to a central unit which per location can choose the best possible channel to establish a connection on. This removes the need for a high-performance processing unit in each device and for a business with many users it could still be cost effective.</w:t>
+      <w:r>
+        <w:t>Final note on neural networks</w:t>
+      </w:r>
+    </w:p>
+    <w:p>
+      <w:r>
+        <w:t>One thing that has to be taken into account when reviewing every possible neural network model is that varying sampling rates might be used which could create unfair advantages towards some models which have been tested against low noise environments versus models that were tested in high noise environments.</w:t>
       </w:r>
     </w:p>
     <w:p>
@@ -1879,6 +1926,11 @@
       </w:r>
     </w:p>
     <w:p>
+      <w:r>
+        <w:t>For this project multiple neural network models will be used to compare each of the networks and find the best solution that performs well in a relatively high noise environment with a low sample rate.</w:t>
+      </w:r>
+    </w:p>
+    <w:p>
       <w:pPr>
         <w:pStyle w:val="Heading2"/>
       </w:pPr>
@@ -1956,17 +2008,14 @@
       </w:pPr>
       <w:bookmarkStart w:id="13" w:name="_Toc186447383"/>
       <w:r>
+        <w:lastRenderedPageBreak/>
         <w:t>Creating the test data</w:t>
       </w:r>
       <w:bookmarkEnd w:id="13"/>
     </w:p>
     <w:p>
       <w:r>
-        <w:t xml:space="preserve">The initial test data will consist of generated data that is modelled on real data. This method was chosen because it provides a lot of initial data that can be used to create a </w:t>
-      </w:r>
-      <w:r>
-        <w:lastRenderedPageBreak/>
-        <w:t>close to reality model. This approach was also taken by another paper which was taken as inspiration of the initial setup of this model</w:t>
+        <w:t>The initial test data will consist of generated data that is modelled on real data. This method was chosen because it provides a lot of initial data that can be used to create a close to reality model. This approach was also taken by another paper which was taken as inspiration of the initial setup of this model</w:t>
       </w:r>
     </w:p>
     <w:p>
@@ -2013,13 +2062,11 @@
       <w:r>
         <w:t xml:space="preserve">To validate the </w:t>
       </w:r>
-      <w:proofErr w:type="gramStart"/>
-      <w:r>
-        <w:t>model</w:t>
-      </w:r>
-      <w:proofErr w:type="gramEnd"/>
-      <w:r>
-        <w:t xml:space="preserve"> I have created a model that uses the fast fourier transform over the input data to see if the predictions can match this approach and to validate if the current model is actually more performant than just performing a fast fourier transform over the collection data samples.</w:t>
+      <w:r>
+        <w:t>model,</w:t>
+      </w:r>
+      <w:r>
+        <w:t xml:space="preserve"> I have created a model that uses the fast fourier transform over the input data to see if the predictions can match this approach and to validate if the current model is more performant than just performing a fast fourier transform over the collection data samples.</w:t>
       </w:r>
     </w:p>
     <w:p>
@@ -2032,7 +2079,11 @@
       </w:r>
       <w:bookmarkEnd w:id="16"/>
     </w:p>
-    <w:p/>
+    <w:p>
+      <w:r>
+        <w:t>To ensure that the models are not overfitted to the training data, data will be recorded using the devices provided by the Warsaw University of Technology, which will then be used to validate that the model also works in a real world environment.</w:t>
+      </w:r>
+    </w:p>
     <w:p>
       <w:pPr>
         <w:pStyle w:val="Heading3"/>
@@ -2082,6 +2133,7 @@
         <w:rPr>
           <w:noProof/>
         </w:rPr>
+        <w:lastRenderedPageBreak/>
         <w:drawing>
           <wp:inline distT="0" distB="0" distL="0" distR="0" wp14:anchorId="10C82B7A" wp14:editId="717EBC75">
             <wp:extent cx="5731510" cy="1836420"/>
@@ -2135,7 +2187,6 @@
         <w:pStyle w:val="Heading1"/>
       </w:pPr>
       <w:r>
-        <w:lastRenderedPageBreak/>
         <w:t xml:space="preserve"> </w:t>
       </w:r>
       <w:bookmarkStart w:id="18" w:name="_Toc169269457"/>
@@ -2398,7 +2449,14 @@
               <w:rPr>
                 <w:lang w:eastAsia="en-GB"/>
               </w:rPr>
-              <w:t>Given the strong performance of convolutional methods, each model was also tested with and without convolution layers. This model improves the information extracted from each IQ sample by converting the two IQ values into more detailed representations using convolution. While this slightly increases classification time, it significantly improves model accuracy.</w:t>
+              <w:t xml:space="preserve">Given the strong performance of convolutional methods, each model was also tested with and without convolution layers. This model improves the information extracted from each IQ sample by converting the two IQ values into more detailed representations using convolution. While this slightly </w:t>
+            </w:r>
+            <w:r>
+              <w:rPr>
+                <w:lang w:eastAsia="en-GB"/>
+              </w:rPr>
+              <w:lastRenderedPageBreak/>
+              <w:t>increases classification time, it significantly improves model accuracy.</w:t>
             </w:r>
           </w:p>
         </w:tc>
@@ -2417,6 +2475,7 @@
               <w:rPr>
                 <w:lang w:eastAsia="en-GB"/>
               </w:rPr>
+              <w:lastRenderedPageBreak/>
               <w:t>Simplicity with added accuracy</w:t>
             </w:r>
           </w:p>
@@ -2484,21 +2543,7 @@
               <w:rPr>
                 <w:lang w:eastAsia="en-GB"/>
               </w:rPr>
-              <w:t xml:space="preserve"> and </w:t>
-            </w:r>
-            <w:proofErr w:type="gramStart"/>
-            <w:r>
-              <w:rPr>
-                <w:lang w:eastAsia="en-GB"/>
-              </w:rPr>
-              <w:t>is able to</w:t>
-            </w:r>
-            <w:proofErr w:type="gramEnd"/>
-            <w:r>
-              <w:rPr>
-                <w:lang w:eastAsia="en-GB"/>
-              </w:rPr>
-              <w:t xml:space="preserve"> not only classify the current channel that is available, but also what </w:t>
+              <w:t xml:space="preserve"> and is able to not only classify the current channel that is available, but also what </w:t>
             </w:r>
             <w:r>
               <w:rPr>
@@ -2560,26 +2605,11 @@
                 <w:lang w:eastAsia="en-GB"/>
               </w:rPr>
             </w:pPr>
-            <w:proofErr w:type="gramStart"/>
-            <w:r>
-              <w:rPr>
-                <w:lang w:eastAsia="en-GB"/>
-              </w:rPr>
-              <w:t>Similar to</w:t>
-            </w:r>
-            <w:proofErr w:type="gramEnd"/>
-            <w:r>
-              <w:rPr>
-                <w:lang w:eastAsia="en-GB"/>
-              </w:rPr>
-              <w:t xml:space="preserve"> the approach taken with the SVM model, a convolutional layer was added to the LSTM model to evaluate its </w:t>
-            </w:r>
-            <w:r>
-              <w:rPr>
-                <w:lang w:eastAsia="en-GB"/>
-              </w:rPr>
-              <w:lastRenderedPageBreak/>
-              <w:t>impact on accuracy. This adjustment aims to further improve the information extracted from IQ samples before feeding them into the LSTM layers.</w:t>
+            <w:r>
+              <w:rPr>
+                <w:lang w:eastAsia="en-GB"/>
+              </w:rPr>
+              <w:t>Similar to the approach taken with the SVM model, a convolutional layer was added to the LSTM model to evaluate its impact on accuracy. This adjustment aims to further improve the information extracted from IQ samples before feeding them into the LSTM layers.</w:t>
             </w:r>
           </w:p>
         </w:tc>
@@ -2598,7 +2628,6 @@
               <w:rPr>
                 <w:lang w:eastAsia="en-GB"/>
               </w:rPr>
-              <w:lastRenderedPageBreak/>
               <w:t>Same advantages as the regular LSTM model but with increased accuracy</w:t>
             </w:r>
           </w:p>
@@ -11880,6 +11909,7 @@
             </w:pPr>
             <w:r>
               <w:rPr>
+                <w:noProof/>
                 <w:lang w:eastAsia="en-GB"/>
               </w:rPr>
               <w:drawing>
@@ -11965,6 +11995,7 @@
             </w:pPr>
             <w:r>
               <w:rPr>
+                <w:noProof/>
                 <w:lang w:eastAsia="en-GB"/>
               </w:rPr>
               <w:drawing>
@@ -12038,6 +12069,9 @@
               <w:ind w:left="720" w:hanging="720"/>
             </w:pPr>
             <w:r>
+              <w:rPr>
+                <w:noProof/>
+              </w:rPr>
               <w:drawing>
                 <wp:inline distT="0" distB="0" distL="0" distR="0" wp14:anchorId="3281EECC" wp14:editId="2A1517ED">
                   <wp:extent cx="2880000" cy="3694610"/>
@@ -12258,6 +12292,7 @@
             </w:pPr>
             <w:r>
               <w:rPr>
+                <w:noProof/>
                 <w:lang w:eastAsia="en-GB"/>
               </w:rPr>
               <w:drawing>
@@ -12310,6 +12345,7 @@
             </w:pPr>
             <w:r>
               <w:rPr>
+                <w:noProof/>
                 <w:lang w:eastAsia="en-GB"/>
               </w:rPr>
               <w:drawing>
@@ -12394,6 +12430,7 @@
             </w:pPr>
             <w:r>
               <w:rPr>
+                <w:noProof/>
                 <w:lang w:eastAsia="en-GB"/>
               </w:rPr>
               <w:drawing>
@@ -12446,6 +12483,7 @@
             </w:pPr>
             <w:r>
               <w:rPr>
+                <w:noProof/>
                 <w:lang w:eastAsia="en-GB"/>
               </w:rPr>
               <w:drawing>
@@ -12516,6 +12554,9 @@
           </w:tcPr>
           <w:p>
             <w:r>
+              <w:rPr>
+                <w:noProof/>
+              </w:rPr>
               <w:drawing>
                 <wp:inline distT="0" distB="0" distL="0" distR="0" wp14:anchorId="6D2D7A8F" wp14:editId="1097B15F">
                   <wp:extent cx="2700000" cy="2298073"/>
@@ -12560,6 +12601,9 @@
           </w:tcPr>
           <w:p>
             <w:r>
+              <w:rPr>
+                <w:noProof/>
+              </w:rPr>
               <w:drawing>
                 <wp:inline distT="0" distB="0" distL="0" distR="0" wp14:anchorId="67DDAE42" wp14:editId="26A392D6">
                   <wp:extent cx="2700000" cy="2298073"/>
@@ -12612,13 +12656,7 @@
           <w:lang w:eastAsia="en-GB"/>
         </w:rPr>
         <w:lastRenderedPageBreak/>
-        <w:t xml:space="preserve">Prediction </w:t>
-      </w:r>
-      <w:r>
-        <w:rPr>
-          <w:lang w:eastAsia="en-GB"/>
-        </w:rPr>
-        <w:t>per model per sequence length</w:t>
+        <w:t>Prediction per model per sequence length</w:t>
       </w:r>
     </w:p>
     <w:p>
@@ -13368,6 +13406,86 @@
       </w:pPr>
       <w:r>
         <w:t>Hu, H. [Dept. of Electronic Engineering Beijing University of Posts and Telecommunication], Song, J. [Dept. of Electronic Engineering Beijing University of Posts and Telecommunication], &amp; Wang, Y. [Dept. of Telecommunication Engineering Xidian University]. (2008). Signal Classification based on Spectral Correlation Analysis and SVM in Cognitive Radio (No. 1550-445X/08).</w:t>
+      </w:r>
+    </w:p>
+    <w:p>
+      <w:pPr>
+        <w:pStyle w:val="ListParagraph"/>
+        <w:numPr>
+          <w:ilvl w:val="0"/>
+          <w:numId w:val="4"/>
+        </w:numPr>
+      </w:pPr>
+      <w:r>
+        <w:rPr>
+          <w:lang w:val="pl-PL"/>
+        </w:rPr>
+        <w:t xml:space="preserve">Kajita, S., Amano, T., Yamaguchi, H., Higashino, T., &amp; Takai, M. (2016). </w:t>
+      </w:r>
+      <w:proofErr w:type="spellStart"/>
+      <w:r>
+        <w:t>WiFi</w:t>
+      </w:r>
+      <w:proofErr w:type="spellEnd"/>
+      <w:r>
+        <w:t xml:space="preserve"> Channel Selection Based on Urban Interference Measurement. </w:t>
+      </w:r>
+      <w:proofErr w:type="spellStart"/>
+      <w:r>
+        <w:rPr>
+          <w:i/>
+          <w:iCs/>
+        </w:rPr>
+        <w:t>MobiQuitous</w:t>
+      </w:r>
+      <w:proofErr w:type="spellEnd"/>
+      <w:r>
+        <w:rPr>
+          <w:i/>
+          <w:iCs/>
+        </w:rPr>
+        <w:t xml:space="preserve"> '16: Proceedings of the 13th ACM International Conference on Mobile and Ubiquitous Systems: Computing, Networking and Services</w:t>
+      </w:r>
+      <w:r>
+        <w:t>, 143–150.</w:t>
+      </w:r>
+    </w:p>
+    <w:p>
+      <w:pPr>
+        <w:pStyle w:val="ListParagraph"/>
+        <w:numPr>
+          <w:ilvl w:val="0"/>
+          <w:numId w:val="4"/>
+        </w:numPr>
+      </w:pPr>
+      <w:r>
+        <w:t xml:space="preserve">G. Van </w:t>
+      </w:r>
+      <w:proofErr w:type="spellStart"/>
+      <w:r>
+        <w:t>Houdt</w:t>
+      </w:r>
+      <w:proofErr w:type="spellEnd"/>
+      <w:r>
+        <w:t xml:space="preserve">, C. Mosquera, and G. Nápoles, "A review on the long short-term memory model," </w:t>
+      </w:r>
+      <w:r>
+        <w:rPr>
+          <w:i/>
+          <w:iCs/>
+        </w:rPr>
+        <w:t>Artificial Intelligence Review</w:t>
+      </w:r>
+      <w:r>
+        <w:t xml:space="preserve">, vol. 53, pp. 5929–5955, 2020. </w:t>
+      </w:r>
+      <w:proofErr w:type="spellStart"/>
+      <w:r>
+        <w:t>doi</w:t>
+      </w:r>
+      <w:proofErr w:type="spellEnd"/>
+      <w:r>
+        <w:t>: 10.1007/s10462-020-09838-1</w:t>
       </w:r>
     </w:p>
     <w:p>

</xml_diff>

<commit_message>
chore: expanded thesis and improved on conv svm model by adding batched normalisation
</commit_message>
<xml_diff>
--- a/docs/Thesis.docx
+++ b/docs/Thesis.docx
@@ -1814,19 +1814,7 @@
     </w:p>
     <w:p>
       <w:r>
-        <w:t xml:space="preserve">This project will use </w:t>
-      </w:r>
-      <w:r>
-        <w:t xml:space="preserve">neural networks </w:t>
-      </w:r>
-      <w:r>
-        <w:t xml:space="preserve">for spectrum sensing in Wi-Fi frequencies. </w:t>
-      </w:r>
-      <w:r>
-        <w:t>For this use case the following libraries will be used</w:t>
-      </w:r>
-      <w:r>
-        <w:t>:</w:t>
+        <w:t>This project will be written using the programming language Python since it has a lot of documentation about the different neural networks that were described in previous chapters of this thesis. I (the author) also have the most experience using this programming language and the libraries that will need to be used to create the models. These libraries are:</w:t>
       </w:r>
     </w:p>
     <w:p>
@@ -1838,7 +1826,33 @@
         </w:numPr>
       </w:pPr>
       <w:r>
+        <w:t>For creating and training the model</w:t>
+      </w:r>
+    </w:p>
+    <w:p>
+      <w:pPr>
+        <w:pStyle w:val="ListParagraph"/>
+        <w:numPr>
+          <w:ilvl w:val="1"/>
+          <w:numId w:val="1"/>
+        </w:numPr>
+      </w:pPr>
+      <w:proofErr w:type="spellStart"/>
+      <w:r>
         <w:t>PyTorch</w:t>
+      </w:r>
+      <w:proofErr w:type="spellEnd"/>
+    </w:p>
+    <w:p>
+      <w:pPr>
+        <w:pStyle w:val="ListParagraph"/>
+        <w:numPr>
+          <w:ilvl w:val="1"/>
+          <w:numId w:val="1"/>
+        </w:numPr>
+      </w:pPr>
+      <w:r>
+        <w:t>NumPy</w:t>
       </w:r>
     </w:p>
     <w:p>
@@ -1850,7 +1864,160 @@
         </w:numPr>
       </w:pPr>
       <w:r>
-        <w:t>NumPy</w:t>
+        <w:t>For analysing the data</w:t>
+      </w:r>
+    </w:p>
+    <w:p>
+      <w:pPr>
+        <w:pStyle w:val="ListParagraph"/>
+        <w:numPr>
+          <w:ilvl w:val="1"/>
+          <w:numId w:val="1"/>
+        </w:numPr>
+      </w:pPr>
+      <w:r>
+        <w:t>Pandas</w:t>
+      </w:r>
+    </w:p>
+    <w:p>
+      <w:pPr>
+        <w:pStyle w:val="ListParagraph"/>
+        <w:numPr>
+          <w:ilvl w:val="1"/>
+          <w:numId w:val="1"/>
+        </w:numPr>
+      </w:pPr>
+      <w:r>
+        <w:t>Matplotlib</w:t>
+      </w:r>
+    </w:p>
+    <w:p>
+      <w:pPr>
+        <w:pStyle w:val="ListParagraph"/>
+        <w:numPr>
+          <w:ilvl w:val="1"/>
+          <w:numId w:val="1"/>
+        </w:numPr>
+      </w:pPr>
+      <w:r>
+        <w:t>Seaborn</w:t>
+      </w:r>
+    </w:p>
+    <w:p>
+      <w:pPr>
+        <w:pStyle w:val="ListParagraph"/>
+        <w:numPr>
+          <w:ilvl w:val="1"/>
+          <w:numId w:val="1"/>
+        </w:numPr>
+      </w:pPr>
+      <w:r>
+        <w:t>Scikit-learn</w:t>
+      </w:r>
+    </w:p>
+    <w:p>
+      <w:pPr>
+        <w:pStyle w:val="Heading2"/>
+      </w:pPr>
+      <w:r>
+        <w:t>Training data</w:t>
+      </w:r>
+    </w:p>
+    <w:p>
+      <w:r>
+        <w:t xml:space="preserve">For the creation of a neural network that can be used to classify low noise channels within the Wi-Fi spectrum, training data needs to be gathered that reflects the spectrum in a </w:t>
+      </w:r>
+      <w:r>
+        <w:t>real</w:t>
+      </w:r>
+      <w:r>
+        <w:t>-</w:t>
+      </w:r>
+      <w:r>
+        <w:t>life</w:t>
+      </w:r>
+      <w:r>
+        <w:t xml:space="preserve"> environment.</w:t>
+      </w:r>
+    </w:p>
+    <w:p>
+      <w:r>
+        <w:t xml:space="preserve">This training data for the neural network </w:t>
+      </w:r>
+      <w:r>
+        <w:t>will be collected using custom hardware provided by the Warsaw University of Technology.</w:t>
+      </w:r>
+      <w:r>
+        <w:t xml:space="preserve"> Initial training data will be collected from an </w:t>
+      </w:r>
+      <w:r>
+        <w:t>open-source</w:t>
+      </w:r>
+      <w:r>
+        <w:t xml:space="preserve"> data platform</w:t>
+      </w:r>
+      <w:r>
+        <w:t xml:space="preserve"> or prior research that uses similar data</w:t>
+      </w:r>
+      <w:r>
+        <w:t>.</w:t>
+      </w:r>
+    </w:p>
+    <w:p>
+      <w:r>
+        <w:t xml:space="preserve">When recording radio waves, the variations in air pressure caused by a combination of different frequencies are captured. However, this data does not inherently reveal which frequencies contributed to the recorded waves. To analyse this data and determine which frequencies were most and least active, it must be transformed from the time domain to the frequency domain using the Fourier transform. While the Fourier transform is effective, it is computationally </w:t>
+      </w:r>
+      <w:r>
+        <w:t xml:space="preserve">expensive </w:t>
+      </w:r>
+      <w:r>
+        <w:t>and unsuitable for edge devices.</w:t>
+      </w:r>
+    </w:p>
+    <w:p>
+      <w:r>
+        <w:t>Neural networks offer a more practical solution for this scenario</w:t>
+      </w:r>
+      <w:r>
+        <w:t xml:space="preserve"> (transforming the recorded samples from the time domain into the frequency domain)</w:t>
+      </w:r>
+      <w:r>
+        <w:t>. As highlighted in the literature reviewed for this project, several types of neural networks have shown high accuracy in performing this task. Therefore, this project aims to develop and compare various models to evaluate their accuracy and identify the best approach for this application.</w:t>
+      </w:r>
+    </w:p>
+    <w:p>
+      <w:r>
+        <w:br w:type="page"/>
+      </w:r>
+    </w:p>
+    <w:p>
+      <w:pPr>
+        <w:pStyle w:val="Heading2"/>
+      </w:pPr>
+      <w:r>
+        <w:lastRenderedPageBreak/>
+        <w:t>Outline</w:t>
+      </w:r>
+    </w:p>
+    <w:p>
+      <w:r>
+        <w:t>For this project multiple neural network models will be used to compare each of the networks and find the best solution that performs well in a relatively high noise environment with a low sample rate.</w:t>
+      </w:r>
+    </w:p>
+    <w:p>
+      <w:r>
+        <w:t xml:space="preserve">The </w:t>
+      </w:r>
+      <w:r>
+        <w:t xml:space="preserve">test and training </w:t>
+      </w:r>
+      <w:r>
+        <w:t>data consists of a list of sequences where each sample in the sequence consists of a real number and imaginary number.</w:t>
+      </w:r>
+    </w:p>
+    <w:p>
+      <w:r>
+        <w:t>The creation of the model will consist of the following steps</w:t>
       </w:r>
     </w:p>
     <w:p>
@@ -1862,7 +2029,13 @@
         </w:numPr>
       </w:pPr>
       <w:r>
-        <w:t>Matplotlib</w:t>
+        <w:t>Creating test</w:t>
+      </w:r>
+      <w:r>
+        <w:t xml:space="preserve"> and training</w:t>
+      </w:r>
+      <w:r>
+        <w:t xml:space="preserve"> data: generating test data in the correct format</w:t>
       </w:r>
     </w:p>
     <w:p>
@@ -1874,7 +2047,13 @@
         </w:numPr>
       </w:pPr>
       <w:r>
-        <w:t>Seaborn</w:t>
+        <w:t xml:space="preserve">Creating the initial setup of the model: using the test data create a neural network that </w:t>
+      </w:r>
+      <w:r>
+        <w:t>can</w:t>
+      </w:r>
+      <w:r>
+        <w:t xml:space="preserve"> classify the occupancy</w:t>
       </w:r>
     </w:p>
     <w:p>
@@ -1886,66 +2065,7 @@
         </w:numPr>
       </w:pPr>
       <w:r>
-        <w:t>Scikit-learn</w:t>
-      </w:r>
-    </w:p>
-    <w:p>
-      <w:r>
-        <w:t>Data will be collected using custom hardware provided by the Warsaw University of Technology.</w:t>
-      </w:r>
-      <w:r>
-        <w:t xml:space="preserve"> Initial training data will be collected from an </w:t>
-      </w:r>
-      <w:r>
-        <w:t>open-source</w:t>
-      </w:r>
-      <w:r>
-        <w:t xml:space="preserve"> data platform</w:t>
-      </w:r>
-      <w:r>
-        <w:t xml:space="preserve"> or prior research that uses similar data</w:t>
-      </w:r>
-      <w:r>
-        <w:t>.</w:t>
-      </w:r>
-    </w:p>
-    <w:p>
-      <w:r>
-        <w:t xml:space="preserve">When recording radio waves, the variations in air pressure caused by a combination of different frequencies are captured. However, this data does not inherently reveal which frequencies contributed to the recorded waves. To analyse this data and determine which frequencies were most and least active, it must be transformed from the time domain to the frequency domain using the Fourier transform. While the Fourier transform is effective, it is computationally </w:t>
-      </w:r>
-      <w:r>
-        <w:t xml:space="preserve">expensive </w:t>
-      </w:r>
-      <w:r>
-        <w:t>and unsuitable for edge devices.</w:t>
-      </w:r>
-    </w:p>
-    <w:p>
-      <w:r>
-        <w:t>Neural networks offer a more practical solution for this scenario. As highlighted in the literature reviewed for this project, several types of neural networks have shown high accuracy in performing this task. Therefore, this project aims to develop and compare various models to evaluate their accuracy and identify the best approach for this application.</w:t>
-      </w:r>
-    </w:p>
-    <w:p>
-      <w:r>
-        <w:t>For this project multiple neural network models will be used to compare each of the networks and find the best solution that performs well in a relatively high noise environment with a low sample rate.</w:t>
-      </w:r>
-    </w:p>
-    <w:p>
-      <w:pPr>
-        <w:pStyle w:val="Heading2"/>
-      </w:pPr>
-      <w:r>
-        <w:t>Creating the model</w:t>
-      </w:r>
-    </w:p>
-    <w:p>
-      <w:r>
-        <w:t>The data consists of a list of sequences where each sample in the sequence consists of a real number and imaginary number.</w:t>
-      </w:r>
-    </w:p>
-    <w:p>
-      <w:r>
-        <w:t>The creation of the model will consist of the following steps</w:t>
+        <w:t>Tune the model: improve the accuracy of the model and reduce the sequence length so the model can make an accurate classification with minimal data</w:t>
       </w:r>
     </w:p>
     <w:p>
@@ -1957,7 +2077,192 @@
         </w:numPr>
       </w:pPr>
       <w:r>
-        <w:t>Creating test data: generating test data in the correct format</w:t>
+        <w:t>Record real time data: test the model with real time data</w:t>
+      </w:r>
+    </w:p>
+    <w:p>
+      <w:pPr>
+        <w:rPr>
+          <w:rFonts w:eastAsiaTheme="majorEastAsia" w:cstheme="majorBidi"/>
+          <w:color w:val="0F4761" w:themeColor="accent1" w:themeShade="BF"/>
+          <w:sz w:val="28"/>
+          <w:szCs w:val="28"/>
+        </w:rPr>
+      </w:pPr>
+      <w:bookmarkStart w:id="13" w:name="_Toc186447383"/>
+      <w:r>
+        <w:br w:type="page"/>
+      </w:r>
+    </w:p>
+    <w:p>
+      <w:pPr>
+        <w:pStyle w:val="Heading3"/>
+      </w:pPr>
+      <w:r>
+        <w:lastRenderedPageBreak/>
+        <w:t>Creating the test data</w:t>
+      </w:r>
+      <w:bookmarkEnd w:id="13"/>
+    </w:p>
+    <w:p>
+      <w:r>
+        <w:t>The initial test data will consist of generated data that is modelled on real data. This method was chosen because it provides a lot of initial data that can be used to create a close to reality model. This approach was also taken by another paper which was taken as inspiration of the initial setup of this model</w:t>
+      </w:r>
+      <w:r>
+        <w:t xml:space="preserve">. The data is a large collection of recorded data that are used to created sequences with overlap. For each file of recorded </w:t>
+      </w:r>
+      <w:r>
+        <w:t>data,</w:t>
+      </w:r>
+      <w:r>
+        <w:t xml:space="preserve"> the channels with high and low noise are known, this is used to create the labels.</w:t>
+      </w:r>
+    </w:p>
+    <w:p>
+      <w:r>
+        <w:t>The processing of the raw test data into usable sequences with labels can be found in the “</w:t>
+      </w:r>
+      <w:proofErr w:type="spellStart"/>
+      <w:r>
+        <w:t>src</w:t>
+      </w:r>
+      <w:proofErr w:type="spellEnd"/>
+      <w:r>
+        <w:t>/</w:t>
+      </w:r>
+      <w:proofErr w:type="spellStart"/>
+      <w:r>
+        <w:t>dataprocessing.ipynb</w:t>
+      </w:r>
+      <w:proofErr w:type="spellEnd"/>
+      <w:r>
+        <w:t>” notebook in my project. Within this file the following steps are performed:</w:t>
+      </w:r>
+    </w:p>
+    <w:p>
+      <w:pPr>
+        <w:pStyle w:val="ListParagraph"/>
+        <w:numPr>
+          <w:ilvl w:val="0"/>
+          <w:numId w:val="8"/>
+        </w:numPr>
+      </w:pPr>
+      <w:r>
+        <w:t>Load all the byte data from the dataset</w:t>
+      </w:r>
+    </w:p>
+    <w:p>
+      <w:pPr>
+        <w:pStyle w:val="ListParagraph"/>
+        <w:numPr>
+          <w:ilvl w:val="0"/>
+          <w:numId w:val="8"/>
+        </w:numPr>
+      </w:pPr>
+      <w:r>
+        <w:t>Go over each file using a for loop and read the data from the file with the datatype for complex numbers (IQ samples)</w:t>
+      </w:r>
+    </w:p>
+    <w:p>
+      <w:pPr>
+        <w:pStyle w:val="ListParagraph"/>
+        <w:numPr>
+          <w:ilvl w:val="0"/>
+          <w:numId w:val="8"/>
+        </w:numPr>
+      </w:pPr>
+      <w:r>
+        <w:t>Transform this data into a list of items where each item contains two integers for the real and imaginary value of the complex numbers, within python this item containing two integers is stored in what is called a tuple</w:t>
+      </w:r>
+    </w:p>
+    <w:p>
+      <w:pPr>
+        <w:pStyle w:val="ListParagraph"/>
+        <w:numPr>
+          <w:ilvl w:val="0"/>
+          <w:numId w:val="8"/>
+        </w:numPr>
+      </w:pPr>
+      <w:r>
+        <w:t>Create sequences of a pre-defined length with a pre-defined overlap. This is done by iterating over the long list using specific steps with overlap and creating a list of sequences.</w:t>
+      </w:r>
+    </w:p>
+    <w:p>
+      <w:pPr>
+        <w:pStyle w:val="ListParagraph"/>
+        <w:numPr>
+          <w:ilvl w:val="0"/>
+          <w:numId w:val="8"/>
+        </w:numPr>
+      </w:pPr>
+      <w:r>
+        <w:t>Store the sequences in a file with the same name as the file that it was loaded from, this is done because each file contains its label that the data belongs to, for instance channels 1 and 3 have high noise and 2 and 4 contain low noise.</w:t>
+      </w:r>
+    </w:p>
+    <w:p>
+      <w:pPr>
+        <w:pStyle w:val="ListParagraph"/>
+        <w:numPr>
+          <w:ilvl w:val="0"/>
+          <w:numId w:val="8"/>
+        </w:numPr>
+      </w:pPr>
+      <w:r>
+        <w:t>After iterating over all the files create one big training and test dataset file by shuffling and combining all the separate files into one big file storing each sequence of tuples and their corresponding label per item and inserting these items randomly.</w:t>
+      </w:r>
+    </w:p>
+    <w:p>
+      <w:pPr>
+        <w:rPr>
+          <w:rFonts w:eastAsiaTheme="majorEastAsia" w:cstheme="majorBidi"/>
+          <w:color w:val="0F4761" w:themeColor="accent1" w:themeShade="BF"/>
+          <w:sz w:val="28"/>
+          <w:szCs w:val="28"/>
+        </w:rPr>
+      </w:pPr>
+      <w:bookmarkStart w:id="14" w:name="_Toc186447384"/>
+      <w:r>
+        <w:br w:type="page"/>
+      </w:r>
+    </w:p>
+    <w:p>
+      <w:pPr>
+        <w:pStyle w:val="Heading3"/>
+      </w:pPr>
+      <w:r>
+        <w:lastRenderedPageBreak/>
+        <w:t>Creating the initial setup</w:t>
+      </w:r>
+      <w:bookmarkEnd w:id="14"/>
+    </w:p>
+    <w:p>
+      <w:pPr>
+        <w:pStyle w:val="Heading3"/>
+        <w:rPr>
+          <w:rFonts w:eastAsiaTheme="minorHAnsi" w:cstheme="minorBidi"/>
+          <w:color w:val="auto"/>
+          <w:sz w:val="24"/>
+          <w:szCs w:val="24"/>
+        </w:rPr>
+      </w:pPr>
+      <w:bookmarkStart w:id="15" w:name="_Toc186447385"/>
+      <w:r>
+        <w:rPr>
+          <w:rFonts w:eastAsiaTheme="minorHAnsi" w:cstheme="minorBidi"/>
+          <w:color w:val="auto"/>
+          <w:sz w:val="24"/>
+          <w:szCs w:val="24"/>
+        </w:rPr>
+        <w:t xml:space="preserve">For the initial setup, several variants of a neural network were tested to determine which configuration offered the best accuracy while maintaining low computational cost for deployment on edge devices. </w:t>
+      </w:r>
+      <w:r>
+        <w:rPr>
+          <w:rFonts w:eastAsiaTheme="minorHAnsi" w:cstheme="minorBidi"/>
+          <w:color w:val="auto"/>
+          <w:sz w:val="24"/>
+          <w:szCs w:val="24"/>
+        </w:rPr>
+        <w:t>The models that were chosen for this thesis are:</w:t>
       </w:r>
     </w:p>
     <w:p>
@@ -1969,13 +2274,7 @@
         </w:numPr>
       </w:pPr>
       <w:r>
-        <w:t xml:space="preserve">Creating the initial setup of the model: using the test data create a neural network that </w:t>
-      </w:r>
-      <w:r>
-        <w:t>can</w:t>
-      </w:r>
-      <w:r>
-        <w:t xml:space="preserve"> classify the occupancy</w:t>
+        <w:t>Convolutional model</w:t>
       </w:r>
     </w:p>
     <w:p>
@@ -1987,7 +2286,7 @@
         </w:numPr>
       </w:pPr>
       <w:r>
-        <w:t>Tune the model: improve the accuracy of the model and reduce the sequence length so the model can make an accurate classification with minimal data</w:t>
+        <w:t>Support vector machine model</w:t>
       </w:r>
     </w:p>
     <w:p>
@@ -1999,97 +2298,159 @@
         </w:numPr>
       </w:pPr>
       <w:r>
-        <w:t>Record real time data: test the model with real time data</w:t>
+        <w:t>Convolutional support vector machine model</w:t>
+      </w:r>
+    </w:p>
+    <w:p>
+      <w:pPr>
+        <w:pStyle w:val="ListParagraph"/>
+        <w:numPr>
+          <w:ilvl w:val="0"/>
+          <w:numId w:val="1"/>
+        </w:numPr>
+      </w:pPr>
+      <w:r>
+        <w:t>Long short-term memory model</w:t>
+      </w:r>
+    </w:p>
+    <w:p>
+      <w:pPr>
+        <w:pStyle w:val="ListParagraph"/>
+        <w:numPr>
+          <w:ilvl w:val="0"/>
+          <w:numId w:val="1"/>
+        </w:numPr>
+      </w:pPr>
+      <w:r>
+        <w:t>Convolutional long short-term memory model</w:t>
+      </w:r>
+    </w:p>
+    <w:p>
+      <w:pPr>
+        <w:pStyle w:val="ListParagraph"/>
+        <w:numPr>
+          <w:ilvl w:val="0"/>
+          <w:numId w:val="1"/>
+        </w:numPr>
+      </w:pPr>
+      <w:r>
+        <w:t>Fast Fourier Transform model (for validation)</w:t>
+      </w:r>
+    </w:p>
+    <w:p>
+      <w:r>
+        <w:t>The choice to combine each model with a non-convolutional and convolutional variant was made after observing the big increase in performance after adding just two convolutional layers while keeping the computational cost low. These models can be found in the project in the “</w:t>
+      </w:r>
+      <w:proofErr w:type="spellStart"/>
+      <w:r>
+        <w:t>src</w:t>
+      </w:r>
+      <w:proofErr w:type="spellEnd"/>
+      <w:r>
+        <w:t>” folder ending with “_</w:t>
+      </w:r>
+      <w:proofErr w:type="spellStart"/>
+      <w:r>
+        <w:t>model.ipynb</w:t>
+      </w:r>
+      <w:proofErr w:type="spellEnd"/>
+      <w:r>
+        <w:t xml:space="preserve">”. Every model was taken from a basic instruction about how to setup each model using </w:t>
+      </w:r>
+      <w:proofErr w:type="spellStart"/>
+      <w:r>
+        <w:t>PyTorch</w:t>
+      </w:r>
+      <w:proofErr w:type="spellEnd"/>
+      <w:r>
+        <w:t>.</w:t>
       </w:r>
     </w:p>
     <w:p>
       <w:pPr>
         <w:pStyle w:val="Heading3"/>
       </w:pPr>
-      <w:bookmarkStart w:id="13" w:name="_Toc186447383"/>
+      <w:r>
+        <w:t>Tuning the model</w:t>
+      </w:r>
+      <w:bookmarkEnd w:id="15"/>
+    </w:p>
+    <w:p>
+      <w:r>
+        <w:t xml:space="preserve">To validate the </w:t>
+      </w:r>
+      <w:r>
+        <w:t>model,</w:t>
+      </w:r>
+      <w:r>
+        <w:t xml:space="preserve"> I have created a model that uses the fast fourier transform over the input data to see if the predictions can match this approach and to validate if the current model is more performant than just performing a fast fourier transform over the collection data samples.</w:t>
+      </w:r>
+      <w:r>
+        <w:t xml:space="preserve"> This model contains a simple linear classifier like in the support vector machine model, but it uses the Fast Fourier Transform before it passes the data to the model. This model can be found in the “</w:t>
+      </w:r>
+      <w:proofErr w:type="spellStart"/>
+      <w:r>
+        <w:t>src</w:t>
+      </w:r>
+      <w:proofErr w:type="spellEnd"/>
+      <w:r>
+        <w:t>/</w:t>
+      </w:r>
+      <w:proofErr w:type="spellStart"/>
+      <w:r>
+        <w:t>fft_model.ipynb</w:t>
+      </w:r>
+      <w:proofErr w:type="spellEnd"/>
+      <w:r>
+        <w:t>” file.</w:t>
+      </w:r>
+    </w:p>
+    <w:p>
+      <w:r>
+        <w:t>Furthermore, result have been observed and graphed using plots created by matplotlib for each model (these can be seen in the Results section of this thesis). These models were used to spot where the model got stuck and how fast the model minimised it’s loss function.</w:t>
+      </w:r>
+    </w:p>
+    <w:p>
+      <w:pPr>
+        <w:pStyle w:val="Heading3"/>
+      </w:pPr>
+      <w:bookmarkStart w:id="16" w:name="_Toc186447386"/>
+      <w:r>
+        <w:t>Record real time data</w:t>
+      </w:r>
+      <w:bookmarkEnd w:id="16"/>
+    </w:p>
+    <w:p>
+      <w:r>
+        <w:t xml:space="preserve">To ensure that the models are not overfitted to the training data, data will be recorded using the devices provided by the Warsaw University of Technology, which will then be used to validate that the model also works in a </w:t>
+      </w:r>
+      <w:r>
+        <w:t>real-world</w:t>
+      </w:r>
+      <w:r>
+        <w:t xml:space="preserve"> environment.</w:t>
+      </w:r>
+    </w:p>
+    <w:p>
+      <w:pPr>
+        <w:rPr>
+          <w:rFonts w:eastAsiaTheme="majorEastAsia" w:cstheme="majorBidi"/>
+          <w:color w:val="0F4761" w:themeColor="accent1" w:themeShade="BF"/>
+          <w:sz w:val="28"/>
+          <w:szCs w:val="28"/>
+        </w:rPr>
+      </w:pPr>
+      <w:bookmarkStart w:id="17" w:name="_Toc186447387"/>
+      <w:r>
+        <w:br w:type="page"/>
+      </w:r>
+    </w:p>
+    <w:p>
+      <w:pPr>
+        <w:pStyle w:val="Heading3"/>
+      </w:pPr>
       <w:r>
         <w:lastRenderedPageBreak/>
-        <w:t>Creating the test data</w:t>
-      </w:r>
-      <w:bookmarkEnd w:id="13"/>
-    </w:p>
-    <w:p>
-      <w:r>
-        <w:t>The initial test data will consist of generated data that is modelled on real data. This method was chosen because it provides a lot of initial data that can be used to create a close to reality model. This approach was also taken by another paper which was taken as inspiration of the initial setup of this model</w:t>
-      </w:r>
-    </w:p>
-    <w:p>
-      <w:pPr>
-        <w:pStyle w:val="Heading3"/>
-      </w:pPr>
-      <w:bookmarkStart w:id="14" w:name="_Toc186447384"/>
-      <w:r>
-        <w:t>Creating the initial setup</w:t>
-      </w:r>
-      <w:bookmarkEnd w:id="14"/>
-    </w:p>
-    <w:p>
-      <w:pPr>
-        <w:pStyle w:val="Heading3"/>
-        <w:rPr>
-          <w:rFonts w:eastAsiaTheme="minorHAnsi" w:cstheme="minorBidi"/>
-          <w:color w:val="auto"/>
-          <w:sz w:val="24"/>
-          <w:szCs w:val="24"/>
-        </w:rPr>
-      </w:pPr>
-      <w:bookmarkStart w:id="15" w:name="_Toc186447385"/>
-      <w:r>
-        <w:rPr>
-          <w:rFonts w:eastAsiaTheme="minorHAnsi" w:cstheme="minorBidi"/>
-          <w:color w:val="auto"/>
-          <w:sz w:val="24"/>
-          <w:szCs w:val="24"/>
-        </w:rPr>
-        <w:t>For the initial setup, several variants of a neural network were tested to determine which configuration offered the best accuracy while maintaining low computational cost for deployment on edge devices. One model, consisting of two convolutional layers, one pooling layer, and one long short-term memory (LSTM) layer, achieved approximately 99.77% accuracy on the test data.</w:t>
-      </w:r>
-    </w:p>
-    <w:p>
-      <w:pPr>
-        <w:pStyle w:val="Heading3"/>
-      </w:pPr>
-      <w:r>
-        <w:t>Tuning the model</w:t>
-      </w:r>
-      <w:bookmarkEnd w:id="15"/>
-    </w:p>
-    <w:p>
-      <w:r>
-        <w:t xml:space="preserve">To validate the </w:t>
-      </w:r>
-      <w:r>
-        <w:t>model,</w:t>
-      </w:r>
-      <w:r>
-        <w:t xml:space="preserve"> I have created a model that uses the fast fourier transform over the input data to see if the predictions can match this approach and to validate if the current model is more performant than just performing a fast fourier transform over the collection data samples.</w:t>
-      </w:r>
-    </w:p>
-    <w:p>
-      <w:pPr>
-        <w:pStyle w:val="Heading3"/>
-      </w:pPr>
-      <w:bookmarkStart w:id="16" w:name="_Toc186447386"/>
-      <w:r>
-        <w:t>Record real time data</w:t>
-      </w:r>
-      <w:bookmarkEnd w:id="16"/>
-    </w:p>
-    <w:p>
-      <w:r>
-        <w:t>To ensure that the models are not overfitted to the training data, data will be recorded using the devices provided by the Warsaw University of Technology, which will then be used to validate that the model also works in a real world environment.</w:t>
-      </w:r>
-    </w:p>
-    <w:p>
-      <w:pPr>
-        <w:pStyle w:val="Heading3"/>
-      </w:pPr>
-      <w:bookmarkStart w:id="17" w:name="_Toc186447387"/>
-      <w:r>
         <w:t>Finishing up</w:t>
       </w:r>
       <w:bookmarkEnd w:id="17"/>
@@ -2133,7 +2494,6 @@
         <w:rPr>
           <w:noProof/>
         </w:rPr>
-        <w:lastRenderedPageBreak/>
         <w:drawing>
           <wp:inline distT="0" distB="0" distL="0" distR="0" wp14:anchorId="10C82B7A" wp14:editId="717EBC75">
             <wp:extent cx="5731510" cy="1836420"/>
@@ -2184,9 +2544,23 @@
     </w:p>
     <w:p>
       <w:pPr>
+        <w:rPr>
+          <w:rFonts w:asciiTheme="majorHAnsi" w:eastAsiaTheme="majorEastAsia" w:hAnsiTheme="majorHAnsi" w:cstheme="majorBidi"/>
+          <w:color w:val="0F4761" w:themeColor="accent1" w:themeShade="BF"/>
+          <w:sz w:val="40"/>
+          <w:szCs w:val="40"/>
+        </w:rPr>
+      </w:pPr>
+      <w:r>
+        <w:br w:type="page"/>
+      </w:r>
+    </w:p>
+    <w:p>
+      <w:pPr>
         <w:pStyle w:val="Heading1"/>
       </w:pPr>
       <w:r>
+        <w:lastRenderedPageBreak/>
         <w:t xml:space="preserve"> </w:t>
       </w:r>
       <w:bookmarkStart w:id="18" w:name="_Toc169269457"/>
@@ -2449,14 +2823,7 @@
               <w:rPr>
                 <w:lang w:eastAsia="en-GB"/>
               </w:rPr>
-              <w:t xml:space="preserve">Given the strong performance of convolutional methods, each model was also tested with and without convolution layers. This model improves the information extracted from each IQ sample by converting the two IQ values into more detailed representations using convolution. While this slightly </w:t>
-            </w:r>
-            <w:r>
-              <w:rPr>
-                <w:lang w:eastAsia="en-GB"/>
-              </w:rPr>
-              <w:lastRenderedPageBreak/>
-              <w:t>increases classification time, it significantly improves model accuracy.</w:t>
+              <w:t>Given the strong performance of convolutional methods, each model was also tested with and without convolution layers. This model improves the information extracted from each IQ sample by converting the two IQ values into more detailed representations using convolution. While this slightly increases classification time, it significantly improves model accuracy.</w:t>
             </w:r>
           </w:p>
         </w:tc>
@@ -2475,7 +2842,6 @@
               <w:rPr>
                 <w:lang w:eastAsia="en-GB"/>
               </w:rPr>
-              <w:lastRenderedPageBreak/>
               <w:t>Simplicity with added accuracy</w:t>
             </w:r>
           </w:p>
@@ -2609,7 +2975,14 @@
               <w:rPr>
                 <w:lang w:eastAsia="en-GB"/>
               </w:rPr>
-              <w:t>Similar to the approach taken with the SVM model, a convolutional layer was added to the LSTM model to evaluate its impact on accuracy. This adjustment aims to further improve the information extracted from IQ samples before feeding them into the LSTM layers.</w:t>
+              <w:t xml:space="preserve">Similar to the approach taken with the SVM model, a convolutional layer was added to the LSTM model to evaluate its </w:t>
+            </w:r>
+            <w:r>
+              <w:rPr>
+                <w:lang w:eastAsia="en-GB"/>
+              </w:rPr>
+              <w:lastRenderedPageBreak/>
+              <w:t>impact on accuracy. This adjustment aims to further improve the information extracted from IQ samples before feeding them into the LSTM layers.</w:t>
             </w:r>
           </w:p>
         </w:tc>
@@ -2628,6 +3001,7 @@
               <w:rPr>
                 <w:lang w:eastAsia="en-GB"/>
               </w:rPr>
+              <w:lastRenderedPageBreak/>
               <w:t>Same advantages as the regular LSTM model but with increased accuracy</w:t>
             </w:r>
           </w:p>
@@ -7264,21 +7638,7 @@
         <w:rPr>
           <w:lang w:eastAsia="en-GB"/>
         </w:rPr>
-        <w:t xml:space="preserve">Using the </w:t>
-      </w:r>
-      <w:proofErr w:type="spellStart"/>
-      <w:r>
-        <w:rPr>
-          <w:lang w:eastAsia="en-GB"/>
-        </w:rPr>
-        <w:t>torchviz</w:t>
-      </w:r>
-      <w:proofErr w:type="spellEnd"/>
-      <w:r>
-        <w:rPr>
-          <w:lang w:eastAsia="en-GB"/>
-        </w:rPr>
-        <w:t xml:space="preserve"> library I have visualised the three chosen models for classification and what their corresponding weights are after training</w:t>
+        <w:t>Using the torchviz library I have visualised the three chosen models for classification and what their corresponding weights are after training</w:t>
       </w:r>
       <w:r>
         <w:rPr>
@@ -11801,21 +12161,7 @@
         <w:rPr>
           <w:lang w:eastAsia="en-GB"/>
         </w:rPr>
-        <w:t xml:space="preserve">Using the </w:t>
-      </w:r>
-      <w:proofErr w:type="spellStart"/>
-      <w:r>
-        <w:rPr>
-          <w:lang w:eastAsia="en-GB"/>
-        </w:rPr>
-        <w:t>torchviz</w:t>
-      </w:r>
-      <w:proofErr w:type="spellEnd"/>
-      <w:r>
-        <w:rPr>
-          <w:lang w:eastAsia="en-GB"/>
-        </w:rPr>
-        <w:t xml:space="preserve"> library I have visualised the three chosen models for classification and what their corresponding weights are after training (for 32 samples per sequence).</w:t>
+        <w:t>Using the torchviz library I have visualised the three chosen models for classification and what their corresponding weights are after training (for 32 samples per sequence).</w:t>
       </w:r>
     </w:p>
     <w:tbl>
@@ -12866,18 +13212,8 @@
                 <w:szCs w:val="22"/>
                 <w:lang w:eastAsia="en-GB"/>
               </w:rPr>
-              <w:t>Response time: ~</w:t>
-            </w:r>
-            <w:proofErr w:type="spellStart"/>
-            <w:r>
-              <w:rPr>
-                <w:sz w:val="22"/>
-                <w:szCs w:val="22"/>
-                <w:lang w:eastAsia="en-GB"/>
-              </w:rPr>
-              <w:t>ms</w:t>
-            </w:r>
-            <w:proofErr w:type="spellEnd"/>
+              <w:t>Response time: ~ms</w:t>
+            </w:r>
           </w:p>
           <w:p>
             <w:pPr>
@@ -12992,18 +13328,8 @@
                 <w:szCs w:val="22"/>
                 <w:lang w:eastAsia="en-GB"/>
               </w:rPr>
-              <w:t>Response time: ~</w:t>
-            </w:r>
-            <w:proofErr w:type="spellStart"/>
-            <w:r>
-              <w:rPr>
-                <w:sz w:val="22"/>
-                <w:szCs w:val="22"/>
-                <w:lang w:eastAsia="en-GB"/>
-              </w:rPr>
-              <w:t>ms</w:t>
-            </w:r>
-            <w:proofErr w:type="spellEnd"/>
+              <w:t>Response time: ~ms</w:t>
+            </w:r>
           </w:p>
           <w:p>
             <w:pPr>
@@ -13422,29 +13748,15 @@
         </w:rPr>
         <w:t xml:space="preserve">Kajita, S., Amano, T., Yamaguchi, H., Higashino, T., &amp; Takai, M. (2016). </w:t>
       </w:r>
-      <w:proofErr w:type="spellStart"/>
-      <w:r>
-        <w:t>WiFi</w:t>
-      </w:r>
-      <w:proofErr w:type="spellEnd"/>
-      <w:r>
-        <w:t xml:space="preserve"> Channel Selection Based on Urban Interference Measurement. </w:t>
-      </w:r>
-      <w:proofErr w:type="spellStart"/>
+      <w:r>
+        <w:t xml:space="preserve">WiFi Channel Selection Based on Urban Interference Measurement. </w:t>
+      </w:r>
       <w:r>
         <w:rPr>
           <w:i/>
           <w:iCs/>
         </w:rPr>
-        <w:t>MobiQuitous</w:t>
-      </w:r>
-      <w:proofErr w:type="spellEnd"/>
-      <w:r>
-        <w:rPr>
-          <w:i/>
-          <w:iCs/>
-        </w:rPr>
-        <w:t xml:space="preserve"> '16: Proceedings of the 13th ACM International Conference on Mobile and Ubiquitous Systems: Computing, Networking and Services</w:t>
+        <w:t>MobiQuitous '16: Proceedings of the 13th ACM International Conference on Mobile and Ubiquitous Systems: Computing, Networking and Services</w:t>
       </w:r>
       <w:r>
         <w:t>, 143–150.</w:t>
@@ -13459,15 +13771,7 @@
         </w:numPr>
       </w:pPr>
       <w:r>
-        <w:t xml:space="preserve">G. Van </w:t>
-      </w:r>
-      <w:proofErr w:type="spellStart"/>
-      <w:r>
-        <w:t>Houdt</w:t>
-      </w:r>
-      <w:proofErr w:type="spellEnd"/>
-      <w:r>
-        <w:t xml:space="preserve">, C. Mosquera, and G. Nápoles, "A review on the long short-term memory model," </w:t>
+        <w:t xml:space="preserve">G. Van Houdt, C. Mosquera, and G. Nápoles, "A review on the long short-term memory model," </w:t>
       </w:r>
       <w:r>
         <w:rPr>
@@ -13477,15 +13781,7 @@
         <w:t>Artificial Intelligence Review</w:t>
       </w:r>
       <w:r>
-        <w:t xml:space="preserve">, vol. 53, pp. 5929–5955, 2020. </w:t>
-      </w:r>
-      <w:proofErr w:type="spellStart"/>
-      <w:r>
-        <w:t>doi</w:t>
-      </w:r>
-      <w:proofErr w:type="spellEnd"/>
-      <w:r>
-        <w:t>: 10.1007/s10462-020-09838-1</w:t>
+        <w:t>, vol. 53, pp. 5929–5955, 2020. doi: 10.1007/s10462-020-09838-1</w:t>
       </w:r>
     </w:p>
     <w:p>
@@ -13507,6 +13803,95 @@
 <file path=word/numbering.xml><?xml version="1.0" encoding="utf-8"?>
 <w:numbering xmlns:wpc="http://schemas.microsoft.com/office/word/2010/wordprocessingCanvas" xmlns:cx="http://schemas.microsoft.com/office/drawing/2014/chartex" xmlns:cx1="http://schemas.microsoft.com/office/drawing/2015/9/8/chartex" xmlns:cx2="http://schemas.microsoft.com/office/drawing/2015/10/21/chartex" xmlns:cx3="http://schemas.microsoft.com/office/drawing/2016/5/9/chartex" xmlns:cx4="http://schemas.microsoft.com/office/drawing/2016/5/10/chartex" xmlns:cx5="http://schemas.microsoft.com/office/drawing/2016/5/11/chartex" xmlns:cx6="http://schemas.microsoft.com/office/drawing/2016/5/12/chartex" xmlns:cx7="http://schemas.microsoft.com/office/drawing/2016/5/13/chartex" xmlns:cx8="http://schemas.microsoft.com/office/drawing/2016/5/14/chartex" xmlns:mc="http://schemas.openxmlformats.org/markup-compatibility/2006" xmlns:aink="http://schemas.microsoft.com/office/drawing/2016/ink" xmlns:am3d="http://schemas.microsoft.com/office/drawing/2017/model3d" xmlns:o="urn:schemas-microsoft-com:office:office" xmlns:oel="http://schemas.microsoft.com/office/2019/extlst" xmlns:r="http://schemas.openxmlformats.org/officeDocument/2006/relationships" xmlns:m="http://schemas.openxmlformats.org/officeDocument/2006/math" xmlns:v="urn:schemas-microsoft-com:vml" xmlns:wp14="http://schemas.microsoft.com/office/word/2010/wordprocessingDrawing" xmlns:wp="http://schemas.openxmlformats.org/drawingml/2006/wordprocessingDrawing" xmlns:w10="urn:schemas-microsoft-com:office:word" xmlns:w="http://schemas.openxmlformats.org/wordprocessingml/2006/main" xmlns:w14="http://schemas.microsoft.com/office/word/2010/wordml" xmlns:w15="http://schemas.microsoft.com/office/word/2012/wordml" xmlns:w16cex="http://schemas.microsoft.com/office/word/2018/wordml/cex" xmlns:w16cid="http://schemas.microsoft.com/office/word/2016/wordml/cid" xmlns:w16="http://schemas.microsoft.com/office/word/2018/wordml" xmlns:w16du="http://schemas.microsoft.com/office/word/2023/wordml/word16du" xmlns:w16sdtdh="http://schemas.microsoft.com/office/word/2020/wordml/sdtdatahash" xmlns:w16sdtfl="http://schemas.microsoft.com/office/word/2024/wordml/sdtformatlock" xmlns:w16se="http://schemas.microsoft.com/office/word/2015/wordml/symex" xmlns:wpg="http://schemas.microsoft.com/office/word/2010/wordprocessingGroup" xmlns:wpi="http://schemas.microsoft.com/office/word/2010/wordprocessingInk" xmlns:wne="http://schemas.microsoft.com/office/word/2006/wordml" xmlns:wps="http://schemas.microsoft.com/office/word/2010/wordprocessingShape" mc:Ignorable="w14 w15 w16se w16cid w16 w16cex w16sdtdh w16sdtfl w16du wp14">
   <w:abstractNum w:abstractNumId="0" w15:restartNumberingAfterBreak="0">
+    <w:nsid w:val="0F206AE0"/>
+    <w:multiLevelType w:val="hybridMultilevel"/>
+    <w:tmpl w:val="27B47F7E"/>
+    <w:lvl w:ilvl="0" w:tplc="0809000F">
+      <w:start w:val="1"/>
+      <w:numFmt w:val="decimal"/>
+      <w:lvlText w:val="%1."/>
+      <w:lvlJc w:val="left"/>
+      <w:pPr>
+        <w:ind w:left="720" w:hanging="360"/>
+      </w:pPr>
+      <w:rPr>
+        <w:rFonts w:hint="default"/>
+      </w:rPr>
+    </w:lvl>
+    <w:lvl w:ilvl="1" w:tplc="08090019" w:tentative="1">
+      <w:start w:val="1"/>
+      <w:numFmt w:val="lowerLetter"/>
+      <w:lvlText w:val="%2."/>
+      <w:lvlJc w:val="left"/>
+      <w:pPr>
+        <w:ind w:left="1440" w:hanging="360"/>
+      </w:pPr>
+    </w:lvl>
+    <w:lvl w:ilvl="2" w:tplc="0809001B" w:tentative="1">
+      <w:start w:val="1"/>
+      <w:numFmt w:val="lowerRoman"/>
+      <w:lvlText w:val="%3."/>
+      <w:lvlJc w:val="right"/>
+      <w:pPr>
+        <w:ind w:left="2160" w:hanging="180"/>
+      </w:pPr>
+    </w:lvl>
+    <w:lvl w:ilvl="3" w:tplc="0809000F" w:tentative="1">
+      <w:start w:val="1"/>
+      <w:numFmt w:val="decimal"/>
+      <w:lvlText w:val="%4."/>
+      <w:lvlJc w:val="left"/>
+      <w:pPr>
+        <w:ind w:left="2880" w:hanging="360"/>
+      </w:pPr>
+    </w:lvl>
+    <w:lvl w:ilvl="4" w:tplc="08090019" w:tentative="1">
+      <w:start w:val="1"/>
+      <w:numFmt w:val="lowerLetter"/>
+      <w:lvlText w:val="%5."/>
+      <w:lvlJc w:val="left"/>
+      <w:pPr>
+        <w:ind w:left="3600" w:hanging="360"/>
+      </w:pPr>
+    </w:lvl>
+    <w:lvl w:ilvl="5" w:tplc="0809001B" w:tentative="1">
+      <w:start w:val="1"/>
+      <w:numFmt w:val="lowerRoman"/>
+      <w:lvlText w:val="%6."/>
+      <w:lvlJc w:val="right"/>
+      <w:pPr>
+        <w:ind w:left="4320" w:hanging="180"/>
+      </w:pPr>
+    </w:lvl>
+    <w:lvl w:ilvl="6" w:tplc="0809000F" w:tentative="1">
+      <w:start w:val="1"/>
+      <w:numFmt w:val="decimal"/>
+      <w:lvlText w:val="%7."/>
+      <w:lvlJc w:val="left"/>
+      <w:pPr>
+        <w:ind w:left="5040" w:hanging="360"/>
+      </w:pPr>
+    </w:lvl>
+    <w:lvl w:ilvl="7" w:tplc="08090019" w:tentative="1">
+      <w:start w:val="1"/>
+      <w:numFmt w:val="lowerLetter"/>
+      <w:lvlText w:val="%8."/>
+      <w:lvlJc w:val="left"/>
+      <w:pPr>
+        <w:ind w:left="5760" w:hanging="360"/>
+      </w:pPr>
+    </w:lvl>
+    <w:lvl w:ilvl="8" w:tplc="0809001B" w:tentative="1">
+      <w:start w:val="1"/>
+      <w:numFmt w:val="lowerRoman"/>
+      <w:lvlText w:val="%9."/>
+      <w:lvlJc w:val="right"/>
+      <w:pPr>
+        <w:ind w:left="6480" w:hanging="180"/>
+      </w:pPr>
+    </w:lvl>
+  </w:abstractNum>
+  <w:abstractNum w:abstractNumId="1" w15:restartNumberingAfterBreak="0">
     <w:nsid w:val="1AE611CA"/>
     <w:multiLevelType w:val="multilevel"/>
     <w:tmpl w:val="6F604090"/>
@@ -13655,7 +14040,7 @@
       </w:rPr>
     </w:lvl>
   </w:abstractNum>
-  <w:abstractNum w:abstractNumId="1" w15:restartNumberingAfterBreak="0">
+  <w:abstractNum w:abstractNumId="2" w15:restartNumberingAfterBreak="0">
     <w:nsid w:val="365815B3"/>
     <w:multiLevelType w:val="hybridMultilevel"/>
     <w:tmpl w:val="6BC26F20"/>
@@ -13767,7 +14152,7 @@
       </w:rPr>
     </w:lvl>
   </w:abstractNum>
-  <w:abstractNum w:abstractNumId="2" w15:restartNumberingAfterBreak="0">
+  <w:abstractNum w:abstractNumId="3" w15:restartNumberingAfterBreak="0">
     <w:nsid w:val="4A304BF4"/>
     <w:multiLevelType w:val="hybridMultilevel"/>
     <w:tmpl w:val="61BCC520"/>
@@ -13853,7 +14238,7 @@
       </w:pPr>
     </w:lvl>
   </w:abstractNum>
-  <w:abstractNum w:abstractNumId="3" w15:restartNumberingAfterBreak="0">
+  <w:abstractNum w:abstractNumId="4" w15:restartNumberingAfterBreak="0">
     <w:nsid w:val="67AF04C5"/>
     <w:multiLevelType w:val="hybridMultilevel"/>
     <w:tmpl w:val="DC263FDA"/>
@@ -13939,7 +14324,7 @@
       </w:pPr>
     </w:lvl>
   </w:abstractNum>
-  <w:abstractNum w:abstractNumId="4" w15:restartNumberingAfterBreak="0">
+  <w:abstractNum w:abstractNumId="5" w15:restartNumberingAfterBreak="0">
     <w:nsid w:val="6875255E"/>
     <w:multiLevelType w:val="hybridMultilevel"/>
     <w:tmpl w:val="821E1E78"/>
@@ -14051,7 +14436,7 @@
       </w:rPr>
     </w:lvl>
   </w:abstractNum>
-  <w:abstractNum w:abstractNumId="5" w15:restartNumberingAfterBreak="0">
+  <w:abstractNum w:abstractNumId="6" w15:restartNumberingAfterBreak="0">
     <w:nsid w:val="79266A5F"/>
     <w:multiLevelType w:val="hybridMultilevel"/>
     <w:tmpl w:val="BCD49A5E"/>
@@ -14066,7 +14451,7 @@
         <w:rFonts w:ascii="Aptos" w:eastAsiaTheme="minorHAnsi" w:hAnsi="Aptos" w:cstheme="minorBidi" w:hint="default"/>
       </w:rPr>
     </w:lvl>
-    <w:lvl w:ilvl="1" w:tplc="08090003" w:tentative="1">
+    <w:lvl w:ilvl="1" w:tplc="08090003">
       <w:start w:val="1"/>
       <w:numFmt w:val="bullet"/>
       <w:lvlText w:val="o"/>
@@ -14163,7 +14548,7 @@
       </w:rPr>
     </w:lvl>
   </w:abstractNum>
-  <w:abstractNum w:abstractNumId="6" w15:restartNumberingAfterBreak="0">
+  <w:abstractNum w:abstractNumId="7" w15:restartNumberingAfterBreak="0">
     <w:nsid w:val="7E45043B"/>
     <w:multiLevelType w:val="multilevel"/>
     <w:tmpl w:val="D264E3C4"/>
@@ -14313,25 +14698,28 @@
     </w:lvl>
   </w:abstractNum>
   <w:num w:numId="1" w16cid:durableId="1715157441">
+    <w:abstractNumId w:val="6"/>
+  </w:num>
+  <w:num w:numId="2" w16cid:durableId="251552943">
+    <w:abstractNumId w:val="3"/>
+  </w:num>
+  <w:num w:numId="3" w16cid:durableId="1280651508">
+    <w:abstractNumId w:val="2"/>
+  </w:num>
+  <w:num w:numId="4" w16cid:durableId="710033731">
+    <w:abstractNumId w:val="4"/>
+  </w:num>
+  <w:num w:numId="5" w16cid:durableId="1034694883">
+    <w:abstractNumId w:val="7"/>
+  </w:num>
+  <w:num w:numId="6" w16cid:durableId="324632256">
+    <w:abstractNumId w:val="1"/>
+  </w:num>
+  <w:num w:numId="7" w16cid:durableId="1322656282">
     <w:abstractNumId w:val="5"/>
   </w:num>
-  <w:num w:numId="2" w16cid:durableId="251552943">
-    <w:abstractNumId w:val="2"/>
-  </w:num>
-  <w:num w:numId="3" w16cid:durableId="1280651508">
-    <w:abstractNumId w:val="1"/>
-  </w:num>
-  <w:num w:numId="4" w16cid:durableId="710033731">
-    <w:abstractNumId w:val="3"/>
-  </w:num>
-  <w:num w:numId="5" w16cid:durableId="1034694883">
-    <w:abstractNumId w:val="6"/>
-  </w:num>
-  <w:num w:numId="6" w16cid:durableId="324632256">
+  <w:num w:numId="8" w16cid:durableId="1773013356">
     <w:abstractNumId w:val="0"/>
-  </w:num>
-  <w:num w:numId="7" w16cid:durableId="1322656282">
-    <w:abstractNumId w:val="4"/>
   </w:num>
 </w:numbering>
 </file>

</xml_diff>